<commit_message>
Add actor context diagram; update SRS
</commit_message>
<xml_diff>
--- a/Document/02_Requirements/Report3_Software Requirement Specification.docx
+++ b/Document/02_Requirements/Report3_Software Requirement Specification.docx
@@ -1,6 +1,6 @@
 
 <file path=word/document.xml><?xml version="1.0" encoding="utf-8"?>
-<w:document xmlns:wpc="http://schemas.microsoft.com/office/word/2010/wordprocessingCanvas" xmlns:cx="http://schemas.microsoft.com/office/drawing/2014/chartex" xmlns:cx1="http://schemas.microsoft.com/office/drawing/2015/9/8/chartex" xmlns:cx2="http://schemas.microsoft.com/office/drawing/2015/10/21/chartex" xmlns:cx3="http://schemas.microsoft.com/office/drawing/2016/5/9/chartex" xmlns:cx4="http://schemas.microsoft.com/office/drawing/2016/5/10/chartex" xmlns:cx5="http://schemas.microsoft.com/office/drawing/2016/5/11/chartex" xmlns:cx6="http://schemas.microsoft.com/office/drawing/2016/5/12/chartex" xmlns:cx7="http://schemas.microsoft.com/office/drawing/2016/5/13/chartex" xmlns:cx8="http://schemas.microsoft.com/office/drawing/2016/5/14/chartex" xmlns:mc="http://schemas.openxmlformats.org/markup-compatibility/2006" xmlns:aink="http://schemas.microsoft.com/office/drawing/2016/ink" xmlns:am3d="http://schemas.microsoft.com/office/drawing/2017/model3d" xmlns:o="urn:schemas-microsoft-com:office:office" xmlns:r="http://schemas.openxmlformats.org/officeDocument/2006/relationships" xmlns:m="http://schemas.openxmlformats.org/officeDocument/2006/math" xmlns:v="urn:schemas-microsoft-com:vml" xmlns:wp14="http://schemas.microsoft.com/office/word/2010/wordprocessingDrawing" xmlns:wp="http://schemas.openxmlformats.org/drawingml/2006/wordprocessingDrawing" xmlns:w10="urn:schemas-microsoft-com:office:word" xmlns:w="http://schemas.openxmlformats.org/wordprocessingml/2006/main" xmlns:w14="http://schemas.microsoft.com/office/word/2010/wordml" xmlns:w15="http://schemas.microsoft.com/office/word/2012/wordml" xmlns:w16cex="http://schemas.microsoft.com/office/word/2018/wordml/cex" xmlns:w16cid="http://schemas.microsoft.com/office/word/2016/wordml/cid" xmlns:w16="http://schemas.microsoft.com/office/word/2018/wordml" xmlns:w16sdtdh="http://schemas.microsoft.com/office/word/2020/wordml/sdtdatahash" xmlns:w16se="http://schemas.microsoft.com/office/word/2015/wordml/symex" xmlns:wpg="http://schemas.microsoft.com/office/word/2010/wordprocessingGroup" xmlns:wpi="http://schemas.microsoft.com/office/word/2010/wordprocessingInk" xmlns:wne="http://schemas.microsoft.com/office/word/2006/wordml" xmlns:wps="http://schemas.microsoft.com/office/word/2010/wordprocessingShape" mc:Ignorable="w14 w15 w16se w16cid w16 w16cex w16sdtdh wp14">
+<w:document xmlns:wpc="http://schemas.microsoft.com/office/word/2010/wordprocessingCanvas" xmlns:cx="http://schemas.microsoft.com/office/drawing/2014/chartex" xmlns:cx1="http://schemas.microsoft.com/office/drawing/2015/9/8/chartex" xmlns:cx2="http://schemas.microsoft.com/office/drawing/2015/10/21/chartex" xmlns:cx3="http://schemas.microsoft.com/office/drawing/2016/5/9/chartex" xmlns:cx4="http://schemas.microsoft.com/office/drawing/2016/5/10/chartex" xmlns:cx5="http://schemas.microsoft.com/office/drawing/2016/5/11/chartex" xmlns:cx6="http://schemas.microsoft.com/office/drawing/2016/5/12/chartex" xmlns:cx7="http://schemas.microsoft.com/office/drawing/2016/5/13/chartex" xmlns:cx8="http://schemas.microsoft.com/office/drawing/2016/5/14/chartex" xmlns:mc="http://schemas.openxmlformats.org/markup-compatibility/2006" xmlns:aink="http://schemas.microsoft.com/office/drawing/2016/ink" xmlns:am3d="http://schemas.microsoft.com/office/drawing/2017/model3d" xmlns:o="urn:schemas-microsoft-com:office:office" xmlns:oel="http://schemas.microsoft.com/office/2019/extlst" xmlns:r="http://schemas.openxmlformats.org/officeDocument/2006/relationships" xmlns:m="http://schemas.openxmlformats.org/officeDocument/2006/math" xmlns:v="urn:schemas-microsoft-com:vml" xmlns:wp14="http://schemas.microsoft.com/office/word/2010/wordprocessingDrawing" xmlns:wp="http://schemas.openxmlformats.org/drawingml/2006/wordprocessingDrawing" xmlns:w10="urn:schemas-microsoft-com:office:word" xmlns:w="http://schemas.openxmlformats.org/wordprocessingml/2006/main" xmlns:w14="http://schemas.microsoft.com/office/word/2010/wordml" xmlns:w15="http://schemas.microsoft.com/office/word/2012/wordml" xmlns:w16cex="http://schemas.microsoft.com/office/word/2018/wordml/cex" xmlns:w16cid="http://schemas.microsoft.com/office/word/2016/wordml/cid" xmlns:w16="http://schemas.microsoft.com/office/word/2018/wordml" xmlns:w16sdtdh="http://schemas.microsoft.com/office/word/2020/wordml/sdtdatahash" xmlns:w16se="http://schemas.microsoft.com/office/word/2015/wordml/symex" xmlns:wpg="http://schemas.microsoft.com/office/word/2010/wordprocessingGroup" xmlns:wpi="http://schemas.microsoft.com/office/word/2010/wordprocessingInk" xmlns:wne="http://schemas.microsoft.com/office/word/2006/wordml" xmlns:wps="http://schemas.microsoft.com/office/word/2010/wordprocessingShape" mc:Ignorable="w14 w15 w16se w16cid w16 w16cex w16sdtdh wp14">
   <w:body>
     <w:p/>
     <w:p>
@@ -12,7 +12,7 @@
           <w:noProof/>
         </w:rPr>
         <w:drawing>
-          <wp:inline distT="0" distB="0" distL="0" distR="0" wp14:anchorId="3497F587" wp14:editId="44B2FFC7">
+          <wp:inline distT="0" distB="0" distL="0" distR="0" wp14:anchorId="0F3E5BD4" wp14:editId="66559F64">
             <wp:extent cx="2713741" cy="742362"/>
             <wp:effectExtent l="0" t="0" r="0" b="0"/>
             <wp:docPr id="24" name="image1.png"/>
@@ -243,7 +243,6 @@
           <w:docPartUnique/>
         </w:docPartObj>
       </w:sdtPr>
-      <w:sdtEndPr/>
       <w:sdtContent>
         <w:p>
           <w:pPr>
@@ -3334,7 +3333,7 @@
           <w:noProof/>
         </w:rPr>
         <w:drawing>
-          <wp:inline distT="0" distB="0" distL="0" distR="0" wp14:anchorId="220B56ED" wp14:editId="28128F93">
+          <wp:inline distT="0" distB="0" distL="0" distR="0" wp14:anchorId="7DD0B530" wp14:editId="4AC3E7ED">
             <wp:extent cx="4330342" cy="3315587"/>
             <wp:effectExtent l="0" t="0" r="0" b="0"/>
             <wp:docPr id="26" name="image6.png"/>
@@ -3441,7 +3440,7 @@
           <w:noProof/>
         </w:rPr>
         <w:drawing>
-          <wp:inline distT="0" distB="0" distL="0" distR="0" wp14:anchorId="6B1ACD32" wp14:editId="7E3EEC59">
+          <wp:inline distT="0" distB="0" distL="0" distR="0" wp14:anchorId="58A541BE" wp14:editId="56D7FD46">
             <wp:extent cx="5746750" cy="2310765"/>
             <wp:effectExtent l="0" t="0" r="0" b="0"/>
             <wp:docPr id="25" name="image3.png"/>
@@ -3530,462 +3529,1273 @@
         <w:t>.1 Actors</w:t>
       </w:r>
     </w:p>
-    <w:p>
-      <w:pPr>
-        <w:jc w:val="both"/>
-        <w:rPr>
-          <w:i/>
-          <w:color w:val="0000FF"/>
-        </w:rPr>
-      </w:pPr>
-      <w:r>
-        <w:rPr>
-          <w:i/>
-          <w:color w:val="0000FF"/>
-        </w:rPr>
-        <w:t xml:space="preserve">[An actor is someone/something that interacts with the system. </w:t>
-      </w:r>
-    </w:p>
-    <w:p>
-      <w:pPr>
-        <w:numPr>
-          <w:ilvl w:val="0"/>
-          <w:numId w:val="6"/>
-        </w:numPr>
-        <w:pBdr>
-          <w:top w:val="nil"/>
-          <w:left w:val="nil"/>
-          <w:bottom w:val="nil"/>
-          <w:right w:val="nil"/>
-          <w:between w:val="nil"/>
-        </w:pBdr>
-        <w:spacing w:after="0"/>
-        <w:ind w:left="426" w:hanging="283"/>
-        <w:rPr>
-          <w:i/>
-          <w:color w:val="0000FF"/>
-        </w:rPr>
-      </w:pPr>
-      <w:r>
-        <w:rPr>
-          <w:i/>
-          <w:color w:val="0000FF"/>
-        </w:rPr>
-        <w:t>The only external entities that interact with the system</w:t>
-      </w:r>
-    </w:p>
-    <w:p>
-      <w:pPr>
-        <w:numPr>
-          <w:ilvl w:val="0"/>
-          <w:numId w:val="6"/>
-        </w:numPr>
-        <w:pBdr>
-          <w:top w:val="nil"/>
-          <w:left w:val="nil"/>
-          <w:bottom w:val="nil"/>
-          <w:right w:val="nil"/>
-          <w:between w:val="nil"/>
-        </w:pBdr>
-        <w:spacing w:after="0"/>
-        <w:ind w:left="426" w:hanging="283"/>
-        <w:rPr>
-          <w:i/>
-          <w:color w:val="0000FF"/>
-        </w:rPr>
-      </w:pPr>
-      <w:r>
-        <w:rPr>
-          <w:i/>
-          <w:color w:val="0000FF"/>
-        </w:rPr>
-        <w:t>﻿Actors are outside the system and not part of it</w:t>
-      </w:r>
-    </w:p>
-    <w:p>
-      <w:pPr>
-        <w:numPr>
-          <w:ilvl w:val="0"/>
-          <w:numId w:val="6"/>
-        </w:numPr>
-        <w:pBdr>
-          <w:top w:val="nil"/>
-          <w:left w:val="nil"/>
-          <w:bottom w:val="nil"/>
-          <w:right w:val="nil"/>
-          <w:between w:val="nil"/>
-        </w:pBdr>
-        <w:spacing w:after="0"/>
-        <w:ind w:left="426" w:hanging="283"/>
-        <w:rPr>
-          <w:i/>
-          <w:color w:val="0000FF"/>
-        </w:rPr>
-      </w:pPr>
-      <w:r>
-        <w:rPr>
-          <w:i/>
-          <w:color w:val="0000FF"/>
-        </w:rPr>
-        <w:t>﻿A user is an individual, whereas an actor represents the role played by all users of the same type</w:t>
-      </w:r>
-    </w:p>
-    <w:p>
-      <w:pPr>
-        <w:numPr>
-          <w:ilvl w:val="0"/>
-          <w:numId w:val="6"/>
-        </w:numPr>
-        <w:pBdr>
-          <w:top w:val="nil"/>
-          <w:left w:val="nil"/>
-          <w:bottom w:val="nil"/>
-          <w:right w:val="nil"/>
-          <w:between w:val="nil"/>
-        </w:pBdr>
-        <w:ind w:left="426" w:hanging="283"/>
-        <w:rPr>
-          <w:i/>
-          <w:color w:val="0000FF"/>
-        </w:rPr>
-      </w:pPr>
-      <w:r>
-        <w:rPr>
-          <w:i/>
-          <w:color w:val="0000FF"/>
-        </w:rPr>
-        <w:t>There are other types of actors in addition to or in place of human actors: external systems, I/O devices, or timers</w:t>
-      </w:r>
-    </w:p>
-    <w:p>
-      <w:pPr>
-        <w:jc w:val="both"/>
-        <w:rPr>
-          <w:i/>
-          <w:color w:val="0000FF"/>
-        </w:rPr>
-      </w:pPr>
-      <w:r>
-        <w:rPr>
-          <w:i/>
-          <w:color w:val="0000FF"/>
-        </w:rPr>
-        <w:t>Following are some questions you might ask to help user representatives identify actors</w:t>
-      </w:r>
-    </w:p>
-    <w:p>
-      <w:pPr>
-        <w:numPr>
-          <w:ilvl w:val="0"/>
-          <w:numId w:val="6"/>
-        </w:numPr>
-        <w:pBdr>
-          <w:top w:val="nil"/>
-          <w:left w:val="nil"/>
-          <w:bottom w:val="nil"/>
-          <w:right w:val="nil"/>
-          <w:between w:val="nil"/>
-        </w:pBdr>
-        <w:spacing w:after="0"/>
-        <w:ind w:left="426" w:hanging="283"/>
-        <w:rPr>
-          <w:i/>
-          <w:color w:val="0000FF"/>
-        </w:rPr>
-      </w:pPr>
-      <w:r>
-        <w:rPr>
-          <w:i/>
-          <w:color w:val="0000FF"/>
-        </w:rPr>
-        <w:t>Who (or what) is notified when something occurs within the system?</w:t>
-      </w:r>
-    </w:p>
-    <w:p>
-      <w:pPr>
-        <w:numPr>
-          <w:ilvl w:val="0"/>
-          <w:numId w:val="6"/>
-        </w:numPr>
-        <w:pBdr>
-          <w:top w:val="nil"/>
-          <w:left w:val="nil"/>
-          <w:bottom w:val="nil"/>
-          <w:right w:val="nil"/>
-          <w:between w:val="nil"/>
-        </w:pBdr>
-        <w:spacing w:after="0"/>
-        <w:ind w:left="426" w:hanging="283"/>
-        <w:rPr>
-          <w:i/>
-          <w:color w:val="0000FF"/>
-        </w:rPr>
-      </w:pPr>
-      <w:r>
-        <w:rPr>
-          <w:i/>
-          <w:color w:val="0000FF"/>
-        </w:rPr>
-        <w:t>Who (or what) provides information or services to the system?</w:t>
-      </w:r>
-    </w:p>
-    <w:p>
-      <w:pPr>
-        <w:numPr>
-          <w:ilvl w:val="0"/>
-          <w:numId w:val="6"/>
-        </w:numPr>
-        <w:pBdr>
-          <w:top w:val="nil"/>
-          <w:left w:val="nil"/>
-          <w:bottom w:val="nil"/>
-          <w:right w:val="nil"/>
-          <w:between w:val="nil"/>
-        </w:pBdr>
-        <w:ind w:left="426" w:hanging="283"/>
-        <w:rPr>
-          <w:i/>
-          <w:color w:val="0000FF"/>
-        </w:rPr>
-      </w:pPr>
-      <w:r>
-        <w:rPr>
-          <w:i/>
-          <w:color w:val="0000FF"/>
-        </w:rPr>
-        <w:t>Who (or what) helps the system respond to and complete a task?</w:t>
-      </w:r>
-    </w:p>
-    <w:p>
-      <w:pPr>
-        <w:spacing w:after="60" w:line="240" w:lineRule="auto"/>
-        <w:rPr>
-          <w:i/>
-          <w:color w:val="0000FF"/>
-        </w:rPr>
-      </w:pPr>
-      <w:r>
-        <w:rPr>
-          <w:i/>
-          <w:color w:val="0000FF"/>
-        </w:rPr>
-        <w:t>This part gives the description of system actors, you can follow the table form as below]</w:t>
-      </w:r>
-    </w:p>
     <w:tbl>
       <w:tblPr>
-        <w:tblStyle w:val="a0"/>
-        <w:tblW w:w="8920" w:type="dxa"/>
-        <w:tblInd w:w="137" w:type="dxa"/>
-        <w:tblBorders>
-          <w:top w:val="single" w:sz="8" w:space="0" w:color="000000"/>
-          <w:left w:val="single" w:sz="8" w:space="0" w:color="000000"/>
-          <w:bottom w:val="single" w:sz="8" w:space="0" w:color="000000"/>
-          <w:right w:val="single" w:sz="8" w:space="0" w:color="000000"/>
-          <w:insideH w:val="single" w:sz="8" w:space="0" w:color="000000"/>
-          <w:insideV w:val="single" w:sz="8" w:space="0" w:color="000000"/>
-        </w:tblBorders>
+        <w:tblStyle w:val="TableGrid"/>
+        <w:tblW w:w="5000" w:type="pct"/>
+        <w:jc w:val="center"/>
         <w:tblLayout w:type="fixed"/>
-        <w:tblLook w:val="0400" w:firstRow="0" w:lastRow="0" w:firstColumn="0" w:lastColumn="0" w:noHBand="0" w:noVBand="1"/>
+        <w:tblLook w:val="04A0" w:firstRow="1" w:lastRow="0" w:firstColumn="1" w:lastColumn="0" w:noHBand="0" w:noVBand="1"/>
       </w:tblPr>
       <w:tblGrid>
-        <w:gridCol w:w="416"/>
-        <w:gridCol w:w="1707"/>
-        <w:gridCol w:w="6797"/>
+        <w:gridCol w:w="762"/>
+        <w:gridCol w:w="2075"/>
+        <w:gridCol w:w="6203"/>
       </w:tblGrid>
       <w:tr>
         <w:trPr>
-          <w:trHeight w:val="67"/>
+          <w:tblHeader/>
+          <w:jc w:val="center"/>
         </w:trPr>
         <w:tc>
           <w:tcPr>
-            <w:tcW w:w="416" w:type="dxa"/>
-            <w:shd w:val="clear" w:color="auto" w:fill="FFE8E1"/>
+            <w:tcW w:w="800" w:type="dxa"/>
+            <w:tcBorders>
+              <w:top w:val="single" w:sz="4" w:space="0" w:color="CBD5E1"/>
+              <w:left w:val="single" w:sz="4" w:space="0" w:color="CBD5E1"/>
+              <w:bottom w:val="single" w:sz="4" w:space="0" w:color="CBD5E1"/>
+              <w:right w:val="single" w:sz="4" w:space="0" w:color="CBD5E1"/>
+            </w:tcBorders>
+            <w:shd w:val="clear" w:color="auto" w:fill="F8FAFC"/>
+            <w:tcMar>
+              <w:top w:w="80" w:type="dxa"/>
+              <w:left w:w="80" w:type="dxa"/>
+              <w:bottom w:w="80" w:type="dxa"/>
+              <w:right w:w="80" w:type="dxa"/>
+            </w:tcMar>
             <w:vAlign w:val="center"/>
           </w:tcPr>
           <w:p>
             <w:pPr>
-              <w:spacing w:after="0" w:line="240" w:lineRule="auto"/>
+              <w:spacing w:line="264" w:lineRule="auto"/>
               <w:jc w:val="center"/>
-              <w:rPr>
+            </w:pPr>
+            <w:r>
+              <w:rPr>
+                <w:rFonts w:ascii="Arial" w:hAnsi="Arial"/>
                 <w:b/>
-              </w:rPr>
-            </w:pPr>
-            <w:r>
-              <w:rPr>
+                <w:color w:val="1E40AF"/>
+                <w:sz w:val="21"/>
+              </w:rPr>
+              <w:t>#</w:t>
+            </w:r>
+          </w:p>
+        </w:tc>
+        <w:tc>
+          <w:tcPr>
+            <w:tcW w:w="2200" w:type="dxa"/>
+            <w:tcBorders>
+              <w:top w:val="single" w:sz="4" w:space="0" w:color="CBD5E1"/>
+              <w:left w:val="single" w:sz="4" w:space="0" w:color="CBD5E1"/>
+              <w:bottom w:val="single" w:sz="4" w:space="0" w:color="CBD5E1"/>
+              <w:right w:val="single" w:sz="4" w:space="0" w:color="CBD5E1"/>
+            </w:tcBorders>
+            <w:shd w:val="clear" w:color="auto" w:fill="F8FAFC"/>
+            <w:tcMar>
+              <w:top w:w="80" w:type="dxa"/>
+              <w:left w:w="80" w:type="dxa"/>
+              <w:bottom w:w="80" w:type="dxa"/>
+              <w:right w:w="80" w:type="dxa"/>
+            </w:tcMar>
+            <w:vAlign w:val="center"/>
+          </w:tcPr>
+          <w:p>
+            <w:pPr>
+              <w:spacing w:line="264" w:lineRule="auto"/>
+              <w:jc w:val="center"/>
+            </w:pPr>
+            <w:r>
+              <w:rPr>
+                <w:rFonts w:ascii="Arial" w:hAnsi="Arial"/>
                 <w:b/>
-              </w:rPr>
-              <w:t>#</w:t>
-            </w:r>
-          </w:p>
-        </w:tc>
-        <w:tc>
-          <w:tcPr>
-            <w:tcW w:w="1707" w:type="dxa"/>
-            <w:shd w:val="clear" w:color="auto" w:fill="FFE8E1"/>
+                <w:color w:val="1E40AF"/>
+                <w:sz w:val="21"/>
+              </w:rPr>
+              <w:t>Actor</w:t>
+            </w:r>
+          </w:p>
+        </w:tc>
+        <w:tc>
+          <w:tcPr>
+            <w:tcW w:w="6600" w:type="dxa"/>
+            <w:tcBorders>
+              <w:top w:val="single" w:sz="4" w:space="0" w:color="CBD5E1"/>
+              <w:left w:val="single" w:sz="4" w:space="0" w:color="CBD5E1"/>
+              <w:bottom w:val="single" w:sz="4" w:space="0" w:color="CBD5E1"/>
+              <w:right w:val="single" w:sz="4" w:space="0" w:color="CBD5E1"/>
+            </w:tcBorders>
+            <w:shd w:val="clear" w:color="auto" w:fill="F8FAFC"/>
+            <w:tcMar>
+              <w:top w:w="80" w:type="dxa"/>
+              <w:left w:w="80" w:type="dxa"/>
+              <w:bottom w:w="80" w:type="dxa"/>
+              <w:right w:w="80" w:type="dxa"/>
+            </w:tcMar>
             <w:vAlign w:val="center"/>
           </w:tcPr>
           <w:p>
             <w:pPr>
-              <w:spacing w:after="0" w:line="240" w:lineRule="auto"/>
-              <w:rPr>
+              <w:spacing w:line="264" w:lineRule="auto"/>
+              <w:jc w:val="center"/>
+            </w:pPr>
+            <w:r>
+              <w:rPr>
+                <w:rFonts w:ascii="Arial" w:hAnsi="Arial"/>
                 <w:b/>
-              </w:rPr>
-            </w:pPr>
-            <w:r>
-              <w:rPr>
-                <w:b/>
-              </w:rPr>
-              <w:t>Actor</w:t>
-            </w:r>
-          </w:p>
-        </w:tc>
-        <w:tc>
-          <w:tcPr>
-            <w:tcW w:w="6797" w:type="dxa"/>
-            <w:shd w:val="clear" w:color="auto" w:fill="FFE8E1"/>
-            <w:vAlign w:val="center"/>
-          </w:tcPr>
-          <w:p>
-            <w:pPr>
-              <w:spacing w:after="0" w:line="240" w:lineRule="auto"/>
-              <w:rPr>
-                <w:b/>
-              </w:rPr>
-            </w:pPr>
-            <w:r>
-              <w:rPr>
-                <w:b/>
+                <w:color w:val="1E40AF"/>
+                <w:sz w:val="21"/>
               </w:rPr>
               <w:t>Description</w:t>
-            </w:r>
-          </w:p>
-        </w:tc>
-      </w:tr>
-      <w:tr>
-        <w:tc>
-          <w:tcPr>
-            <w:tcW w:w="416" w:type="dxa"/>
-            <w:shd w:val="clear" w:color="auto" w:fill="auto"/>
-            <w:vAlign w:val="center"/>
-          </w:tcPr>
-          <w:p>
-            <w:pPr>
-              <w:ind w:left="34"/>
-            </w:pPr>
-            <w:r>
-              <w:t>1</w:t>
-            </w:r>
-          </w:p>
-        </w:tc>
-        <w:tc>
-          <w:tcPr>
-            <w:tcW w:w="1707" w:type="dxa"/>
-            <w:shd w:val="clear" w:color="auto" w:fill="auto"/>
-            <w:vAlign w:val="center"/>
-          </w:tcPr>
-          <w:p>
-            <w:r>
-              <w:t>Administrator</w:t>
-            </w:r>
-          </w:p>
-        </w:tc>
-        <w:tc>
-          <w:tcPr>
-            <w:tcW w:w="6797" w:type="dxa"/>
-            <w:shd w:val="clear" w:color="auto" w:fill="auto"/>
-            <w:vAlign w:val="center"/>
-          </w:tcPr>
-          <w:p>
-            <w:r>
-              <w:t>Actor description here..</w:t>
             </w:r>
           </w:p>
         </w:tc>
       </w:tr>
       <w:tr>
         <w:trPr>
-          <w:trHeight w:val="315"/>
+          <w:jc w:val="center"/>
         </w:trPr>
         <w:tc>
           <w:tcPr>
-            <w:tcW w:w="416" w:type="dxa"/>
-            <w:shd w:val="clear" w:color="auto" w:fill="auto"/>
-            <w:vAlign w:val="center"/>
-          </w:tcPr>
-          <w:p>
-            <w:pPr>
-              <w:ind w:left="34"/>
-            </w:pPr>
-            <w:r>
-              <w:t>2</w:t>
-            </w:r>
-          </w:p>
-        </w:tc>
-        <w:tc>
-          <w:tcPr>
-            <w:tcW w:w="1707" w:type="dxa"/>
-            <w:shd w:val="clear" w:color="auto" w:fill="auto"/>
-            <w:vAlign w:val="center"/>
-          </w:tcPr>
-          <w:p>
-            <w:r>
-              <w:t>Menu Manager</w:t>
-            </w:r>
-          </w:p>
-        </w:tc>
-        <w:tc>
-          <w:tcPr>
-            <w:tcW w:w="6797" w:type="dxa"/>
-            <w:shd w:val="clear" w:color="auto" w:fill="auto"/>
-            <w:vAlign w:val="center"/>
-          </w:tcPr>
-          <w:p>
-            <w:r>
-              <w:t>..</w:t>
+            <w:tcW w:w="800" w:type="dxa"/>
+            <w:tcBorders>
+              <w:top w:val="single" w:sz="4" w:space="0" w:color="CBD5E1"/>
+              <w:left w:val="single" w:sz="4" w:space="0" w:color="CBD5E1"/>
+              <w:bottom w:val="single" w:sz="4" w:space="0" w:color="CBD5E1"/>
+              <w:right w:val="single" w:sz="4" w:space="0" w:color="CBD5E1"/>
+            </w:tcBorders>
+            <w:tcMar>
+              <w:top w:w="80" w:type="dxa"/>
+              <w:left w:w="80" w:type="dxa"/>
+              <w:bottom w:w="80" w:type="dxa"/>
+              <w:right w:w="80" w:type="dxa"/>
+            </w:tcMar>
+          </w:tcPr>
+          <w:p>
+            <w:pPr>
+              <w:spacing w:line="264" w:lineRule="auto"/>
+              <w:jc w:val="center"/>
+            </w:pPr>
+            <w:r>
+              <w:rPr>
+                <w:rFonts w:ascii="Arial" w:hAnsi="Arial"/>
+                <w:b/>
+                <w:color w:val="0F172A"/>
+                <w:sz w:val="20"/>
+              </w:rPr>
+              <w:t>1</w:t>
+            </w:r>
+          </w:p>
+        </w:tc>
+        <w:tc>
+          <w:tcPr>
+            <w:tcW w:w="2200" w:type="dxa"/>
+            <w:tcBorders>
+              <w:top w:val="single" w:sz="4" w:space="0" w:color="CBD5E1"/>
+              <w:left w:val="single" w:sz="4" w:space="0" w:color="CBD5E1"/>
+              <w:bottom w:val="single" w:sz="4" w:space="0" w:color="CBD5E1"/>
+              <w:right w:val="single" w:sz="4" w:space="0" w:color="CBD5E1"/>
+            </w:tcBorders>
+            <w:tcMar>
+              <w:top w:w="80" w:type="dxa"/>
+              <w:left w:w="80" w:type="dxa"/>
+              <w:bottom w:w="80" w:type="dxa"/>
+              <w:right w:w="80" w:type="dxa"/>
+            </w:tcMar>
+          </w:tcPr>
+          <w:p>
+            <w:pPr>
+              <w:spacing w:line="264" w:lineRule="auto"/>
+            </w:pPr>
+            <w:r>
+              <w:rPr>
+                <w:rFonts w:ascii="Arial" w:hAnsi="Arial"/>
+                <w:b/>
+                <w:color w:val="1D4ED8"/>
+                <w:sz w:val="20"/>
+              </w:rPr>
+              <w:t>Academic Admin</w:t>
+            </w:r>
+          </w:p>
+        </w:tc>
+        <w:tc>
+          <w:tcPr>
+            <w:tcW w:w="6600" w:type="dxa"/>
+            <w:tcBorders>
+              <w:top w:val="single" w:sz="4" w:space="0" w:color="CBD5E1"/>
+              <w:left w:val="single" w:sz="4" w:space="0" w:color="CBD5E1"/>
+              <w:bottom w:val="single" w:sz="4" w:space="0" w:color="CBD5E1"/>
+              <w:right w:val="single" w:sz="4" w:space="0" w:color="CBD5E1"/>
+            </w:tcBorders>
+            <w:tcMar>
+              <w:top w:w="80" w:type="dxa"/>
+              <w:left w:w="80" w:type="dxa"/>
+              <w:bottom w:w="80" w:type="dxa"/>
+              <w:right w:w="80" w:type="dxa"/>
+            </w:tcMar>
+          </w:tcPr>
+          <w:p>
+            <w:pPr>
+              <w:spacing w:after="40" w:line="264" w:lineRule="auto"/>
+            </w:pPr>
+            <w:r>
+              <w:rPr>
+                <w:rFonts w:ascii="Arial" w:hAnsi="Arial"/>
+                <w:sz w:val="20"/>
+              </w:rPr>
+              <w:t>The primary power user of CLS — responsible for all day-to-day academic and administrative operations.</w:t>
+            </w:r>
+          </w:p>
+          <w:p>
+            <w:pPr>
+              <w:spacing w:after="40" w:line="264" w:lineRule="auto"/>
+            </w:pPr>
+          </w:p>
+          <w:p>
+            <w:pPr>
+              <w:spacing w:after="40" w:line="264" w:lineRule="auto"/>
+            </w:pPr>
+            <w:r>
+              <w:rPr>
+                <w:rFonts w:ascii="Arial" w:hAnsi="Arial"/>
+                <w:sz w:val="20"/>
+              </w:rPr>
+              <w:t>The Academic Admin replaces all legacy spreadsheet-based workflows and serves as the central system operator. Key responsibilities include:</w:t>
+            </w:r>
+          </w:p>
+          <w:p>
+            <w:pPr>
+              <w:spacing w:after="40" w:line="264" w:lineRule="auto"/>
+            </w:pPr>
+            <w:r>
+              <w:rPr>
+                <w:rFonts w:ascii="Arial" w:hAnsi="Arial"/>
+                <w:sz w:val="20"/>
+              </w:rPr>
+              <w:t xml:space="preserve">• </w:t>
+            </w:r>
+            <w:r>
+              <w:rPr>
+                <w:rFonts w:ascii="Arial" w:hAnsi="Arial"/>
+                <w:b/>
+                <w:sz w:val="20"/>
+              </w:rPr>
+              <w:t>Learner Lifecycle Management:</w:t>
+            </w:r>
+            <w:r>
+              <w:rPr>
+                <w:rFonts w:ascii="Arial" w:hAnsi="Arial"/>
+                <w:sz w:val="20"/>
+              </w:rPr>
+              <w:t xml:space="preserve"> </w:t>
+            </w:r>
+            <w:proofErr w:type="spellStart"/>
+            <w:r>
+              <w:rPr>
+                <w:rFonts w:ascii="Arial" w:hAnsi="Arial"/>
+                <w:sz w:val="20"/>
+              </w:rPr>
+              <w:t>Enrolls</w:t>
+            </w:r>
+            <w:proofErr w:type="spellEnd"/>
+            <w:r>
+              <w:rPr>
+                <w:rFonts w:ascii="Arial" w:hAnsi="Arial"/>
+                <w:sz w:val="20"/>
+              </w:rPr>
+              <w:t xml:space="preserve"> new learners, manages their profiles, assigns Learning Packages, and tracks each learner's progression from </w:t>
+            </w:r>
+            <w:proofErr w:type="spellStart"/>
+            <w:r>
+              <w:rPr>
+                <w:rFonts w:ascii="Arial" w:hAnsi="Arial"/>
+                <w:sz w:val="20"/>
+              </w:rPr>
+              <w:t>enrollment</w:t>
+            </w:r>
+            <w:proofErr w:type="spellEnd"/>
+            <w:r>
+              <w:rPr>
+                <w:rFonts w:ascii="Arial" w:hAnsi="Arial"/>
+                <w:sz w:val="20"/>
+              </w:rPr>
+              <w:t xml:space="preserve"> through completion or withdrawal.</w:t>
+            </w:r>
+          </w:p>
+          <w:p>
+            <w:pPr>
+              <w:spacing w:after="40" w:line="264" w:lineRule="auto"/>
+            </w:pPr>
+            <w:r>
+              <w:rPr>
+                <w:rFonts w:ascii="Arial" w:hAnsi="Arial"/>
+                <w:sz w:val="20"/>
+              </w:rPr>
+              <w:t xml:space="preserve">• </w:t>
+            </w:r>
+            <w:r>
+              <w:rPr>
+                <w:rFonts w:ascii="Arial" w:hAnsi="Arial"/>
+                <w:b/>
+                <w:sz w:val="20"/>
+              </w:rPr>
+              <w:t>Session Scheduling:</w:t>
+            </w:r>
+            <w:r>
+              <w:rPr>
+                <w:rFonts w:ascii="Arial" w:hAnsi="Arial"/>
+                <w:sz w:val="20"/>
+              </w:rPr>
+              <w:t xml:space="preserve"> Creates, modifies, and manages session timetables. The system validates all schedule inputs against conflict-detection rules to prevent room and Teacher double-booking (Scheduling Conflict).</w:t>
+            </w:r>
+          </w:p>
+          <w:p>
+            <w:pPr>
+              <w:spacing w:after="40" w:line="264" w:lineRule="auto"/>
+            </w:pPr>
+            <w:r>
+              <w:rPr>
+                <w:rFonts w:ascii="Arial" w:hAnsi="Arial"/>
+                <w:sz w:val="20"/>
+              </w:rPr>
+              <w:t xml:space="preserve">• </w:t>
+            </w:r>
+            <w:r>
+              <w:rPr>
+                <w:rFonts w:ascii="Arial" w:hAnsi="Arial"/>
+                <w:b/>
+                <w:sz w:val="20"/>
+              </w:rPr>
+              <w:t>Attendance Tracking:</w:t>
+            </w:r>
+            <w:r>
+              <w:rPr>
+                <w:rFonts w:ascii="Arial" w:hAnsi="Arial"/>
+                <w:sz w:val="20"/>
+              </w:rPr>
+              <w:t xml:space="preserve"> Records daily attendance for each session. Upon saving, the system automatically triggers Notification emails to the associated Parent.</w:t>
+            </w:r>
+          </w:p>
+          <w:p>
+            <w:pPr>
+              <w:spacing w:after="40" w:line="264" w:lineRule="auto"/>
+            </w:pPr>
+            <w:r>
+              <w:rPr>
+                <w:rFonts w:ascii="Arial" w:hAnsi="Arial"/>
+                <w:sz w:val="20"/>
+              </w:rPr>
+              <w:t xml:space="preserve">• </w:t>
+            </w:r>
+            <w:r>
+              <w:rPr>
+                <w:rFonts w:ascii="Arial" w:hAnsi="Arial"/>
+                <w:b/>
+                <w:sz w:val="20"/>
+              </w:rPr>
+              <w:t>Learning Package Monitoring:</w:t>
+            </w:r>
+            <w:r>
+              <w:rPr>
+                <w:rFonts w:ascii="Arial" w:hAnsi="Arial"/>
+                <w:sz w:val="20"/>
+              </w:rPr>
+              <w:t xml:space="preserve"> Receives system-generated alerts exactly 2 weeks before a learner's Learning Package expires, enabling proactive renewal outreach to reduce churn.</w:t>
+            </w:r>
+          </w:p>
+          <w:p>
+            <w:pPr>
+              <w:spacing w:line="264" w:lineRule="auto"/>
+            </w:pPr>
+            <w:r>
+              <w:rPr>
+                <w:rFonts w:ascii="Arial" w:hAnsi="Arial"/>
+                <w:sz w:val="20"/>
+              </w:rPr>
+              <w:t xml:space="preserve">• </w:t>
+            </w:r>
+            <w:r>
+              <w:rPr>
+                <w:rFonts w:ascii="Arial" w:hAnsi="Arial"/>
+                <w:b/>
+                <w:sz w:val="20"/>
+              </w:rPr>
+              <w:t>Feedback SLA Oversight:</w:t>
+            </w:r>
+            <w:r>
+              <w:rPr>
+                <w:rFonts w:ascii="Arial" w:hAnsi="Arial"/>
+                <w:sz w:val="20"/>
+              </w:rPr>
+              <w:t xml:space="preserve"> Monitors Teacher compliance with the 12-hour post-session Feedback SLA via dashboard reports.</w:t>
             </w:r>
           </w:p>
         </w:tc>
       </w:tr>
       <w:tr>
-        <w:tc>
-          <w:tcPr>
-            <w:tcW w:w="416" w:type="dxa"/>
-            <w:shd w:val="clear" w:color="auto" w:fill="auto"/>
-            <w:vAlign w:val="center"/>
-          </w:tcPr>
-          <w:p>
-            <w:pPr>
-              <w:ind w:left="34"/>
-            </w:pPr>
-            <w:r>
+        <w:trPr>
+          <w:jc w:val="center"/>
+        </w:trPr>
+        <w:tc>
+          <w:tcPr>
+            <w:tcW w:w="800" w:type="dxa"/>
+            <w:tcBorders>
+              <w:top w:val="single" w:sz="4" w:space="0" w:color="CBD5E1"/>
+              <w:left w:val="single" w:sz="4" w:space="0" w:color="CBD5E1"/>
+              <w:bottom w:val="single" w:sz="4" w:space="0" w:color="CBD5E1"/>
+              <w:right w:val="single" w:sz="4" w:space="0" w:color="CBD5E1"/>
+            </w:tcBorders>
+            <w:tcMar>
+              <w:top w:w="80" w:type="dxa"/>
+              <w:left w:w="80" w:type="dxa"/>
+              <w:bottom w:w="80" w:type="dxa"/>
+              <w:right w:w="80" w:type="dxa"/>
+            </w:tcMar>
+          </w:tcPr>
+          <w:p>
+            <w:pPr>
+              <w:spacing w:line="264" w:lineRule="auto"/>
+              <w:jc w:val="center"/>
+            </w:pPr>
+            <w:r>
+              <w:rPr>
+                <w:rFonts w:ascii="Arial" w:hAnsi="Arial"/>
+                <w:b/>
+                <w:color w:val="0F172A"/>
+                <w:sz w:val="20"/>
+              </w:rPr>
+              <w:lastRenderedPageBreak/>
+              <w:t>2</w:t>
+            </w:r>
+          </w:p>
+        </w:tc>
+        <w:tc>
+          <w:tcPr>
+            <w:tcW w:w="2200" w:type="dxa"/>
+            <w:tcBorders>
+              <w:top w:val="single" w:sz="4" w:space="0" w:color="CBD5E1"/>
+              <w:left w:val="single" w:sz="4" w:space="0" w:color="CBD5E1"/>
+              <w:bottom w:val="single" w:sz="4" w:space="0" w:color="CBD5E1"/>
+              <w:right w:val="single" w:sz="4" w:space="0" w:color="CBD5E1"/>
+            </w:tcBorders>
+            <w:tcMar>
+              <w:top w:w="80" w:type="dxa"/>
+              <w:left w:w="80" w:type="dxa"/>
+              <w:bottom w:w="80" w:type="dxa"/>
+              <w:right w:w="80" w:type="dxa"/>
+            </w:tcMar>
+          </w:tcPr>
+          <w:p>
+            <w:pPr>
+              <w:spacing w:line="264" w:lineRule="auto"/>
+            </w:pPr>
+            <w:r>
+              <w:rPr>
+                <w:rFonts w:ascii="Arial" w:hAnsi="Arial"/>
+                <w:b/>
+                <w:color w:val="1D4ED8"/>
+                <w:sz w:val="20"/>
+              </w:rPr>
+              <w:t>Teacher</w:t>
+            </w:r>
+          </w:p>
+        </w:tc>
+        <w:tc>
+          <w:tcPr>
+            <w:tcW w:w="6600" w:type="dxa"/>
+            <w:tcBorders>
+              <w:top w:val="single" w:sz="4" w:space="0" w:color="CBD5E1"/>
+              <w:left w:val="single" w:sz="4" w:space="0" w:color="CBD5E1"/>
+              <w:bottom w:val="single" w:sz="4" w:space="0" w:color="CBD5E1"/>
+              <w:right w:val="single" w:sz="4" w:space="0" w:color="CBD5E1"/>
+            </w:tcBorders>
+            <w:tcMar>
+              <w:top w:w="80" w:type="dxa"/>
+              <w:left w:w="80" w:type="dxa"/>
+              <w:bottom w:w="80" w:type="dxa"/>
+              <w:right w:w="80" w:type="dxa"/>
+            </w:tcMar>
+          </w:tcPr>
+          <w:p>
+            <w:pPr>
+              <w:spacing w:after="40" w:line="264" w:lineRule="auto"/>
+            </w:pPr>
+            <w:r>
+              <w:rPr>
+                <w:rFonts w:ascii="Arial" w:hAnsi="Arial"/>
+                <w:sz w:val="20"/>
+              </w:rPr>
+              <w:t>The academic content contributor — responsible for delivering sessions and providing post-session learner evaluations within a strict SLA.</w:t>
+            </w:r>
+          </w:p>
+          <w:p>
+            <w:pPr>
+              <w:spacing w:after="40" w:line="264" w:lineRule="auto"/>
+            </w:pPr>
+          </w:p>
+          <w:p>
+            <w:pPr>
+              <w:spacing w:after="40" w:line="264" w:lineRule="auto"/>
+            </w:pPr>
+            <w:r>
+              <w:rPr>
+                <w:rFonts w:ascii="Arial" w:hAnsi="Arial"/>
+                <w:sz w:val="20"/>
+              </w:rPr>
+              <w:t>Teachers interact with CLS primarily through the Feedback submission module and session schedule viewer. Key responsibilities include:</w:t>
+            </w:r>
+          </w:p>
+          <w:p>
+            <w:pPr>
+              <w:spacing w:after="40" w:line="264" w:lineRule="auto"/>
+            </w:pPr>
+            <w:r>
+              <w:rPr>
+                <w:rFonts w:ascii="Arial" w:hAnsi="Arial"/>
+                <w:sz w:val="20"/>
+              </w:rPr>
+              <w:t xml:space="preserve">• </w:t>
+            </w:r>
+            <w:r>
+              <w:rPr>
+                <w:rFonts w:ascii="Arial" w:hAnsi="Arial"/>
+                <w:b/>
+                <w:sz w:val="20"/>
+              </w:rPr>
+              <w:t>View Session Schedule:</w:t>
+            </w:r>
+            <w:r>
+              <w:rPr>
+                <w:rFonts w:ascii="Arial" w:hAnsi="Arial"/>
+                <w:sz w:val="20"/>
+              </w:rPr>
+              <w:t xml:space="preserve"> Accesses their assigned session timetable including date, time, room, and learner roster. The system guarantees zero Scheduling Conflicts across all Teacher assignments.</w:t>
+            </w:r>
+          </w:p>
+          <w:p>
+            <w:pPr>
+              <w:spacing w:after="40" w:line="264" w:lineRule="auto"/>
+            </w:pPr>
+            <w:r>
+              <w:rPr>
+                <w:rFonts w:ascii="Arial" w:hAnsi="Arial"/>
+                <w:sz w:val="20"/>
+              </w:rPr>
+              <w:t xml:space="preserve">• </w:t>
+            </w:r>
+            <w:r>
+              <w:rPr>
+                <w:rFonts w:ascii="Arial" w:hAnsi="Arial"/>
+                <w:b/>
+                <w:sz w:val="20"/>
+              </w:rPr>
+              <w:t>Submit Session Feedback:</w:t>
+            </w:r>
+            <w:r>
+              <w:rPr>
+                <w:rFonts w:ascii="Arial" w:hAnsi="Arial"/>
+                <w:sz w:val="20"/>
+              </w:rPr>
+              <w:t xml:space="preserve"> After each session, the Teacher must compose and submit a Feedback entry evaluating each learner's academic performance. A strict SLA of 12 hours post-session is enforced.</w:t>
+            </w:r>
+          </w:p>
+          <w:p>
+            <w:pPr>
+              <w:spacing w:after="40" w:line="264" w:lineRule="auto"/>
+            </w:pPr>
+            <w:r>
+              <w:rPr>
+                <w:rFonts w:ascii="Arial" w:hAnsi="Arial"/>
+                <w:sz w:val="20"/>
+              </w:rPr>
+              <w:t xml:space="preserve">• </w:t>
+            </w:r>
+            <w:r>
+              <w:rPr>
+                <w:rFonts w:ascii="Arial" w:hAnsi="Arial"/>
+                <w:b/>
+                <w:sz w:val="20"/>
+              </w:rPr>
+              <w:t>Confirm Attendance:</w:t>
+            </w:r>
+            <w:r>
+              <w:rPr>
+                <w:rFonts w:ascii="Arial" w:hAnsi="Arial"/>
+                <w:sz w:val="20"/>
+              </w:rPr>
+              <w:t xml:space="preserve"> Assists with confirming learner attendance during or after a session.</w:t>
+            </w:r>
+          </w:p>
+          <w:p>
+            <w:pPr>
+              <w:spacing w:line="264" w:lineRule="auto"/>
+            </w:pPr>
+            <w:r>
+              <w:rPr>
+                <w:rFonts w:ascii="Arial" w:hAnsi="Arial"/>
+                <w:sz w:val="20"/>
+              </w:rPr>
+              <w:t xml:space="preserve">• </w:t>
+            </w:r>
+            <w:r>
+              <w:rPr>
+                <w:rFonts w:ascii="Arial" w:hAnsi="Arial"/>
+                <w:b/>
+                <w:sz w:val="20"/>
+              </w:rPr>
+              <w:t>Receive SLA Reminders:</w:t>
+            </w:r>
+            <w:r>
+              <w:rPr>
+                <w:rFonts w:ascii="Arial" w:hAnsi="Arial"/>
+                <w:sz w:val="20"/>
+              </w:rPr>
+              <w:t xml:space="preserve"> The system sends reminders if a Feedback entry has not been submitted within the SLA window.</w:t>
+            </w:r>
+          </w:p>
+        </w:tc>
+      </w:tr>
+      <w:tr>
+        <w:trPr>
+          <w:jc w:val="center"/>
+        </w:trPr>
+        <w:tc>
+          <w:tcPr>
+            <w:tcW w:w="800" w:type="dxa"/>
+            <w:tcBorders>
+              <w:top w:val="single" w:sz="4" w:space="0" w:color="CBD5E1"/>
+              <w:left w:val="single" w:sz="4" w:space="0" w:color="CBD5E1"/>
+              <w:bottom w:val="single" w:sz="4" w:space="0" w:color="CBD5E1"/>
+              <w:right w:val="single" w:sz="4" w:space="0" w:color="CBD5E1"/>
+            </w:tcBorders>
+            <w:tcMar>
+              <w:top w:w="80" w:type="dxa"/>
+              <w:left w:w="80" w:type="dxa"/>
+              <w:bottom w:w="80" w:type="dxa"/>
+              <w:right w:w="80" w:type="dxa"/>
+            </w:tcMar>
+          </w:tcPr>
+          <w:p>
+            <w:pPr>
+              <w:spacing w:line="264" w:lineRule="auto"/>
+              <w:jc w:val="center"/>
+            </w:pPr>
+            <w:r>
+              <w:rPr>
+                <w:rFonts w:ascii="Arial" w:hAnsi="Arial"/>
+                <w:b/>
+                <w:color w:val="0F172A"/>
+                <w:sz w:val="20"/>
+              </w:rPr>
               <w:t>3</w:t>
             </w:r>
           </w:p>
         </w:tc>
         <w:tc>
           <w:tcPr>
-            <w:tcW w:w="1707" w:type="dxa"/>
-            <w:shd w:val="clear" w:color="auto" w:fill="auto"/>
-            <w:vAlign w:val="center"/>
-          </w:tcPr>
-          <w:p>
-            <w:r>
-              <w:t>…</w:t>
-            </w:r>
-          </w:p>
-        </w:tc>
-        <w:tc>
-          <w:tcPr>
-            <w:tcW w:w="6797" w:type="dxa"/>
-            <w:shd w:val="clear" w:color="auto" w:fill="auto"/>
-            <w:vAlign w:val="center"/>
-          </w:tcPr>
-          <w:p/>
+            <w:tcW w:w="2200" w:type="dxa"/>
+            <w:tcBorders>
+              <w:top w:val="single" w:sz="4" w:space="0" w:color="CBD5E1"/>
+              <w:left w:val="single" w:sz="4" w:space="0" w:color="CBD5E1"/>
+              <w:bottom w:val="single" w:sz="4" w:space="0" w:color="CBD5E1"/>
+              <w:right w:val="single" w:sz="4" w:space="0" w:color="CBD5E1"/>
+            </w:tcBorders>
+            <w:tcMar>
+              <w:top w:w="80" w:type="dxa"/>
+              <w:left w:w="80" w:type="dxa"/>
+              <w:bottom w:w="80" w:type="dxa"/>
+              <w:right w:w="80" w:type="dxa"/>
+            </w:tcMar>
+          </w:tcPr>
+          <w:p>
+            <w:pPr>
+              <w:spacing w:line="264" w:lineRule="auto"/>
+            </w:pPr>
+            <w:r>
+              <w:rPr>
+                <w:rFonts w:ascii="Arial" w:hAnsi="Arial"/>
+                <w:b/>
+                <w:color w:val="1D4ED8"/>
+                <w:sz w:val="20"/>
+              </w:rPr>
+              <w:t>Parent (Sponsor)</w:t>
+            </w:r>
+          </w:p>
+        </w:tc>
+        <w:tc>
+          <w:tcPr>
+            <w:tcW w:w="6600" w:type="dxa"/>
+            <w:tcBorders>
+              <w:top w:val="single" w:sz="4" w:space="0" w:color="CBD5E1"/>
+              <w:left w:val="single" w:sz="4" w:space="0" w:color="CBD5E1"/>
+              <w:bottom w:val="single" w:sz="4" w:space="0" w:color="CBD5E1"/>
+              <w:right w:val="single" w:sz="4" w:space="0" w:color="CBD5E1"/>
+            </w:tcBorders>
+            <w:tcMar>
+              <w:top w:w="80" w:type="dxa"/>
+              <w:left w:w="80" w:type="dxa"/>
+              <w:bottom w:w="80" w:type="dxa"/>
+              <w:right w:w="80" w:type="dxa"/>
+            </w:tcMar>
+          </w:tcPr>
+          <w:p>
+            <w:pPr>
+              <w:spacing w:after="40" w:line="264" w:lineRule="auto"/>
+            </w:pPr>
+            <w:r>
+              <w:rPr>
+                <w:rFonts w:ascii="Arial" w:hAnsi="Arial"/>
+                <w:sz w:val="20"/>
+              </w:rPr>
+              <w:t>The financial sponsor and external stakeholder — a non-login recipient of automated system Notifications regarding their child's academic activity.</w:t>
+            </w:r>
+          </w:p>
+          <w:p>
+            <w:pPr>
+              <w:spacing w:after="40" w:line="264" w:lineRule="auto"/>
+            </w:pPr>
+          </w:p>
+          <w:p>
+            <w:pPr>
+              <w:spacing w:after="40" w:line="264" w:lineRule="auto"/>
+            </w:pPr>
+            <w:r>
+              <w:rPr>
+                <w:rFonts w:ascii="Arial" w:hAnsi="Arial"/>
+                <w:sz w:val="20"/>
+              </w:rPr>
+              <w:t>In the MVP phase, Parents do not log into CLS directly. All interactions are system-to-Parent push communications via automated email (Notification). The Parent receives:</w:t>
+            </w:r>
+          </w:p>
+          <w:p>
+            <w:pPr>
+              <w:spacing w:after="40" w:line="264" w:lineRule="auto"/>
+            </w:pPr>
+            <w:r>
+              <w:rPr>
+                <w:rFonts w:ascii="Arial" w:hAnsi="Arial"/>
+                <w:sz w:val="20"/>
+              </w:rPr>
+              <w:t xml:space="preserve">• </w:t>
+            </w:r>
+            <w:r>
+              <w:rPr>
+                <w:rFonts w:ascii="Arial" w:hAnsi="Arial"/>
+                <w:b/>
+                <w:sz w:val="20"/>
+              </w:rPr>
+              <w:t>Attendance Notification:</w:t>
+            </w:r>
+            <w:r>
+              <w:rPr>
+                <w:rFonts w:ascii="Arial" w:hAnsi="Arial"/>
+                <w:sz w:val="20"/>
+              </w:rPr>
+              <w:t xml:space="preserve"> An automated email dispatched immediately after the Academic Admin records attendance, confirming whether the learner was present or absent for a specific session.</w:t>
+            </w:r>
+          </w:p>
+          <w:p>
+            <w:pPr>
+              <w:spacing w:after="40" w:line="264" w:lineRule="auto"/>
+            </w:pPr>
+            <w:r>
+              <w:rPr>
+                <w:rFonts w:ascii="Arial" w:hAnsi="Arial"/>
+                <w:sz w:val="20"/>
+              </w:rPr>
+              <w:t xml:space="preserve">• </w:t>
+            </w:r>
+            <w:r>
+              <w:rPr>
+                <w:rFonts w:ascii="Arial" w:hAnsi="Arial"/>
+                <w:b/>
+                <w:sz w:val="20"/>
+              </w:rPr>
+              <w:t>Schedule Change Notification:</w:t>
+            </w:r>
+            <w:r>
+              <w:rPr>
+                <w:rFonts w:ascii="Arial" w:hAnsi="Arial"/>
+                <w:sz w:val="20"/>
+              </w:rPr>
+              <w:t xml:space="preserve"> An automated email triggered whenever a session's date, time, room, or Teacher assignment is modified.</w:t>
+            </w:r>
+          </w:p>
+          <w:p>
+            <w:pPr>
+              <w:spacing w:after="40" w:line="264" w:lineRule="auto"/>
+            </w:pPr>
+            <w:r>
+              <w:rPr>
+                <w:rFonts w:ascii="Arial" w:hAnsi="Arial"/>
+                <w:sz w:val="20"/>
+              </w:rPr>
+              <w:t xml:space="preserve">• </w:t>
+            </w:r>
+            <w:r>
+              <w:rPr>
+                <w:rFonts w:ascii="Arial" w:hAnsi="Arial"/>
+                <w:b/>
+                <w:sz w:val="20"/>
+              </w:rPr>
+              <w:t>Session Feedback Report:</w:t>
+            </w:r>
+            <w:r>
+              <w:rPr>
+                <w:rFonts w:ascii="Arial" w:hAnsi="Arial"/>
+                <w:sz w:val="20"/>
+              </w:rPr>
+              <w:t xml:space="preserve"> A per-session email containing the Teacher's academic Feedback on the learner's performance.</w:t>
+            </w:r>
+          </w:p>
+          <w:p>
+            <w:pPr>
+              <w:spacing w:line="264" w:lineRule="auto"/>
+            </w:pPr>
+            <w:r>
+              <w:rPr>
+                <w:rFonts w:ascii="Arial" w:hAnsi="Arial"/>
+                <w:sz w:val="20"/>
+              </w:rPr>
+              <w:t xml:space="preserve">• </w:t>
+            </w:r>
+            <w:r>
+              <w:rPr>
+                <w:rFonts w:ascii="Arial" w:hAnsi="Arial"/>
+                <w:b/>
+                <w:sz w:val="20"/>
+              </w:rPr>
+              <w:t>Learning Package Expiry Notice:</w:t>
+            </w:r>
+            <w:r>
+              <w:rPr>
+                <w:rFonts w:ascii="Arial" w:hAnsi="Arial"/>
+                <w:sz w:val="20"/>
+              </w:rPr>
+              <w:t xml:space="preserve"> An automated email sent when the learner's remaining sessions or package duration approaches depletion (2-week threshold).</w:t>
+            </w:r>
+          </w:p>
+        </w:tc>
+      </w:tr>
+      <w:tr>
+        <w:trPr>
+          <w:jc w:val="center"/>
+        </w:trPr>
+        <w:tc>
+          <w:tcPr>
+            <w:tcW w:w="800" w:type="dxa"/>
+            <w:tcBorders>
+              <w:top w:val="single" w:sz="4" w:space="0" w:color="CBD5E1"/>
+              <w:left w:val="single" w:sz="4" w:space="0" w:color="CBD5E1"/>
+              <w:bottom w:val="single" w:sz="4" w:space="0" w:color="CBD5E1"/>
+              <w:right w:val="single" w:sz="4" w:space="0" w:color="CBD5E1"/>
+            </w:tcBorders>
+            <w:tcMar>
+              <w:top w:w="80" w:type="dxa"/>
+              <w:left w:w="80" w:type="dxa"/>
+              <w:bottom w:w="80" w:type="dxa"/>
+              <w:right w:w="80" w:type="dxa"/>
+            </w:tcMar>
+          </w:tcPr>
+          <w:p>
+            <w:pPr>
+              <w:spacing w:line="264" w:lineRule="auto"/>
+              <w:jc w:val="center"/>
+            </w:pPr>
+            <w:r>
+              <w:rPr>
+                <w:rFonts w:ascii="Arial" w:hAnsi="Arial"/>
+                <w:b/>
+                <w:color w:val="0F172A"/>
+                <w:sz w:val="20"/>
+              </w:rPr>
+              <w:t>4</w:t>
+            </w:r>
+          </w:p>
+        </w:tc>
+        <w:tc>
+          <w:tcPr>
+            <w:tcW w:w="2200" w:type="dxa"/>
+            <w:tcBorders>
+              <w:top w:val="single" w:sz="4" w:space="0" w:color="CBD5E1"/>
+              <w:left w:val="single" w:sz="4" w:space="0" w:color="CBD5E1"/>
+              <w:bottom w:val="single" w:sz="4" w:space="0" w:color="CBD5E1"/>
+              <w:right w:val="single" w:sz="4" w:space="0" w:color="CBD5E1"/>
+            </w:tcBorders>
+            <w:tcMar>
+              <w:top w:w="80" w:type="dxa"/>
+              <w:left w:w="80" w:type="dxa"/>
+              <w:bottom w:w="80" w:type="dxa"/>
+              <w:right w:w="80" w:type="dxa"/>
+            </w:tcMar>
+          </w:tcPr>
+          <w:p>
+            <w:pPr>
+              <w:spacing w:line="264" w:lineRule="auto"/>
+            </w:pPr>
+            <w:proofErr w:type="spellStart"/>
+            <w:r>
+              <w:rPr>
+                <w:rFonts w:ascii="Arial" w:hAnsi="Arial"/>
+                <w:b/>
+                <w:color w:val="1D4ED8"/>
+                <w:sz w:val="20"/>
+              </w:rPr>
+              <w:t>Center</w:t>
+            </w:r>
+            <w:proofErr w:type="spellEnd"/>
+            <w:r>
+              <w:rPr>
+                <w:rFonts w:ascii="Arial" w:hAnsi="Arial"/>
+                <w:b/>
+                <w:color w:val="1D4ED8"/>
+                <w:sz w:val="20"/>
+              </w:rPr>
+              <w:t xml:space="preserve"> Director</w:t>
+            </w:r>
+          </w:p>
+        </w:tc>
+        <w:tc>
+          <w:tcPr>
+            <w:tcW w:w="6600" w:type="dxa"/>
+            <w:tcBorders>
+              <w:top w:val="single" w:sz="4" w:space="0" w:color="CBD5E1"/>
+              <w:left w:val="single" w:sz="4" w:space="0" w:color="CBD5E1"/>
+              <w:bottom w:val="single" w:sz="4" w:space="0" w:color="CBD5E1"/>
+              <w:right w:val="single" w:sz="4" w:space="0" w:color="CBD5E1"/>
+            </w:tcBorders>
+            <w:tcMar>
+              <w:top w:w="80" w:type="dxa"/>
+              <w:left w:w="80" w:type="dxa"/>
+              <w:bottom w:w="80" w:type="dxa"/>
+              <w:right w:w="80" w:type="dxa"/>
+            </w:tcMar>
+          </w:tcPr>
+          <w:p>
+            <w:pPr>
+              <w:spacing w:after="40" w:line="264" w:lineRule="auto"/>
+            </w:pPr>
+            <w:r>
+              <w:rPr>
+                <w:rFonts w:ascii="Arial" w:hAnsi="Arial"/>
+                <w:sz w:val="20"/>
+              </w:rPr>
+              <w:t>The project sponsor and strategic decision-maker — consumes high-level dashboards and operational reports generated by CLS.</w:t>
+            </w:r>
+          </w:p>
+          <w:p>
+            <w:pPr>
+              <w:spacing w:after="40" w:line="264" w:lineRule="auto"/>
+            </w:pPr>
+          </w:p>
+          <w:p>
+            <w:pPr>
+              <w:spacing w:after="40" w:line="264" w:lineRule="auto"/>
+            </w:pPr>
+            <w:r>
+              <w:rPr>
+                <w:rFonts w:ascii="Arial" w:hAnsi="Arial"/>
+                <w:sz w:val="20"/>
+              </w:rPr>
+              <w:t xml:space="preserve">The </w:t>
+            </w:r>
+            <w:proofErr w:type="spellStart"/>
+            <w:r>
+              <w:rPr>
+                <w:rFonts w:ascii="Arial" w:hAnsi="Arial"/>
+                <w:sz w:val="20"/>
+              </w:rPr>
+              <w:t>Center</w:t>
+            </w:r>
+            <w:proofErr w:type="spellEnd"/>
+            <w:r>
+              <w:rPr>
+                <w:rFonts w:ascii="Arial" w:hAnsi="Arial"/>
+                <w:sz w:val="20"/>
+              </w:rPr>
+              <w:t xml:space="preserve"> Director interacts with CLS at a strategic oversight level. This actor does not perform routine data entry but relies on the system for visibility into critical business metrics:</w:t>
+            </w:r>
+          </w:p>
+          <w:p>
+            <w:pPr>
+              <w:spacing w:after="40" w:line="264" w:lineRule="auto"/>
+            </w:pPr>
+            <w:r>
+              <w:rPr>
+                <w:rFonts w:ascii="Arial" w:hAnsi="Arial"/>
+                <w:sz w:val="20"/>
+              </w:rPr>
+              <w:lastRenderedPageBreak/>
+              <w:t xml:space="preserve">• </w:t>
+            </w:r>
+            <w:r>
+              <w:rPr>
+                <w:rFonts w:ascii="Arial" w:hAnsi="Arial"/>
+                <w:b/>
+                <w:sz w:val="20"/>
+              </w:rPr>
+              <w:t>Operational Dashboard:</w:t>
+            </w:r>
+            <w:r>
+              <w:rPr>
+                <w:rFonts w:ascii="Arial" w:hAnsi="Arial"/>
+                <w:sz w:val="20"/>
+              </w:rPr>
+              <w:t xml:space="preserve"> Accesses a summary dashboard displaying key operational indicators — total active learners, session utilization rates, and Teacher workload distribution.</w:t>
+            </w:r>
+          </w:p>
+          <w:p>
+            <w:pPr>
+              <w:spacing w:after="40" w:line="264" w:lineRule="auto"/>
+            </w:pPr>
+            <w:r>
+              <w:rPr>
+                <w:rFonts w:ascii="Arial" w:hAnsi="Arial"/>
+                <w:sz w:val="20"/>
+              </w:rPr>
+              <w:t xml:space="preserve">• </w:t>
+            </w:r>
+            <w:r>
+              <w:rPr>
+                <w:rFonts w:ascii="Arial" w:hAnsi="Arial"/>
+                <w:b/>
+                <w:sz w:val="20"/>
+              </w:rPr>
+              <w:t>Churn Rate Monitoring:</w:t>
+            </w:r>
+            <w:r>
+              <w:rPr>
+                <w:rFonts w:ascii="Arial" w:hAnsi="Arial"/>
+                <w:sz w:val="20"/>
+              </w:rPr>
+              <w:t xml:space="preserve"> Reviews learner retention and dropout trends to evaluate the effectiveness of proactive renewal alerts (target: reduce churn by 20%).</w:t>
+            </w:r>
+          </w:p>
+          <w:p>
+            <w:pPr>
+              <w:spacing w:after="40" w:line="264" w:lineRule="auto"/>
+            </w:pPr>
+            <w:r>
+              <w:rPr>
+                <w:rFonts w:ascii="Arial" w:hAnsi="Arial"/>
+                <w:sz w:val="20"/>
+              </w:rPr>
+              <w:t xml:space="preserve">• </w:t>
+            </w:r>
+            <w:r>
+              <w:rPr>
+                <w:rFonts w:ascii="Arial" w:hAnsi="Arial"/>
+                <w:b/>
+                <w:sz w:val="20"/>
+              </w:rPr>
+              <w:t>Revenue &amp; Package Reports:</w:t>
+            </w:r>
+            <w:r>
+              <w:rPr>
+                <w:rFonts w:ascii="Arial" w:hAnsi="Arial"/>
+                <w:sz w:val="20"/>
+              </w:rPr>
+              <w:t xml:space="preserve"> Views aggregated data on Learning Package sales, remaining sessions across learners, and upcoming expirations for cash flow forecasting.</w:t>
+            </w:r>
+          </w:p>
+          <w:p>
+            <w:pPr>
+              <w:spacing w:line="264" w:lineRule="auto"/>
+            </w:pPr>
+            <w:r>
+              <w:rPr>
+                <w:rFonts w:ascii="Arial" w:hAnsi="Arial"/>
+                <w:sz w:val="20"/>
+              </w:rPr>
+              <w:t xml:space="preserve">• </w:t>
+            </w:r>
+            <w:r>
+              <w:rPr>
+                <w:rFonts w:ascii="Arial" w:hAnsi="Arial"/>
+                <w:b/>
+                <w:sz w:val="20"/>
+              </w:rPr>
+              <w:t>Scheduling Conflict Reports:</w:t>
+            </w:r>
+            <w:r>
+              <w:rPr>
+                <w:rFonts w:ascii="Arial" w:hAnsi="Arial"/>
+                <w:sz w:val="20"/>
+              </w:rPr>
+              <w:t xml:space="preserve"> Reviews audit logs confirming zero Scheduling Conflicts, validating system integrity.</w:t>
+            </w:r>
+          </w:p>
+        </w:tc>
+      </w:tr>
+      <w:tr>
+        <w:trPr>
+          <w:jc w:val="center"/>
+        </w:trPr>
+        <w:tc>
+          <w:tcPr>
+            <w:tcW w:w="800" w:type="dxa"/>
+            <w:tcBorders>
+              <w:top w:val="single" w:sz="4" w:space="0" w:color="CBD5E1"/>
+              <w:left w:val="single" w:sz="4" w:space="0" w:color="CBD5E1"/>
+              <w:bottom w:val="single" w:sz="4" w:space="0" w:color="CBD5E1"/>
+              <w:right w:val="single" w:sz="4" w:space="0" w:color="CBD5E1"/>
+            </w:tcBorders>
+            <w:tcMar>
+              <w:top w:w="80" w:type="dxa"/>
+              <w:left w:w="80" w:type="dxa"/>
+              <w:bottom w:w="80" w:type="dxa"/>
+              <w:right w:w="80" w:type="dxa"/>
+            </w:tcMar>
+          </w:tcPr>
+          <w:p>
+            <w:pPr>
+              <w:spacing w:line="264" w:lineRule="auto"/>
+              <w:jc w:val="center"/>
+            </w:pPr>
+            <w:r>
+              <w:rPr>
+                <w:rFonts w:ascii="Arial" w:hAnsi="Arial"/>
+                <w:b/>
+                <w:color w:val="0F172A"/>
+                <w:sz w:val="20"/>
+              </w:rPr>
+              <w:lastRenderedPageBreak/>
+              <w:t>5</w:t>
+            </w:r>
+          </w:p>
+        </w:tc>
+        <w:tc>
+          <w:tcPr>
+            <w:tcW w:w="2200" w:type="dxa"/>
+            <w:tcBorders>
+              <w:top w:val="single" w:sz="4" w:space="0" w:color="CBD5E1"/>
+              <w:left w:val="single" w:sz="4" w:space="0" w:color="CBD5E1"/>
+              <w:bottom w:val="single" w:sz="4" w:space="0" w:color="CBD5E1"/>
+              <w:right w:val="single" w:sz="4" w:space="0" w:color="CBD5E1"/>
+            </w:tcBorders>
+            <w:tcMar>
+              <w:top w:w="80" w:type="dxa"/>
+              <w:left w:w="80" w:type="dxa"/>
+              <w:bottom w:w="80" w:type="dxa"/>
+              <w:right w:w="80" w:type="dxa"/>
+            </w:tcMar>
+          </w:tcPr>
+          <w:p>
+            <w:pPr>
+              <w:spacing w:line="264" w:lineRule="auto"/>
+            </w:pPr>
+            <w:r>
+              <w:rPr>
+                <w:rFonts w:ascii="Arial" w:hAnsi="Arial"/>
+                <w:b/>
+                <w:color w:val="1D4ED8"/>
+                <w:sz w:val="20"/>
+              </w:rPr>
+              <w:t>Email Service</w:t>
+            </w:r>
+          </w:p>
+        </w:tc>
+        <w:tc>
+          <w:tcPr>
+            <w:tcW w:w="6600" w:type="dxa"/>
+            <w:tcBorders>
+              <w:top w:val="single" w:sz="4" w:space="0" w:color="CBD5E1"/>
+              <w:left w:val="single" w:sz="4" w:space="0" w:color="CBD5E1"/>
+              <w:bottom w:val="single" w:sz="4" w:space="0" w:color="CBD5E1"/>
+              <w:right w:val="single" w:sz="4" w:space="0" w:color="CBD5E1"/>
+            </w:tcBorders>
+            <w:tcMar>
+              <w:top w:w="80" w:type="dxa"/>
+              <w:left w:w="80" w:type="dxa"/>
+              <w:bottom w:w="80" w:type="dxa"/>
+              <w:right w:w="80" w:type="dxa"/>
+            </w:tcMar>
+          </w:tcPr>
+          <w:p>
+            <w:pPr>
+              <w:spacing w:after="40" w:line="264" w:lineRule="auto"/>
+            </w:pPr>
+            <w:r>
+              <w:rPr>
+                <w:rFonts w:ascii="Arial" w:hAnsi="Arial"/>
+                <w:sz w:val="20"/>
+              </w:rPr>
+              <w:t>A third-party email delivery platform (e.g., SendGrid, Amazon SES) integrated via REST API to handle all automated outbound Notifications.</w:t>
+            </w:r>
+          </w:p>
+          <w:p>
+            <w:pPr>
+              <w:spacing w:after="40" w:line="264" w:lineRule="auto"/>
+            </w:pPr>
+          </w:p>
+          <w:p>
+            <w:pPr>
+              <w:spacing w:after="40" w:line="264" w:lineRule="auto"/>
+            </w:pPr>
+            <w:r>
+              <w:rPr>
+                <w:rFonts w:ascii="Arial" w:hAnsi="Arial"/>
+                <w:sz w:val="20"/>
+              </w:rPr>
+              <w:t>The Email Service is a non-human, external system actor. CLS delegates all email dispatch operations to this service. Key interactions include:</w:t>
+            </w:r>
+          </w:p>
+          <w:p>
+            <w:pPr>
+              <w:spacing w:after="40" w:line="264" w:lineRule="auto"/>
+            </w:pPr>
+            <w:r>
+              <w:rPr>
+                <w:rFonts w:ascii="Arial" w:hAnsi="Arial"/>
+                <w:sz w:val="20"/>
+              </w:rPr>
+              <w:t xml:space="preserve">• </w:t>
+            </w:r>
+            <w:r>
+              <w:rPr>
+                <w:rFonts w:ascii="Arial" w:hAnsi="Arial"/>
+                <w:b/>
+                <w:sz w:val="20"/>
+              </w:rPr>
+              <w:t>Email Dispatch Request:</w:t>
+            </w:r>
+            <w:r>
+              <w:rPr>
+                <w:rFonts w:ascii="Arial" w:hAnsi="Arial"/>
+                <w:sz w:val="20"/>
+              </w:rPr>
+              <w:t xml:space="preserve"> CLS sends structured API requests containing recipient address (Parent email), subject line, and HTML email body for each Notification event (attendance, schedule change, Feedback, Learning Package expiry).</w:t>
+            </w:r>
+          </w:p>
+          <w:p>
+            <w:pPr>
+              <w:spacing w:line="264" w:lineRule="auto"/>
+            </w:pPr>
+            <w:r>
+              <w:rPr>
+                <w:rFonts w:ascii="Arial" w:hAnsi="Arial"/>
+                <w:sz w:val="20"/>
+              </w:rPr>
+              <w:t xml:space="preserve">• </w:t>
+            </w:r>
+            <w:r>
+              <w:rPr>
+                <w:rFonts w:ascii="Arial" w:hAnsi="Arial"/>
+                <w:b/>
+                <w:sz w:val="20"/>
+              </w:rPr>
+              <w:t>Delivery Status Response:</w:t>
+            </w:r>
+            <w:r>
+              <w:rPr>
+                <w:rFonts w:ascii="Arial" w:hAnsi="Arial"/>
+                <w:sz w:val="20"/>
+              </w:rPr>
+              <w:t xml:space="preserve"> The Email Service returns delivery status callbacks (delivered, bounced, failed) to CLS, enabling the system to log Notification outcomes and flag delivery failures for Academic Admin review.</w:t>
+            </w:r>
+          </w:p>
         </w:tc>
       </w:tr>
     </w:tbl>
-    <w:p/>
     <w:p>
       <w:pPr>
         <w:pStyle w:val="Heading4"/>
@@ -4007,15 +4817,7 @@
           <w:i/>
           <w:color w:val="0000FF"/>
         </w:rPr>
-        <w:t xml:space="preserve">[A use case (UC) describes a sequence of interactions between a system and an external actor that results in the actor being able to achieve some outcome of value. The names of use cases are always </w:t>
-      </w:r>
-      <w:r>
-        <w:rPr>
-          <w:i/>
-          <w:color w:val="0000FF"/>
-        </w:rPr>
-        <w:lastRenderedPageBreak/>
-        <w:t>written in the form of a verb followed by an object. Select strong, descriptive names to make it evident from the name that the use case will deliver something valuable for some user.</w:t>
+        <w:t>[A use case (UC) describes a sequence of interactions between a system and an external actor that results in the actor being able to achieve some outcome of value. The names of use cases are always written in the form of a verb followed by an object. Select strong, descriptive names to make it evident from the name that the use case will deliver something valuable for some user.</w:t>
       </w:r>
     </w:p>
     <w:p>
@@ -4677,6 +5479,7 @@
         <w:pStyle w:val="Heading4"/>
       </w:pPr>
       <w:r>
+        <w:lastRenderedPageBreak/>
         <w:t>1.</w:t>
       </w:r>
       <w:r>
@@ -4735,7 +5538,7 @@
           <w:noProof/>
         </w:rPr>
         <w:drawing>
-          <wp:inline distT="0" distB="0" distL="0" distR="0" wp14:anchorId="4EFE15D5" wp14:editId="04985DD4">
+          <wp:inline distT="0" distB="0" distL="0" distR="0" wp14:anchorId="371C4BCF" wp14:editId="539514D2">
             <wp:extent cx="3384468" cy="1597231"/>
             <wp:effectExtent l="0" t="0" r="6985" b="3175"/>
             <wp:docPr id="27" name="image7.png"/>
@@ -4799,7 +5602,7 @@
           <w:noProof/>
         </w:rPr>
         <w:drawing>
-          <wp:inline distT="0" distB="0" distL="0" distR="0" wp14:anchorId="64545280" wp14:editId="11EDD317">
+          <wp:inline distT="0" distB="0" distL="0" distR="0" wp14:anchorId="194CA737" wp14:editId="2CB7A42D">
             <wp:extent cx="3253839" cy="1692233"/>
             <wp:effectExtent l="0" t="0" r="3810" b="3810"/>
             <wp:docPr id="30" name="image9.png"/>
@@ -4856,7 +5659,6 @@
       </w:pPr>
       <w:bookmarkStart w:id="6" w:name="_Toc187341936"/>
       <w:r>
-        <w:lastRenderedPageBreak/>
         <w:t>1.4 System Functionalities</w:t>
       </w:r>
       <w:bookmarkEnd w:id="6"/>
@@ -4909,8 +5711,9 @@
         <w:rPr>
           <w:noProof/>
         </w:rPr>
+        <w:lastRenderedPageBreak/>
         <w:drawing>
-          <wp:inline distT="0" distB="0" distL="0" distR="0" wp14:anchorId="6BC7E3FB" wp14:editId="6E821116">
+          <wp:inline distT="0" distB="0" distL="0" distR="0" wp14:anchorId="1C2218DC" wp14:editId="63206079">
             <wp:extent cx="5763629" cy="2462474"/>
             <wp:effectExtent l="0" t="0" r="0" b="0"/>
             <wp:docPr id="29" name="image10.png"/>
@@ -4967,7 +5770,23 @@
           <w:i/>
           <w:color w:val="0000FF"/>
         </w:rPr>
-        <w:t>[Provide the system roles authorization to the system features (down to screens, and event to the screen activities if applicable) in the table form as below – replace Role-Name1, Role-Name2,… with your specific system user role names]</w:t>
+        <w:t>[Provide the system roles authorization to the system features (down to screens, and event to the screen activities if applicable) in the table form as below – replace Role-Name1, Role-Name</w:t>
+      </w:r>
+      <w:proofErr w:type="gramStart"/>
+      <w:r>
+        <w:rPr>
+          <w:i/>
+          <w:color w:val="0000FF"/>
+        </w:rPr>
+        <w:t>2,…</w:t>
+      </w:r>
+      <w:proofErr w:type="gramEnd"/>
+      <w:r>
+        <w:rPr>
+          <w:i/>
+          <w:color w:val="0000FF"/>
+        </w:rPr>
+        <w:t xml:space="preserve"> with your specific system user role names]</w:t>
       </w:r>
     </w:p>
     <w:tbl>
@@ -5410,7 +6229,39 @@
           <w:i/>
           <w:color w:val="0000FF"/>
         </w:rPr>
-        <w:t>[Provide the descriptions for the non-screen system functions, i.e batch/cron job, service, API, etc.]</w:t>
+        <w:t xml:space="preserve">[Provide the descriptions for the non-screen system functions, </w:t>
+      </w:r>
+      <w:proofErr w:type="spellStart"/>
+      <w:r>
+        <w:rPr>
+          <w:i/>
+          <w:color w:val="0000FF"/>
+        </w:rPr>
+        <w:t>i.e</w:t>
+      </w:r>
+      <w:proofErr w:type="spellEnd"/>
+      <w:r>
+        <w:rPr>
+          <w:i/>
+          <w:color w:val="0000FF"/>
+        </w:rPr>
+        <w:t xml:space="preserve"> batch/</w:t>
+      </w:r>
+      <w:proofErr w:type="spellStart"/>
+      <w:r>
+        <w:rPr>
+          <w:i/>
+          <w:color w:val="0000FF"/>
+        </w:rPr>
+        <w:t>cron</w:t>
+      </w:r>
+      <w:proofErr w:type="spellEnd"/>
+      <w:r>
+        <w:rPr>
+          <w:i/>
+          <w:color w:val="0000FF"/>
+        </w:rPr>
+        <w:t xml:space="preserve"> job, service, API, etc.]</w:t>
       </w:r>
     </w:p>
     <w:tbl>
@@ -5697,7 +6548,7 @@
         </w:rPr>
         <w:lastRenderedPageBreak/>
         <w:drawing>
-          <wp:inline distT="0" distB="0" distL="0" distR="0" wp14:anchorId="0ED67168" wp14:editId="53C9525C">
+          <wp:inline distT="0" distB="0" distL="0" distR="0" wp14:anchorId="6C21F6C5" wp14:editId="6E04C439">
             <wp:extent cx="5343525" cy="2371725"/>
             <wp:effectExtent l="0" t="0" r="9525" b="9525"/>
             <wp:docPr id="32" name="image12.png"/>
@@ -6077,7 +6928,23 @@
           <w:i/>
           <w:color w:val="0000FF"/>
         </w:rPr>
-        <w:t>. Other UCs (i.e CRUD or data-viewing UCs) are simple, and you just need to refer the descriptions in the Functional Requirement (part 3) below)]</w:t>
+        <w:t>. Other UCs (</w:t>
+      </w:r>
+      <w:proofErr w:type="spellStart"/>
+      <w:r>
+        <w:rPr>
+          <w:i/>
+          <w:color w:val="0000FF"/>
+        </w:rPr>
+        <w:t>i.e</w:t>
+      </w:r>
+      <w:proofErr w:type="spellEnd"/>
+      <w:r>
+        <w:rPr>
+          <w:i/>
+          <w:color w:val="0000FF"/>
+        </w:rPr>
+        <w:t xml:space="preserve"> CRUD or data-viewing UCs) are simple, and you just need to refer the descriptions in the Functional Requirement (part 3) below)]</w:t>
       </w:r>
     </w:p>
     <w:p>
@@ -6868,7 +7735,21 @@
               <w:rPr>
                 <w:color w:val="000000"/>
               </w:rPr>
-              <w:t>System show the User Login screen</w:t>
+              <w:t xml:space="preserve">System </w:t>
+            </w:r>
+            <w:proofErr w:type="gramStart"/>
+            <w:r>
+              <w:rPr>
+                <w:color w:val="000000"/>
+              </w:rPr>
+              <w:t>show</w:t>
+            </w:r>
+            <w:proofErr w:type="gramEnd"/>
+            <w:r>
+              <w:rPr>
+                <w:color w:val="000000"/>
+              </w:rPr>
+              <w:t xml:space="preserve"> the User Login screen</w:t>
             </w:r>
           </w:p>
           <w:p>
@@ -7397,7 +8278,15 @@
         <w:t>2</w:t>
       </w:r>
       <w:r>
-        <w:t xml:space="preserve"> Xyz Feature</w:t>
+        <w:t xml:space="preserve"> </w:t>
+      </w:r>
+      <w:proofErr w:type="spellStart"/>
+      <w:r>
+        <w:t>Xyz</w:t>
+      </w:r>
+      <w:proofErr w:type="spellEnd"/>
+      <w:r>
+        <w:t xml:space="preserve"> Feature</w:t>
       </w:r>
       <w:bookmarkEnd w:id="10"/>
     </w:p>
@@ -7461,12 +8350,28 @@
       <w:r>
         <w:t xml:space="preserve">3.1 </w:t>
       </w:r>
+      <w:proofErr w:type="spellStart"/>
       <w:r>
         <w:rPr>
           <w:lang w:val="vi-VN"/>
         </w:rPr>
-        <w:t>Feature Name</w:t>
-      </w:r>
+        <w:t>Feature</w:t>
+      </w:r>
+      <w:proofErr w:type="spellEnd"/>
+      <w:r>
+        <w:rPr>
+          <w:lang w:val="vi-VN"/>
+        </w:rPr>
+        <w:t xml:space="preserve"> </w:t>
+      </w:r>
+      <w:proofErr w:type="spellStart"/>
+      <w:r>
+        <w:rPr>
+          <w:lang w:val="vi-VN"/>
+        </w:rPr>
+        <w:t>Name</w:t>
+      </w:r>
+      <w:proofErr w:type="spellEnd"/>
       <w:r>
         <w:t>1</w:t>
       </w:r>
@@ -7488,9 +8393,31 @@
         <w:rPr>
           <w:lang w:val="vi-VN"/>
         </w:rPr>
-        <w:t>.1 SubFeature Name</w:t>
+        <w:t xml:space="preserve">.1 </w:t>
+      </w:r>
+      <w:proofErr w:type="spellStart"/>
+      <w:r>
+        <w:rPr>
+          <w:lang w:val="vi-VN"/>
+        </w:rPr>
+        <w:t>SubFeature</w:t>
+      </w:r>
+      <w:proofErr w:type="spellEnd"/>
+      <w:r>
+        <w:rPr>
+          <w:lang w:val="vi-VN"/>
+        </w:rPr>
+        <w:t xml:space="preserve"> </w:t>
+      </w:r>
+      <w:proofErr w:type="spellStart"/>
+      <w:r>
+        <w:rPr>
+          <w:lang w:val="vi-VN"/>
+        </w:rPr>
+        <w:t>Name</w:t>
       </w:r>
       <w:bookmarkEnd w:id="18"/>
+      <w:proofErr w:type="spellEnd"/>
       <w:r>
         <w:t>1.1</w:t>
       </w:r>
@@ -7504,12 +8431,14 @@
       <w:r>
         <w:t xml:space="preserve">3.1.1.1 </w:t>
       </w:r>
+      <w:proofErr w:type="spellStart"/>
       <w:r>
         <w:rPr>
           <w:lang w:val="vi-VN"/>
         </w:rPr>
         <w:t>Screen</w:t>
       </w:r>
+      <w:proofErr w:type="spellEnd"/>
       <w:r>
         <w:t>/Function</w:t>
       </w:r>
@@ -7517,8 +8446,16 @@
         <w:rPr>
           <w:lang w:val="vi-VN"/>
         </w:rPr>
-        <w:t xml:space="preserve"> Name</w:t>
-      </w:r>
+        <w:t xml:space="preserve"> </w:t>
+      </w:r>
+      <w:proofErr w:type="spellStart"/>
+      <w:r>
+        <w:rPr>
+          <w:lang w:val="vi-VN"/>
+        </w:rPr>
+        <w:t>Name</w:t>
+      </w:r>
+      <w:proofErr w:type="spellEnd"/>
       <w:r>
         <w:t>1</w:t>
       </w:r>
@@ -7551,7 +8488,23 @@
           <w:i/>
           <w:color w:val="0000FF"/>
         </w:rPr>
-        <w:t xml:space="preserve">UI layout (Mockup </w:t>
+        <w:t>UI layout (</w:t>
+      </w:r>
+      <w:proofErr w:type="spellStart"/>
+      <w:r>
+        <w:rPr>
+          <w:i/>
+          <w:color w:val="0000FF"/>
+        </w:rPr>
+        <w:t>Mockup</w:t>
+      </w:r>
+      <w:proofErr w:type="spellEnd"/>
+      <w:r>
+        <w:rPr>
+          <w:i/>
+          <w:color w:val="0000FF"/>
+        </w:rPr>
+        <w:t xml:space="preserve"> </w:t>
       </w:r>
       <w:r>
         <w:rPr>
@@ -7923,8 +8876,30 @@
         <w:rPr>
           <w:lang w:val="vi-VN"/>
         </w:rPr>
-        <w:t xml:space="preserve"> SubFeature Name</w:t>
-      </w:r>
+        <w:t xml:space="preserve"> </w:t>
+      </w:r>
+      <w:proofErr w:type="spellStart"/>
+      <w:r>
+        <w:rPr>
+          <w:lang w:val="vi-VN"/>
+        </w:rPr>
+        <w:t>SubFeature</w:t>
+      </w:r>
+      <w:proofErr w:type="spellEnd"/>
+      <w:r>
+        <w:rPr>
+          <w:lang w:val="vi-VN"/>
+        </w:rPr>
+        <w:t xml:space="preserve"> </w:t>
+      </w:r>
+      <w:proofErr w:type="spellStart"/>
+      <w:r>
+        <w:rPr>
+          <w:lang w:val="vi-VN"/>
+        </w:rPr>
+        <w:t>Name</w:t>
+      </w:r>
+      <w:proofErr w:type="spellEnd"/>
       <w:r>
         <w:t>1.2</w:t>
       </w:r>
@@ -7986,10 +8961,32 @@
         <w:rPr>
           <w:lang w:val="vi-VN"/>
         </w:rPr>
-        <w:t xml:space="preserve"> User Login</w:t>
+        <w:t xml:space="preserve"> </w:t>
+      </w:r>
+      <w:proofErr w:type="spellStart"/>
+      <w:r>
+        <w:rPr>
+          <w:lang w:val="vi-VN"/>
+        </w:rPr>
+        <w:t>User</w:t>
+      </w:r>
+      <w:proofErr w:type="spellEnd"/>
+      <w:r>
+        <w:rPr>
+          <w:lang w:val="vi-VN"/>
+        </w:rPr>
+        <w:t xml:space="preserve"> </w:t>
+      </w:r>
+      <w:proofErr w:type="spellStart"/>
+      <w:r>
+        <w:rPr>
+          <w:lang w:val="vi-VN"/>
+        </w:rPr>
+        <w:t>Login</w:t>
       </w:r>
       <w:bookmarkEnd w:id="29"/>
       <w:bookmarkEnd w:id="30"/>
+      <w:proofErr w:type="spellEnd"/>
     </w:p>
     <w:p>
       <w:r>
@@ -8066,7 +9063,7 @@
         <mc:AlternateContent>
           <mc:Choice Requires="wps">
             <w:drawing>
-              <wp:anchor distT="0" distB="0" distL="114300" distR="114300" simplePos="0" relativeHeight="251661312" behindDoc="0" locked="0" layoutInCell="1" hidden="0" allowOverlap="1" wp14:anchorId="6D697A5F" wp14:editId="02887E62">
+              <wp:anchor distT="0" distB="0" distL="114300" distR="114300" simplePos="0" relativeHeight="251661312" behindDoc="0" locked="0" layoutInCell="1" hidden="0" allowOverlap="1" wp14:anchorId="47E8A4D6" wp14:editId="43086F66">
                 <wp:simplePos x="0" y="0"/>
                 <wp:positionH relativeFrom="column">
                   <wp:posOffset>5141595</wp:posOffset>
@@ -8124,7 +9121,7 @@
           </mc:Choice>
           <mc:Fallback>
             <w:pict>
-              <v:rect w14:anchorId="55AF27F5" id="Rectangle 22" o:spid="_x0000_s1026" style="position:absolute;margin-left:404.85pt;margin-top:101pt;width:26.6pt;height:17.25pt;z-index:251661312;visibility:visible;mso-wrap-style:square;mso-wrap-distance-left:9pt;mso-wrap-distance-top:0;mso-wrap-distance-right:9pt;mso-wrap-distance-bottom:0;mso-position-horizontal:absolute;mso-position-horizontal-relative:text;mso-position-vertical:absolute;mso-position-vertical-relative:text;v-text-anchor:top" o:gfxdata="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" filled="f" stroked="f">
+              <v:rect w14:anchorId="47E8A4D6" id="Rectangle 22" o:spid="_x0000_s1026" style="position:absolute;margin-left:404.85pt;margin-top:101pt;width:26.6pt;height:17.25pt;z-index:251661312;visibility:visible;mso-wrap-style:square;mso-wrap-distance-left:9pt;mso-wrap-distance-top:0;mso-wrap-distance-right:9pt;mso-wrap-distance-bottom:0;mso-position-horizontal:absolute;mso-position-horizontal-relative:text;mso-position-vertical:absolute;mso-position-vertical-relative:text;v-text-anchor:top" o:gfxdata="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" filled="f" stroked="f">
                 <v:textbox inset="2.53958mm,1.2694mm,2.53958mm,1.2694mm">
                   <w:txbxContent>
                     <w:p>
@@ -8154,7 +9151,7 @@
         <mc:AlternateContent>
           <mc:Choice Requires="wps">
             <w:drawing>
-              <wp:anchor distT="0" distB="0" distL="114300" distR="114300" simplePos="0" relativeHeight="251660288" behindDoc="0" locked="0" layoutInCell="1" hidden="0" allowOverlap="1" wp14:anchorId="4965306C" wp14:editId="49FF6944">
+              <wp:anchor distT="0" distB="0" distL="114300" distR="114300" simplePos="0" relativeHeight="251660288" behindDoc="0" locked="0" layoutInCell="1" hidden="0" allowOverlap="1" wp14:anchorId="35A664BC" wp14:editId="4B73617A">
                 <wp:simplePos x="0" y="0"/>
                 <wp:positionH relativeFrom="column">
                   <wp:posOffset>734695</wp:posOffset>
@@ -8212,7 +9209,7 @@
           </mc:Choice>
           <mc:Fallback>
             <w:pict>
-              <v:rect w14:anchorId="09F2BBB5" id="Rectangle 23" o:spid="_x0000_s1027" style="position:absolute;margin-left:57.85pt;margin-top:14pt;width:26.6pt;height:17.25pt;z-index:251660288;visibility:visible;mso-wrap-style:square;mso-wrap-distance-left:9pt;mso-wrap-distance-top:0;mso-wrap-distance-right:9pt;mso-wrap-distance-bottom:0;mso-position-horizontal:absolute;mso-position-horizontal-relative:text;mso-position-vertical:absolute;mso-position-vertical-relative:text;v-text-anchor:top" o:gfxdata="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" filled="f" stroked="f">
+              <v:rect w14:anchorId="35A664BC" id="Rectangle 23" o:spid="_x0000_s1027" style="position:absolute;margin-left:57.85pt;margin-top:14pt;width:26.6pt;height:17.25pt;z-index:251660288;visibility:visible;mso-wrap-style:square;mso-wrap-distance-left:9pt;mso-wrap-distance-top:0;mso-wrap-distance-right:9pt;mso-wrap-distance-bottom:0;mso-position-horizontal:absolute;mso-position-horizontal-relative:text;mso-position-vertical:absolute;mso-position-vertical-relative:text;v-text-anchor:top" o:gfxdata="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" filled="f" stroked="f">
                 <v:textbox inset="2.53958mm,1.2694mm,2.53958mm,1.2694mm">
                   <w:txbxContent>
                     <w:p>
@@ -8242,7 +9239,7 @@
         <mc:AlternateContent>
           <mc:Choice Requires="wps">
             <w:drawing>
-              <wp:anchor distT="0" distB="0" distL="114300" distR="114300" simplePos="0" relativeHeight="251659264" behindDoc="0" locked="0" layoutInCell="1" hidden="0" allowOverlap="1" wp14:anchorId="667631DD" wp14:editId="5F63D528">
+              <wp:anchor distT="0" distB="0" distL="114300" distR="114300" simplePos="0" relativeHeight="251659264" behindDoc="0" locked="0" layoutInCell="1" hidden="0" allowOverlap="1" wp14:anchorId="246F75B7" wp14:editId="6303B2A3">
                 <wp:simplePos x="0" y="0"/>
                 <wp:positionH relativeFrom="column">
                   <wp:posOffset>48895</wp:posOffset>
@@ -8300,7 +9297,7 @@
           </mc:Choice>
           <mc:Fallback>
             <w:pict>
-              <v:rect w14:anchorId="6DB37E60" id="Rectangle 21" o:spid="_x0000_s1028" style="position:absolute;margin-left:3.85pt;margin-top:15pt;width:26.6pt;height:17.25pt;z-index:251659264;visibility:visible;mso-wrap-style:square;mso-wrap-distance-left:9pt;mso-wrap-distance-top:0;mso-wrap-distance-right:9pt;mso-wrap-distance-bottom:0;mso-position-horizontal:absolute;mso-position-horizontal-relative:text;mso-position-vertical:absolute;mso-position-vertical-relative:text;v-text-anchor:top" o:gfxdata="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" filled="f" stroked="f">
+              <v:rect w14:anchorId="246F75B7" id="Rectangle 21" o:spid="_x0000_s1028" style="position:absolute;margin-left:3.85pt;margin-top:15pt;width:26.6pt;height:17.25pt;z-index:251659264;visibility:visible;mso-wrap-style:square;mso-wrap-distance-left:9pt;mso-wrap-distance-top:0;mso-wrap-distance-right:9pt;mso-wrap-distance-bottom:0;mso-position-horizontal:absolute;mso-position-horizontal-relative:text;mso-position-vertical:absolute;mso-position-vertical-relative:text;v-text-anchor:top" o:gfxdata="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" filled="f" stroked="f">
                 <v:textbox inset="2.53958mm,1.2694mm,2.53958mm,1.2694mm">
                   <w:txbxContent>
                     <w:p>
@@ -8328,7 +9325,7 @@
           <w:noProof/>
         </w:rPr>
         <w:drawing>
-          <wp:inline distT="0" distB="0" distL="0" distR="0" wp14:anchorId="13F552A0" wp14:editId="456F779A">
+          <wp:inline distT="0" distB="0" distL="0" distR="0" wp14:anchorId="1FE90A28" wp14:editId="4A376C6F">
             <wp:extent cx="5746750" cy="1701165"/>
             <wp:effectExtent l="19050" t="19050" r="25400" b="13335"/>
             <wp:docPr id="33" name="image8.png"/>
@@ -8651,7 +9648,7 @@
           <w:noProof/>
         </w:rPr>
         <w:drawing>
-          <wp:inline distT="0" distB="0" distL="0" distR="0" wp14:anchorId="604C209E" wp14:editId="638C26C9">
+          <wp:inline distT="0" distB="0" distL="0" distR="0" wp14:anchorId="4B47B83D" wp14:editId="1973D4CE">
             <wp:extent cx="3297335" cy="2101186"/>
             <wp:effectExtent l="19050" t="19050" r="17780" b="13970"/>
             <wp:docPr id="34" name="image5.png"/>
@@ -10619,118 +11616,19 @@
                 <w:sz w:val="22"/>
                 <w:szCs w:val="22"/>
               </w:rPr>
-              <w:t xml:space="preserve">A confirmation email has been sent to {email_address}. </w:t>
-            </w:r>
-          </w:p>
-        </w:tc>
-      </w:tr>
-      <w:tr>
-        <w:tc>
-          <w:tcPr>
-            <w:tcW w:w="557" w:type="dxa"/>
-          </w:tcPr>
-          <w:p>
-            <w:pPr>
-              <w:spacing w:before="60" w:after="60"/>
-              <w:rPr>
-                <w:rFonts w:asciiTheme="minorHAnsi" w:hAnsiTheme="minorHAnsi" w:cstheme="minorHAnsi"/>
-                <w:sz w:val="22"/>
-                <w:szCs w:val="22"/>
-              </w:rPr>
-            </w:pPr>
-            <w:r>
-              <w:rPr>
-                <w:rFonts w:asciiTheme="minorHAnsi" w:hAnsiTheme="minorHAnsi" w:cstheme="minorHAnsi"/>
-                <w:sz w:val="22"/>
-                <w:szCs w:val="22"/>
-              </w:rPr>
-              <w:t>6</w:t>
-            </w:r>
-          </w:p>
-        </w:tc>
-        <w:tc>
-          <w:tcPr>
-            <w:tcW w:w="1122" w:type="dxa"/>
-          </w:tcPr>
-          <w:p>
-            <w:pPr>
-              <w:spacing w:before="60" w:after="60"/>
-              <w:rPr>
-                <w:rFonts w:asciiTheme="minorHAnsi" w:hAnsiTheme="minorHAnsi" w:cstheme="minorHAnsi"/>
-                <w:sz w:val="22"/>
-                <w:szCs w:val="22"/>
-              </w:rPr>
-            </w:pPr>
-            <w:r>
-              <w:rPr>
-                <w:rFonts w:asciiTheme="minorHAnsi" w:hAnsiTheme="minorHAnsi" w:cstheme="minorHAnsi"/>
-                <w:sz w:val="22"/>
-                <w:szCs w:val="22"/>
-              </w:rPr>
-              <w:t>MSG06</w:t>
-            </w:r>
-          </w:p>
-        </w:tc>
-        <w:tc>
-          <w:tcPr>
-            <w:tcW w:w="1466" w:type="dxa"/>
-          </w:tcPr>
-          <w:p>
-            <w:pPr>
-              <w:spacing w:before="60" w:after="60"/>
-              <w:rPr>
-                <w:rFonts w:asciiTheme="minorHAnsi" w:hAnsiTheme="minorHAnsi" w:cstheme="minorHAnsi"/>
-                <w:sz w:val="22"/>
-                <w:szCs w:val="22"/>
-              </w:rPr>
-            </w:pPr>
-            <w:r>
-              <w:rPr>
-                <w:rFonts w:asciiTheme="minorHAnsi" w:hAnsiTheme="minorHAnsi" w:cstheme="minorHAnsi"/>
-                <w:sz w:val="22"/>
-                <w:szCs w:val="22"/>
-              </w:rPr>
-              <w:t>Toast message</w:t>
-            </w:r>
-          </w:p>
-        </w:tc>
-        <w:tc>
-          <w:tcPr>
-            <w:tcW w:w="3038" w:type="dxa"/>
-          </w:tcPr>
-          <w:p>
-            <w:pPr>
-              <w:spacing w:before="60" w:after="60"/>
-              <w:rPr>
-                <w:rFonts w:asciiTheme="minorHAnsi" w:hAnsiTheme="minorHAnsi" w:cstheme="minorHAnsi"/>
-                <w:sz w:val="22"/>
-                <w:szCs w:val="22"/>
-              </w:rPr>
-            </w:pPr>
-            <w:r>
-              <w:rPr>
-                <w:rFonts w:asciiTheme="minorHAnsi" w:hAnsiTheme="minorHAnsi" w:cstheme="minorHAnsi"/>
-                <w:sz w:val="22"/>
-                <w:szCs w:val="22"/>
-              </w:rPr>
-              <w:t>Resetting asset information successfully</w:t>
-            </w:r>
-          </w:p>
-        </w:tc>
-        <w:tc>
-          <w:tcPr>
-            <w:tcW w:w="2964" w:type="dxa"/>
-          </w:tcPr>
-          <w:p>
-            <w:pPr>
-              <w:spacing w:before="60" w:after="60"/>
+              <w:t>A confirmation email has been sent to {</w:t>
+            </w:r>
+            <w:proofErr w:type="spellStart"/>
+            <w:r>
               <w:rPr>
                 <w:rFonts w:asciiTheme="minorHAnsi" w:hAnsiTheme="minorHAnsi" w:cstheme="minorHAnsi"/>
                 <w:i/>
                 <w:sz w:val="22"/>
                 <w:szCs w:val="22"/>
               </w:rPr>
-            </w:pPr>
+              <w:t>email_address</w:t>
+            </w:r>
+            <w:proofErr w:type="spellEnd"/>
             <w:r>
               <w:rPr>
                 <w:rFonts w:asciiTheme="minorHAnsi" w:hAnsiTheme="minorHAnsi" w:cstheme="minorHAnsi"/>
@@ -10738,7 +11636,7 @@
                 <w:sz w:val="22"/>
                 <w:szCs w:val="22"/>
               </w:rPr>
-              <w:t xml:space="preserve">Return asset(s) successfully. </w:t>
+              <w:t xml:space="preserve">}. </w:t>
             </w:r>
           </w:p>
         </w:tc>
@@ -10763,7 +11661,7 @@
                 <w:sz w:val="22"/>
                 <w:szCs w:val="22"/>
               </w:rPr>
-              <w:t>7</w:t>
+              <w:t>6</w:t>
             </w:r>
           </w:p>
         </w:tc>
@@ -10786,7 +11684,7 @@
                 <w:sz w:val="22"/>
                 <w:szCs w:val="22"/>
               </w:rPr>
-              <w:t>MSG07</w:t>
+              <w:t>MSG06</w:t>
             </w:r>
           </w:p>
         </w:tc>
@@ -10832,7 +11730,7 @@
                 <w:sz w:val="22"/>
                 <w:szCs w:val="22"/>
               </w:rPr>
-              <w:t>Deleting asset information successfully</w:t>
+              <w:t>Resetting asset information successfully</w:t>
             </w:r>
           </w:p>
         </w:tc>
@@ -10857,7 +11755,7 @@
                 <w:sz w:val="22"/>
                 <w:szCs w:val="22"/>
               </w:rPr>
-              <w:t xml:space="preserve">Delete asset(s) successfully. </w:t>
+              <w:t xml:space="preserve">Return asset(s) successfully. </w:t>
             </w:r>
           </w:p>
         </w:tc>
@@ -10882,8 +11780,7 @@
                 <w:sz w:val="22"/>
                 <w:szCs w:val="22"/>
               </w:rPr>
-              <w:lastRenderedPageBreak/>
-              <w:t>8</w:t>
+              <w:t>7</w:t>
             </w:r>
           </w:p>
         </w:tc>
@@ -10906,7 +11803,7 @@
                 <w:sz w:val="22"/>
                 <w:szCs w:val="22"/>
               </w:rPr>
-              <w:t>MSG08</w:t>
+              <w:t>MSG07</w:t>
             </w:r>
           </w:p>
         </w:tc>
@@ -10929,7 +11826,7 @@
                 <w:sz w:val="22"/>
                 <w:szCs w:val="22"/>
               </w:rPr>
-              <w:t>In red, under the text box</w:t>
+              <w:t>Toast message</w:t>
             </w:r>
           </w:p>
         </w:tc>
@@ -10952,7 +11849,7 @@
                 <w:sz w:val="22"/>
                 <w:szCs w:val="22"/>
               </w:rPr>
-              <w:t>Input value length &gt; max length</w:t>
+              <w:t>Deleting asset information successfully</w:t>
             </w:r>
           </w:p>
         </w:tc>
@@ -10977,7 +11874,7 @@
                 <w:sz w:val="22"/>
                 <w:szCs w:val="22"/>
               </w:rPr>
-              <w:t xml:space="preserve">Exceed max length of {max_length}. </w:t>
+              <w:t xml:space="preserve">Delete asset(s) successfully. </w:t>
             </w:r>
           </w:p>
         </w:tc>
@@ -11002,7 +11899,8 @@
                 <w:sz w:val="22"/>
                 <w:szCs w:val="22"/>
               </w:rPr>
-              <w:t>9</w:t>
+              <w:lastRenderedPageBreak/>
+              <w:t>8</w:t>
             </w:r>
           </w:p>
         </w:tc>
@@ -11025,7 +11923,7 @@
                 <w:sz w:val="22"/>
                 <w:szCs w:val="22"/>
               </w:rPr>
-              <w:t>MSG09</w:t>
+              <w:t>MSG08</w:t>
             </w:r>
           </w:p>
         </w:tc>
@@ -11048,7 +11946,7 @@
                 <w:sz w:val="22"/>
                 <w:szCs w:val="22"/>
               </w:rPr>
-              <w:t>In line</w:t>
+              <w:t>In red, under the text box</w:t>
             </w:r>
           </w:p>
         </w:tc>
@@ -11071,7 +11969,7 @@
                 <w:sz w:val="22"/>
                 <w:szCs w:val="22"/>
               </w:rPr>
-              <w:t>Username or password is not correct when clicking sign-in</w:t>
+              <w:t>Input value length &gt; max length</w:t>
             </w:r>
           </w:p>
         </w:tc>
@@ -11096,7 +11994,157 @@
                 <w:sz w:val="22"/>
                 <w:szCs w:val="22"/>
               </w:rPr>
-              <w:t>Incorrrect user name or password. Please check again.</w:t>
+              <w:t>Exceed max length of {</w:t>
+            </w:r>
+            <w:proofErr w:type="spellStart"/>
+            <w:r>
+              <w:rPr>
+                <w:rFonts w:asciiTheme="minorHAnsi" w:hAnsiTheme="minorHAnsi" w:cstheme="minorHAnsi"/>
+                <w:i/>
+                <w:sz w:val="22"/>
+                <w:szCs w:val="22"/>
+              </w:rPr>
+              <w:t>max_length</w:t>
+            </w:r>
+            <w:proofErr w:type="spellEnd"/>
+            <w:r>
+              <w:rPr>
+                <w:rFonts w:asciiTheme="minorHAnsi" w:hAnsiTheme="minorHAnsi" w:cstheme="minorHAnsi"/>
+                <w:i/>
+                <w:sz w:val="22"/>
+                <w:szCs w:val="22"/>
+              </w:rPr>
+              <w:t xml:space="preserve">}. </w:t>
+            </w:r>
+          </w:p>
+        </w:tc>
+      </w:tr>
+      <w:tr>
+        <w:tc>
+          <w:tcPr>
+            <w:tcW w:w="557" w:type="dxa"/>
+          </w:tcPr>
+          <w:p>
+            <w:pPr>
+              <w:spacing w:before="60" w:after="60"/>
+              <w:rPr>
+                <w:rFonts w:asciiTheme="minorHAnsi" w:hAnsiTheme="minorHAnsi" w:cstheme="minorHAnsi"/>
+                <w:sz w:val="22"/>
+                <w:szCs w:val="22"/>
+              </w:rPr>
+            </w:pPr>
+            <w:r>
+              <w:rPr>
+                <w:rFonts w:asciiTheme="minorHAnsi" w:hAnsiTheme="minorHAnsi" w:cstheme="minorHAnsi"/>
+                <w:sz w:val="22"/>
+                <w:szCs w:val="22"/>
+              </w:rPr>
+              <w:t>9</w:t>
+            </w:r>
+          </w:p>
+        </w:tc>
+        <w:tc>
+          <w:tcPr>
+            <w:tcW w:w="1122" w:type="dxa"/>
+          </w:tcPr>
+          <w:p>
+            <w:pPr>
+              <w:spacing w:before="60" w:after="60"/>
+              <w:rPr>
+                <w:rFonts w:asciiTheme="minorHAnsi" w:hAnsiTheme="minorHAnsi" w:cstheme="minorHAnsi"/>
+                <w:sz w:val="22"/>
+                <w:szCs w:val="22"/>
+              </w:rPr>
+            </w:pPr>
+            <w:r>
+              <w:rPr>
+                <w:rFonts w:asciiTheme="minorHAnsi" w:hAnsiTheme="minorHAnsi" w:cstheme="minorHAnsi"/>
+                <w:sz w:val="22"/>
+                <w:szCs w:val="22"/>
+              </w:rPr>
+              <w:t>MSG09</w:t>
+            </w:r>
+          </w:p>
+        </w:tc>
+        <w:tc>
+          <w:tcPr>
+            <w:tcW w:w="1466" w:type="dxa"/>
+          </w:tcPr>
+          <w:p>
+            <w:pPr>
+              <w:spacing w:before="60" w:after="60"/>
+              <w:rPr>
+                <w:rFonts w:asciiTheme="minorHAnsi" w:hAnsiTheme="minorHAnsi" w:cstheme="minorHAnsi"/>
+                <w:sz w:val="22"/>
+                <w:szCs w:val="22"/>
+              </w:rPr>
+            </w:pPr>
+            <w:r>
+              <w:rPr>
+                <w:rFonts w:asciiTheme="minorHAnsi" w:hAnsiTheme="minorHAnsi" w:cstheme="minorHAnsi"/>
+                <w:sz w:val="22"/>
+                <w:szCs w:val="22"/>
+              </w:rPr>
+              <w:t>In line</w:t>
+            </w:r>
+          </w:p>
+        </w:tc>
+        <w:tc>
+          <w:tcPr>
+            <w:tcW w:w="3038" w:type="dxa"/>
+          </w:tcPr>
+          <w:p>
+            <w:pPr>
+              <w:spacing w:before="60" w:after="60"/>
+              <w:rPr>
+                <w:rFonts w:asciiTheme="minorHAnsi" w:hAnsiTheme="minorHAnsi" w:cstheme="minorHAnsi"/>
+                <w:sz w:val="22"/>
+                <w:szCs w:val="22"/>
+              </w:rPr>
+            </w:pPr>
+            <w:r>
+              <w:rPr>
+                <w:rFonts w:asciiTheme="minorHAnsi" w:hAnsiTheme="minorHAnsi" w:cstheme="minorHAnsi"/>
+                <w:sz w:val="22"/>
+                <w:szCs w:val="22"/>
+              </w:rPr>
+              <w:t>Username or password is not correct when clicking sign-in</w:t>
+            </w:r>
+          </w:p>
+        </w:tc>
+        <w:tc>
+          <w:tcPr>
+            <w:tcW w:w="2964" w:type="dxa"/>
+          </w:tcPr>
+          <w:p>
+            <w:pPr>
+              <w:spacing w:before="60" w:after="60"/>
+              <w:rPr>
+                <w:rFonts w:asciiTheme="minorHAnsi" w:hAnsiTheme="minorHAnsi" w:cstheme="minorHAnsi"/>
+                <w:i/>
+                <w:sz w:val="22"/>
+                <w:szCs w:val="22"/>
+              </w:rPr>
+            </w:pPr>
+            <w:proofErr w:type="spellStart"/>
+            <w:r>
+              <w:rPr>
+                <w:rFonts w:asciiTheme="minorHAnsi" w:hAnsiTheme="minorHAnsi" w:cstheme="minorHAnsi"/>
+                <w:i/>
+                <w:sz w:val="22"/>
+                <w:szCs w:val="22"/>
+              </w:rPr>
+              <w:t>Incorrrect</w:t>
+            </w:r>
+            <w:proofErr w:type="spellEnd"/>
+            <w:r>
+              <w:rPr>
+                <w:rFonts w:asciiTheme="minorHAnsi" w:hAnsiTheme="minorHAnsi" w:cstheme="minorHAnsi"/>
+                <w:i/>
+                <w:sz w:val="22"/>
+                <w:szCs w:val="22"/>
+              </w:rPr>
+              <w:t xml:space="preserve"> user name or password. Please check again.</w:t>
             </w:r>
           </w:p>
         </w:tc>
@@ -11228,7 +12276,7 @@
 </file>
 
 <file path=word/endnotes.xml><?xml version="1.0" encoding="utf-8"?>
-<w:endnotes xmlns:wpc="http://schemas.microsoft.com/office/word/2010/wordprocessingCanvas" xmlns:cx="http://schemas.microsoft.com/office/drawing/2014/chartex" xmlns:cx1="http://schemas.microsoft.com/office/drawing/2015/9/8/chartex" xmlns:cx2="http://schemas.microsoft.com/office/drawing/2015/10/21/chartex" xmlns:cx3="http://schemas.microsoft.com/office/drawing/2016/5/9/chartex" xmlns:cx4="http://schemas.microsoft.com/office/drawing/2016/5/10/chartex" xmlns:cx5="http://schemas.microsoft.com/office/drawing/2016/5/11/chartex" xmlns:cx6="http://schemas.microsoft.com/office/drawing/2016/5/12/chartex" xmlns:cx7="http://schemas.microsoft.com/office/drawing/2016/5/13/chartex" xmlns:cx8="http://schemas.microsoft.com/office/drawing/2016/5/14/chartex" xmlns:mc="http://schemas.openxmlformats.org/markup-compatibility/2006" xmlns:aink="http://schemas.microsoft.com/office/drawing/2016/ink" xmlns:am3d="http://schemas.microsoft.com/office/drawing/2017/model3d" xmlns:o="urn:schemas-microsoft-com:office:office" xmlns:r="http://schemas.openxmlformats.org/officeDocument/2006/relationships" xmlns:m="http://schemas.openxmlformats.org/officeDocument/2006/math" xmlns:v="urn:schemas-microsoft-com:vml" xmlns:wp14="http://schemas.microsoft.com/office/word/2010/wordprocessingDrawing" xmlns:wp="http://schemas.openxmlformats.org/drawingml/2006/wordprocessingDrawing" xmlns:w10="urn:schemas-microsoft-com:office:word" xmlns:w="http://schemas.openxmlformats.org/wordprocessingml/2006/main" xmlns:w14="http://schemas.microsoft.com/office/word/2010/wordml" xmlns:w15="http://schemas.microsoft.com/office/word/2012/wordml" xmlns:w16cex="http://schemas.microsoft.com/office/word/2018/wordml/cex" xmlns:w16cid="http://schemas.microsoft.com/office/word/2016/wordml/cid" xmlns:w16="http://schemas.microsoft.com/office/word/2018/wordml" xmlns:w16sdtdh="http://schemas.microsoft.com/office/word/2020/wordml/sdtdatahash" xmlns:w16se="http://schemas.microsoft.com/office/word/2015/wordml/symex" xmlns:wpg="http://schemas.microsoft.com/office/word/2010/wordprocessingGroup" xmlns:wpi="http://schemas.microsoft.com/office/word/2010/wordprocessingInk" xmlns:wne="http://schemas.microsoft.com/office/word/2006/wordml" xmlns:wps="http://schemas.microsoft.com/office/word/2010/wordprocessingShape" mc:Ignorable="w14 w15 w16se w16cid w16 w16cex w16sdtdh wp14">
+<w:endnotes xmlns:wpc="http://schemas.microsoft.com/office/word/2010/wordprocessingCanvas" xmlns:cx="http://schemas.microsoft.com/office/drawing/2014/chartex" xmlns:cx1="http://schemas.microsoft.com/office/drawing/2015/9/8/chartex" xmlns:cx2="http://schemas.microsoft.com/office/drawing/2015/10/21/chartex" xmlns:cx3="http://schemas.microsoft.com/office/drawing/2016/5/9/chartex" xmlns:cx4="http://schemas.microsoft.com/office/drawing/2016/5/10/chartex" xmlns:cx5="http://schemas.microsoft.com/office/drawing/2016/5/11/chartex" xmlns:cx6="http://schemas.microsoft.com/office/drawing/2016/5/12/chartex" xmlns:cx7="http://schemas.microsoft.com/office/drawing/2016/5/13/chartex" xmlns:cx8="http://schemas.microsoft.com/office/drawing/2016/5/14/chartex" xmlns:mc="http://schemas.openxmlformats.org/markup-compatibility/2006" xmlns:aink="http://schemas.microsoft.com/office/drawing/2016/ink" xmlns:am3d="http://schemas.microsoft.com/office/drawing/2017/model3d" xmlns:o="urn:schemas-microsoft-com:office:office" xmlns:oel="http://schemas.microsoft.com/office/2019/extlst" xmlns:r="http://schemas.openxmlformats.org/officeDocument/2006/relationships" xmlns:m="http://schemas.openxmlformats.org/officeDocument/2006/math" xmlns:v="urn:schemas-microsoft-com:vml" xmlns:wp14="http://schemas.microsoft.com/office/word/2010/wordprocessingDrawing" xmlns:wp="http://schemas.openxmlformats.org/drawingml/2006/wordprocessingDrawing" xmlns:w10="urn:schemas-microsoft-com:office:word" xmlns:w="http://schemas.openxmlformats.org/wordprocessingml/2006/main" xmlns:w14="http://schemas.microsoft.com/office/word/2010/wordml" xmlns:w15="http://schemas.microsoft.com/office/word/2012/wordml" xmlns:w16cex="http://schemas.microsoft.com/office/word/2018/wordml/cex" xmlns:w16cid="http://schemas.microsoft.com/office/word/2016/wordml/cid" xmlns:w16="http://schemas.microsoft.com/office/word/2018/wordml" xmlns:w16sdtdh="http://schemas.microsoft.com/office/word/2020/wordml/sdtdatahash" xmlns:w16se="http://schemas.microsoft.com/office/word/2015/wordml/symex" xmlns:wpg="http://schemas.microsoft.com/office/word/2010/wordprocessingGroup" xmlns:wpi="http://schemas.microsoft.com/office/word/2010/wordprocessingInk" xmlns:wne="http://schemas.microsoft.com/office/word/2006/wordml" xmlns:wps="http://schemas.microsoft.com/office/word/2010/wordprocessingShape" mc:Ignorable="w14 w15 w16se w16cid w16 w16cex w16sdtdh wp14">
   <w:endnote w:type="separator" w:id="-1">
     <w:p>
       <w:pPr>
@@ -11253,7 +12301,7 @@
 </file>
 
 <file path=word/footer1.xml><?xml version="1.0" encoding="utf-8"?>
-<w:ftr xmlns:wpc="http://schemas.microsoft.com/office/word/2010/wordprocessingCanvas" xmlns:cx="http://schemas.microsoft.com/office/drawing/2014/chartex" xmlns:cx1="http://schemas.microsoft.com/office/drawing/2015/9/8/chartex" xmlns:cx2="http://schemas.microsoft.com/office/drawing/2015/10/21/chartex" xmlns:cx3="http://schemas.microsoft.com/office/drawing/2016/5/9/chartex" xmlns:cx4="http://schemas.microsoft.com/office/drawing/2016/5/10/chartex" xmlns:cx5="http://schemas.microsoft.com/office/drawing/2016/5/11/chartex" xmlns:cx6="http://schemas.microsoft.com/office/drawing/2016/5/12/chartex" xmlns:cx7="http://schemas.microsoft.com/office/drawing/2016/5/13/chartex" xmlns:cx8="http://schemas.microsoft.com/office/drawing/2016/5/14/chartex" xmlns:mc="http://schemas.openxmlformats.org/markup-compatibility/2006" xmlns:aink="http://schemas.microsoft.com/office/drawing/2016/ink" xmlns:am3d="http://schemas.microsoft.com/office/drawing/2017/model3d" xmlns:o="urn:schemas-microsoft-com:office:office" xmlns:r="http://schemas.openxmlformats.org/officeDocument/2006/relationships" xmlns:m="http://schemas.openxmlformats.org/officeDocument/2006/math" xmlns:v="urn:schemas-microsoft-com:vml" xmlns:wp14="http://schemas.microsoft.com/office/word/2010/wordprocessingDrawing" xmlns:wp="http://schemas.openxmlformats.org/drawingml/2006/wordprocessingDrawing" xmlns:w10="urn:schemas-microsoft-com:office:word" xmlns:w="http://schemas.openxmlformats.org/wordprocessingml/2006/main" xmlns:w14="http://schemas.microsoft.com/office/word/2010/wordml" xmlns:w15="http://schemas.microsoft.com/office/word/2012/wordml" xmlns:w16cex="http://schemas.microsoft.com/office/word/2018/wordml/cex" xmlns:w16cid="http://schemas.microsoft.com/office/word/2016/wordml/cid" xmlns:w16="http://schemas.microsoft.com/office/word/2018/wordml" xmlns:w16sdtdh="http://schemas.microsoft.com/office/word/2020/wordml/sdtdatahash" xmlns:w16se="http://schemas.microsoft.com/office/word/2015/wordml/symex" xmlns:wpg="http://schemas.microsoft.com/office/word/2010/wordprocessingGroup" xmlns:wpi="http://schemas.microsoft.com/office/word/2010/wordprocessingInk" xmlns:wne="http://schemas.microsoft.com/office/word/2006/wordml" xmlns:wps="http://schemas.microsoft.com/office/word/2010/wordprocessingShape" mc:Ignorable="w14 w15 w16se w16cid w16 w16cex w16sdtdh wp14">
+<w:ftr xmlns:wpc="http://schemas.microsoft.com/office/word/2010/wordprocessingCanvas" xmlns:cx="http://schemas.microsoft.com/office/drawing/2014/chartex" xmlns:cx1="http://schemas.microsoft.com/office/drawing/2015/9/8/chartex" xmlns:cx2="http://schemas.microsoft.com/office/drawing/2015/10/21/chartex" xmlns:cx3="http://schemas.microsoft.com/office/drawing/2016/5/9/chartex" xmlns:cx4="http://schemas.microsoft.com/office/drawing/2016/5/10/chartex" xmlns:cx5="http://schemas.microsoft.com/office/drawing/2016/5/11/chartex" xmlns:cx6="http://schemas.microsoft.com/office/drawing/2016/5/12/chartex" xmlns:cx7="http://schemas.microsoft.com/office/drawing/2016/5/13/chartex" xmlns:cx8="http://schemas.microsoft.com/office/drawing/2016/5/14/chartex" xmlns:mc="http://schemas.openxmlformats.org/markup-compatibility/2006" xmlns:aink="http://schemas.microsoft.com/office/drawing/2016/ink" xmlns:am3d="http://schemas.microsoft.com/office/drawing/2017/model3d" xmlns:o="urn:schemas-microsoft-com:office:office" xmlns:oel="http://schemas.microsoft.com/office/2019/extlst" xmlns:r="http://schemas.openxmlformats.org/officeDocument/2006/relationships" xmlns:m="http://schemas.openxmlformats.org/officeDocument/2006/math" xmlns:v="urn:schemas-microsoft-com:vml" xmlns:wp14="http://schemas.microsoft.com/office/word/2010/wordprocessingDrawing" xmlns:wp="http://schemas.openxmlformats.org/drawingml/2006/wordprocessingDrawing" xmlns:w10="urn:schemas-microsoft-com:office:word" xmlns:w="http://schemas.openxmlformats.org/wordprocessingml/2006/main" xmlns:w14="http://schemas.microsoft.com/office/word/2010/wordml" xmlns:w15="http://schemas.microsoft.com/office/word/2012/wordml" xmlns:w16cex="http://schemas.microsoft.com/office/word/2018/wordml/cex" xmlns:w16cid="http://schemas.microsoft.com/office/word/2016/wordml/cid" xmlns:w16="http://schemas.microsoft.com/office/word/2018/wordml" xmlns:w16sdtdh="http://schemas.microsoft.com/office/word/2020/wordml/sdtdatahash" xmlns:w16se="http://schemas.microsoft.com/office/word/2015/wordml/symex" xmlns:wpg="http://schemas.microsoft.com/office/word/2010/wordprocessingGroup" xmlns:wpi="http://schemas.microsoft.com/office/word/2010/wordprocessingInk" xmlns:wne="http://schemas.microsoft.com/office/word/2006/wordml" xmlns:wps="http://schemas.microsoft.com/office/word/2010/wordprocessingShape" mc:Ignorable="w14 w15 w16se w16cid w16 w16cex w16sdtdh wp14">
   <w:p>
     <w:pPr>
       <w:widowControl w:val="0"/>
@@ -11311,6 +12359,7 @@
               <w:szCs w:val="22"/>
             </w:rPr>
           </w:pPr>
+          <w:proofErr w:type="spellStart"/>
           <w:r>
             <w:rPr>
               <w:rFonts w:ascii="Calibri" w:eastAsia="Calibri" w:hAnsi="Calibri" w:cs="Calibri"/>
@@ -11318,7 +12367,17 @@
               <w:sz w:val="22"/>
               <w:szCs w:val="22"/>
             </w:rPr>
-            <w:t>ProjectCode – Report 3 (SRS Document)</w:t>
+            <w:t>ProjectCode</w:t>
+          </w:r>
+          <w:proofErr w:type="spellEnd"/>
+          <w:r>
+            <w:rPr>
+              <w:rFonts w:ascii="Calibri" w:eastAsia="Calibri" w:hAnsi="Calibri" w:cs="Calibri"/>
+              <w:color w:val="000000"/>
+              <w:sz w:val="22"/>
+              <w:szCs w:val="22"/>
+            </w:rPr>
+            <w:t xml:space="preserve"> – Report 3 (SRS Document)</w:t>
           </w:r>
         </w:p>
       </w:tc>
@@ -11449,7 +12508,7 @@
 </file>
 
 <file path=word/footnotes.xml><?xml version="1.0" encoding="utf-8"?>
-<w:footnotes xmlns:wpc="http://schemas.microsoft.com/office/word/2010/wordprocessingCanvas" xmlns:cx="http://schemas.microsoft.com/office/drawing/2014/chartex" xmlns:cx1="http://schemas.microsoft.com/office/drawing/2015/9/8/chartex" xmlns:cx2="http://schemas.microsoft.com/office/drawing/2015/10/21/chartex" xmlns:cx3="http://schemas.microsoft.com/office/drawing/2016/5/9/chartex" xmlns:cx4="http://schemas.microsoft.com/office/drawing/2016/5/10/chartex" xmlns:cx5="http://schemas.microsoft.com/office/drawing/2016/5/11/chartex" xmlns:cx6="http://schemas.microsoft.com/office/drawing/2016/5/12/chartex" xmlns:cx7="http://schemas.microsoft.com/office/drawing/2016/5/13/chartex" xmlns:cx8="http://schemas.microsoft.com/office/drawing/2016/5/14/chartex" xmlns:mc="http://schemas.openxmlformats.org/markup-compatibility/2006" xmlns:aink="http://schemas.microsoft.com/office/drawing/2016/ink" xmlns:am3d="http://schemas.microsoft.com/office/drawing/2017/model3d" xmlns:o="urn:schemas-microsoft-com:office:office" xmlns:r="http://schemas.openxmlformats.org/officeDocument/2006/relationships" xmlns:m="http://schemas.openxmlformats.org/officeDocument/2006/math" xmlns:v="urn:schemas-microsoft-com:vml" xmlns:wp14="http://schemas.microsoft.com/office/word/2010/wordprocessingDrawing" xmlns:wp="http://schemas.openxmlformats.org/drawingml/2006/wordprocessingDrawing" xmlns:w10="urn:schemas-microsoft-com:office:word" xmlns:w="http://schemas.openxmlformats.org/wordprocessingml/2006/main" xmlns:w14="http://schemas.microsoft.com/office/word/2010/wordml" xmlns:w15="http://schemas.microsoft.com/office/word/2012/wordml" xmlns:w16cex="http://schemas.microsoft.com/office/word/2018/wordml/cex" xmlns:w16cid="http://schemas.microsoft.com/office/word/2016/wordml/cid" xmlns:w16="http://schemas.microsoft.com/office/word/2018/wordml" xmlns:w16sdtdh="http://schemas.microsoft.com/office/word/2020/wordml/sdtdatahash" xmlns:w16se="http://schemas.microsoft.com/office/word/2015/wordml/symex" xmlns:wpg="http://schemas.microsoft.com/office/word/2010/wordprocessingGroup" xmlns:wpi="http://schemas.microsoft.com/office/word/2010/wordprocessingInk" xmlns:wne="http://schemas.microsoft.com/office/word/2006/wordml" xmlns:wps="http://schemas.microsoft.com/office/word/2010/wordprocessingShape" mc:Ignorable="w14 w15 w16se w16cid w16 w16cex w16sdtdh wp14">
+<w:footnotes xmlns:wpc="http://schemas.microsoft.com/office/word/2010/wordprocessingCanvas" xmlns:cx="http://schemas.microsoft.com/office/drawing/2014/chartex" xmlns:cx1="http://schemas.microsoft.com/office/drawing/2015/9/8/chartex" xmlns:cx2="http://schemas.microsoft.com/office/drawing/2015/10/21/chartex" xmlns:cx3="http://schemas.microsoft.com/office/drawing/2016/5/9/chartex" xmlns:cx4="http://schemas.microsoft.com/office/drawing/2016/5/10/chartex" xmlns:cx5="http://schemas.microsoft.com/office/drawing/2016/5/11/chartex" xmlns:cx6="http://schemas.microsoft.com/office/drawing/2016/5/12/chartex" xmlns:cx7="http://schemas.microsoft.com/office/drawing/2016/5/13/chartex" xmlns:cx8="http://schemas.microsoft.com/office/drawing/2016/5/14/chartex" xmlns:mc="http://schemas.openxmlformats.org/markup-compatibility/2006" xmlns:aink="http://schemas.microsoft.com/office/drawing/2016/ink" xmlns:am3d="http://schemas.microsoft.com/office/drawing/2017/model3d" xmlns:o="urn:schemas-microsoft-com:office:office" xmlns:oel="http://schemas.microsoft.com/office/2019/extlst" xmlns:r="http://schemas.openxmlformats.org/officeDocument/2006/relationships" xmlns:m="http://schemas.openxmlformats.org/officeDocument/2006/math" xmlns:v="urn:schemas-microsoft-com:vml" xmlns:wp14="http://schemas.microsoft.com/office/word/2010/wordprocessingDrawing" xmlns:wp="http://schemas.openxmlformats.org/drawingml/2006/wordprocessingDrawing" xmlns:w10="urn:schemas-microsoft-com:office:word" xmlns:w="http://schemas.openxmlformats.org/wordprocessingml/2006/main" xmlns:w14="http://schemas.microsoft.com/office/word/2010/wordml" xmlns:w15="http://schemas.microsoft.com/office/word/2012/wordml" xmlns:w16cex="http://schemas.microsoft.com/office/word/2018/wordml/cex" xmlns:w16cid="http://schemas.microsoft.com/office/word/2016/wordml/cid" xmlns:w16="http://schemas.microsoft.com/office/word/2018/wordml" xmlns:w16sdtdh="http://schemas.microsoft.com/office/word/2020/wordml/sdtdatahash" xmlns:w16se="http://schemas.microsoft.com/office/word/2015/wordml/symex" xmlns:wpg="http://schemas.microsoft.com/office/word/2010/wordprocessingGroup" xmlns:wpi="http://schemas.microsoft.com/office/word/2010/wordprocessingInk" xmlns:wne="http://schemas.microsoft.com/office/word/2006/wordml" xmlns:wps="http://schemas.microsoft.com/office/word/2010/wordprocessingShape" mc:Ignorable="w14 w15 w16se w16cid w16 w16cex w16sdtdh wp14">
   <w:footnote w:type="separator" w:id="-1">
     <w:p>
       <w:pPr>
@@ -11474,7 +12533,7 @@
 </file>
 
 <file path=word/numbering.xml><?xml version="1.0" encoding="utf-8"?>
-<w:numbering xmlns:wpc="http://schemas.microsoft.com/office/word/2010/wordprocessingCanvas" xmlns:cx="http://schemas.microsoft.com/office/drawing/2014/chartex" xmlns:cx1="http://schemas.microsoft.com/office/drawing/2015/9/8/chartex" xmlns:cx2="http://schemas.microsoft.com/office/drawing/2015/10/21/chartex" xmlns:cx3="http://schemas.microsoft.com/office/drawing/2016/5/9/chartex" xmlns:cx4="http://schemas.microsoft.com/office/drawing/2016/5/10/chartex" xmlns:cx5="http://schemas.microsoft.com/office/drawing/2016/5/11/chartex" xmlns:cx6="http://schemas.microsoft.com/office/drawing/2016/5/12/chartex" xmlns:cx7="http://schemas.microsoft.com/office/drawing/2016/5/13/chartex" xmlns:cx8="http://schemas.microsoft.com/office/drawing/2016/5/14/chartex" xmlns:mc="http://schemas.openxmlformats.org/markup-compatibility/2006" xmlns:aink="http://schemas.microsoft.com/office/drawing/2016/ink" xmlns:am3d="http://schemas.microsoft.com/office/drawing/2017/model3d" xmlns:o="urn:schemas-microsoft-com:office:office" xmlns:r="http://schemas.openxmlformats.org/officeDocument/2006/relationships" xmlns:m="http://schemas.openxmlformats.org/officeDocument/2006/math" xmlns:v="urn:schemas-microsoft-com:vml" xmlns:wp14="http://schemas.microsoft.com/office/word/2010/wordprocessingDrawing" xmlns:wp="http://schemas.openxmlformats.org/drawingml/2006/wordprocessingDrawing" xmlns:w10="urn:schemas-microsoft-com:office:word" xmlns:w="http://schemas.openxmlformats.org/wordprocessingml/2006/main" xmlns:w14="http://schemas.microsoft.com/office/word/2010/wordml" xmlns:w15="http://schemas.microsoft.com/office/word/2012/wordml" xmlns:w16cex="http://schemas.microsoft.com/office/word/2018/wordml/cex" xmlns:w16cid="http://schemas.microsoft.com/office/word/2016/wordml/cid" xmlns:w16="http://schemas.microsoft.com/office/word/2018/wordml" xmlns:w16sdtdh="http://schemas.microsoft.com/office/word/2020/wordml/sdtdatahash" xmlns:w16se="http://schemas.microsoft.com/office/word/2015/wordml/symex" xmlns:wpg="http://schemas.microsoft.com/office/word/2010/wordprocessingGroup" xmlns:wpi="http://schemas.microsoft.com/office/word/2010/wordprocessingInk" xmlns:wne="http://schemas.microsoft.com/office/word/2006/wordml" xmlns:wps="http://schemas.microsoft.com/office/word/2010/wordprocessingShape" mc:Ignorable="w14 w15 w16se w16cid w16 w16cex w16sdtdh wp14">
+<w:numbering xmlns:wpc="http://schemas.microsoft.com/office/word/2010/wordprocessingCanvas" xmlns:cx="http://schemas.microsoft.com/office/drawing/2014/chartex" xmlns:cx1="http://schemas.microsoft.com/office/drawing/2015/9/8/chartex" xmlns:cx2="http://schemas.microsoft.com/office/drawing/2015/10/21/chartex" xmlns:cx3="http://schemas.microsoft.com/office/drawing/2016/5/9/chartex" xmlns:cx4="http://schemas.microsoft.com/office/drawing/2016/5/10/chartex" xmlns:cx5="http://schemas.microsoft.com/office/drawing/2016/5/11/chartex" xmlns:cx6="http://schemas.microsoft.com/office/drawing/2016/5/12/chartex" xmlns:cx7="http://schemas.microsoft.com/office/drawing/2016/5/13/chartex" xmlns:cx8="http://schemas.microsoft.com/office/drawing/2016/5/14/chartex" xmlns:mc="http://schemas.openxmlformats.org/markup-compatibility/2006" xmlns:aink="http://schemas.microsoft.com/office/drawing/2016/ink" xmlns:am3d="http://schemas.microsoft.com/office/drawing/2017/model3d" xmlns:o="urn:schemas-microsoft-com:office:office" xmlns:oel="http://schemas.microsoft.com/office/2019/extlst" xmlns:r="http://schemas.openxmlformats.org/officeDocument/2006/relationships" xmlns:m="http://schemas.openxmlformats.org/officeDocument/2006/math" xmlns:v="urn:schemas-microsoft-com:vml" xmlns:wp14="http://schemas.microsoft.com/office/word/2010/wordprocessingDrawing" xmlns:wp="http://schemas.openxmlformats.org/drawingml/2006/wordprocessingDrawing" xmlns:w10="urn:schemas-microsoft-com:office:word" xmlns:w="http://schemas.openxmlformats.org/wordprocessingml/2006/main" xmlns:w14="http://schemas.microsoft.com/office/word/2010/wordml" xmlns:w15="http://schemas.microsoft.com/office/word/2012/wordml" xmlns:w16cex="http://schemas.microsoft.com/office/word/2018/wordml/cex" xmlns:w16cid="http://schemas.microsoft.com/office/word/2016/wordml/cid" xmlns:w16="http://schemas.microsoft.com/office/word/2018/wordml" xmlns:w16sdtdh="http://schemas.microsoft.com/office/word/2020/wordml/sdtdatahash" xmlns:w16se="http://schemas.microsoft.com/office/word/2015/wordml/symex" xmlns:wpg="http://schemas.microsoft.com/office/word/2010/wordprocessingGroup" xmlns:wpi="http://schemas.microsoft.com/office/word/2010/wordprocessingInk" xmlns:wne="http://schemas.microsoft.com/office/word/2006/wordml" xmlns:wps="http://schemas.microsoft.com/office/word/2010/wordprocessingShape" mc:Ignorable="w14 w15 w16se w16cid w16 w16cex w16sdtdh wp14">
   <w:abstractNum w:abstractNumId="0" w15:restartNumberingAfterBreak="0">
     <w:nsid w:val="08100D2D"/>
     <w:multiLevelType w:val="hybridMultilevel"/>
@@ -12542,34 +13601,34 @@
       </w:pPr>
     </w:lvl>
   </w:abstractNum>
-  <w:num w:numId="1">
+  <w:num w:numId="1" w16cid:durableId="2066491357">
     <w:abstractNumId w:val="8"/>
   </w:num>
-  <w:num w:numId="2">
+  <w:num w:numId="2" w16cid:durableId="1376852211">
     <w:abstractNumId w:val="6"/>
   </w:num>
-  <w:num w:numId="3">
+  <w:num w:numId="3" w16cid:durableId="348220544">
     <w:abstractNumId w:val="2"/>
   </w:num>
-  <w:num w:numId="4">
+  <w:num w:numId="4" w16cid:durableId="1972973950">
     <w:abstractNumId w:val="4"/>
   </w:num>
-  <w:num w:numId="5">
+  <w:num w:numId="5" w16cid:durableId="1036924651">
     <w:abstractNumId w:val="7"/>
   </w:num>
-  <w:num w:numId="6">
+  <w:num w:numId="6" w16cid:durableId="1608082540">
     <w:abstractNumId w:val="1"/>
   </w:num>
-  <w:num w:numId="7">
+  <w:num w:numId="7" w16cid:durableId="1984653601">
     <w:abstractNumId w:val="9"/>
   </w:num>
-  <w:num w:numId="8">
+  <w:num w:numId="8" w16cid:durableId="1332295807">
     <w:abstractNumId w:val="3"/>
   </w:num>
-  <w:num w:numId="9">
+  <w:num w:numId="9" w16cid:durableId="629166703">
     <w:abstractNumId w:val="0"/>
   </w:num>
-  <w:num w:numId="10">
+  <w:num w:numId="10" w16cid:durableId="1800031366">
     <w:abstractNumId w:val="5"/>
   </w:num>
 </w:numbering>
@@ -12698,6 +13757,7 @@
     <w:lsdException w:name="HTML Sample" w:semiHidden="1" w:unhideWhenUsed="1"/>
     <w:lsdException w:name="HTML Typewriter" w:semiHidden="1" w:unhideWhenUsed="1"/>
     <w:lsdException w:name="HTML Variable" w:semiHidden="1" w:unhideWhenUsed="1"/>
+    <w:lsdException w:name="Normal Table" w:semiHidden="1" w:unhideWhenUsed="1"/>
     <w:lsdException w:name="annotation subject" w:semiHidden="1" w:unhideWhenUsed="1"/>
     <w:lsdException w:name="No List" w:semiHidden="1" w:unhideWhenUsed="1"/>
     <w:lsdException w:name="Outline List 1" w:semiHidden="1" w:unhideWhenUsed="1"/>
@@ -12744,8 +13804,10 @@
     <w:lsdException w:name="Table Subtle 2" w:semiHidden="1" w:unhideWhenUsed="1"/>
     <w:lsdException w:name="Table Web 1" w:semiHidden="1" w:unhideWhenUsed="1"/>
     <w:lsdException w:name="Table Web 2" w:semiHidden="1" w:unhideWhenUsed="1"/>
+    <w:lsdException w:name="Table Web 3" w:semiHidden="1" w:unhideWhenUsed="1"/>
     <w:lsdException w:name="Balloon Text" w:semiHidden="1" w:unhideWhenUsed="1"/>
     <w:lsdException w:name="Table Grid" w:uiPriority="0"/>
+    <w:lsdException w:name="Table Theme" w:semiHidden="1" w:unhideWhenUsed="1"/>
     <w:lsdException w:name="Placeholder Text" w:semiHidden="1"/>
     <w:lsdException w:name="No Spacing" w:uiPriority="1" w:qFormat="1"/>
     <w:lsdException w:name="Light Shading" w:uiPriority="60"/>

</xml_diff>

<commit_message>
Add 1.3.2 Use Cases (UC) to SRS
</commit_message>
<xml_diff>
--- a/Document/02_Requirements/Report3_Software Requirement Specification.docx
+++ b/Document/02_Requirements/Report3_Software Requirement Specification.docx
@@ -4806,674 +4806,3735 @@
     </w:p>
     <w:p>
       <w:pPr>
-        <w:jc w:val="both"/>
+        <w:spacing w:after="200"/>
+      </w:pPr>
+      <w:r>
         <w:rPr>
-          <w:i/>
-          <w:color w:val="0000FF"/>
+          <w:sz w:val="21"/>
+          <w:rFonts w:ascii="Arial" w:hAnsi="Arial"/>
         </w:rPr>
-      </w:pPr>
-      <w:r>
-        <w:rPr>
-          <w:i/>
-          <w:color w:val="0000FF"/>
-        </w:rPr>
-        <w:t>[A use case (UC) describes a sequence of interactions between a system and an external actor that results in the actor being able to achieve some outcome of value. The names of use cases are always written in the form of a verb followed by an object. Select strong, descriptive names to make it evident from the name that the use case will deliver something valuable for some user.</w:t>
-      </w:r>
-    </w:p>
-    <w:p>
-      <w:pPr>
-        <w:rPr>
-          <w:i/>
-          <w:color w:val="0000FF"/>
-        </w:rPr>
-      </w:pPr>
-      <w:r>
-        <w:rPr>
-          <w:i/>
-          <w:color w:val="0000FF"/>
-        </w:rPr>
-        <w:t>Following are some questions you might ask to help user representatives identify use cases</w:t>
-      </w:r>
-    </w:p>
-    <w:p>
-      <w:pPr>
-        <w:numPr>
-          <w:ilvl w:val="0"/>
-          <w:numId w:val="6"/>
-        </w:numPr>
-        <w:pBdr>
-          <w:top w:val="nil"/>
-          <w:left w:val="nil"/>
-          <w:bottom w:val="nil"/>
-          <w:right w:val="nil"/>
-          <w:between w:val="nil"/>
-        </w:pBdr>
-        <w:spacing w:after="0"/>
-        <w:ind w:left="426" w:hanging="283"/>
-        <w:rPr>
-          <w:i/>
-          <w:color w:val="0000FF"/>
-        </w:rPr>
-      </w:pPr>
-      <w:r>
-        <w:rPr>
-          <w:i/>
-          <w:color w:val="0000FF"/>
-        </w:rPr>
-        <w:t>What will the actor use the system for?</w:t>
-      </w:r>
-    </w:p>
-    <w:p>
-      <w:pPr>
-        <w:numPr>
-          <w:ilvl w:val="0"/>
-          <w:numId w:val="6"/>
-        </w:numPr>
-        <w:pBdr>
-          <w:top w:val="nil"/>
-          <w:left w:val="nil"/>
-          <w:bottom w:val="nil"/>
-          <w:right w:val="nil"/>
-          <w:between w:val="nil"/>
-        </w:pBdr>
-        <w:spacing w:after="0"/>
-        <w:ind w:left="426" w:hanging="283"/>
-        <w:rPr>
-          <w:i/>
-          <w:color w:val="0000FF"/>
-        </w:rPr>
-      </w:pPr>
-      <w:r>
-        <w:rPr>
-          <w:i/>
-          <w:color w:val="0000FF"/>
-        </w:rPr>
-        <w:t>Will the actor create, store, change, remove, or read data in the system?</w:t>
-      </w:r>
-    </w:p>
-    <w:p>
-      <w:pPr>
-        <w:numPr>
-          <w:ilvl w:val="0"/>
-          <w:numId w:val="6"/>
-        </w:numPr>
-        <w:pBdr>
-          <w:top w:val="nil"/>
-          <w:left w:val="nil"/>
-          <w:bottom w:val="nil"/>
-          <w:right w:val="nil"/>
-          <w:between w:val="nil"/>
-        </w:pBdr>
-        <w:spacing w:after="0"/>
-        <w:ind w:left="426" w:hanging="283"/>
-        <w:rPr>
-          <w:i/>
-          <w:color w:val="0000FF"/>
-        </w:rPr>
-      </w:pPr>
-      <w:r>
-        <w:rPr>
-          <w:i/>
-          <w:color w:val="0000FF"/>
-        </w:rPr>
-        <w:t>Will the actor need to inform the system about external events or changes?</w:t>
-      </w:r>
-    </w:p>
-    <w:p>
-      <w:pPr>
-        <w:numPr>
-          <w:ilvl w:val="0"/>
-          <w:numId w:val="6"/>
-        </w:numPr>
-        <w:pBdr>
-          <w:top w:val="nil"/>
-          <w:left w:val="nil"/>
-          <w:bottom w:val="nil"/>
-          <w:right w:val="nil"/>
-          <w:between w:val="nil"/>
-        </w:pBdr>
-        <w:ind w:left="426" w:hanging="283"/>
-        <w:rPr>
-          <w:i/>
-          <w:color w:val="0000FF"/>
-        </w:rPr>
-      </w:pPr>
-      <w:r>
-        <w:rPr>
-          <w:i/>
-          <w:color w:val="0000FF"/>
-        </w:rPr>
-        <w:t>Will the actor need to be informed about certain occurrences in the system?</w:t>
-      </w:r>
-    </w:p>
-    <w:p>
-      <w:pPr>
-        <w:jc w:val="both"/>
-        <w:rPr>
-          <w:i/>
-          <w:color w:val="0000FF"/>
-        </w:rPr>
-      </w:pPr>
-      <w:r>
-        <w:rPr>
-          <w:i/>
-          <w:color w:val="0000FF"/>
-        </w:rPr>
-        <w:t>This part describe</w:t>
-      </w:r>
-      <w:r>
-        <w:rPr>
-          <w:i/>
-          <w:color w:val="0000FF"/>
-        </w:rPr>
-        <w:t>s</w:t>
-      </w:r>
-      <w:r>
-        <w:rPr>
-          <w:i/>
-          <w:color w:val="0000FF"/>
-        </w:rPr>
-        <w:t xml:space="preserve"> the use cases</w:t>
-      </w:r>
-      <w:r>
-        <w:rPr>
-          <w:i/>
-          <w:color w:val="0000FF"/>
-        </w:rPr>
-        <w:t xml:space="preserve"> you could define</w:t>
-      </w:r>
-      <w:r>
-        <w:rPr>
-          <w:i/>
-          <w:color w:val="0000FF"/>
-        </w:rPr>
-        <w:t>, you can follow the table form as below</w:t>
-      </w:r>
-      <w:r>
-        <w:rPr>
-          <w:i/>
-          <w:color w:val="0000FF"/>
-        </w:rPr>
-        <w:t>]</w:t>
+        <w:t xml:space="preserve">A Use Case (UC) describes a sequence of interactions between the CLS system and an external actor that results in a measurable outcome of value. Use case names follow the verb-object naming convention (e.g., "Record Session Attendance"). The following table lists all identified use cases grouped by system feature, mapped to the CLS MVP Phase 1 scope and business goals.</w:t>
       </w:r>
     </w:p>
     <w:tbl>
       <w:tblPr>
-        <w:tblW w:w="9214" w:type="dxa"/>
-        <w:tblInd w:w="-5" w:type="dxa"/>
-        <w:tblLook w:val="04A0" w:firstRow="1" w:lastRow="0" w:firstColumn="1" w:lastColumn="0" w:noHBand="0" w:noVBand="1"/>
+        <w:tblStyle w:val="TableGrid"/>
+        <w:tblW w:w="5000" w:type="pct"/>
+        <w:tblLayout w:type="fixed"/>
+        <w:jc w:val="center"/>
       </w:tblPr>
       <w:tblGrid>
-        <w:gridCol w:w="520"/>
-        <w:gridCol w:w="1890"/>
-        <w:gridCol w:w="1701"/>
-        <w:gridCol w:w="5103"/>
+        <w:gridCol w:w="900"/>
+        <w:gridCol w:w="2400"/>
+        <w:gridCol w:w="2200"/>
+        <w:gridCol w:w="4100"/>
       </w:tblGrid>
       <w:tr>
         <w:trPr>
-          <w:trHeight w:val="288"/>
+          <w:tblHeader/>
         </w:trPr>
         <w:tc>
           <w:tcPr>
-            <w:tcW w:w="520" w:type="dxa"/>
+            <w:shd w:val="clear" w:color="auto" w:fill="F8FAFC"/>
             <w:tcBorders>
-              <w:top w:val="single" w:sz="4" w:space="0" w:color="auto"/>
-              <w:left w:val="single" w:sz="4" w:space="0" w:color="auto"/>
-              <w:bottom w:val="single" w:sz="4" w:space="0" w:color="auto"/>
-              <w:right w:val="single" w:sz="4" w:space="0" w:color="auto"/>
+              <w:top w:val="single" w:sz="4" w:space="0" w:color="CBD5E1"/>
+              <w:left w:val="single" w:sz="4" w:space="0" w:color="CBD5E1"/>
+              <w:bottom w:val="single" w:sz="4" w:space="0" w:color="CBD5E1"/>
+              <w:right w:val="single" w:sz="4" w:space="0" w:color="CBD5E1"/>
             </w:tcBorders>
-            <w:shd w:val="clear" w:color="auto" w:fill="FFE8E1"/>
-          </w:tcPr>
-          <w:p>
-            <w:pPr>
-              <w:spacing w:after="0" w:line="240" w:lineRule="auto"/>
+            <w:vAlign w:val="center"/>
+            <w:tcMar>
+              <w:top w:w="80" w:type="dxa"/>
+              <w:left w:w="80" w:type="dxa"/>
+              <w:bottom w:w="80" w:type="dxa"/>
+              <w:right w:w="80" w:type="dxa"/>
+            </w:tcMar>
+          </w:tcPr>
+          <w:p>
+            <w:pPr>
               <w:jc w:val="center"/>
-              <w:rPr>
-                <w:rFonts w:cstheme="minorHAnsi"/>
+              <w:spacing w:after="40" w:line="264" w:lineRule="auto"/>
+            </w:pPr>
+            <w:r>
+              <w:rPr>
                 <w:b/>
-              </w:rPr>
-            </w:pPr>
-            <w:r>
-              <w:rPr>
-                <w:rFonts w:cstheme="minorHAnsi"/>
+                <w:sz w:val="21"/>
+                <w:szCs w:val="21"/>
+                <w:rFonts w:ascii="Arial" w:hAnsi="Arial" w:cs="Arial"/>
+                <w:color w:val="1E40AF"/>
+              </w:rPr>
+              <w:t xml:space="preserve">ID</w:t>
+            </w:r>
+          </w:p>
+        </w:tc>
+        <w:tc>
+          <w:tcPr>
+            <w:shd w:val="clear" w:color="auto" w:fill="F8FAFC"/>
+            <w:tcBorders>
+              <w:top w:val="single" w:sz="4" w:space="0" w:color="CBD5E1"/>
+              <w:left w:val="single" w:sz="4" w:space="0" w:color="CBD5E1"/>
+              <w:bottom w:val="single" w:sz="4" w:space="0" w:color="CBD5E1"/>
+              <w:right w:val="single" w:sz="4" w:space="0" w:color="CBD5E1"/>
+            </w:tcBorders>
+            <w:vAlign w:val="center"/>
+            <w:tcMar>
+              <w:top w:w="80" w:type="dxa"/>
+              <w:left w:w="80" w:type="dxa"/>
+              <w:bottom w:w="80" w:type="dxa"/>
+              <w:right w:w="80" w:type="dxa"/>
+            </w:tcMar>
+          </w:tcPr>
+          <w:p>
+            <w:pPr>
+              <w:jc w:val="center"/>
+              <w:spacing w:after="40" w:line="264" w:lineRule="auto"/>
+            </w:pPr>
+            <w:r>
+              <w:rPr>
                 <w:b/>
-              </w:rPr>
-              <w:t>ID</w:t>
-            </w:r>
-          </w:p>
-        </w:tc>
-        <w:tc>
-          <w:tcPr>
-            <w:tcW w:w="1890" w:type="dxa"/>
+                <w:sz w:val="21"/>
+                <w:szCs w:val="21"/>
+                <w:rFonts w:ascii="Arial" w:hAnsi="Arial" w:cs="Arial"/>
+                <w:color w:val="1E40AF"/>
+              </w:rPr>
+              <w:t xml:space="preserve">Use Case</w:t>
+            </w:r>
+          </w:p>
+        </w:tc>
+        <w:tc>
+          <w:tcPr>
+            <w:shd w:val="clear" w:color="auto" w:fill="F8FAFC"/>
             <w:tcBorders>
-              <w:top w:val="single" w:sz="4" w:space="0" w:color="auto"/>
-              <w:left w:val="nil"/>
-              <w:bottom w:val="single" w:sz="4" w:space="0" w:color="auto"/>
-              <w:right w:val="single" w:sz="4" w:space="0" w:color="auto"/>
+              <w:top w:val="single" w:sz="4" w:space="0" w:color="CBD5E1"/>
+              <w:left w:val="single" w:sz="4" w:space="0" w:color="CBD5E1"/>
+              <w:bottom w:val="single" w:sz="4" w:space="0" w:color="CBD5E1"/>
+              <w:right w:val="single" w:sz="4" w:space="0" w:color="CBD5E1"/>
             </w:tcBorders>
-            <w:shd w:val="clear" w:color="auto" w:fill="FFE8E1"/>
-            <w:noWrap/>
-            <w:vAlign w:val="bottom"/>
-            <w:hideMark/>
-          </w:tcPr>
-          <w:p>
-            <w:pPr>
-              <w:spacing w:after="0" w:line="240" w:lineRule="auto"/>
-              <w:rPr>
-                <w:rFonts w:cstheme="minorHAnsi"/>
+            <w:vAlign w:val="center"/>
+            <w:tcMar>
+              <w:top w:w="80" w:type="dxa"/>
+              <w:left w:w="80" w:type="dxa"/>
+              <w:bottom w:w="80" w:type="dxa"/>
+              <w:right w:w="80" w:type="dxa"/>
+            </w:tcMar>
+          </w:tcPr>
+          <w:p>
+            <w:pPr>
+              <w:jc w:val="center"/>
+              <w:spacing w:after="40" w:line="264" w:lineRule="auto"/>
+            </w:pPr>
+            <w:r>
+              <w:rPr>
                 <w:b/>
-              </w:rPr>
-            </w:pPr>
-            <w:r>
-              <w:rPr>
-                <w:rFonts w:cstheme="minorHAnsi"/>
+                <w:sz w:val="21"/>
+                <w:szCs w:val="21"/>
+                <w:rFonts w:ascii="Arial" w:hAnsi="Arial" w:cs="Arial"/>
+                <w:color w:val="1E40AF"/>
+              </w:rPr>
+              <w:t xml:space="preserve">Feature</w:t>
+            </w:r>
+          </w:p>
+        </w:tc>
+        <w:tc>
+          <w:tcPr>
+            <w:shd w:val="clear" w:color="auto" w:fill="F8FAFC"/>
+            <w:tcBorders>
+              <w:top w:val="single" w:sz="4" w:space="0" w:color="CBD5E1"/>
+              <w:left w:val="single" w:sz="4" w:space="0" w:color="CBD5E1"/>
+              <w:bottom w:val="single" w:sz="4" w:space="0" w:color="CBD5E1"/>
+              <w:right w:val="single" w:sz="4" w:space="0" w:color="CBD5E1"/>
+            </w:tcBorders>
+            <w:vAlign w:val="center"/>
+            <w:tcMar>
+              <w:top w:w="80" w:type="dxa"/>
+              <w:left w:w="80" w:type="dxa"/>
+              <w:bottom w:w="80" w:type="dxa"/>
+              <w:right w:w="80" w:type="dxa"/>
+            </w:tcMar>
+          </w:tcPr>
+          <w:p>
+            <w:pPr>
+              <w:jc w:val="center"/>
+              <w:spacing w:after="40" w:line="264" w:lineRule="auto"/>
+            </w:pPr>
+            <w:r>
+              <w:rPr>
                 <w:b/>
-              </w:rPr>
-              <w:t>Use Case</w:t>
-            </w:r>
-          </w:p>
-        </w:tc>
-        <w:tc>
-          <w:tcPr>
-            <w:tcW w:w="1701" w:type="dxa"/>
-            <w:tcBorders>
-              <w:top w:val="single" w:sz="4" w:space="0" w:color="auto"/>
-              <w:left w:val="nil"/>
-              <w:bottom w:val="single" w:sz="4" w:space="0" w:color="auto"/>
-              <w:right w:val="single" w:sz="4" w:space="0" w:color="auto"/>
-            </w:tcBorders>
-            <w:shd w:val="clear" w:color="auto" w:fill="FFE8E1"/>
-            <w:noWrap/>
-            <w:vAlign w:val="bottom"/>
-            <w:hideMark/>
-          </w:tcPr>
-          <w:p>
-            <w:pPr>
-              <w:spacing w:after="0" w:line="240" w:lineRule="auto"/>
-              <w:rPr>
-                <w:rFonts w:cstheme="minorHAnsi"/>
-                <w:b/>
-              </w:rPr>
-            </w:pPr>
-            <w:r>
-              <w:rPr>
-                <w:rFonts w:cstheme="minorHAnsi"/>
-                <w:b/>
-              </w:rPr>
-              <w:t>Feature</w:t>
-            </w:r>
-          </w:p>
-        </w:tc>
-        <w:tc>
-          <w:tcPr>
-            <w:tcW w:w="5103" w:type="dxa"/>
-            <w:tcBorders>
-              <w:top w:val="single" w:sz="4" w:space="0" w:color="auto"/>
-              <w:left w:val="nil"/>
-              <w:bottom w:val="single" w:sz="4" w:space="0" w:color="auto"/>
-              <w:right w:val="single" w:sz="4" w:space="0" w:color="auto"/>
-            </w:tcBorders>
-            <w:shd w:val="clear" w:color="auto" w:fill="FFE8E1"/>
-          </w:tcPr>
-          <w:p>
-            <w:pPr>
-              <w:spacing w:after="0" w:line="240" w:lineRule="auto"/>
-              <w:rPr>
-                <w:rFonts w:cstheme="minorHAnsi"/>
-                <w:b/>
-              </w:rPr>
-            </w:pPr>
-            <w:r>
-              <w:rPr>
-                <w:rFonts w:cstheme="minorHAnsi"/>
-                <w:b/>
-              </w:rPr>
-              <w:t>Use Case Description</w:t>
+                <w:sz w:val="21"/>
+                <w:szCs w:val="21"/>
+                <w:rFonts w:ascii="Arial" w:hAnsi="Arial" w:cs="Arial"/>
+                <w:color w:val="1E40AF"/>
+              </w:rPr>
+              <w:t xml:space="preserve">Use Case Description</w:t>
             </w:r>
           </w:p>
         </w:tc>
       </w:tr>
       <w:tr>
-        <w:trPr>
-          <w:trHeight w:val="288"/>
-        </w:trPr>
-        <w:tc>
-          <w:tcPr>
-            <w:tcW w:w="520" w:type="dxa"/>
+        <w:tc>
+          <w:tcPr>
             <w:tcBorders>
-              <w:top w:val="nil"/>
-              <w:left w:val="single" w:sz="4" w:space="0" w:color="auto"/>
-              <w:bottom w:val="single" w:sz="4" w:space="0" w:color="auto"/>
-              <w:right w:val="single" w:sz="4" w:space="0" w:color="auto"/>
+              <w:top w:val="single" w:sz="4" w:space="0" w:color="CBD5E1"/>
+              <w:left w:val="single" w:sz="4" w:space="0" w:color="CBD5E1"/>
+              <w:bottom w:val="single" w:sz="4" w:space="0" w:color="CBD5E1"/>
+              <w:right w:val="single" w:sz="4" w:space="0" w:color="CBD5E1"/>
             </w:tcBorders>
-          </w:tcPr>
-          <w:p>
-            <w:pPr>
-              <w:spacing w:after="0" w:line="240" w:lineRule="auto"/>
+            <w:vAlign w:val="top"/>
+            <w:tcMar>
+              <w:top w:w="80" w:type="dxa"/>
+              <w:left w:w="80" w:type="dxa"/>
+              <w:bottom w:w="80" w:type="dxa"/>
+              <w:right w:w="80" w:type="dxa"/>
+            </w:tcMar>
+          </w:tcPr>
+          <w:p>
+            <w:pPr>
               <w:jc w:val="center"/>
-              <w:rPr>
-                <w:rFonts w:eastAsia="Times New Roman" w:cstheme="minorHAnsi"/>
-                <w:color w:val="000000"/>
-                <w:lang w:val="en-US"/>
-              </w:rPr>
-            </w:pPr>
-            <w:r>
-              <w:rPr>
-                <w:rFonts w:eastAsia="Times New Roman" w:cstheme="minorHAnsi"/>
-                <w:color w:val="000000"/>
-                <w:lang w:val="en-US"/>
-              </w:rPr>
-              <w:t>01</w:t>
-            </w:r>
-          </w:p>
-        </w:tc>
-        <w:tc>
-          <w:tcPr>
-            <w:tcW w:w="1890" w:type="dxa"/>
+              <w:spacing w:after="40" w:line="264" w:lineRule="auto"/>
+            </w:pPr>
+            <w:r>
+              <w:rPr>
+                <w:b/>
+                <w:sz w:val="20"/>
+                <w:szCs w:val="20"/>
+                <w:rFonts w:ascii="Arial" w:hAnsi="Arial" w:cs="Arial"/>
+                <w:color w:val="0F172A"/>
+              </w:rPr>
+              <w:t xml:space="preserve">UC-01</w:t>
+            </w:r>
+          </w:p>
+        </w:tc>
+        <w:tc>
+          <w:tcPr>
             <w:tcBorders>
-              <w:top w:val="nil"/>
-              <w:left w:val="nil"/>
-              <w:bottom w:val="single" w:sz="4" w:space="0" w:color="auto"/>
-              <w:right w:val="single" w:sz="4" w:space="0" w:color="auto"/>
+              <w:top w:val="single" w:sz="4" w:space="0" w:color="CBD5E1"/>
+              <w:left w:val="single" w:sz="4" w:space="0" w:color="CBD5E1"/>
+              <w:bottom w:val="single" w:sz="4" w:space="0" w:color="CBD5E1"/>
+              <w:right w:val="single" w:sz="4" w:space="0" w:color="CBD5E1"/>
             </w:tcBorders>
-            <w:shd w:val="clear" w:color="auto" w:fill="auto"/>
-            <w:noWrap/>
-          </w:tcPr>
-          <w:p>
-            <w:pPr>
-              <w:spacing w:after="0" w:line="240" w:lineRule="auto"/>
-            </w:pPr>
-            <w:r>
-              <w:t>View Menu</w:t>
-            </w:r>
-          </w:p>
-        </w:tc>
-        <w:tc>
-          <w:tcPr>
-            <w:tcW w:w="1701" w:type="dxa"/>
+            <w:vAlign w:val="top"/>
+            <w:tcMar>
+              <w:top w:w="80" w:type="dxa"/>
+              <w:left w:w="80" w:type="dxa"/>
+              <w:bottom w:w="80" w:type="dxa"/>
+              <w:right w:w="80" w:type="dxa"/>
+            </w:tcMar>
+          </w:tcPr>
+          <w:p>
+            <w:pPr>
+              <w:jc w:val="left"/>
+              <w:spacing w:after="40" w:line="264" w:lineRule="auto"/>
+            </w:pPr>
+            <w:r>
+              <w:rPr>
+                <w:b/>
+                <w:sz w:val="20"/>
+                <w:szCs w:val="20"/>
+                <w:rFonts w:ascii="Arial" w:hAnsi="Arial" w:cs="Arial"/>
+                <w:color w:val="1D4ED8"/>
+              </w:rPr>
+              <w:t xml:space="preserve">Login System</w:t>
+            </w:r>
+          </w:p>
+        </w:tc>
+        <w:tc>
+          <w:tcPr>
             <w:tcBorders>
-              <w:top w:val="nil"/>
-              <w:left w:val="nil"/>
-              <w:bottom w:val="single" w:sz="4" w:space="0" w:color="auto"/>
-              <w:right w:val="single" w:sz="4" w:space="0" w:color="auto"/>
+              <w:top w:val="single" w:sz="4" w:space="0" w:color="CBD5E1"/>
+              <w:left w:val="single" w:sz="4" w:space="0" w:color="CBD5E1"/>
+              <w:bottom w:val="single" w:sz="4" w:space="0" w:color="CBD5E1"/>
+              <w:right w:val="single" w:sz="4" w:space="0" w:color="CBD5E1"/>
             </w:tcBorders>
-            <w:shd w:val="clear" w:color="auto" w:fill="auto"/>
-            <w:noWrap/>
-          </w:tcPr>
-          <w:p>
-            <w:pPr>
-              <w:spacing w:after="0" w:line="240" w:lineRule="auto"/>
-              <w:rPr>
-                <w:rFonts w:eastAsia="Times New Roman" w:cstheme="minorHAnsi"/>
-                <w:color w:val="000000"/>
-                <w:lang w:val="en-US"/>
-              </w:rPr>
-            </w:pPr>
-            <w:r>
-              <w:rPr>
-                <w:rFonts w:eastAsia="Times New Roman" w:cstheme="minorHAnsi"/>
-                <w:color w:val="000000"/>
-                <w:lang w:val="en-US"/>
-              </w:rPr>
-              <w:t>Feature Name1</w:t>
-            </w:r>
-          </w:p>
-        </w:tc>
-        <w:tc>
-          <w:tcPr>
-            <w:tcW w:w="5103" w:type="dxa"/>
+            <w:vAlign w:val="top"/>
+            <w:tcMar>
+              <w:top w:w="80" w:type="dxa"/>
+              <w:left w:w="80" w:type="dxa"/>
+              <w:bottom w:w="80" w:type="dxa"/>
+              <w:right w:w="80" w:type="dxa"/>
+            </w:tcMar>
+          </w:tcPr>
+          <w:p>
+            <w:pPr>
+              <w:jc w:val="left"/>
+              <w:spacing w:after="40" w:line="264" w:lineRule="auto"/>
+            </w:pPr>
+            <w:r>
+              <w:rPr>
+                <w:sz w:val="20"/>
+                <w:szCs w:val="20"/>
+                <w:rFonts w:ascii="Arial" w:hAnsi="Arial" w:cs="Arial"/>
+                <w:color w:val="334155"/>
+              </w:rPr>
+              <w:t xml:space="preserve">User Authentication</w:t>
+            </w:r>
+          </w:p>
+        </w:tc>
+        <w:tc>
+          <w:tcPr>
             <w:tcBorders>
-              <w:top w:val="nil"/>
-              <w:left w:val="nil"/>
-              <w:bottom w:val="single" w:sz="4" w:space="0" w:color="auto"/>
-              <w:right w:val="single" w:sz="4" w:space="0" w:color="auto"/>
+              <w:top w:val="single" w:sz="4" w:space="0" w:color="CBD5E1"/>
+              <w:left w:val="single" w:sz="4" w:space="0" w:color="CBD5E1"/>
+              <w:bottom w:val="single" w:sz="4" w:space="0" w:color="CBD5E1"/>
+              <w:right w:val="single" w:sz="4" w:space="0" w:color="CBD5E1"/>
             </w:tcBorders>
-          </w:tcPr>
-          <w:p>
-            <w:pPr>
-              <w:spacing w:after="0" w:line="240" w:lineRule="auto"/>
-              <w:rPr>
-                <w:rFonts w:eastAsia="Times New Roman" w:cstheme="minorHAnsi"/>
-                <w:color w:val="000000"/>
-                <w:lang w:val="en-US"/>
-              </w:rPr>
-            </w:pPr>
+            <w:vAlign w:val="top"/>
+            <w:tcMar>
+              <w:top w:w="80" w:type="dxa"/>
+              <w:left w:w="80" w:type="dxa"/>
+              <w:bottom w:w="80" w:type="dxa"/>
+              <w:right w:w="80" w:type="dxa"/>
+            </w:tcMar>
+          </w:tcPr>
+          <w:p>
+            <w:pPr>
+              <w:jc w:val="left"/>
+              <w:spacing w:after="40" w:line="264" w:lineRule="auto"/>
+            </w:pPr>
+            <w:r>
+              <w:rPr>
+                <w:sz w:val="20"/>
+                <w:szCs w:val="20"/>
+                <w:rFonts w:ascii="Arial" w:hAnsi="Arial" w:cs="Arial"/>
+                <w:color w:val="334155"/>
+              </w:rPr>
+              <w:t xml:space="preserve">Allows Academic Admin, Teacher, and Center Director to securely log into CLS using email and password credentials. The system validates credentials, tracks login activity, and redirects users to the appropriate dashboard based on their role.</w:t>
+            </w:r>
           </w:p>
         </w:tc>
       </w:tr>
       <w:tr>
-        <w:trPr>
-          <w:trHeight w:val="288"/>
-        </w:trPr>
-        <w:tc>
-          <w:tcPr>
-            <w:tcW w:w="520" w:type="dxa"/>
+        <w:tc>
+          <w:tcPr>
             <w:tcBorders>
-              <w:top w:val="nil"/>
-              <w:left w:val="single" w:sz="4" w:space="0" w:color="auto"/>
-              <w:bottom w:val="single" w:sz="4" w:space="0" w:color="auto"/>
-              <w:right w:val="single" w:sz="4" w:space="0" w:color="auto"/>
+              <w:top w:val="single" w:sz="4" w:space="0" w:color="CBD5E1"/>
+              <w:left w:val="single" w:sz="4" w:space="0" w:color="CBD5E1"/>
+              <w:bottom w:val="single" w:sz="4" w:space="0" w:color="CBD5E1"/>
+              <w:right w:val="single" w:sz="4" w:space="0" w:color="CBD5E1"/>
             </w:tcBorders>
-          </w:tcPr>
-          <w:p>
-            <w:pPr>
-              <w:spacing w:after="0" w:line="240" w:lineRule="auto"/>
+            <w:vAlign w:val="top"/>
+            <w:tcMar>
+              <w:top w:w="80" w:type="dxa"/>
+              <w:left w:w="80" w:type="dxa"/>
+              <w:bottom w:w="80" w:type="dxa"/>
+              <w:right w:w="80" w:type="dxa"/>
+            </w:tcMar>
+          </w:tcPr>
+          <w:p>
+            <w:pPr>
               <w:jc w:val="center"/>
-              <w:rPr>
-                <w:rFonts w:eastAsia="Times New Roman" w:cstheme="minorHAnsi"/>
-                <w:color w:val="000000"/>
-                <w:lang w:val="en-US"/>
-              </w:rPr>
-            </w:pPr>
-            <w:r>
-              <w:rPr>
-                <w:rFonts w:eastAsia="Times New Roman" w:cstheme="minorHAnsi"/>
-                <w:color w:val="000000"/>
-                <w:lang w:val="en-US"/>
-              </w:rPr>
-              <w:t>02</w:t>
-            </w:r>
-          </w:p>
-        </w:tc>
-        <w:tc>
-          <w:tcPr>
-            <w:tcW w:w="1890" w:type="dxa"/>
+              <w:spacing w:after="40" w:line="264" w:lineRule="auto"/>
+            </w:pPr>
+            <w:r>
+              <w:rPr>
+                <w:b/>
+                <w:sz w:val="20"/>
+                <w:szCs w:val="20"/>
+                <w:rFonts w:ascii="Arial" w:hAnsi="Arial" w:cs="Arial"/>
+                <w:color w:val="0F172A"/>
+              </w:rPr>
+              <w:t xml:space="preserve">UC-02</w:t>
+            </w:r>
+          </w:p>
+        </w:tc>
+        <w:tc>
+          <w:tcPr>
             <w:tcBorders>
-              <w:top w:val="nil"/>
-              <w:left w:val="nil"/>
-              <w:bottom w:val="single" w:sz="4" w:space="0" w:color="auto"/>
-              <w:right w:val="single" w:sz="4" w:space="0" w:color="auto"/>
+              <w:top w:val="single" w:sz="4" w:space="0" w:color="CBD5E1"/>
+              <w:left w:val="single" w:sz="4" w:space="0" w:color="CBD5E1"/>
+              <w:bottom w:val="single" w:sz="4" w:space="0" w:color="CBD5E1"/>
+              <w:right w:val="single" w:sz="4" w:space="0" w:color="CBD5E1"/>
             </w:tcBorders>
-            <w:shd w:val="clear" w:color="auto" w:fill="auto"/>
-            <w:noWrap/>
-            <w:hideMark/>
-          </w:tcPr>
-          <w:p>
-            <w:pPr>
-              <w:spacing w:after="0" w:line="240" w:lineRule="auto"/>
-              <w:rPr>
-                <w:rFonts w:eastAsia="Times New Roman" w:cstheme="minorHAnsi"/>
-                <w:color w:val="000000"/>
-                <w:lang w:val="en-US"/>
-              </w:rPr>
-            </w:pPr>
-            <w:r>
-              <w:rPr>
-                <w:rFonts w:eastAsia="Times New Roman" w:cstheme="minorHAnsi"/>
-                <w:lang w:val="en-US"/>
-              </w:rPr>
-              <w:t>Order a Meal</w:t>
-            </w:r>
-          </w:p>
-        </w:tc>
-        <w:tc>
-          <w:tcPr>
-            <w:tcW w:w="1701" w:type="dxa"/>
+            <w:vAlign w:val="top"/>
+            <w:tcMar>
+              <w:top w:w="80" w:type="dxa"/>
+              <w:left w:w="80" w:type="dxa"/>
+              <w:bottom w:w="80" w:type="dxa"/>
+              <w:right w:w="80" w:type="dxa"/>
+            </w:tcMar>
+          </w:tcPr>
+          <w:p>
+            <w:pPr>
+              <w:jc w:val="left"/>
+              <w:spacing w:after="40" w:line="264" w:lineRule="auto"/>
+            </w:pPr>
+            <w:r>
+              <w:rPr>
+                <w:b/>
+                <w:sz w:val="20"/>
+                <w:szCs w:val="20"/>
+                <w:rFonts w:ascii="Arial" w:hAnsi="Arial" w:cs="Arial"/>
+                <w:color w:val="1D4ED8"/>
+              </w:rPr>
+              <w:t xml:space="preserve">Reset Password</w:t>
+            </w:r>
+          </w:p>
+        </w:tc>
+        <w:tc>
+          <w:tcPr>
             <w:tcBorders>
-              <w:top w:val="nil"/>
-              <w:left w:val="nil"/>
-              <w:bottom w:val="single" w:sz="4" w:space="0" w:color="auto"/>
-              <w:right w:val="single" w:sz="4" w:space="0" w:color="auto"/>
+              <w:top w:val="single" w:sz="4" w:space="0" w:color="CBD5E1"/>
+              <w:left w:val="single" w:sz="4" w:space="0" w:color="CBD5E1"/>
+              <w:bottom w:val="single" w:sz="4" w:space="0" w:color="CBD5E1"/>
+              <w:right w:val="single" w:sz="4" w:space="0" w:color="CBD5E1"/>
             </w:tcBorders>
-            <w:shd w:val="clear" w:color="auto" w:fill="auto"/>
-            <w:noWrap/>
-            <w:hideMark/>
-          </w:tcPr>
-          <w:p>
-            <w:pPr>
-              <w:spacing w:after="0" w:line="240" w:lineRule="auto"/>
-              <w:rPr>
-                <w:rFonts w:eastAsia="Times New Roman" w:cstheme="minorHAnsi"/>
-                <w:color w:val="000000"/>
-                <w:lang w:val="en-US"/>
-              </w:rPr>
-            </w:pPr>
-            <w:r>
-              <w:rPr>
-                <w:rFonts w:eastAsia="Times New Roman" w:cstheme="minorHAnsi"/>
-                <w:color w:val="000000"/>
-                <w:lang w:val="en-US"/>
-              </w:rPr>
-              <w:t>Feature Name2</w:t>
-            </w:r>
-          </w:p>
-        </w:tc>
-        <w:tc>
-          <w:tcPr>
-            <w:tcW w:w="5103" w:type="dxa"/>
+            <w:vAlign w:val="top"/>
+            <w:tcMar>
+              <w:top w:w="80" w:type="dxa"/>
+              <w:left w:w="80" w:type="dxa"/>
+              <w:bottom w:w="80" w:type="dxa"/>
+              <w:right w:w="80" w:type="dxa"/>
+            </w:tcMar>
+          </w:tcPr>
+          <w:p>
+            <w:pPr>
+              <w:jc w:val="left"/>
+              <w:spacing w:after="40" w:line="264" w:lineRule="auto"/>
+            </w:pPr>
+            <w:r>
+              <w:rPr>
+                <w:sz w:val="20"/>
+                <w:szCs w:val="20"/>
+                <w:rFonts w:ascii="Arial" w:hAnsi="Arial" w:cs="Arial"/>
+                <w:color w:val="334155"/>
+              </w:rPr>
+              <w:t xml:space="preserve">User Authentication</w:t>
+            </w:r>
+          </w:p>
+        </w:tc>
+        <w:tc>
+          <w:tcPr>
             <w:tcBorders>
-              <w:top w:val="nil"/>
-              <w:left w:val="nil"/>
-              <w:bottom w:val="single" w:sz="4" w:space="0" w:color="auto"/>
-              <w:right w:val="single" w:sz="4" w:space="0" w:color="auto"/>
+              <w:top w:val="single" w:sz="4" w:space="0" w:color="CBD5E1"/>
+              <w:left w:val="single" w:sz="4" w:space="0" w:color="CBD5E1"/>
+              <w:bottom w:val="single" w:sz="4" w:space="0" w:color="CBD5E1"/>
+              <w:right w:val="single" w:sz="4" w:space="0" w:color="CBD5E1"/>
             </w:tcBorders>
-          </w:tcPr>
-          <w:p>
-            <w:pPr>
-              <w:spacing w:after="0" w:line="240" w:lineRule="auto"/>
-              <w:rPr>
-                <w:rFonts w:eastAsia="Times New Roman" w:cstheme="minorHAnsi"/>
-                <w:color w:val="000000"/>
-                <w:lang w:val="en-US"/>
-              </w:rPr>
-            </w:pPr>
+            <w:vAlign w:val="top"/>
+            <w:tcMar>
+              <w:top w:w="80" w:type="dxa"/>
+              <w:left w:w="80" w:type="dxa"/>
+              <w:bottom w:w="80" w:type="dxa"/>
+              <w:right w:w="80" w:type="dxa"/>
+            </w:tcMar>
+          </w:tcPr>
+          <w:p>
+            <w:pPr>
+              <w:jc w:val="left"/>
+              <w:spacing w:after="40" w:line="264" w:lineRule="auto"/>
+            </w:pPr>
+            <w:r>
+              <w:rPr>
+                <w:sz w:val="20"/>
+                <w:szCs w:val="20"/>
+                <w:rFonts w:ascii="Arial" w:hAnsi="Arial" w:cs="Arial"/>
+                <w:color w:val="334155"/>
+              </w:rPr>
+              <w:t xml:space="preserve">Allows authenticated users to reset their forgotten password via a verification email link. The system sends a password reset token to the registered email address and allows the user to set a new password within a time-limited window.</w:t>
+            </w:r>
           </w:p>
         </w:tc>
       </w:tr>
       <w:tr>
-        <w:trPr>
-          <w:trHeight w:val="288"/>
-        </w:trPr>
-        <w:tc>
-          <w:tcPr>
-            <w:tcW w:w="520" w:type="dxa"/>
+        <w:tc>
+          <w:tcPr>
             <w:tcBorders>
-              <w:top w:val="single" w:sz="4" w:space="0" w:color="auto"/>
-              <w:left w:val="single" w:sz="4" w:space="0" w:color="auto"/>
-              <w:bottom w:val="single" w:sz="4" w:space="0" w:color="auto"/>
-              <w:right w:val="single" w:sz="4" w:space="0" w:color="auto"/>
+              <w:top w:val="single" w:sz="4" w:space="0" w:color="CBD5E1"/>
+              <w:left w:val="single" w:sz="4" w:space="0" w:color="CBD5E1"/>
+              <w:bottom w:val="single" w:sz="4" w:space="0" w:color="CBD5E1"/>
+              <w:right w:val="single" w:sz="4" w:space="0" w:color="CBD5E1"/>
             </w:tcBorders>
-          </w:tcPr>
-          <w:p>
-            <w:pPr>
-              <w:spacing w:after="0" w:line="240" w:lineRule="auto"/>
+            <w:vAlign w:val="top"/>
+            <w:tcMar>
+              <w:top w:w="80" w:type="dxa"/>
+              <w:left w:w="80" w:type="dxa"/>
+              <w:bottom w:w="80" w:type="dxa"/>
+              <w:right w:w="80" w:type="dxa"/>
+            </w:tcMar>
+          </w:tcPr>
+          <w:p>
+            <w:pPr>
               <w:jc w:val="center"/>
-              <w:rPr>
-                <w:rFonts w:eastAsia="Times New Roman" w:cstheme="minorHAnsi"/>
-                <w:color w:val="000000"/>
-                <w:lang w:val="en-US"/>
-              </w:rPr>
-            </w:pPr>
-            <w:r>
-              <w:rPr>
-                <w:rFonts w:eastAsia="Times New Roman" w:cstheme="minorHAnsi"/>
-                <w:color w:val="000000"/>
-                <w:lang w:val="en-US"/>
-              </w:rPr>
-              <w:t>03</w:t>
-            </w:r>
-          </w:p>
-        </w:tc>
-        <w:tc>
-          <w:tcPr>
-            <w:tcW w:w="1890" w:type="dxa"/>
+              <w:spacing w:after="40" w:line="264" w:lineRule="auto"/>
+            </w:pPr>
+            <w:r>
+              <w:rPr>
+                <w:b/>
+                <w:sz w:val="20"/>
+                <w:szCs w:val="20"/>
+                <w:rFonts w:ascii="Arial" w:hAnsi="Arial" w:cs="Arial"/>
+                <w:color w:val="0F172A"/>
+              </w:rPr>
+              <w:t xml:space="preserve">UC-03</w:t>
+            </w:r>
+          </w:p>
+        </w:tc>
+        <w:tc>
+          <w:tcPr>
             <w:tcBorders>
-              <w:top w:val="single" w:sz="4" w:space="0" w:color="auto"/>
-              <w:left w:val="nil"/>
-              <w:bottom w:val="single" w:sz="4" w:space="0" w:color="auto"/>
-              <w:right w:val="single" w:sz="4" w:space="0" w:color="auto"/>
+              <w:top w:val="single" w:sz="4" w:space="0" w:color="CBD5E1"/>
+              <w:left w:val="single" w:sz="4" w:space="0" w:color="CBD5E1"/>
+              <w:bottom w:val="single" w:sz="4" w:space="0" w:color="CBD5E1"/>
+              <w:right w:val="single" w:sz="4" w:space="0" w:color="CBD5E1"/>
             </w:tcBorders>
-            <w:shd w:val="clear" w:color="auto" w:fill="auto"/>
-            <w:noWrap/>
-          </w:tcPr>
-          <w:p>
-            <w:pPr>
-              <w:spacing w:after="0" w:line="240" w:lineRule="auto"/>
-              <w:rPr>
-                <w:rFonts w:eastAsia="Times New Roman" w:cstheme="minorHAnsi"/>
-                <w:lang w:val="en-US"/>
-              </w:rPr>
-            </w:pPr>
-            <w:r>
-              <w:rPr>
-                <w:rFonts w:eastAsia="Times New Roman" w:cstheme="minorHAnsi"/>
-                <w:lang w:val="en-US"/>
-              </w:rPr>
-              <w:t>…</w:t>
-            </w:r>
-          </w:p>
-        </w:tc>
-        <w:tc>
-          <w:tcPr>
-            <w:tcW w:w="1701" w:type="dxa"/>
+            <w:vAlign w:val="top"/>
+            <w:tcMar>
+              <w:top w:w="80" w:type="dxa"/>
+              <w:left w:w="80" w:type="dxa"/>
+              <w:bottom w:w="80" w:type="dxa"/>
+              <w:right w:w="80" w:type="dxa"/>
+            </w:tcMar>
+          </w:tcPr>
+          <w:p>
+            <w:pPr>
+              <w:jc w:val="left"/>
+              <w:spacing w:after="40" w:line="264" w:lineRule="auto"/>
+            </w:pPr>
+            <w:r>
+              <w:rPr>
+                <w:b/>
+                <w:sz w:val="20"/>
+                <w:szCs w:val="20"/>
+                <w:rFonts w:ascii="Arial" w:hAnsi="Arial" w:cs="Arial"/>
+                <w:color w:val="1D4ED8"/>
+              </w:rPr>
+              <w:t xml:space="preserve">Enroll New Learner</w:t>
+            </w:r>
+          </w:p>
+        </w:tc>
+        <w:tc>
+          <w:tcPr>
             <w:tcBorders>
-              <w:top w:val="single" w:sz="4" w:space="0" w:color="auto"/>
-              <w:left w:val="nil"/>
-              <w:bottom w:val="single" w:sz="4" w:space="0" w:color="auto"/>
-              <w:right w:val="single" w:sz="4" w:space="0" w:color="auto"/>
+              <w:top w:val="single" w:sz="4" w:space="0" w:color="CBD5E1"/>
+              <w:left w:val="single" w:sz="4" w:space="0" w:color="CBD5E1"/>
+              <w:bottom w:val="single" w:sz="4" w:space="0" w:color="CBD5E1"/>
+              <w:right w:val="single" w:sz="4" w:space="0" w:color="CBD5E1"/>
             </w:tcBorders>
-            <w:shd w:val="clear" w:color="auto" w:fill="auto"/>
-            <w:noWrap/>
-          </w:tcPr>
-          <w:p>
-            <w:pPr>
-              <w:spacing w:after="0" w:line="240" w:lineRule="auto"/>
-              <w:rPr>
-                <w:rFonts w:eastAsia="Times New Roman" w:cstheme="minorHAnsi"/>
-                <w:color w:val="000000"/>
-                <w:lang w:val="en-US"/>
-              </w:rPr>
-            </w:pPr>
-          </w:p>
-        </w:tc>
-        <w:tc>
-          <w:tcPr>
-            <w:tcW w:w="5103" w:type="dxa"/>
+            <w:vAlign w:val="top"/>
+            <w:tcMar>
+              <w:top w:w="80" w:type="dxa"/>
+              <w:left w:w="80" w:type="dxa"/>
+              <w:bottom w:w="80" w:type="dxa"/>
+              <w:right w:w="80" w:type="dxa"/>
+            </w:tcMar>
+          </w:tcPr>
+          <w:p>
+            <w:pPr>
+              <w:jc w:val="left"/>
+              <w:spacing w:after="40" w:line="264" w:lineRule="auto"/>
+            </w:pPr>
+            <w:r>
+              <w:rPr>
+                <w:sz w:val="20"/>
+                <w:szCs w:val="20"/>
+                <w:rFonts w:ascii="Arial" w:hAnsi="Arial" w:cs="Arial"/>
+                <w:color w:val="334155"/>
+              </w:rPr>
+              <w:t xml:space="preserve">Learner Management</w:t>
+            </w:r>
+          </w:p>
+        </w:tc>
+        <w:tc>
+          <w:tcPr>
             <w:tcBorders>
-              <w:top w:val="single" w:sz="4" w:space="0" w:color="auto"/>
-              <w:left w:val="nil"/>
-              <w:bottom w:val="single" w:sz="4" w:space="0" w:color="auto"/>
-              <w:right w:val="single" w:sz="4" w:space="0" w:color="auto"/>
+              <w:top w:val="single" w:sz="4" w:space="0" w:color="CBD5E1"/>
+              <w:left w:val="single" w:sz="4" w:space="0" w:color="CBD5E1"/>
+              <w:bottom w:val="single" w:sz="4" w:space="0" w:color="CBD5E1"/>
+              <w:right w:val="single" w:sz="4" w:space="0" w:color="CBD5E1"/>
             </w:tcBorders>
-          </w:tcPr>
-          <w:p>
-            <w:pPr>
-              <w:spacing w:after="0" w:line="240" w:lineRule="auto"/>
-              <w:rPr>
-                <w:rFonts w:eastAsia="Times New Roman" w:cstheme="minorHAnsi"/>
-                <w:color w:val="000000"/>
-                <w:lang w:val="en-US"/>
-              </w:rPr>
-            </w:pPr>
+            <w:vAlign w:val="top"/>
+            <w:tcMar>
+              <w:top w:w="80" w:type="dxa"/>
+              <w:left w:w="80" w:type="dxa"/>
+              <w:bottom w:w="80" w:type="dxa"/>
+              <w:right w:w="80" w:type="dxa"/>
+            </w:tcMar>
+          </w:tcPr>
+          <w:p>
+            <w:pPr>
+              <w:jc w:val="left"/>
+              <w:spacing w:after="40" w:line="264" w:lineRule="auto"/>
+            </w:pPr>
+            <w:r>
+              <w:rPr>
+                <w:sz w:val="20"/>
+                <w:szCs w:val="20"/>
+                <w:rFonts w:ascii="Arial" w:hAnsi="Arial" w:cs="Arial"/>
+                <w:color w:val="334155"/>
+              </w:rPr>
+              <w:t xml:space="preserve">Allows the Academic Admin to register a new learner into the system by entering personal details, Parent (Sponsor) contact information, and initial Learning Package selection. Upon successful enrollment, parent email is stored for automated Notification dispatch.</w:t>
+            </w:r>
+          </w:p>
+        </w:tc>
+      </w:tr>
+      <w:tr>
+        <w:tc>
+          <w:tcPr>
+            <w:tcBorders>
+              <w:top w:val="single" w:sz="4" w:space="0" w:color="CBD5E1"/>
+              <w:left w:val="single" w:sz="4" w:space="0" w:color="CBD5E1"/>
+              <w:bottom w:val="single" w:sz="4" w:space="0" w:color="CBD5E1"/>
+              <w:right w:val="single" w:sz="4" w:space="0" w:color="CBD5E1"/>
+            </w:tcBorders>
+            <w:vAlign w:val="top"/>
+            <w:tcMar>
+              <w:top w:w="80" w:type="dxa"/>
+              <w:left w:w="80" w:type="dxa"/>
+              <w:bottom w:w="80" w:type="dxa"/>
+              <w:right w:w="80" w:type="dxa"/>
+            </w:tcMar>
+          </w:tcPr>
+          <w:p>
+            <w:pPr>
+              <w:jc w:val="center"/>
+              <w:spacing w:after="40" w:line="264" w:lineRule="auto"/>
+            </w:pPr>
+            <w:r>
+              <w:rPr>
+                <w:b/>
+                <w:sz w:val="20"/>
+                <w:szCs w:val="20"/>
+                <w:rFonts w:ascii="Arial" w:hAnsi="Arial" w:cs="Arial"/>
+                <w:color w:val="0F172A"/>
+              </w:rPr>
+              <w:t xml:space="preserve">UC-04</w:t>
+            </w:r>
+          </w:p>
+        </w:tc>
+        <w:tc>
+          <w:tcPr>
+            <w:tcBorders>
+              <w:top w:val="single" w:sz="4" w:space="0" w:color="CBD5E1"/>
+              <w:left w:val="single" w:sz="4" w:space="0" w:color="CBD5E1"/>
+              <w:bottom w:val="single" w:sz="4" w:space="0" w:color="CBD5E1"/>
+              <w:right w:val="single" w:sz="4" w:space="0" w:color="CBD5E1"/>
+            </w:tcBorders>
+            <w:vAlign w:val="top"/>
+            <w:tcMar>
+              <w:top w:w="80" w:type="dxa"/>
+              <w:left w:w="80" w:type="dxa"/>
+              <w:bottom w:w="80" w:type="dxa"/>
+              <w:right w:w="80" w:type="dxa"/>
+            </w:tcMar>
+          </w:tcPr>
+          <w:p>
+            <w:pPr>
+              <w:jc w:val="left"/>
+              <w:spacing w:after="40" w:line="264" w:lineRule="auto"/>
+            </w:pPr>
+            <w:r>
+              <w:rPr>
+                <w:b/>
+                <w:sz w:val="20"/>
+                <w:szCs w:val="20"/>
+                <w:rFonts w:ascii="Arial" w:hAnsi="Arial" w:cs="Arial"/>
+                <w:color w:val="1D4ED8"/>
+              </w:rPr>
+              <w:t xml:space="preserve">View Learner List</w:t>
+            </w:r>
+          </w:p>
+        </w:tc>
+        <w:tc>
+          <w:tcPr>
+            <w:tcBorders>
+              <w:top w:val="single" w:sz="4" w:space="0" w:color="CBD5E1"/>
+              <w:left w:val="single" w:sz="4" w:space="0" w:color="CBD5E1"/>
+              <w:bottom w:val="single" w:sz="4" w:space="0" w:color="CBD5E1"/>
+              <w:right w:val="single" w:sz="4" w:space="0" w:color="CBD5E1"/>
+            </w:tcBorders>
+            <w:vAlign w:val="top"/>
+            <w:tcMar>
+              <w:top w:w="80" w:type="dxa"/>
+              <w:left w:w="80" w:type="dxa"/>
+              <w:bottom w:w="80" w:type="dxa"/>
+              <w:right w:w="80" w:type="dxa"/>
+            </w:tcMar>
+          </w:tcPr>
+          <w:p>
+            <w:pPr>
+              <w:jc w:val="left"/>
+              <w:spacing w:after="40" w:line="264" w:lineRule="auto"/>
+            </w:pPr>
+            <w:r>
+              <w:rPr>
+                <w:sz w:val="20"/>
+                <w:szCs w:val="20"/>
+                <w:rFonts w:ascii="Arial" w:hAnsi="Arial" w:cs="Arial"/>
+                <w:color w:val="334155"/>
+              </w:rPr>
+              <w:t xml:space="preserve">Learner Management</w:t>
+            </w:r>
+          </w:p>
+        </w:tc>
+        <w:tc>
+          <w:tcPr>
+            <w:tcBorders>
+              <w:top w:val="single" w:sz="4" w:space="0" w:color="CBD5E1"/>
+              <w:left w:val="single" w:sz="4" w:space="0" w:color="CBD5E1"/>
+              <w:bottom w:val="single" w:sz="4" w:space="0" w:color="CBD5E1"/>
+              <w:right w:val="single" w:sz="4" w:space="0" w:color="CBD5E1"/>
+            </w:tcBorders>
+            <w:vAlign w:val="top"/>
+            <w:tcMar>
+              <w:top w:w="80" w:type="dxa"/>
+              <w:left w:w="80" w:type="dxa"/>
+              <w:bottom w:w="80" w:type="dxa"/>
+              <w:right w:w="80" w:type="dxa"/>
+            </w:tcMar>
+          </w:tcPr>
+          <w:p>
+            <w:pPr>
+              <w:jc w:val="left"/>
+              <w:spacing w:after="40" w:line="264" w:lineRule="auto"/>
+            </w:pPr>
+            <w:r>
+              <w:rPr>
+                <w:sz w:val="20"/>
+                <w:szCs w:val="20"/>
+                <w:rFonts w:ascii="Arial" w:hAnsi="Arial" w:cs="Arial"/>
+                <w:color w:val="334155"/>
+              </w:rPr>
+              <w:t xml:space="preserve">Allows the Academic Admin and Center Director to view, search, filter, and sort the list of all learners. The list displays learner name, status (Active / Inactive / Withdrawn), assigned Learning Package, remaining sessions, and associated Parent contact.</w:t>
+            </w:r>
+          </w:p>
+        </w:tc>
+      </w:tr>
+      <w:tr>
+        <w:tc>
+          <w:tcPr>
+            <w:tcBorders>
+              <w:top w:val="single" w:sz="4" w:space="0" w:color="CBD5E1"/>
+              <w:left w:val="single" w:sz="4" w:space="0" w:color="CBD5E1"/>
+              <w:bottom w:val="single" w:sz="4" w:space="0" w:color="CBD5E1"/>
+              <w:right w:val="single" w:sz="4" w:space="0" w:color="CBD5E1"/>
+            </w:tcBorders>
+            <w:vAlign w:val="top"/>
+            <w:tcMar>
+              <w:top w:w="80" w:type="dxa"/>
+              <w:left w:w="80" w:type="dxa"/>
+              <w:bottom w:w="80" w:type="dxa"/>
+              <w:right w:w="80" w:type="dxa"/>
+            </w:tcMar>
+          </w:tcPr>
+          <w:p>
+            <w:pPr>
+              <w:jc w:val="center"/>
+              <w:spacing w:after="40" w:line="264" w:lineRule="auto"/>
+            </w:pPr>
+            <w:r>
+              <w:rPr>
+                <w:b/>
+                <w:sz w:val="20"/>
+                <w:szCs w:val="20"/>
+                <w:rFonts w:ascii="Arial" w:hAnsi="Arial" w:cs="Arial"/>
+                <w:color w:val="0F172A"/>
+              </w:rPr>
+              <w:t xml:space="preserve">UC-05</w:t>
+            </w:r>
+          </w:p>
+        </w:tc>
+        <w:tc>
+          <w:tcPr>
+            <w:tcBorders>
+              <w:top w:val="single" w:sz="4" w:space="0" w:color="CBD5E1"/>
+              <w:left w:val="single" w:sz="4" w:space="0" w:color="CBD5E1"/>
+              <w:bottom w:val="single" w:sz="4" w:space="0" w:color="CBD5E1"/>
+              <w:right w:val="single" w:sz="4" w:space="0" w:color="CBD5E1"/>
+            </w:tcBorders>
+            <w:vAlign w:val="top"/>
+            <w:tcMar>
+              <w:top w:w="80" w:type="dxa"/>
+              <w:left w:w="80" w:type="dxa"/>
+              <w:bottom w:w="80" w:type="dxa"/>
+              <w:right w:w="80" w:type="dxa"/>
+            </w:tcMar>
+          </w:tcPr>
+          <w:p>
+            <w:pPr>
+              <w:jc w:val="left"/>
+              <w:spacing w:after="40" w:line="264" w:lineRule="auto"/>
+            </w:pPr>
+            <w:r>
+              <w:rPr>
+                <w:b/>
+                <w:sz w:val="20"/>
+                <w:szCs w:val="20"/>
+                <w:rFonts w:ascii="Arial" w:hAnsi="Arial" w:cs="Arial"/>
+                <w:color w:val="1D4ED8"/>
+              </w:rPr>
+              <w:t xml:space="preserve">Update Learner Profile</w:t>
+            </w:r>
+          </w:p>
+        </w:tc>
+        <w:tc>
+          <w:tcPr>
+            <w:tcBorders>
+              <w:top w:val="single" w:sz="4" w:space="0" w:color="CBD5E1"/>
+              <w:left w:val="single" w:sz="4" w:space="0" w:color="CBD5E1"/>
+              <w:bottom w:val="single" w:sz="4" w:space="0" w:color="CBD5E1"/>
+              <w:right w:val="single" w:sz="4" w:space="0" w:color="CBD5E1"/>
+            </w:tcBorders>
+            <w:vAlign w:val="top"/>
+            <w:tcMar>
+              <w:top w:w="80" w:type="dxa"/>
+              <w:left w:w="80" w:type="dxa"/>
+              <w:bottom w:w="80" w:type="dxa"/>
+              <w:right w:w="80" w:type="dxa"/>
+            </w:tcMar>
+          </w:tcPr>
+          <w:p>
+            <w:pPr>
+              <w:jc w:val="left"/>
+              <w:spacing w:after="40" w:line="264" w:lineRule="auto"/>
+            </w:pPr>
+            <w:r>
+              <w:rPr>
+                <w:sz w:val="20"/>
+                <w:szCs w:val="20"/>
+                <w:rFonts w:ascii="Arial" w:hAnsi="Arial" w:cs="Arial"/>
+                <w:color w:val="334155"/>
+              </w:rPr>
+              <w:t xml:space="preserve">Learner Management</w:t>
+            </w:r>
+          </w:p>
+        </w:tc>
+        <w:tc>
+          <w:tcPr>
+            <w:tcBorders>
+              <w:top w:val="single" w:sz="4" w:space="0" w:color="CBD5E1"/>
+              <w:left w:val="single" w:sz="4" w:space="0" w:color="CBD5E1"/>
+              <w:bottom w:val="single" w:sz="4" w:space="0" w:color="CBD5E1"/>
+              <w:right w:val="single" w:sz="4" w:space="0" w:color="CBD5E1"/>
+            </w:tcBorders>
+            <w:vAlign w:val="top"/>
+            <w:tcMar>
+              <w:top w:w="80" w:type="dxa"/>
+              <w:left w:w="80" w:type="dxa"/>
+              <w:bottom w:w="80" w:type="dxa"/>
+              <w:right w:w="80" w:type="dxa"/>
+            </w:tcMar>
+          </w:tcPr>
+          <w:p>
+            <w:pPr>
+              <w:jc w:val="left"/>
+              <w:spacing w:after="40" w:line="264" w:lineRule="auto"/>
+            </w:pPr>
+            <w:r>
+              <w:rPr>
+                <w:sz w:val="20"/>
+                <w:szCs w:val="20"/>
+                <w:rFonts w:ascii="Arial" w:hAnsi="Arial" w:cs="Arial"/>
+                <w:color w:val="334155"/>
+              </w:rPr>
+              <w:t xml:space="preserve">Allows the Academic Admin to modify a learner's personal details, parent contact information, or enrollment status. Status transitions include Active → Inactive, Active → Withdrawn, and Inactive → Active, following the center's operational policy.</w:t>
+            </w:r>
+          </w:p>
+        </w:tc>
+      </w:tr>
+      <w:tr>
+        <w:tc>
+          <w:tcPr>
+            <w:tcBorders>
+              <w:top w:val="single" w:sz="4" w:space="0" w:color="CBD5E1"/>
+              <w:left w:val="single" w:sz="4" w:space="0" w:color="CBD5E1"/>
+              <w:bottom w:val="single" w:sz="4" w:space="0" w:color="CBD5E1"/>
+              <w:right w:val="single" w:sz="4" w:space="0" w:color="CBD5E1"/>
+            </w:tcBorders>
+            <w:vAlign w:val="top"/>
+            <w:tcMar>
+              <w:top w:w="80" w:type="dxa"/>
+              <w:left w:w="80" w:type="dxa"/>
+              <w:bottom w:w="80" w:type="dxa"/>
+              <w:right w:w="80" w:type="dxa"/>
+            </w:tcMar>
+          </w:tcPr>
+          <w:p>
+            <w:pPr>
+              <w:jc w:val="center"/>
+              <w:spacing w:after="40" w:line="264" w:lineRule="auto"/>
+            </w:pPr>
+            <w:r>
+              <w:rPr>
+                <w:b/>
+                <w:sz w:val="20"/>
+                <w:szCs w:val="20"/>
+                <w:rFonts w:ascii="Arial" w:hAnsi="Arial" w:cs="Arial"/>
+                <w:color w:val="0F172A"/>
+              </w:rPr>
+              <w:t xml:space="preserve">UC-06</w:t>
+            </w:r>
+          </w:p>
+        </w:tc>
+        <w:tc>
+          <w:tcPr>
+            <w:tcBorders>
+              <w:top w:val="single" w:sz="4" w:space="0" w:color="CBD5E1"/>
+              <w:left w:val="single" w:sz="4" w:space="0" w:color="CBD5E1"/>
+              <w:bottom w:val="single" w:sz="4" w:space="0" w:color="CBD5E1"/>
+              <w:right w:val="single" w:sz="4" w:space="0" w:color="CBD5E1"/>
+            </w:tcBorders>
+            <w:vAlign w:val="top"/>
+            <w:tcMar>
+              <w:top w:w="80" w:type="dxa"/>
+              <w:left w:w="80" w:type="dxa"/>
+              <w:bottom w:w="80" w:type="dxa"/>
+              <w:right w:w="80" w:type="dxa"/>
+            </w:tcMar>
+          </w:tcPr>
+          <w:p>
+            <w:pPr>
+              <w:jc w:val="left"/>
+              <w:spacing w:after="40" w:line="264" w:lineRule="auto"/>
+            </w:pPr>
+            <w:r>
+              <w:rPr>
+                <w:b/>
+                <w:sz w:val="20"/>
+                <w:szCs w:val="20"/>
+                <w:rFonts w:ascii="Arial" w:hAnsi="Arial" w:cs="Arial"/>
+                <w:color w:val="1D4ED8"/>
+              </w:rPr>
+              <w:t xml:space="preserve">Create Learning Package</w:t>
+            </w:r>
+          </w:p>
+        </w:tc>
+        <w:tc>
+          <w:tcPr>
+            <w:tcBorders>
+              <w:top w:val="single" w:sz="4" w:space="0" w:color="CBD5E1"/>
+              <w:left w:val="single" w:sz="4" w:space="0" w:color="CBD5E1"/>
+              <w:bottom w:val="single" w:sz="4" w:space="0" w:color="CBD5E1"/>
+              <w:right w:val="single" w:sz="4" w:space="0" w:color="CBD5E1"/>
+            </w:tcBorders>
+            <w:vAlign w:val="top"/>
+            <w:tcMar>
+              <w:top w:w="80" w:type="dxa"/>
+              <w:left w:w="80" w:type="dxa"/>
+              <w:bottom w:w="80" w:type="dxa"/>
+              <w:right w:w="80" w:type="dxa"/>
+            </w:tcMar>
+          </w:tcPr>
+          <w:p>
+            <w:pPr>
+              <w:jc w:val="left"/>
+              <w:spacing w:after="40" w:line="264" w:lineRule="auto"/>
+            </w:pPr>
+            <w:r>
+              <w:rPr>
+                <w:sz w:val="20"/>
+                <w:szCs w:val="20"/>
+                <w:rFonts w:ascii="Arial" w:hAnsi="Arial" w:cs="Arial"/>
+                <w:color w:val="334155"/>
+              </w:rPr>
+              <w:t xml:space="preserve">Learning Package Management</w:t>
+            </w:r>
+          </w:p>
+        </w:tc>
+        <w:tc>
+          <w:tcPr>
+            <w:tcBorders>
+              <w:top w:val="single" w:sz="4" w:space="0" w:color="CBD5E1"/>
+              <w:left w:val="single" w:sz="4" w:space="0" w:color="CBD5E1"/>
+              <w:bottom w:val="single" w:sz="4" w:space="0" w:color="CBD5E1"/>
+              <w:right w:val="single" w:sz="4" w:space="0" w:color="CBD5E1"/>
+            </w:tcBorders>
+            <w:vAlign w:val="top"/>
+            <w:tcMar>
+              <w:top w:w="80" w:type="dxa"/>
+              <w:left w:w="80" w:type="dxa"/>
+              <w:bottom w:w="80" w:type="dxa"/>
+              <w:right w:w="80" w:type="dxa"/>
+            </w:tcMar>
+          </w:tcPr>
+          <w:p>
+            <w:pPr>
+              <w:jc w:val="left"/>
+              <w:spacing w:after="40" w:line="264" w:lineRule="auto"/>
+            </w:pPr>
+            <w:r>
+              <w:rPr>
+                <w:sz w:val="20"/>
+                <w:szCs w:val="20"/>
+                <w:rFonts w:ascii="Arial" w:hAnsi="Arial" w:cs="Arial"/>
+                <w:color w:val="334155"/>
+              </w:rPr>
+              <w:t xml:space="preserve">Allows the Academic Admin to define a new Learning Package with attributes: package name, total number of sessions (or duration in months), tuition fee amount, and applicable subject area (English / Kids Coding).</w:t>
+            </w:r>
+          </w:p>
+        </w:tc>
+      </w:tr>
+      <w:tr>
+        <w:tc>
+          <w:tcPr>
+            <w:tcBorders>
+              <w:top w:val="single" w:sz="4" w:space="0" w:color="CBD5E1"/>
+              <w:left w:val="single" w:sz="4" w:space="0" w:color="CBD5E1"/>
+              <w:bottom w:val="single" w:sz="4" w:space="0" w:color="CBD5E1"/>
+              <w:right w:val="single" w:sz="4" w:space="0" w:color="CBD5E1"/>
+            </w:tcBorders>
+            <w:vAlign w:val="top"/>
+            <w:tcMar>
+              <w:top w:w="80" w:type="dxa"/>
+              <w:left w:w="80" w:type="dxa"/>
+              <w:bottom w:w="80" w:type="dxa"/>
+              <w:right w:w="80" w:type="dxa"/>
+            </w:tcMar>
+          </w:tcPr>
+          <w:p>
+            <w:pPr>
+              <w:jc w:val="center"/>
+              <w:spacing w:after="40" w:line="264" w:lineRule="auto"/>
+            </w:pPr>
+            <w:r>
+              <w:rPr>
+                <w:b/>
+                <w:sz w:val="20"/>
+                <w:szCs w:val="20"/>
+                <w:rFonts w:ascii="Arial" w:hAnsi="Arial" w:cs="Arial"/>
+                <w:color w:val="0F172A"/>
+              </w:rPr>
+              <w:t xml:space="preserve">UC-07</w:t>
+            </w:r>
+          </w:p>
+        </w:tc>
+        <w:tc>
+          <w:tcPr>
+            <w:tcBorders>
+              <w:top w:val="single" w:sz="4" w:space="0" w:color="CBD5E1"/>
+              <w:left w:val="single" w:sz="4" w:space="0" w:color="CBD5E1"/>
+              <w:bottom w:val="single" w:sz="4" w:space="0" w:color="CBD5E1"/>
+              <w:right w:val="single" w:sz="4" w:space="0" w:color="CBD5E1"/>
+            </w:tcBorders>
+            <w:vAlign w:val="top"/>
+            <w:tcMar>
+              <w:top w:w="80" w:type="dxa"/>
+              <w:left w:w="80" w:type="dxa"/>
+              <w:bottom w:w="80" w:type="dxa"/>
+              <w:right w:w="80" w:type="dxa"/>
+            </w:tcMar>
+          </w:tcPr>
+          <w:p>
+            <w:pPr>
+              <w:jc w:val="left"/>
+              <w:spacing w:after="40" w:line="264" w:lineRule="auto"/>
+            </w:pPr>
+            <w:r>
+              <w:rPr>
+                <w:b/>
+                <w:sz w:val="20"/>
+                <w:szCs w:val="20"/>
+                <w:rFonts w:ascii="Arial" w:hAnsi="Arial" w:cs="Arial"/>
+                <w:color w:val="1D4ED8"/>
+              </w:rPr>
+              <w:t xml:space="preserve">Assign Learning Package to Learner</w:t>
+            </w:r>
+          </w:p>
+        </w:tc>
+        <w:tc>
+          <w:tcPr>
+            <w:tcBorders>
+              <w:top w:val="single" w:sz="4" w:space="0" w:color="CBD5E1"/>
+              <w:left w:val="single" w:sz="4" w:space="0" w:color="CBD5E1"/>
+              <w:bottom w:val="single" w:sz="4" w:space="0" w:color="CBD5E1"/>
+              <w:right w:val="single" w:sz="4" w:space="0" w:color="CBD5E1"/>
+            </w:tcBorders>
+            <w:vAlign w:val="top"/>
+            <w:tcMar>
+              <w:top w:w="80" w:type="dxa"/>
+              <w:left w:w="80" w:type="dxa"/>
+              <w:bottom w:w="80" w:type="dxa"/>
+              <w:right w:w="80" w:type="dxa"/>
+            </w:tcMar>
+          </w:tcPr>
+          <w:p>
+            <w:pPr>
+              <w:jc w:val="left"/>
+              <w:spacing w:after="40" w:line="264" w:lineRule="auto"/>
+            </w:pPr>
+            <w:r>
+              <w:rPr>
+                <w:sz w:val="20"/>
+                <w:szCs w:val="20"/>
+                <w:rFonts w:ascii="Arial" w:hAnsi="Arial" w:cs="Arial"/>
+                <w:color w:val="334155"/>
+              </w:rPr>
+              <w:t xml:space="preserve">Learning Package Management</w:t>
+            </w:r>
+          </w:p>
+        </w:tc>
+        <w:tc>
+          <w:tcPr>
+            <w:tcBorders>
+              <w:top w:val="single" w:sz="4" w:space="0" w:color="CBD5E1"/>
+              <w:left w:val="single" w:sz="4" w:space="0" w:color="CBD5E1"/>
+              <w:bottom w:val="single" w:sz="4" w:space="0" w:color="CBD5E1"/>
+              <w:right w:val="single" w:sz="4" w:space="0" w:color="CBD5E1"/>
+            </w:tcBorders>
+            <w:vAlign w:val="top"/>
+            <w:tcMar>
+              <w:top w:w="80" w:type="dxa"/>
+              <w:left w:w="80" w:type="dxa"/>
+              <w:bottom w:w="80" w:type="dxa"/>
+              <w:right w:w="80" w:type="dxa"/>
+            </w:tcMar>
+          </w:tcPr>
+          <w:p>
+            <w:pPr>
+              <w:jc w:val="left"/>
+              <w:spacing w:after="40" w:line="264" w:lineRule="auto"/>
+            </w:pPr>
+            <w:r>
+              <w:rPr>
+                <w:sz w:val="20"/>
+                <w:szCs w:val="20"/>
+                <w:rFonts w:ascii="Arial" w:hAnsi="Arial" w:cs="Arial"/>
+                <w:color w:val="334155"/>
+              </w:rPr>
+              <w:t xml:space="preserve">Allows the Academic Admin to assign or renew a Learning Package for a specific learner. The system records the assignment date, calculates the expected expiration date, and initializes the remaining session counter for attendance deduction tracking.</w:t>
+            </w:r>
+          </w:p>
+        </w:tc>
+      </w:tr>
+      <w:tr>
+        <w:tc>
+          <w:tcPr>
+            <w:tcBorders>
+              <w:top w:val="single" w:sz="4" w:space="0" w:color="CBD5E1"/>
+              <w:left w:val="single" w:sz="4" w:space="0" w:color="CBD5E1"/>
+              <w:bottom w:val="single" w:sz="4" w:space="0" w:color="CBD5E1"/>
+              <w:right w:val="single" w:sz="4" w:space="0" w:color="CBD5E1"/>
+            </w:tcBorders>
+            <w:vAlign w:val="top"/>
+            <w:tcMar>
+              <w:top w:w="80" w:type="dxa"/>
+              <w:left w:w="80" w:type="dxa"/>
+              <w:bottom w:w="80" w:type="dxa"/>
+              <w:right w:w="80" w:type="dxa"/>
+            </w:tcMar>
+          </w:tcPr>
+          <w:p>
+            <w:pPr>
+              <w:jc w:val="center"/>
+              <w:spacing w:after="40" w:line="264" w:lineRule="auto"/>
+            </w:pPr>
+            <w:r>
+              <w:rPr>
+                <w:b/>
+                <w:sz w:val="20"/>
+                <w:szCs w:val="20"/>
+                <w:rFonts w:ascii="Arial" w:hAnsi="Arial" w:cs="Arial"/>
+                <w:color w:val="0F172A"/>
+              </w:rPr>
+              <w:t xml:space="preserve">UC-08</w:t>
+            </w:r>
+          </w:p>
+        </w:tc>
+        <w:tc>
+          <w:tcPr>
+            <w:tcBorders>
+              <w:top w:val="single" w:sz="4" w:space="0" w:color="CBD5E1"/>
+              <w:left w:val="single" w:sz="4" w:space="0" w:color="CBD5E1"/>
+              <w:bottom w:val="single" w:sz="4" w:space="0" w:color="CBD5E1"/>
+              <w:right w:val="single" w:sz="4" w:space="0" w:color="CBD5E1"/>
+            </w:tcBorders>
+            <w:vAlign w:val="top"/>
+            <w:tcMar>
+              <w:top w:w="80" w:type="dxa"/>
+              <w:left w:w="80" w:type="dxa"/>
+              <w:bottom w:w="80" w:type="dxa"/>
+              <w:right w:w="80" w:type="dxa"/>
+            </w:tcMar>
+          </w:tcPr>
+          <w:p>
+            <w:pPr>
+              <w:jc w:val="left"/>
+              <w:spacing w:after="40" w:line="264" w:lineRule="auto"/>
+            </w:pPr>
+            <w:r>
+              <w:rPr>
+                <w:b/>
+                <w:sz w:val="20"/>
+                <w:szCs w:val="20"/>
+                <w:rFonts w:ascii="Arial" w:hAnsi="Arial" w:cs="Arial"/>
+                <w:color w:val="1D4ED8"/>
+              </w:rPr>
+              <w:t xml:space="preserve">Track Package Remaining Sessions</w:t>
+            </w:r>
+          </w:p>
+        </w:tc>
+        <w:tc>
+          <w:tcPr>
+            <w:tcBorders>
+              <w:top w:val="single" w:sz="4" w:space="0" w:color="CBD5E1"/>
+              <w:left w:val="single" w:sz="4" w:space="0" w:color="CBD5E1"/>
+              <w:bottom w:val="single" w:sz="4" w:space="0" w:color="CBD5E1"/>
+              <w:right w:val="single" w:sz="4" w:space="0" w:color="CBD5E1"/>
+            </w:tcBorders>
+            <w:vAlign w:val="top"/>
+            <w:tcMar>
+              <w:top w:w="80" w:type="dxa"/>
+              <w:left w:w="80" w:type="dxa"/>
+              <w:bottom w:w="80" w:type="dxa"/>
+              <w:right w:w="80" w:type="dxa"/>
+            </w:tcMar>
+          </w:tcPr>
+          <w:p>
+            <w:pPr>
+              <w:jc w:val="left"/>
+              <w:spacing w:after="40" w:line="264" w:lineRule="auto"/>
+            </w:pPr>
+            <w:r>
+              <w:rPr>
+                <w:sz w:val="20"/>
+                <w:szCs w:val="20"/>
+                <w:rFonts w:ascii="Arial" w:hAnsi="Arial" w:cs="Arial"/>
+                <w:color w:val="334155"/>
+              </w:rPr>
+              <w:t xml:space="preserve">Learning Package Management</w:t>
+            </w:r>
+          </w:p>
+        </w:tc>
+        <w:tc>
+          <w:tcPr>
+            <w:tcBorders>
+              <w:top w:val="single" w:sz="4" w:space="0" w:color="CBD5E1"/>
+              <w:left w:val="single" w:sz="4" w:space="0" w:color="CBD5E1"/>
+              <w:bottom w:val="single" w:sz="4" w:space="0" w:color="CBD5E1"/>
+              <w:right w:val="single" w:sz="4" w:space="0" w:color="CBD5E1"/>
+            </w:tcBorders>
+            <w:vAlign w:val="top"/>
+            <w:tcMar>
+              <w:top w:w="80" w:type="dxa"/>
+              <w:left w:w="80" w:type="dxa"/>
+              <w:bottom w:w="80" w:type="dxa"/>
+              <w:right w:w="80" w:type="dxa"/>
+            </w:tcMar>
+          </w:tcPr>
+          <w:p>
+            <w:pPr>
+              <w:jc w:val="left"/>
+              <w:spacing w:after="40" w:line="264" w:lineRule="auto"/>
+            </w:pPr>
+            <w:r>
+              <w:rPr>
+                <w:sz w:val="20"/>
+                <w:szCs w:val="20"/>
+                <w:rFonts w:ascii="Arial" w:hAnsi="Arial" w:cs="Arial"/>
+                <w:color w:val="334155"/>
+              </w:rPr>
+              <w:t xml:space="preserve">Allows the Academic Admin to monitor real-time remaining sessions for each learner's Learning Package. Each recorded attendance automatically decrements the session counter. Supports filtering by expiry urgency and package type.</w:t>
+            </w:r>
+          </w:p>
+        </w:tc>
+      </w:tr>
+      <w:tr>
+        <w:tc>
+          <w:tcPr>
+            <w:tcBorders>
+              <w:top w:val="single" w:sz="4" w:space="0" w:color="CBD5E1"/>
+              <w:left w:val="single" w:sz="4" w:space="0" w:color="CBD5E1"/>
+              <w:bottom w:val="single" w:sz="4" w:space="0" w:color="CBD5E1"/>
+              <w:right w:val="single" w:sz="4" w:space="0" w:color="CBD5E1"/>
+            </w:tcBorders>
+            <w:vAlign w:val="top"/>
+            <w:tcMar>
+              <w:top w:w="80" w:type="dxa"/>
+              <w:left w:w="80" w:type="dxa"/>
+              <w:bottom w:w="80" w:type="dxa"/>
+              <w:right w:w="80" w:type="dxa"/>
+            </w:tcMar>
+          </w:tcPr>
+          <w:p>
+            <w:pPr>
+              <w:jc w:val="center"/>
+              <w:spacing w:after="40" w:line="264" w:lineRule="auto"/>
+            </w:pPr>
+            <w:r>
+              <w:rPr>
+                <w:b/>
+                <w:sz w:val="20"/>
+                <w:szCs w:val="20"/>
+                <w:rFonts w:ascii="Arial" w:hAnsi="Arial" w:cs="Arial"/>
+                <w:color w:val="0F172A"/>
+              </w:rPr>
+              <w:t xml:space="preserve">UC-09</w:t>
+            </w:r>
+          </w:p>
+        </w:tc>
+        <w:tc>
+          <w:tcPr>
+            <w:tcBorders>
+              <w:top w:val="single" w:sz="4" w:space="0" w:color="CBD5E1"/>
+              <w:left w:val="single" w:sz="4" w:space="0" w:color="CBD5E1"/>
+              <w:bottom w:val="single" w:sz="4" w:space="0" w:color="CBD5E1"/>
+              <w:right w:val="single" w:sz="4" w:space="0" w:color="CBD5E1"/>
+            </w:tcBorders>
+            <w:vAlign w:val="top"/>
+            <w:tcMar>
+              <w:top w:w="80" w:type="dxa"/>
+              <w:left w:w="80" w:type="dxa"/>
+              <w:bottom w:w="80" w:type="dxa"/>
+              <w:right w:w="80" w:type="dxa"/>
+            </w:tcMar>
+          </w:tcPr>
+          <w:p>
+            <w:pPr>
+              <w:jc w:val="left"/>
+              <w:spacing w:after="40" w:line="264" w:lineRule="auto"/>
+            </w:pPr>
+            <w:r>
+              <w:rPr>
+                <w:b/>
+                <w:sz w:val="20"/>
+                <w:szCs w:val="20"/>
+                <w:rFonts w:ascii="Arial" w:hAnsi="Arial" w:cs="Arial"/>
+                <w:color w:val="1D4ED8"/>
+              </w:rPr>
+              <w:t xml:space="preserve">Receive Package Expiry Alert</w:t>
+            </w:r>
+          </w:p>
+        </w:tc>
+        <w:tc>
+          <w:tcPr>
+            <w:tcBorders>
+              <w:top w:val="single" w:sz="4" w:space="0" w:color="CBD5E1"/>
+              <w:left w:val="single" w:sz="4" w:space="0" w:color="CBD5E1"/>
+              <w:bottom w:val="single" w:sz="4" w:space="0" w:color="CBD5E1"/>
+              <w:right w:val="single" w:sz="4" w:space="0" w:color="CBD5E1"/>
+            </w:tcBorders>
+            <w:vAlign w:val="top"/>
+            <w:tcMar>
+              <w:top w:w="80" w:type="dxa"/>
+              <w:left w:w="80" w:type="dxa"/>
+              <w:bottom w:w="80" w:type="dxa"/>
+              <w:right w:w="80" w:type="dxa"/>
+            </w:tcMar>
+          </w:tcPr>
+          <w:p>
+            <w:pPr>
+              <w:jc w:val="left"/>
+              <w:spacing w:after="40" w:line="264" w:lineRule="auto"/>
+            </w:pPr>
+            <w:r>
+              <w:rPr>
+                <w:sz w:val="20"/>
+                <w:szCs w:val="20"/>
+                <w:rFonts w:ascii="Arial" w:hAnsi="Arial" w:cs="Arial"/>
+                <w:color w:val="334155"/>
+              </w:rPr>
+              <w:t xml:space="preserve">Learning Package Management</w:t>
+            </w:r>
+          </w:p>
+        </w:tc>
+        <w:tc>
+          <w:tcPr>
+            <w:tcBorders>
+              <w:top w:val="single" w:sz="4" w:space="0" w:color="CBD5E1"/>
+              <w:left w:val="single" w:sz="4" w:space="0" w:color="CBD5E1"/>
+              <w:bottom w:val="single" w:sz="4" w:space="0" w:color="CBD5E1"/>
+              <w:right w:val="single" w:sz="4" w:space="0" w:color="CBD5E1"/>
+            </w:tcBorders>
+            <w:vAlign w:val="top"/>
+            <w:tcMar>
+              <w:top w:w="80" w:type="dxa"/>
+              <w:left w:w="80" w:type="dxa"/>
+              <w:bottom w:w="80" w:type="dxa"/>
+              <w:right w:w="80" w:type="dxa"/>
+            </w:tcMar>
+          </w:tcPr>
+          <w:p>
+            <w:pPr>
+              <w:jc w:val="left"/>
+              <w:spacing w:after="40" w:line="264" w:lineRule="auto"/>
+            </w:pPr>
+            <w:r>
+              <w:rPr>
+                <w:sz w:val="20"/>
+                <w:szCs w:val="20"/>
+                <w:rFonts w:ascii="Arial" w:hAnsi="Arial" w:cs="Arial"/>
+                <w:color w:val="334155"/>
+              </w:rPr>
+              <w:t xml:space="preserve">The system automatically generates an in-app alert to the Academic Admin exactly 2 weeks before a learner's Learning Package is fully depleted (based on remaining sessions or end date). This enables proactive outreach for renewal, directly addressing the 20% churn reduction target.</w:t>
+            </w:r>
+          </w:p>
+        </w:tc>
+      </w:tr>
+      <w:tr>
+        <w:tc>
+          <w:tcPr>
+            <w:tcBorders>
+              <w:top w:val="single" w:sz="4" w:space="0" w:color="CBD5E1"/>
+              <w:left w:val="single" w:sz="4" w:space="0" w:color="CBD5E1"/>
+              <w:bottom w:val="single" w:sz="4" w:space="0" w:color="CBD5E1"/>
+              <w:right w:val="single" w:sz="4" w:space="0" w:color="CBD5E1"/>
+            </w:tcBorders>
+            <w:vAlign w:val="top"/>
+            <w:tcMar>
+              <w:top w:w="80" w:type="dxa"/>
+              <w:left w:w="80" w:type="dxa"/>
+              <w:bottom w:w="80" w:type="dxa"/>
+              <w:right w:w="80" w:type="dxa"/>
+            </w:tcMar>
+          </w:tcPr>
+          <w:p>
+            <w:pPr>
+              <w:jc w:val="center"/>
+              <w:spacing w:after="40" w:line="264" w:lineRule="auto"/>
+            </w:pPr>
+            <w:r>
+              <w:rPr>
+                <w:b/>
+                <w:sz w:val="20"/>
+                <w:szCs w:val="20"/>
+                <w:rFonts w:ascii="Arial" w:hAnsi="Arial" w:cs="Arial"/>
+                <w:color w:val="0F172A"/>
+              </w:rPr>
+              <w:t xml:space="preserve">UC-10</w:t>
+            </w:r>
+          </w:p>
+        </w:tc>
+        <w:tc>
+          <w:tcPr>
+            <w:tcBorders>
+              <w:top w:val="single" w:sz="4" w:space="0" w:color="CBD5E1"/>
+              <w:left w:val="single" w:sz="4" w:space="0" w:color="CBD5E1"/>
+              <w:bottom w:val="single" w:sz="4" w:space="0" w:color="CBD5E1"/>
+              <w:right w:val="single" w:sz="4" w:space="0" w:color="CBD5E1"/>
+            </w:tcBorders>
+            <w:vAlign w:val="top"/>
+            <w:tcMar>
+              <w:top w:w="80" w:type="dxa"/>
+              <w:left w:w="80" w:type="dxa"/>
+              <w:bottom w:w="80" w:type="dxa"/>
+              <w:right w:w="80" w:type="dxa"/>
+            </w:tcMar>
+          </w:tcPr>
+          <w:p>
+            <w:pPr>
+              <w:jc w:val="left"/>
+              <w:spacing w:after="40" w:line="264" w:lineRule="auto"/>
+            </w:pPr>
+            <w:r>
+              <w:rPr>
+                <w:b/>
+                <w:sz w:val="20"/>
+                <w:szCs w:val="20"/>
+                <w:rFonts w:ascii="Arial" w:hAnsi="Arial" w:cs="Arial"/>
+                <w:color w:val="1D4ED8"/>
+              </w:rPr>
+              <w:t xml:space="preserve">Create Session Schedule</w:t>
+            </w:r>
+          </w:p>
+        </w:tc>
+        <w:tc>
+          <w:tcPr>
+            <w:tcBorders>
+              <w:top w:val="single" w:sz="4" w:space="0" w:color="CBD5E1"/>
+              <w:left w:val="single" w:sz="4" w:space="0" w:color="CBD5E1"/>
+              <w:bottom w:val="single" w:sz="4" w:space="0" w:color="CBD5E1"/>
+              <w:right w:val="single" w:sz="4" w:space="0" w:color="CBD5E1"/>
+            </w:tcBorders>
+            <w:vAlign w:val="top"/>
+            <w:tcMar>
+              <w:top w:w="80" w:type="dxa"/>
+              <w:left w:w="80" w:type="dxa"/>
+              <w:bottom w:w="80" w:type="dxa"/>
+              <w:right w:w="80" w:type="dxa"/>
+            </w:tcMar>
+          </w:tcPr>
+          <w:p>
+            <w:pPr>
+              <w:jc w:val="left"/>
+              <w:spacing w:after="40" w:line="264" w:lineRule="auto"/>
+            </w:pPr>
+            <w:r>
+              <w:rPr>
+                <w:sz w:val="20"/>
+                <w:szCs w:val="20"/>
+                <w:rFonts w:ascii="Arial" w:hAnsi="Arial" w:cs="Arial"/>
+                <w:color w:val="334155"/>
+              </w:rPr>
+              <w:t xml:space="preserve">Session Scheduling</w:t>
+            </w:r>
+          </w:p>
+        </w:tc>
+        <w:tc>
+          <w:tcPr>
+            <w:tcBorders>
+              <w:top w:val="single" w:sz="4" w:space="0" w:color="CBD5E1"/>
+              <w:left w:val="single" w:sz="4" w:space="0" w:color="CBD5E1"/>
+              <w:bottom w:val="single" w:sz="4" w:space="0" w:color="CBD5E1"/>
+              <w:right w:val="single" w:sz="4" w:space="0" w:color="CBD5E1"/>
+            </w:tcBorders>
+            <w:vAlign w:val="top"/>
+            <w:tcMar>
+              <w:top w:w="80" w:type="dxa"/>
+              <w:left w:w="80" w:type="dxa"/>
+              <w:bottom w:w="80" w:type="dxa"/>
+              <w:right w:w="80" w:type="dxa"/>
+            </w:tcMar>
+          </w:tcPr>
+          <w:p>
+            <w:pPr>
+              <w:jc w:val="left"/>
+              <w:spacing w:after="40" w:line="264" w:lineRule="auto"/>
+            </w:pPr>
+            <w:r>
+              <w:rPr>
+                <w:sz w:val="20"/>
+                <w:szCs w:val="20"/>
+                <w:rFonts w:ascii="Arial" w:hAnsi="Arial" w:cs="Arial"/>
+                <w:color w:val="334155"/>
+              </w:rPr>
+              <w:t xml:space="preserve">Allows the Academic Admin to schedule a new session by specifying date, time slot, classroom, assigned Teacher, subject, and the list of enrolled learners. Before saving, the system runs the Scheduling Conflict detection algorithm to prevent Teacher or room double-booking.</w:t>
+            </w:r>
+          </w:p>
+        </w:tc>
+      </w:tr>
+      <w:tr>
+        <w:tc>
+          <w:tcPr>
+            <w:tcBorders>
+              <w:top w:val="single" w:sz="4" w:space="0" w:color="CBD5E1"/>
+              <w:left w:val="single" w:sz="4" w:space="0" w:color="CBD5E1"/>
+              <w:bottom w:val="single" w:sz="4" w:space="0" w:color="CBD5E1"/>
+              <w:right w:val="single" w:sz="4" w:space="0" w:color="CBD5E1"/>
+            </w:tcBorders>
+            <w:vAlign w:val="top"/>
+            <w:tcMar>
+              <w:top w:w="80" w:type="dxa"/>
+              <w:left w:w="80" w:type="dxa"/>
+              <w:bottom w:w="80" w:type="dxa"/>
+              <w:right w:w="80" w:type="dxa"/>
+            </w:tcMar>
+          </w:tcPr>
+          <w:p>
+            <w:pPr>
+              <w:jc w:val="center"/>
+              <w:spacing w:after="40" w:line="264" w:lineRule="auto"/>
+            </w:pPr>
+            <w:r>
+              <w:rPr>
+                <w:b/>
+                <w:sz w:val="20"/>
+                <w:szCs w:val="20"/>
+                <w:rFonts w:ascii="Arial" w:hAnsi="Arial" w:cs="Arial"/>
+                <w:color w:val="0F172A"/>
+              </w:rPr>
+              <w:t xml:space="preserve">UC-11</w:t>
+            </w:r>
+          </w:p>
+        </w:tc>
+        <w:tc>
+          <w:tcPr>
+            <w:tcBorders>
+              <w:top w:val="single" w:sz="4" w:space="0" w:color="CBD5E1"/>
+              <w:left w:val="single" w:sz="4" w:space="0" w:color="CBD5E1"/>
+              <w:bottom w:val="single" w:sz="4" w:space="0" w:color="CBD5E1"/>
+              <w:right w:val="single" w:sz="4" w:space="0" w:color="CBD5E1"/>
+            </w:tcBorders>
+            <w:vAlign w:val="top"/>
+            <w:tcMar>
+              <w:top w:w="80" w:type="dxa"/>
+              <w:left w:w="80" w:type="dxa"/>
+              <w:bottom w:w="80" w:type="dxa"/>
+              <w:right w:w="80" w:type="dxa"/>
+            </w:tcMar>
+          </w:tcPr>
+          <w:p>
+            <w:pPr>
+              <w:jc w:val="left"/>
+              <w:spacing w:after="40" w:line="264" w:lineRule="auto"/>
+            </w:pPr>
+            <w:r>
+              <w:rPr>
+                <w:b/>
+                <w:sz w:val="20"/>
+                <w:szCs w:val="20"/>
+                <w:rFonts w:ascii="Arial" w:hAnsi="Arial" w:cs="Arial"/>
+                <w:color w:val="1D4ED8"/>
+              </w:rPr>
+              <w:t xml:space="preserve">Update Session Schedule</w:t>
+            </w:r>
+          </w:p>
+        </w:tc>
+        <w:tc>
+          <w:tcPr>
+            <w:tcBorders>
+              <w:top w:val="single" w:sz="4" w:space="0" w:color="CBD5E1"/>
+              <w:left w:val="single" w:sz="4" w:space="0" w:color="CBD5E1"/>
+              <w:bottom w:val="single" w:sz="4" w:space="0" w:color="CBD5E1"/>
+              <w:right w:val="single" w:sz="4" w:space="0" w:color="CBD5E1"/>
+            </w:tcBorders>
+            <w:vAlign w:val="top"/>
+            <w:tcMar>
+              <w:top w:w="80" w:type="dxa"/>
+              <w:left w:w="80" w:type="dxa"/>
+              <w:bottom w:w="80" w:type="dxa"/>
+              <w:right w:w="80" w:type="dxa"/>
+            </w:tcMar>
+          </w:tcPr>
+          <w:p>
+            <w:pPr>
+              <w:jc w:val="left"/>
+              <w:spacing w:after="40" w:line="264" w:lineRule="auto"/>
+            </w:pPr>
+            <w:r>
+              <w:rPr>
+                <w:sz w:val="20"/>
+                <w:szCs w:val="20"/>
+                <w:rFonts w:ascii="Arial" w:hAnsi="Arial" w:cs="Arial"/>
+                <w:color w:val="334155"/>
+              </w:rPr>
+              <w:t xml:space="preserve">Session Scheduling</w:t>
+            </w:r>
+          </w:p>
+        </w:tc>
+        <w:tc>
+          <w:tcPr>
+            <w:tcBorders>
+              <w:top w:val="single" w:sz="4" w:space="0" w:color="CBD5E1"/>
+              <w:left w:val="single" w:sz="4" w:space="0" w:color="CBD5E1"/>
+              <w:bottom w:val="single" w:sz="4" w:space="0" w:color="CBD5E1"/>
+              <w:right w:val="single" w:sz="4" w:space="0" w:color="CBD5E1"/>
+            </w:tcBorders>
+            <w:vAlign w:val="top"/>
+            <w:tcMar>
+              <w:top w:w="80" w:type="dxa"/>
+              <w:left w:w="80" w:type="dxa"/>
+              <w:bottom w:w="80" w:type="dxa"/>
+              <w:right w:w="80" w:type="dxa"/>
+            </w:tcMar>
+          </w:tcPr>
+          <w:p>
+            <w:pPr>
+              <w:jc w:val="left"/>
+              <w:spacing w:after="40" w:line="264" w:lineRule="auto"/>
+            </w:pPr>
+            <w:r>
+              <w:rPr>
+                <w:sz w:val="20"/>
+                <w:szCs w:val="20"/>
+                <w:rFonts w:ascii="Arial" w:hAnsi="Arial" w:cs="Arial"/>
+                <w:color w:val="334155"/>
+              </w:rPr>
+              <w:t xml:space="preserve">Allows the Academic Admin to modify an existing session's date, time, room, or Teacher assignment. The system re-validates all conflict rules upon each update. If any change affects the Parent-facing schedule, the system automatically triggers a Schedule Change Notification email to all associated Parents.</w:t>
+            </w:r>
+          </w:p>
+        </w:tc>
+      </w:tr>
+      <w:tr>
+        <w:tc>
+          <w:tcPr>
+            <w:tcBorders>
+              <w:top w:val="single" w:sz="4" w:space="0" w:color="CBD5E1"/>
+              <w:left w:val="single" w:sz="4" w:space="0" w:color="CBD5E1"/>
+              <w:bottom w:val="single" w:sz="4" w:space="0" w:color="CBD5E1"/>
+              <w:right w:val="single" w:sz="4" w:space="0" w:color="CBD5E1"/>
+            </w:tcBorders>
+            <w:vAlign w:val="top"/>
+            <w:tcMar>
+              <w:top w:w="80" w:type="dxa"/>
+              <w:left w:w="80" w:type="dxa"/>
+              <w:bottom w:w="80" w:type="dxa"/>
+              <w:right w:w="80" w:type="dxa"/>
+            </w:tcMar>
+          </w:tcPr>
+          <w:p>
+            <w:pPr>
+              <w:jc w:val="center"/>
+              <w:spacing w:after="40" w:line="264" w:lineRule="auto"/>
+            </w:pPr>
+            <w:r>
+              <w:rPr>
+                <w:b/>
+                <w:sz w:val="20"/>
+                <w:szCs w:val="20"/>
+                <w:rFonts w:ascii="Arial" w:hAnsi="Arial" w:cs="Arial"/>
+                <w:color w:val="0F172A"/>
+              </w:rPr>
+              <w:t xml:space="preserve">UC-12</w:t>
+            </w:r>
+          </w:p>
+        </w:tc>
+        <w:tc>
+          <w:tcPr>
+            <w:tcBorders>
+              <w:top w:val="single" w:sz="4" w:space="0" w:color="CBD5E1"/>
+              <w:left w:val="single" w:sz="4" w:space="0" w:color="CBD5E1"/>
+              <w:bottom w:val="single" w:sz="4" w:space="0" w:color="CBD5E1"/>
+              <w:right w:val="single" w:sz="4" w:space="0" w:color="CBD5E1"/>
+            </w:tcBorders>
+            <w:vAlign w:val="top"/>
+            <w:tcMar>
+              <w:top w:w="80" w:type="dxa"/>
+              <w:left w:w="80" w:type="dxa"/>
+              <w:bottom w:w="80" w:type="dxa"/>
+              <w:right w:w="80" w:type="dxa"/>
+            </w:tcMar>
+          </w:tcPr>
+          <w:p>
+            <w:pPr>
+              <w:jc w:val="left"/>
+              <w:spacing w:after="40" w:line="264" w:lineRule="auto"/>
+            </w:pPr>
+            <w:r>
+              <w:rPr>
+                <w:b/>
+                <w:sz w:val="20"/>
+                <w:szCs w:val="20"/>
+                <w:rFonts w:ascii="Arial" w:hAnsi="Arial" w:cs="Arial"/>
+                <w:color w:val="1D4ED8"/>
+              </w:rPr>
+              <w:t xml:space="preserve">View Session Timetable</w:t>
+            </w:r>
+          </w:p>
+        </w:tc>
+        <w:tc>
+          <w:tcPr>
+            <w:tcBorders>
+              <w:top w:val="single" w:sz="4" w:space="0" w:color="CBD5E1"/>
+              <w:left w:val="single" w:sz="4" w:space="0" w:color="CBD5E1"/>
+              <w:bottom w:val="single" w:sz="4" w:space="0" w:color="CBD5E1"/>
+              <w:right w:val="single" w:sz="4" w:space="0" w:color="CBD5E1"/>
+            </w:tcBorders>
+            <w:vAlign w:val="top"/>
+            <w:tcMar>
+              <w:top w:w="80" w:type="dxa"/>
+              <w:left w:w="80" w:type="dxa"/>
+              <w:bottom w:w="80" w:type="dxa"/>
+              <w:right w:w="80" w:type="dxa"/>
+            </w:tcMar>
+          </w:tcPr>
+          <w:p>
+            <w:pPr>
+              <w:jc w:val="left"/>
+              <w:spacing w:after="40" w:line="264" w:lineRule="auto"/>
+            </w:pPr>
+            <w:r>
+              <w:rPr>
+                <w:sz w:val="20"/>
+                <w:szCs w:val="20"/>
+                <w:rFonts w:ascii="Arial" w:hAnsi="Arial" w:cs="Arial"/>
+                <w:color w:val="334155"/>
+              </w:rPr>
+              <w:t xml:space="preserve">Session Scheduling</w:t>
+            </w:r>
+          </w:p>
+        </w:tc>
+        <w:tc>
+          <w:tcPr>
+            <w:tcBorders>
+              <w:top w:val="single" w:sz="4" w:space="0" w:color="CBD5E1"/>
+              <w:left w:val="single" w:sz="4" w:space="0" w:color="CBD5E1"/>
+              <w:bottom w:val="single" w:sz="4" w:space="0" w:color="CBD5E1"/>
+              <w:right w:val="single" w:sz="4" w:space="0" w:color="CBD5E1"/>
+            </w:tcBorders>
+            <w:vAlign w:val="top"/>
+            <w:tcMar>
+              <w:top w:w="80" w:type="dxa"/>
+              <w:left w:w="80" w:type="dxa"/>
+              <w:bottom w:w="80" w:type="dxa"/>
+              <w:right w:w="80" w:type="dxa"/>
+            </w:tcMar>
+          </w:tcPr>
+          <w:p>
+            <w:pPr>
+              <w:jc w:val="left"/>
+              <w:spacing w:after="40" w:line="264" w:lineRule="auto"/>
+            </w:pPr>
+            <w:r>
+              <w:rPr>
+                <w:sz w:val="20"/>
+                <w:szCs w:val="20"/>
+                <w:rFonts w:ascii="Arial" w:hAnsi="Arial" w:cs="Arial"/>
+                <w:color w:val="334155"/>
+              </w:rPr>
+              <w:t xml:space="preserve">Allows Academic Admin, Teacher, and Center Director to view the weekly/monthly session timetable. Teachers see only their own assigned sessions. Academic Admin and Center Director can view the full center-wide schedule with room utilization overview.</w:t>
+            </w:r>
+          </w:p>
+        </w:tc>
+      </w:tr>
+      <w:tr>
+        <w:tc>
+          <w:tcPr>
+            <w:tcBorders>
+              <w:top w:val="single" w:sz="4" w:space="0" w:color="CBD5E1"/>
+              <w:left w:val="single" w:sz="4" w:space="0" w:color="CBD5E1"/>
+              <w:bottom w:val="single" w:sz="4" w:space="0" w:color="CBD5E1"/>
+              <w:right w:val="single" w:sz="4" w:space="0" w:color="CBD5E1"/>
+            </w:tcBorders>
+            <w:vAlign w:val="top"/>
+            <w:tcMar>
+              <w:top w:w="80" w:type="dxa"/>
+              <w:left w:w="80" w:type="dxa"/>
+              <w:bottom w:w="80" w:type="dxa"/>
+              <w:right w:w="80" w:type="dxa"/>
+            </w:tcMar>
+          </w:tcPr>
+          <w:p>
+            <w:pPr>
+              <w:jc w:val="center"/>
+              <w:spacing w:after="40" w:line="264" w:lineRule="auto"/>
+            </w:pPr>
+            <w:r>
+              <w:rPr>
+                <w:b/>
+                <w:sz w:val="20"/>
+                <w:szCs w:val="20"/>
+                <w:rFonts w:ascii="Arial" w:hAnsi="Arial" w:cs="Arial"/>
+                <w:color w:val="0F172A"/>
+              </w:rPr>
+              <w:t xml:space="preserve">UC-13</w:t>
+            </w:r>
+          </w:p>
+        </w:tc>
+        <w:tc>
+          <w:tcPr>
+            <w:tcBorders>
+              <w:top w:val="single" w:sz="4" w:space="0" w:color="CBD5E1"/>
+              <w:left w:val="single" w:sz="4" w:space="0" w:color="CBD5E1"/>
+              <w:bottom w:val="single" w:sz="4" w:space="0" w:color="CBD5E1"/>
+              <w:right w:val="single" w:sz="4" w:space="0" w:color="CBD5E1"/>
+            </w:tcBorders>
+            <w:vAlign w:val="top"/>
+            <w:tcMar>
+              <w:top w:w="80" w:type="dxa"/>
+              <w:left w:w="80" w:type="dxa"/>
+              <w:bottom w:w="80" w:type="dxa"/>
+              <w:right w:w="80" w:type="dxa"/>
+            </w:tcMar>
+          </w:tcPr>
+          <w:p>
+            <w:pPr>
+              <w:jc w:val="left"/>
+              <w:spacing w:after="40" w:line="264" w:lineRule="auto"/>
+            </w:pPr>
+            <w:r>
+              <w:rPr>
+                <w:b/>
+                <w:sz w:val="20"/>
+                <w:szCs w:val="20"/>
+                <w:rFonts w:ascii="Arial" w:hAnsi="Arial" w:cs="Arial"/>
+                <w:color w:val="1D4ED8"/>
+              </w:rPr>
+              <w:t xml:space="preserve">Detect Scheduling Conflict</w:t>
+            </w:r>
+          </w:p>
+        </w:tc>
+        <w:tc>
+          <w:tcPr>
+            <w:tcBorders>
+              <w:top w:val="single" w:sz="4" w:space="0" w:color="CBD5E1"/>
+              <w:left w:val="single" w:sz="4" w:space="0" w:color="CBD5E1"/>
+              <w:bottom w:val="single" w:sz="4" w:space="0" w:color="CBD5E1"/>
+              <w:right w:val="single" w:sz="4" w:space="0" w:color="CBD5E1"/>
+            </w:tcBorders>
+            <w:vAlign w:val="top"/>
+            <w:tcMar>
+              <w:top w:w="80" w:type="dxa"/>
+              <w:left w:w="80" w:type="dxa"/>
+              <w:bottom w:w="80" w:type="dxa"/>
+              <w:right w:w="80" w:type="dxa"/>
+            </w:tcMar>
+          </w:tcPr>
+          <w:p>
+            <w:pPr>
+              <w:jc w:val="left"/>
+              <w:spacing w:after="40" w:line="264" w:lineRule="auto"/>
+            </w:pPr>
+            <w:r>
+              <w:rPr>
+                <w:sz w:val="20"/>
+                <w:szCs w:val="20"/>
+                <w:rFonts w:ascii="Arial" w:hAnsi="Arial" w:cs="Arial"/>
+                <w:color w:val="334155"/>
+              </w:rPr>
+              <w:t xml:space="preserve">Session Scheduling</w:t>
+            </w:r>
+          </w:p>
+        </w:tc>
+        <w:tc>
+          <w:tcPr>
+            <w:tcBorders>
+              <w:top w:val="single" w:sz="4" w:space="0" w:color="CBD5E1"/>
+              <w:left w:val="single" w:sz="4" w:space="0" w:color="CBD5E1"/>
+              <w:bottom w:val="single" w:sz="4" w:space="0" w:color="CBD5E1"/>
+              <w:right w:val="single" w:sz="4" w:space="0" w:color="CBD5E1"/>
+            </w:tcBorders>
+            <w:vAlign w:val="top"/>
+            <w:tcMar>
+              <w:top w:w="80" w:type="dxa"/>
+              <w:left w:w="80" w:type="dxa"/>
+              <w:bottom w:w="80" w:type="dxa"/>
+              <w:right w:w="80" w:type="dxa"/>
+            </w:tcMar>
+          </w:tcPr>
+          <w:p>
+            <w:pPr>
+              <w:jc w:val="left"/>
+              <w:spacing w:after="40" w:line="264" w:lineRule="auto"/>
+            </w:pPr>
+            <w:r>
+              <w:rPr>
+                <w:sz w:val="20"/>
+                <w:szCs w:val="20"/>
+                <w:rFonts w:ascii="Arial" w:hAnsi="Arial" w:cs="Arial"/>
+                <w:color w:val="334155"/>
+              </w:rPr>
+              <w:t xml:space="preserve">The system automatically validates every session creation or update against conflict-detection rules: (1) No two sessions can occupy the same room at the same time, (2) No Teacher can be assigned to overlapping sessions. If a conflict is detected, the system blocks the operation and displays a descriptive error message specifying the conflicting resource.</w:t>
+            </w:r>
+          </w:p>
+        </w:tc>
+      </w:tr>
+      <w:tr>
+        <w:tc>
+          <w:tcPr>
+            <w:tcBorders>
+              <w:top w:val="single" w:sz="4" w:space="0" w:color="CBD5E1"/>
+              <w:left w:val="single" w:sz="4" w:space="0" w:color="CBD5E1"/>
+              <w:bottom w:val="single" w:sz="4" w:space="0" w:color="CBD5E1"/>
+              <w:right w:val="single" w:sz="4" w:space="0" w:color="CBD5E1"/>
+            </w:tcBorders>
+            <w:vAlign w:val="top"/>
+            <w:tcMar>
+              <w:top w:w="80" w:type="dxa"/>
+              <w:left w:w="80" w:type="dxa"/>
+              <w:bottom w:w="80" w:type="dxa"/>
+              <w:right w:w="80" w:type="dxa"/>
+            </w:tcMar>
+          </w:tcPr>
+          <w:p>
+            <w:pPr>
+              <w:jc w:val="center"/>
+              <w:spacing w:after="40" w:line="264" w:lineRule="auto"/>
+            </w:pPr>
+            <w:r>
+              <w:rPr>
+                <w:b/>
+                <w:sz w:val="20"/>
+                <w:szCs w:val="20"/>
+                <w:rFonts w:ascii="Arial" w:hAnsi="Arial" w:cs="Arial"/>
+                <w:color w:val="0F172A"/>
+              </w:rPr>
+              <w:t xml:space="preserve">UC-14</w:t>
+            </w:r>
+          </w:p>
+        </w:tc>
+        <w:tc>
+          <w:tcPr>
+            <w:tcBorders>
+              <w:top w:val="single" w:sz="4" w:space="0" w:color="CBD5E1"/>
+              <w:left w:val="single" w:sz="4" w:space="0" w:color="CBD5E1"/>
+              <w:bottom w:val="single" w:sz="4" w:space="0" w:color="CBD5E1"/>
+              <w:right w:val="single" w:sz="4" w:space="0" w:color="CBD5E1"/>
+            </w:tcBorders>
+            <w:vAlign w:val="top"/>
+            <w:tcMar>
+              <w:top w:w="80" w:type="dxa"/>
+              <w:left w:w="80" w:type="dxa"/>
+              <w:bottom w:w="80" w:type="dxa"/>
+              <w:right w:w="80" w:type="dxa"/>
+            </w:tcMar>
+          </w:tcPr>
+          <w:p>
+            <w:pPr>
+              <w:jc w:val="left"/>
+              <w:spacing w:after="40" w:line="264" w:lineRule="auto"/>
+            </w:pPr>
+            <w:r>
+              <w:rPr>
+                <w:b/>
+                <w:sz w:val="20"/>
+                <w:szCs w:val="20"/>
+                <w:rFonts w:ascii="Arial" w:hAnsi="Arial" w:cs="Arial"/>
+                <w:color w:val="1D4ED8"/>
+              </w:rPr>
+              <w:t xml:space="preserve">Record Session Attendance</w:t>
+            </w:r>
+          </w:p>
+        </w:tc>
+        <w:tc>
+          <w:tcPr>
+            <w:tcBorders>
+              <w:top w:val="single" w:sz="4" w:space="0" w:color="CBD5E1"/>
+              <w:left w:val="single" w:sz="4" w:space="0" w:color="CBD5E1"/>
+              <w:bottom w:val="single" w:sz="4" w:space="0" w:color="CBD5E1"/>
+              <w:right w:val="single" w:sz="4" w:space="0" w:color="CBD5E1"/>
+            </w:tcBorders>
+            <w:vAlign w:val="top"/>
+            <w:tcMar>
+              <w:top w:w="80" w:type="dxa"/>
+              <w:left w:w="80" w:type="dxa"/>
+              <w:bottom w:w="80" w:type="dxa"/>
+              <w:right w:w="80" w:type="dxa"/>
+            </w:tcMar>
+          </w:tcPr>
+          <w:p>
+            <w:pPr>
+              <w:jc w:val="left"/>
+              <w:spacing w:after="40" w:line="264" w:lineRule="auto"/>
+            </w:pPr>
+            <w:r>
+              <w:rPr>
+                <w:sz w:val="20"/>
+                <w:szCs w:val="20"/>
+                <w:rFonts w:ascii="Arial" w:hAnsi="Arial" w:cs="Arial"/>
+                <w:color w:val="334155"/>
+              </w:rPr>
+              <w:t xml:space="preserve">Attendance Management</w:t>
+            </w:r>
+          </w:p>
+        </w:tc>
+        <w:tc>
+          <w:tcPr>
+            <w:tcBorders>
+              <w:top w:val="single" w:sz="4" w:space="0" w:color="CBD5E1"/>
+              <w:left w:val="single" w:sz="4" w:space="0" w:color="CBD5E1"/>
+              <w:bottom w:val="single" w:sz="4" w:space="0" w:color="CBD5E1"/>
+              <w:right w:val="single" w:sz="4" w:space="0" w:color="CBD5E1"/>
+            </w:tcBorders>
+            <w:vAlign w:val="top"/>
+            <w:tcMar>
+              <w:top w:w="80" w:type="dxa"/>
+              <w:left w:w="80" w:type="dxa"/>
+              <w:bottom w:w="80" w:type="dxa"/>
+              <w:right w:w="80" w:type="dxa"/>
+            </w:tcMar>
+          </w:tcPr>
+          <w:p>
+            <w:pPr>
+              <w:jc w:val="left"/>
+              <w:spacing w:after="40" w:line="264" w:lineRule="auto"/>
+            </w:pPr>
+            <w:r>
+              <w:rPr>
+                <w:sz w:val="20"/>
+                <w:szCs w:val="20"/>
+                <w:rFonts w:ascii="Arial" w:hAnsi="Arial" w:cs="Arial"/>
+                <w:color w:val="334155"/>
+              </w:rPr>
+              <w:t xml:space="preserve">Allows the Academic Admin (or Teacher) to mark each learner as Present, Absent, or Late for a specific session. Upon saving, the system: (1) decrements the learner's remaining sessions in their Learning Package, (2) automatically triggers an Attendance Notification email to the Parent, and (3) logs the attendance record for historical tracking.</w:t>
+            </w:r>
+          </w:p>
+        </w:tc>
+      </w:tr>
+      <w:tr>
+        <w:tc>
+          <w:tcPr>
+            <w:tcBorders>
+              <w:top w:val="single" w:sz="4" w:space="0" w:color="CBD5E1"/>
+              <w:left w:val="single" w:sz="4" w:space="0" w:color="CBD5E1"/>
+              <w:bottom w:val="single" w:sz="4" w:space="0" w:color="CBD5E1"/>
+              <w:right w:val="single" w:sz="4" w:space="0" w:color="CBD5E1"/>
+            </w:tcBorders>
+            <w:vAlign w:val="top"/>
+            <w:tcMar>
+              <w:top w:w="80" w:type="dxa"/>
+              <w:left w:w="80" w:type="dxa"/>
+              <w:bottom w:w="80" w:type="dxa"/>
+              <w:right w:w="80" w:type="dxa"/>
+            </w:tcMar>
+          </w:tcPr>
+          <w:p>
+            <w:pPr>
+              <w:jc w:val="center"/>
+              <w:spacing w:after="40" w:line="264" w:lineRule="auto"/>
+            </w:pPr>
+            <w:r>
+              <w:rPr>
+                <w:b/>
+                <w:sz w:val="20"/>
+                <w:szCs w:val="20"/>
+                <w:rFonts w:ascii="Arial" w:hAnsi="Arial" w:cs="Arial"/>
+                <w:color w:val="0F172A"/>
+              </w:rPr>
+              <w:t xml:space="preserve">UC-15</w:t>
+            </w:r>
+          </w:p>
+        </w:tc>
+        <w:tc>
+          <w:tcPr>
+            <w:tcBorders>
+              <w:top w:val="single" w:sz="4" w:space="0" w:color="CBD5E1"/>
+              <w:left w:val="single" w:sz="4" w:space="0" w:color="CBD5E1"/>
+              <w:bottom w:val="single" w:sz="4" w:space="0" w:color="CBD5E1"/>
+              <w:right w:val="single" w:sz="4" w:space="0" w:color="CBD5E1"/>
+            </w:tcBorders>
+            <w:vAlign w:val="top"/>
+            <w:tcMar>
+              <w:top w:w="80" w:type="dxa"/>
+              <w:left w:w="80" w:type="dxa"/>
+              <w:bottom w:w="80" w:type="dxa"/>
+              <w:right w:w="80" w:type="dxa"/>
+            </w:tcMar>
+          </w:tcPr>
+          <w:p>
+            <w:pPr>
+              <w:jc w:val="left"/>
+              <w:spacing w:after="40" w:line="264" w:lineRule="auto"/>
+            </w:pPr>
+            <w:r>
+              <w:rPr>
+                <w:b/>
+                <w:sz w:val="20"/>
+                <w:szCs w:val="20"/>
+                <w:rFonts w:ascii="Arial" w:hAnsi="Arial" w:cs="Arial"/>
+                <w:color w:val="1D4ED8"/>
+              </w:rPr>
+              <w:t xml:space="preserve">View Attendance History</w:t>
+            </w:r>
+          </w:p>
+        </w:tc>
+        <w:tc>
+          <w:tcPr>
+            <w:tcBorders>
+              <w:top w:val="single" w:sz="4" w:space="0" w:color="CBD5E1"/>
+              <w:left w:val="single" w:sz="4" w:space="0" w:color="CBD5E1"/>
+              <w:bottom w:val="single" w:sz="4" w:space="0" w:color="CBD5E1"/>
+              <w:right w:val="single" w:sz="4" w:space="0" w:color="CBD5E1"/>
+            </w:tcBorders>
+            <w:vAlign w:val="top"/>
+            <w:tcMar>
+              <w:top w:w="80" w:type="dxa"/>
+              <w:left w:w="80" w:type="dxa"/>
+              <w:bottom w:w="80" w:type="dxa"/>
+              <w:right w:w="80" w:type="dxa"/>
+            </w:tcMar>
+          </w:tcPr>
+          <w:p>
+            <w:pPr>
+              <w:jc w:val="left"/>
+              <w:spacing w:after="40" w:line="264" w:lineRule="auto"/>
+            </w:pPr>
+            <w:r>
+              <w:rPr>
+                <w:sz w:val="20"/>
+                <w:szCs w:val="20"/>
+                <w:rFonts w:ascii="Arial" w:hAnsi="Arial" w:cs="Arial"/>
+                <w:color w:val="334155"/>
+              </w:rPr>
+              <w:t xml:space="preserve">Attendance Management</w:t>
+            </w:r>
+          </w:p>
+        </w:tc>
+        <w:tc>
+          <w:tcPr>
+            <w:tcBorders>
+              <w:top w:val="single" w:sz="4" w:space="0" w:color="CBD5E1"/>
+              <w:left w:val="single" w:sz="4" w:space="0" w:color="CBD5E1"/>
+              <w:bottom w:val="single" w:sz="4" w:space="0" w:color="CBD5E1"/>
+              <w:right w:val="single" w:sz="4" w:space="0" w:color="CBD5E1"/>
+            </w:tcBorders>
+            <w:vAlign w:val="top"/>
+            <w:tcMar>
+              <w:top w:w="80" w:type="dxa"/>
+              <w:left w:w="80" w:type="dxa"/>
+              <w:bottom w:w="80" w:type="dxa"/>
+              <w:right w:w="80" w:type="dxa"/>
+            </w:tcMar>
+          </w:tcPr>
+          <w:p>
+            <w:pPr>
+              <w:jc w:val="left"/>
+              <w:spacing w:after="40" w:line="264" w:lineRule="auto"/>
+            </w:pPr>
+            <w:r>
+              <w:rPr>
+                <w:sz w:val="20"/>
+                <w:szCs w:val="20"/>
+                <w:rFonts w:ascii="Arial" w:hAnsi="Arial" w:cs="Arial"/>
+                <w:color w:val="334155"/>
+              </w:rPr>
+              <w:t xml:space="preserve">Allows the Academic Admin and Center Director to view the attendance history of any learner, filterable by date range, session, or Teacher. Provides summary statistics including total sessions attended, absence rate, and attendance trend visualization.</w:t>
+            </w:r>
+          </w:p>
+        </w:tc>
+      </w:tr>
+      <w:tr>
+        <w:tc>
+          <w:tcPr>
+            <w:tcBorders>
+              <w:top w:val="single" w:sz="4" w:space="0" w:color="CBD5E1"/>
+              <w:left w:val="single" w:sz="4" w:space="0" w:color="CBD5E1"/>
+              <w:bottom w:val="single" w:sz="4" w:space="0" w:color="CBD5E1"/>
+              <w:right w:val="single" w:sz="4" w:space="0" w:color="CBD5E1"/>
+            </w:tcBorders>
+            <w:vAlign w:val="top"/>
+            <w:tcMar>
+              <w:top w:w="80" w:type="dxa"/>
+              <w:left w:w="80" w:type="dxa"/>
+              <w:bottom w:w="80" w:type="dxa"/>
+              <w:right w:w="80" w:type="dxa"/>
+            </w:tcMar>
+          </w:tcPr>
+          <w:p>
+            <w:pPr>
+              <w:jc w:val="center"/>
+              <w:spacing w:after="40" w:line="264" w:lineRule="auto"/>
+            </w:pPr>
+            <w:r>
+              <w:rPr>
+                <w:b/>
+                <w:sz w:val="20"/>
+                <w:szCs w:val="20"/>
+                <w:rFonts w:ascii="Arial" w:hAnsi="Arial" w:cs="Arial"/>
+                <w:color w:val="0F172A"/>
+              </w:rPr>
+              <w:t xml:space="preserve">UC-16</w:t>
+            </w:r>
+          </w:p>
+        </w:tc>
+        <w:tc>
+          <w:tcPr>
+            <w:tcBorders>
+              <w:top w:val="single" w:sz="4" w:space="0" w:color="CBD5E1"/>
+              <w:left w:val="single" w:sz="4" w:space="0" w:color="CBD5E1"/>
+              <w:bottom w:val="single" w:sz="4" w:space="0" w:color="CBD5E1"/>
+              <w:right w:val="single" w:sz="4" w:space="0" w:color="CBD5E1"/>
+            </w:tcBorders>
+            <w:vAlign w:val="top"/>
+            <w:tcMar>
+              <w:top w:w="80" w:type="dxa"/>
+              <w:left w:w="80" w:type="dxa"/>
+              <w:bottom w:w="80" w:type="dxa"/>
+              <w:right w:w="80" w:type="dxa"/>
+            </w:tcMar>
+          </w:tcPr>
+          <w:p>
+            <w:pPr>
+              <w:jc w:val="left"/>
+              <w:spacing w:after="40" w:line="264" w:lineRule="auto"/>
+            </w:pPr>
+            <w:r>
+              <w:rPr>
+                <w:b/>
+                <w:sz w:val="20"/>
+                <w:szCs w:val="20"/>
+                <w:rFonts w:ascii="Arial" w:hAnsi="Arial" w:cs="Arial"/>
+                <w:color w:val="1D4ED8"/>
+              </w:rPr>
+              <w:t xml:space="preserve">Submit Session Feedback</w:t>
+            </w:r>
+          </w:p>
+        </w:tc>
+        <w:tc>
+          <w:tcPr>
+            <w:tcBorders>
+              <w:top w:val="single" w:sz="4" w:space="0" w:color="CBD5E1"/>
+              <w:left w:val="single" w:sz="4" w:space="0" w:color="CBD5E1"/>
+              <w:bottom w:val="single" w:sz="4" w:space="0" w:color="CBD5E1"/>
+              <w:right w:val="single" w:sz="4" w:space="0" w:color="CBD5E1"/>
+            </w:tcBorders>
+            <w:vAlign w:val="top"/>
+            <w:tcMar>
+              <w:top w:w="80" w:type="dxa"/>
+              <w:left w:w="80" w:type="dxa"/>
+              <w:bottom w:w="80" w:type="dxa"/>
+              <w:right w:w="80" w:type="dxa"/>
+            </w:tcMar>
+          </w:tcPr>
+          <w:p>
+            <w:pPr>
+              <w:jc w:val="left"/>
+              <w:spacing w:after="40" w:line="264" w:lineRule="auto"/>
+            </w:pPr>
+            <w:r>
+              <w:rPr>
+                <w:sz w:val="20"/>
+                <w:szCs w:val="20"/>
+                <w:rFonts w:ascii="Arial" w:hAnsi="Arial" w:cs="Arial"/>
+                <w:color w:val="334155"/>
+              </w:rPr>
+              <w:t xml:space="preserve">Teacher Feedback</w:t>
+            </w:r>
+          </w:p>
+        </w:tc>
+        <w:tc>
+          <w:tcPr>
+            <w:tcBorders>
+              <w:top w:val="single" w:sz="4" w:space="0" w:color="CBD5E1"/>
+              <w:left w:val="single" w:sz="4" w:space="0" w:color="CBD5E1"/>
+              <w:bottom w:val="single" w:sz="4" w:space="0" w:color="CBD5E1"/>
+              <w:right w:val="single" w:sz="4" w:space="0" w:color="CBD5E1"/>
+            </w:tcBorders>
+            <w:vAlign w:val="top"/>
+            <w:tcMar>
+              <w:top w:w="80" w:type="dxa"/>
+              <w:left w:w="80" w:type="dxa"/>
+              <w:bottom w:w="80" w:type="dxa"/>
+              <w:right w:w="80" w:type="dxa"/>
+            </w:tcMar>
+          </w:tcPr>
+          <w:p>
+            <w:pPr>
+              <w:jc w:val="left"/>
+              <w:spacing w:after="40" w:line="264" w:lineRule="auto"/>
+            </w:pPr>
+            <w:r>
+              <w:rPr>
+                <w:sz w:val="20"/>
+                <w:szCs w:val="20"/>
+                <w:rFonts w:ascii="Arial" w:hAnsi="Arial" w:cs="Arial"/>
+                <w:color w:val="334155"/>
+              </w:rPr>
+              <w:t xml:space="preserve">Allows the Teacher to compose and submit an academic Feedback entry for each learner after a session. The SLA mandates submission within 12 hours post-session. The Feedback form includes fields for academic performance rating, behavioral notes, and improvement recommendations. Upon submission, the system timestamps the entry and checks SLA compliance.</w:t>
+            </w:r>
+          </w:p>
+        </w:tc>
+      </w:tr>
+      <w:tr>
+        <w:tc>
+          <w:tcPr>
+            <w:tcBorders>
+              <w:top w:val="single" w:sz="4" w:space="0" w:color="CBD5E1"/>
+              <w:left w:val="single" w:sz="4" w:space="0" w:color="CBD5E1"/>
+              <w:bottom w:val="single" w:sz="4" w:space="0" w:color="CBD5E1"/>
+              <w:right w:val="single" w:sz="4" w:space="0" w:color="CBD5E1"/>
+            </w:tcBorders>
+            <w:vAlign w:val="top"/>
+            <w:tcMar>
+              <w:top w:w="80" w:type="dxa"/>
+              <w:left w:w="80" w:type="dxa"/>
+              <w:bottom w:w="80" w:type="dxa"/>
+              <w:right w:w="80" w:type="dxa"/>
+            </w:tcMar>
+          </w:tcPr>
+          <w:p>
+            <w:pPr>
+              <w:jc w:val="center"/>
+              <w:spacing w:after="40" w:line="264" w:lineRule="auto"/>
+            </w:pPr>
+            <w:r>
+              <w:rPr>
+                <w:b/>
+                <w:sz w:val="20"/>
+                <w:szCs w:val="20"/>
+                <w:rFonts w:ascii="Arial" w:hAnsi="Arial" w:cs="Arial"/>
+                <w:color w:val="0F172A"/>
+              </w:rPr>
+              <w:t xml:space="preserve">UC-17</w:t>
+            </w:r>
+          </w:p>
+        </w:tc>
+        <w:tc>
+          <w:tcPr>
+            <w:tcBorders>
+              <w:top w:val="single" w:sz="4" w:space="0" w:color="CBD5E1"/>
+              <w:left w:val="single" w:sz="4" w:space="0" w:color="CBD5E1"/>
+              <w:bottom w:val="single" w:sz="4" w:space="0" w:color="CBD5E1"/>
+              <w:right w:val="single" w:sz="4" w:space="0" w:color="CBD5E1"/>
+            </w:tcBorders>
+            <w:vAlign w:val="top"/>
+            <w:tcMar>
+              <w:top w:w="80" w:type="dxa"/>
+              <w:left w:w="80" w:type="dxa"/>
+              <w:bottom w:w="80" w:type="dxa"/>
+              <w:right w:w="80" w:type="dxa"/>
+            </w:tcMar>
+          </w:tcPr>
+          <w:p>
+            <w:pPr>
+              <w:jc w:val="left"/>
+              <w:spacing w:after="40" w:line="264" w:lineRule="auto"/>
+            </w:pPr>
+            <w:r>
+              <w:rPr>
+                <w:b/>
+                <w:sz w:val="20"/>
+                <w:szCs w:val="20"/>
+                <w:rFonts w:ascii="Arial" w:hAnsi="Arial" w:cs="Arial"/>
+                <w:color w:val="1D4ED8"/>
+              </w:rPr>
+              <w:t xml:space="preserve">View Feedback History</w:t>
+            </w:r>
+          </w:p>
+        </w:tc>
+        <w:tc>
+          <w:tcPr>
+            <w:tcBorders>
+              <w:top w:val="single" w:sz="4" w:space="0" w:color="CBD5E1"/>
+              <w:left w:val="single" w:sz="4" w:space="0" w:color="CBD5E1"/>
+              <w:bottom w:val="single" w:sz="4" w:space="0" w:color="CBD5E1"/>
+              <w:right w:val="single" w:sz="4" w:space="0" w:color="CBD5E1"/>
+            </w:tcBorders>
+            <w:vAlign w:val="top"/>
+            <w:tcMar>
+              <w:top w:w="80" w:type="dxa"/>
+              <w:left w:w="80" w:type="dxa"/>
+              <w:bottom w:w="80" w:type="dxa"/>
+              <w:right w:w="80" w:type="dxa"/>
+            </w:tcMar>
+          </w:tcPr>
+          <w:p>
+            <w:pPr>
+              <w:jc w:val="left"/>
+              <w:spacing w:after="40" w:line="264" w:lineRule="auto"/>
+            </w:pPr>
+            <w:r>
+              <w:rPr>
+                <w:sz w:val="20"/>
+                <w:szCs w:val="20"/>
+                <w:rFonts w:ascii="Arial" w:hAnsi="Arial" w:cs="Arial"/>
+                <w:color w:val="334155"/>
+              </w:rPr>
+              <w:t xml:space="preserve">Teacher Feedback</w:t>
+            </w:r>
+          </w:p>
+        </w:tc>
+        <w:tc>
+          <w:tcPr>
+            <w:tcBorders>
+              <w:top w:val="single" w:sz="4" w:space="0" w:color="CBD5E1"/>
+              <w:left w:val="single" w:sz="4" w:space="0" w:color="CBD5E1"/>
+              <w:bottom w:val="single" w:sz="4" w:space="0" w:color="CBD5E1"/>
+              <w:right w:val="single" w:sz="4" w:space="0" w:color="CBD5E1"/>
+            </w:tcBorders>
+            <w:vAlign w:val="top"/>
+            <w:tcMar>
+              <w:top w:w="80" w:type="dxa"/>
+              <w:left w:w="80" w:type="dxa"/>
+              <w:bottom w:w="80" w:type="dxa"/>
+              <w:right w:w="80" w:type="dxa"/>
+            </w:tcMar>
+          </w:tcPr>
+          <w:p>
+            <w:pPr>
+              <w:jc w:val="left"/>
+              <w:spacing w:after="40" w:line="264" w:lineRule="auto"/>
+            </w:pPr>
+            <w:r>
+              <w:rPr>
+                <w:sz w:val="20"/>
+                <w:szCs w:val="20"/>
+                <w:rFonts w:ascii="Arial" w:hAnsi="Arial" w:cs="Arial"/>
+                <w:color w:val="334155"/>
+              </w:rPr>
+              <w:t xml:space="preserve">Allows the Academic Admin, Teacher, and Center Director to view historical Feedback entries for any learner, filterable by date range, Teacher, or session. Each entry displays the submission timestamp, SLA compliance status (On-time / Late), and full Feedback content.</w:t>
+            </w:r>
+          </w:p>
+        </w:tc>
+      </w:tr>
+      <w:tr>
+        <w:tc>
+          <w:tcPr>
+            <w:tcBorders>
+              <w:top w:val="single" w:sz="4" w:space="0" w:color="CBD5E1"/>
+              <w:left w:val="single" w:sz="4" w:space="0" w:color="CBD5E1"/>
+              <w:bottom w:val="single" w:sz="4" w:space="0" w:color="CBD5E1"/>
+              <w:right w:val="single" w:sz="4" w:space="0" w:color="CBD5E1"/>
+            </w:tcBorders>
+            <w:vAlign w:val="top"/>
+            <w:tcMar>
+              <w:top w:w="80" w:type="dxa"/>
+              <w:left w:w="80" w:type="dxa"/>
+              <w:bottom w:w="80" w:type="dxa"/>
+              <w:right w:w="80" w:type="dxa"/>
+            </w:tcMar>
+          </w:tcPr>
+          <w:p>
+            <w:pPr>
+              <w:jc w:val="center"/>
+              <w:spacing w:after="40" w:line="264" w:lineRule="auto"/>
+            </w:pPr>
+            <w:r>
+              <w:rPr>
+                <w:b/>
+                <w:sz w:val="20"/>
+                <w:szCs w:val="20"/>
+                <w:rFonts w:ascii="Arial" w:hAnsi="Arial" w:cs="Arial"/>
+                <w:color w:val="0F172A"/>
+              </w:rPr>
+              <w:t xml:space="preserve">UC-18</w:t>
+            </w:r>
+          </w:p>
+        </w:tc>
+        <w:tc>
+          <w:tcPr>
+            <w:tcBorders>
+              <w:top w:val="single" w:sz="4" w:space="0" w:color="CBD5E1"/>
+              <w:left w:val="single" w:sz="4" w:space="0" w:color="CBD5E1"/>
+              <w:bottom w:val="single" w:sz="4" w:space="0" w:color="CBD5E1"/>
+              <w:right w:val="single" w:sz="4" w:space="0" w:color="CBD5E1"/>
+            </w:tcBorders>
+            <w:vAlign w:val="top"/>
+            <w:tcMar>
+              <w:top w:w="80" w:type="dxa"/>
+              <w:left w:w="80" w:type="dxa"/>
+              <w:bottom w:w="80" w:type="dxa"/>
+              <w:right w:w="80" w:type="dxa"/>
+            </w:tcMar>
+          </w:tcPr>
+          <w:p>
+            <w:pPr>
+              <w:jc w:val="left"/>
+              <w:spacing w:after="40" w:line="264" w:lineRule="auto"/>
+            </w:pPr>
+            <w:r>
+              <w:rPr>
+                <w:b/>
+                <w:sz w:val="20"/>
+                <w:szCs w:val="20"/>
+                <w:rFonts w:ascii="Arial" w:hAnsi="Arial" w:cs="Arial"/>
+                <w:color w:val="1D4ED8"/>
+              </w:rPr>
+              <w:t xml:space="preserve">Receive Feedback SLA Reminder</w:t>
+            </w:r>
+          </w:p>
+        </w:tc>
+        <w:tc>
+          <w:tcPr>
+            <w:tcBorders>
+              <w:top w:val="single" w:sz="4" w:space="0" w:color="CBD5E1"/>
+              <w:left w:val="single" w:sz="4" w:space="0" w:color="CBD5E1"/>
+              <w:bottom w:val="single" w:sz="4" w:space="0" w:color="CBD5E1"/>
+              <w:right w:val="single" w:sz="4" w:space="0" w:color="CBD5E1"/>
+            </w:tcBorders>
+            <w:vAlign w:val="top"/>
+            <w:tcMar>
+              <w:top w:w="80" w:type="dxa"/>
+              <w:left w:w="80" w:type="dxa"/>
+              <w:bottom w:w="80" w:type="dxa"/>
+              <w:right w:w="80" w:type="dxa"/>
+            </w:tcMar>
+          </w:tcPr>
+          <w:p>
+            <w:pPr>
+              <w:jc w:val="left"/>
+              <w:spacing w:after="40" w:line="264" w:lineRule="auto"/>
+            </w:pPr>
+            <w:r>
+              <w:rPr>
+                <w:sz w:val="20"/>
+                <w:szCs w:val="20"/>
+                <w:rFonts w:ascii="Arial" w:hAnsi="Arial" w:cs="Arial"/>
+                <w:color w:val="334155"/>
+              </w:rPr>
+              <w:t xml:space="preserve">Teacher Feedback</w:t>
+            </w:r>
+          </w:p>
+        </w:tc>
+        <w:tc>
+          <w:tcPr>
+            <w:tcBorders>
+              <w:top w:val="single" w:sz="4" w:space="0" w:color="CBD5E1"/>
+              <w:left w:val="single" w:sz="4" w:space="0" w:color="CBD5E1"/>
+              <w:bottom w:val="single" w:sz="4" w:space="0" w:color="CBD5E1"/>
+              <w:right w:val="single" w:sz="4" w:space="0" w:color="CBD5E1"/>
+            </w:tcBorders>
+            <w:vAlign w:val="top"/>
+            <w:tcMar>
+              <w:top w:w="80" w:type="dxa"/>
+              <w:left w:w="80" w:type="dxa"/>
+              <w:bottom w:w="80" w:type="dxa"/>
+              <w:right w:w="80" w:type="dxa"/>
+            </w:tcMar>
+          </w:tcPr>
+          <w:p>
+            <w:pPr>
+              <w:jc w:val="left"/>
+              <w:spacing w:after="40" w:line="264" w:lineRule="auto"/>
+            </w:pPr>
+            <w:r>
+              <w:rPr>
+                <w:sz w:val="20"/>
+                <w:szCs w:val="20"/>
+                <w:rFonts w:ascii="Arial" w:hAnsi="Arial" w:cs="Arial"/>
+                <w:color w:val="334155"/>
+              </w:rPr>
+              <w:t xml:space="preserve">The system automatically sends a reminder notification to the Teacher if a session Feedback has not been submitted within 8 hours post-session (warning) and again at the 12-hour SLA deadline. Late submissions are flagged in the system for Academic Admin oversight.</w:t>
+            </w:r>
+          </w:p>
+        </w:tc>
+      </w:tr>
+      <w:tr>
+        <w:tc>
+          <w:tcPr>
+            <w:tcBorders>
+              <w:top w:val="single" w:sz="4" w:space="0" w:color="CBD5E1"/>
+              <w:left w:val="single" w:sz="4" w:space="0" w:color="CBD5E1"/>
+              <w:bottom w:val="single" w:sz="4" w:space="0" w:color="CBD5E1"/>
+              <w:right w:val="single" w:sz="4" w:space="0" w:color="CBD5E1"/>
+            </w:tcBorders>
+            <w:vAlign w:val="top"/>
+            <w:tcMar>
+              <w:top w:w="80" w:type="dxa"/>
+              <w:left w:w="80" w:type="dxa"/>
+              <w:bottom w:w="80" w:type="dxa"/>
+              <w:right w:w="80" w:type="dxa"/>
+            </w:tcMar>
+          </w:tcPr>
+          <w:p>
+            <w:pPr>
+              <w:jc w:val="center"/>
+              <w:spacing w:after="40" w:line="264" w:lineRule="auto"/>
+            </w:pPr>
+            <w:r>
+              <w:rPr>
+                <w:b/>
+                <w:sz w:val="20"/>
+                <w:szCs w:val="20"/>
+                <w:rFonts w:ascii="Arial" w:hAnsi="Arial" w:cs="Arial"/>
+                <w:color w:val="0F172A"/>
+              </w:rPr>
+              <w:t xml:space="preserve">UC-19</w:t>
+            </w:r>
+          </w:p>
+        </w:tc>
+        <w:tc>
+          <w:tcPr>
+            <w:tcBorders>
+              <w:top w:val="single" w:sz="4" w:space="0" w:color="CBD5E1"/>
+              <w:left w:val="single" w:sz="4" w:space="0" w:color="CBD5E1"/>
+              <w:bottom w:val="single" w:sz="4" w:space="0" w:color="CBD5E1"/>
+              <w:right w:val="single" w:sz="4" w:space="0" w:color="CBD5E1"/>
+            </w:tcBorders>
+            <w:vAlign w:val="top"/>
+            <w:tcMar>
+              <w:top w:w="80" w:type="dxa"/>
+              <w:left w:w="80" w:type="dxa"/>
+              <w:bottom w:w="80" w:type="dxa"/>
+              <w:right w:w="80" w:type="dxa"/>
+            </w:tcMar>
+          </w:tcPr>
+          <w:p>
+            <w:pPr>
+              <w:jc w:val="left"/>
+              <w:spacing w:after="40" w:line="264" w:lineRule="auto"/>
+            </w:pPr>
+            <w:r>
+              <w:rPr>
+                <w:b/>
+                <w:sz w:val="20"/>
+                <w:szCs w:val="20"/>
+                <w:rFonts w:ascii="Arial" w:hAnsi="Arial" w:cs="Arial"/>
+                <w:color w:val="1D4ED8"/>
+              </w:rPr>
+              <w:t xml:space="preserve">Send Attendance Notification</w:t>
+            </w:r>
+          </w:p>
+        </w:tc>
+        <w:tc>
+          <w:tcPr>
+            <w:tcBorders>
+              <w:top w:val="single" w:sz="4" w:space="0" w:color="CBD5E1"/>
+              <w:left w:val="single" w:sz="4" w:space="0" w:color="CBD5E1"/>
+              <w:bottom w:val="single" w:sz="4" w:space="0" w:color="CBD5E1"/>
+              <w:right w:val="single" w:sz="4" w:space="0" w:color="CBD5E1"/>
+            </w:tcBorders>
+            <w:vAlign w:val="top"/>
+            <w:tcMar>
+              <w:top w:w="80" w:type="dxa"/>
+              <w:left w:w="80" w:type="dxa"/>
+              <w:bottom w:w="80" w:type="dxa"/>
+              <w:right w:w="80" w:type="dxa"/>
+            </w:tcMar>
+          </w:tcPr>
+          <w:p>
+            <w:pPr>
+              <w:jc w:val="left"/>
+              <w:spacing w:after="40" w:line="264" w:lineRule="auto"/>
+            </w:pPr>
+            <w:r>
+              <w:rPr>
+                <w:sz w:val="20"/>
+                <w:szCs w:val="20"/>
+                <w:rFonts w:ascii="Arial" w:hAnsi="Arial" w:cs="Arial"/>
+                <w:color w:val="334155"/>
+              </w:rPr>
+              <w:t xml:space="preserve">Parent Notification Engine</w:t>
+            </w:r>
+          </w:p>
+        </w:tc>
+        <w:tc>
+          <w:tcPr>
+            <w:tcBorders>
+              <w:top w:val="single" w:sz="4" w:space="0" w:color="CBD5E1"/>
+              <w:left w:val="single" w:sz="4" w:space="0" w:color="CBD5E1"/>
+              <w:bottom w:val="single" w:sz="4" w:space="0" w:color="CBD5E1"/>
+              <w:right w:val="single" w:sz="4" w:space="0" w:color="CBD5E1"/>
+            </w:tcBorders>
+            <w:vAlign w:val="top"/>
+            <w:tcMar>
+              <w:top w:w="80" w:type="dxa"/>
+              <w:left w:w="80" w:type="dxa"/>
+              <w:bottom w:w="80" w:type="dxa"/>
+              <w:right w:w="80" w:type="dxa"/>
+            </w:tcMar>
+          </w:tcPr>
+          <w:p>
+            <w:pPr>
+              <w:jc w:val="left"/>
+              <w:spacing w:after="40" w:line="264" w:lineRule="auto"/>
+            </w:pPr>
+            <w:r>
+              <w:rPr>
+                <w:sz w:val="20"/>
+                <w:szCs w:val="20"/>
+                <w:rFonts w:ascii="Arial" w:hAnsi="Arial" w:cs="Arial"/>
+                <w:color w:val="334155"/>
+              </w:rPr>
+              <w:t xml:space="preserve">The system automatically dispatches an email to the Parent immediately after attendance is recorded for their child. The email includes session date, time, Teacher name, and attendance status (Present / Absent / Late). This is a fully automated, zero-touch process requiring no manual intervention from Academic Admin.</w:t>
+            </w:r>
+          </w:p>
+        </w:tc>
+      </w:tr>
+      <w:tr>
+        <w:tc>
+          <w:tcPr>
+            <w:tcBorders>
+              <w:top w:val="single" w:sz="4" w:space="0" w:color="CBD5E1"/>
+              <w:left w:val="single" w:sz="4" w:space="0" w:color="CBD5E1"/>
+              <w:bottom w:val="single" w:sz="4" w:space="0" w:color="CBD5E1"/>
+              <w:right w:val="single" w:sz="4" w:space="0" w:color="CBD5E1"/>
+            </w:tcBorders>
+            <w:vAlign w:val="top"/>
+            <w:tcMar>
+              <w:top w:w="80" w:type="dxa"/>
+              <w:left w:w="80" w:type="dxa"/>
+              <w:bottom w:w="80" w:type="dxa"/>
+              <w:right w:w="80" w:type="dxa"/>
+            </w:tcMar>
+          </w:tcPr>
+          <w:p>
+            <w:pPr>
+              <w:jc w:val="center"/>
+              <w:spacing w:after="40" w:line="264" w:lineRule="auto"/>
+            </w:pPr>
+            <w:r>
+              <w:rPr>
+                <w:b/>
+                <w:sz w:val="20"/>
+                <w:szCs w:val="20"/>
+                <w:rFonts w:ascii="Arial" w:hAnsi="Arial" w:cs="Arial"/>
+                <w:color w:val="0F172A"/>
+              </w:rPr>
+              <w:t xml:space="preserve">UC-20</w:t>
+            </w:r>
+          </w:p>
+        </w:tc>
+        <w:tc>
+          <w:tcPr>
+            <w:tcBorders>
+              <w:top w:val="single" w:sz="4" w:space="0" w:color="CBD5E1"/>
+              <w:left w:val="single" w:sz="4" w:space="0" w:color="CBD5E1"/>
+              <w:bottom w:val="single" w:sz="4" w:space="0" w:color="CBD5E1"/>
+              <w:right w:val="single" w:sz="4" w:space="0" w:color="CBD5E1"/>
+            </w:tcBorders>
+            <w:vAlign w:val="top"/>
+            <w:tcMar>
+              <w:top w:w="80" w:type="dxa"/>
+              <w:left w:w="80" w:type="dxa"/>
+              <w:bottom w:w="80" w:type="dxa"/>
+              <w:right w:w="80" w:type="dxa"/>
+            </w:tcMar>
+          </w:tcPr>
+          <w:p>
+            <w:pPr>
+              <w:jc w:val="left"/>
+              <w:spacing w:after="40" w:line="264" w:lineRule="auto"/>
+            </w:pPr>
+            <w:r>
+              <w:rPr>
+                <w:b/>
+                <w:sz w:val="20"/>
+                <w:szCs w:val="20"/>
+                <w:rFonts w:ascii="Arial" w:hAnsi="Arial" w:cs="Arial"/>
+                <w:color w:val="1D4ED8"/>
+              </w:rPr>
+              <w:t xml:space="preserve">Send Schedule Change Notification</w:t>
+            </w:r>
+          </w:p>
+        </w:tc>
+        <w:tc>
+          <w:tcPr>
+            <w:tcBorders>
+              <w:top w:val="single" w:sz="4" w:space="0" w:color="CBD5E1"/>
+              <w:left w:val="single" w:sz="4" w:space="0" w:color="CBD5E1"/>
+              <w:bottom w:val="single" w:sz="4" w:space="0" w:color="CBD5E1"/>
+              <w:right w:val="single" w:sz="4" w:space="0" w:color="CBD5E1"/>
+            </w:tcBorders>
+            <w:vAlign w:val="top"/>
+            <w:tcMar>
+              <w:top w:w="80" w:type="dxa"/>
+              <w:left w:w="80" w:type="dxa"/>
+              <w:bottom w:w="80" w:type="dxa"/>
+              <w:right w:w="80" w:type="dxa"/>
+            </w:tcMar>
+          </w:tcPr>
+          <w:p>
+            <w:pPr>
+              <w:jc w:val="left"/>
+              <w:spacing w:after="40" w:line="264" w:lineRule="auto"/>
+            </w:pPr>
+            <w:r>
+              <w:rPr>
+                <w:sz w:val="20"/>
+                <w:szCs w:val="20"/>
+                <w:rFonts w:ascii="Arial" w:hAnsi="Arial" w:cs="Arial"/>
+                <w:color w:val="334155"/>
+              </w:rPr>
+              <w:t xml:space="preserve">Parent Notification Engine</w:t>
+            </w:r>
+          </w:p>
+        </w:tc>
+        <w:tc>
+          <w:tcPr>
+            <w:tcBorders>
+              <w:top w:val="single" w:sz="4" w:space="0" w:color="CBD5E1"/>
+              <w:left w:val="single" w:sz="4" w:space="0" w:color="CBD5E1"/>
+              <w:bottom w:val="single" w:sz="4" w:space="0" w:color="CBD5E1"/>
+              <w:right w:val="single" w:sz="4" w:space="0" w:color="CBD5E1"/>
+            </w:tcBorders>
+            <w:vAlign w:val="top"/>
+            <w:tcMar>
+              <w:top w:w="80" w:type="dxa"/>
+              <w:left w:w="80" w:type="dxa"/>
+              <w:bottom w:w="80" w:type="dxa"/>
+              <w:right w:w="80" w:type="dxa"/>
+            </w:tcMar>
+          </w:tcPr>
+          <w:p>
+            <w:pPr>
+              <w:jc w:val="left"/>
+              <w:spacing w:after="40" w:line="264" w:lineRule="auto"/>
+            </w:pPr>
+            <w:r>
+              <w:rPr>
+                <w:sz w:val="20"/>
+                <w:szCs w:val="20"/>
+                <w:rFonts w:ascii="Arial" w:hAnsi="Arial" w:cs="Arial"/>
+                <w:color w:val="334155"/>
+              </w:rPr>
+              <w:t xml:space="preserve">The system automatically dispatches an email to the Parent whenever a session involving their child is modified (change of date, time, room, or Teacher). The email clearly states the original and updated schedule details to avoid confusion.</w:t>
+            </w:r>
+          </w:p>
+        </w:tc>
+      </w:tr>
+      <w:tr>
+        <w:tc>
+          <w:tcPr>
+            <w:tcBorders>
+              <w:top w:val="single" w:sz="4" w:space="0" w:color="CBD5E1"/>
+              <w:left w:val="single" w:sz="4" w:space="0" w:color="CBD5E1"/>
+              <w:bottom w:val="single" w:sz="4" w:space="0" w:color="CBD5E1"/>
+              <w:right w:val="single" w:sz="4" w:space="0" w:color="CBD5E1"/>
+            </w:tcBorders>
+            <w:vAlign w:val="top"/>
+            <w:tcMar>
+              <w:top w:w="80" w:type="dxa"/>
+              <w:left w:w="80" w:type="dxa"/>
+              <w:bottom w:w="80" w:type="dxa"/>
+              <w:right w:w="80" w:type="dxa"/>
+            </w:tcMar>
+          </w:tcPr>
+          <w:p>
+            <w:pPr>
+              <w:jc w:val="center"/>
+              <w:spacing w:after="40" w:line="264" w:lineRule="auto"/>
+            </w:pPr>
+            <w:r>
+              <w:rPr>
+                <w:b/>
+                <w:sz w:val="20"/>
+                <w:szCs w:val="20"/>
+                <w:rFonts w:ascii="Arial" w:hAnsi="Arial" w:cs="Arial"/>
+                <w:color w:val="0F172A"/>
+              </w:rPr>
+              <w:t xml:space="preserve">UC-21</w:t>
+            </w:r>
+          </w:p>
+        </w:tc>
+        <w:tc>
+          <w:tcPr>
+            <w:tcBorders>
+              <w:top w:val="single" w:sz="4" w:space="0" w:color="CBD5E1"/>
+              <w:left w:val="single" w:sz="4" w:space="0" w:color="CBD5E1"/>
+              <w:bottom w:val="single" w:sz="4" w:space="0" w:color="CBD5E1"/>
+              <w:right w:val="single" w:sz="4" w:space="0" w:color="CBD5E1"/>
+            </w:tcBorders>
+            <w:vAlign w:val="top"/>
+            <w:tcMar>
+              <w:top w:w="80" w:type="dxa"/>
+              <w:left w:w="80" w:type="dxa"/>
+              <w:bottom w:w="80" w:type="dxa"/>
+              <w:right w:w="80" w:type="dxa"/>
+            </w:tcMar>
+          </w:tcPr>
+          <w:p>
+            <w:pPr>
+              <w:jc w:val="left"/>
+              <w:spacing w:after="40" w:line="264" w:lineRule="auto"/>
+            </w:pPr>
+            <w:r>
+              <w:rPr>
+                <w:b/>
+                <w:sz w:val="20"/>
+                <w:szCs w:val="20"/>
+                <w:rFonts w:ascii="Arial" w:hAnsi="Arial" w:cs="Arial"/>
+                <w:color w:val="1D4ED8"/>
+              </w:rPr>
+              <w:t xml:space="preserve">Send Feedback Report to Parent</w:t>
+            </w:r>
+          </w:p>
+        </w:tc>
+        <w:tc>
+          <w:tcPr>
+            <w:tcBorders>
+              <w:top w:val="single" w:sz="4" w:space="0" w:color="CBD5E1"/>
+              <w:left w:val="single" w:sz="4" w:space="0" w:color="CBD5E1"/>
+              <w:bottom w:val="single" w:sz="4" w:space="0" w:color="CBD5E1"/>
+              <w:right w:val="single" w:sz="4" w:space="0" w:color="CBD5E1"/>
+            </w:tcBorders>
+            <w:vAlign w:val="top"/>
+            <w:tcMar>
+              <w:top w:w="80" w:type="dxa"/>
+              <w:left w:w="80" w:type="dxa"/>
+              <w:bottom w:w="80" w:type="dxa"/>
+              <w:right w:w="80" w:type="dxa"/>
+            </w:tcMar>
+          </w:tcPr>
+          <w:p>
+            <w:pPr>
+              <w:jc w:val="left"/>
+              <w:spacing w:after="40" w:line="264" w:lineRule="auto"/>
+            </w:pPr>
+            <w:r>
+              <w:rPr>
+                <w:sz w:val="20"/>
+                <w:szCs w:val="20"/>
+                <w:rFonts w:ascii="Arial" w:hAnsi="Arial" w:cs="Arial"/>
+                <w:color w:val="334155"/>
+              </w:rPr>
+              <w:t xml:space="preserve">Parent Notification Engine</w:t>
+            </w:r>
+          </w:p>
+        </w:tc>
+        <w:tc>
+          <w:tcPr>
+            <w:tcBorders>
+              <w:top w:val="single" w:sz="4" w:space="0" w:color="CBD5E1"/>
+              <w:left w:val="single" w:sz="4" w:space="0" w:color="CBD5E1"/>
+              <w:bottom w:val="single" w:sz="4" w:space="0" w:color="CBD5E1"/>
+              <w:right w:val="single" w:sz="4" w:space="0" w:color="CBD5E1"/>
+            </w:tcBorders>
+            <w:vAlign w:val="top"/>
+            <w:tcMar>
+              <w:top w:w="80" w:type="dxa"/>
+              <w:left w:w="80" w:type="dxa"/>
+              <w:bottom w:w="80" w:type="dxa"/>
+              <w:right w:w="80" w:type="dxa"/>
+            </w:tcMar>
+          </w:tcPr>
+          <w:p>
+            <w:pPr>
+              <w:jc w:val="left"/>
+              <w:spacing w:after="40" w:line="264" w:lineRule="auto"/>
+            </w:pPr>
+            <w:r>
+              <w:rPr>
+                <w:sz w:val="20"/>
+                <w:szCs w:val="20"/>
+                <w:rFonts w:ascii="Arial" w:hAnsi="Arial" w:cs="Arial"/>
+                <w:color w:val="334155"/>
+              </w:rPr>
+              <w:t xml:space="preserve">The system automatically dispatches an email to the Parent after the Teacher submits a session Feedback for their child. The email contains the Teacher's academic evaluation, performance notes, and any improvement recommendations — providing transparent academic visibility.</w:t>
+            </w:r>
+          </w:p>
+        </w:tc>
+      </w:tr>
+      <w:tr>
+        <w:tc>
+          <w:tcPr>
+            <w:tcBorders>
+              <w:top w:val="single" w:sz="4" w:space="0" w:color="CBD5E1"/>
+              <w:left w:val="single" w:sz="4" w:space="0" w:color="CBD5E1"/>
+              <w:bottom w:val="single" w:sz="4" w:space="0" w:color="CBD5E1"/>
+              <w:right w:val="single" w:sz="4" w:space="0" w:color="CBD5E1"/>
+            </w:tcBorders>
+            <w:vAlign w:val="top"/>
+            <w:tcMar>
+              <w:top w:w="80" w:type="dxa"/>
+              <w:left w:w="80" w:type="dxa"/>
+              <w:bottom w:w="80" w:type="dxa"/>
+              <w:right w:w="80" w:type="dxa"/>
+            </w:tcMar>
+          </w:tcPr>
+          <w:p>
+            <w:pPr>
+              <w:jc w:val="center"/>
+              <w:spacing w:after="40" w:line="264" w:lineRule="auto"/>
+            </w:pPr>
+            <w:r>
+              <w:rPr>
+                <w:b/>
+                <w:sz w:val="20"/>
+                <w:szCs w:val="20"/>
+                <w:rFonts w:ascii="Arial" w:hAnsi="Arial" w:cs="Arial"/>
+                <w:color w:val="0F172A"/>
+              </w:rPr>
+              <w:t xml:space="preserve">UC-22</w:t>
+            </w:r>
+          </w:p>
+        </w:tc>
+        <w:tc>
+          <w:tcPr>
+            <w:tcBorders>
+              <w:top w:val="single" w:sz="4" w:space="0" w:color="CBD5E1"/>
+              <w:left w:val="single" w:sz="4" w:space="0" w:color="CBD5E1"/>
+              <w:bottom w:val="single" w:sz="4" w:space="0" w:color="CBD5E1"/>
+              <w:right w:val="single" w:sz="4" w:space="0" w:color="CBD5E1"/>
+            </w:tcBorders>
+            <w:vAlign w:val="top"/>
+            <w:tcMar>
+              <w:top w:w="80" w:type="dxa"/>
+              <w:left w:w="80" w:type="dxa"/>
+              <w:bottom w:w="80" w:type="dxa"/>
+              <w:right w:w="80" w:type="dxa"/>
+            </w:tcMar>
+          </w:tcPr>
+          <w:p>
+            <w:pPr>
+              <w:jc w:val="left"/>
+              <w:spacing w:after="40" w:line="264" w:lineRule="auto"/>
+            </w:pPr>
+            <w:r>
+              <w:rPr>
+                <w:b/>
+                <w:sz w:val="20"/>
+                <w:szCs w:val="20"/>
+                <w:rFonts w:ascii="Arial" w:hAnsi="Arial" w:cs="Arial"/>
+                <w:color w:val="1D4ED8"/>
+              </w:rPr>
+              <w:t xml:space="preserve">Send Package Expiry Notification</w:t>
+            </w:r>
+          </w:p>
+        </w:tc>
+        <w:tc>
+          <w:tcPr>
+            <w:tcBorders>
+              <w:top w:val="single" w:sz="4" w:space="0" w:color="CBD5E1"/>
+              <w:left w:val="single" w:sz="4" w:space="0" w:color="CBD5E1"/>
+              <w:bottom w:val="single" w:sz="4" w:space="0" w:color="CBD5E1"/>
+              <w:right w:val="single" w:sz="4" w:space="0" w:color="CBD5E1"/>
+            </w:tcBorders>
+            <w:vAlign w:val="top"/>
+            <w:tcMar>
+              <w:top w:w="80" w:type="dxa"/>
+              <w:left w:w="80" w:type="dxa"/>
+              <w:bottom w:w="80" w:type="dxa"/>
+              <w:right w:w="80" w:type="dxa"/>
+            </w:tcMar>
+          </w:tcPr>
+          <w:p>
+            <w:pPr>
+              <w:jc w:val="left"/>
+              <w:spacing w:after="40" w:line="264" w:lineRule="auto"/>
+            </w:pPr>
+            <w:r>
+              <w:rPr>
+                <w:sz w:val="20"/>
+                <w:szCs w:val="20"/>
+                <w:rFonts w:ascii="Arial" w:hAnsi="Arial" w:cs="Arial"/>
+                <w:color w:val="334155"/>
+              </w:rPr>
+              <w:t xml:space="preserve">Parent Notification Engine</w:t>
+            </w:r>
+          </w:p>
+        </w:tc>
+        <w:tc>
+          <w:tcPr>
+            <w:tcBorders>
+              <w:top w:val="single" w:sz="4" w:space="0" w:color="CBD5E1"/>
+              <w:left w:val="single" w:sz="4" w:space="0" w:color="CBD5E1"/>
+              <w:bottom w:val="single" w:sz="4" w:space="0" w:color="CBD5E1"/>
+              <w:right w:val="single" w:sz="4" w:space="0" w:color="CBD5E1"/>
+            </w:tcBorders>
+            <w:vAlign w:val="top"/>
+            <w:tcMar>
+              <w:top w:w="80" w:type="dxa"/>
+              <w:left w:w="80" w:type="dxa"/>
+              <w:bottom w:w="80" w:type="dxa"/>
+              <w:right w:w="80" w:type="dxa"/>
+            </w:tcMar>
+          </w:tcPr>
+          <w:p>
+            <w:pPr>
+              <w:jc w:val="left"/>
+              <w:spacing w:after="40" w:line="264" w:lineRule="auto"/>
+            </w:pPr>
+            <w:r>
+              <w:rPr>
+                <w:sz w:val="20"/>
+                <w:szCs w:val="20"/>
+                <w:rFonts w:ascii="Arial" w:hAnsi="Arial" w:cs="Arial"/>
+                <w:color w:val="334155"/>
+              </w:rPr>
+              <w:t xml:space="preserve">The system automatically dispatches an email to the Parent when their child's Learning Package remaining sessions reach the 2-week threshold. The email includes current remaining sessions, projected depletion date, and a call-to-action to contact the center for renewal.</w:t>
+            </w:r>
+          </w:p>
+        </w:tc>
+      </w:tr>
+      <w:tr>
+        <w:tc>
+          <w:tcPr>
+            <w:tcBorders>
+              <w:top w:val="single" w:sz="4" w:space="0" w:color="CBD5E1"/>
+              <w:left w:val="single" w:sz="4" w:space="0" w:color="CBD5E1"/>
+              <w:bottom w:val="single" w:sz="4" w:space="0" w:color="CBD5E1"/>
+              <w:right w:val="single" w:sz="4" w:space="0" w:color="CBD5E1"/>
+            </w:tcBorders>
+            <w:vAlign w:val="top"/>
+            <w:tcMar>
+              <w:top w:w="80" w:type="dxa"/>
+              <w:left w:w="80" w:type="dxa"/>
+              <w:bottom w:w="80" w:type="dxa"/>
+              <w:right w:w="80" w:type="dxa"/>
+            </w:tcMar>
+          </w:tcPr>
+          <w:p>
+            <w:pPr>
+              <w:jc w:val="center"/>
+              <w:spacing w:after="40" w:line="264" w:lineRule="auto"/>
+            </w:pPr>
+            <w:r>
+              <w:rPr>
+                <w:b/>
+                <w:sz w:val="20"/>
+                <w:szCs w:val="20"/>
+                <w:rFonts w:ascii="Arial" w:hAnsi="Arial" w:cs="Arial"/>
+                <w:color w:val="0F172A"/>
+              </w:rPr>
+              <w:t xml:space="preserve">UC-23</w:t>
+            </w:r>
+          </w:p>
+        </w:tc>
+        <w:tc>
+          <w:tcPr>
+            <w:tcBorders>
+              <w:top w:val="single" w:sz="4" w:space="0" w:color="CBD5E1"/>
+              <w:left w:val="single" w:sz="4" w:space="0" w:color="CBD5E1"/>
+              <w:bottom w:val="single" w:sz="4" w:space="0" w:color="CBD5E1"/>
+              <w:right w:val="single" w:sz="4" w:space="0" w:color="CBD5E1"/>
+            </w:tcBorders>
+            <w:vAlign w:val="top"/>
+            <w:tcMar>
+              <w:top w:w="80" w:type="dxa"/>
+              <w:left w:w="80" w:type="dxa"/>
+              <w:bottom w:w="80" w:type="dxa"/>
+              <w:right w:w="80" w:type="dxa"/>
+            </w:tcMar>
+          </w:tcPr>
+          <w:p>
+            <w:pPr>
+              <w:jc w:val="left"/>
+              <w:spacing w:after="40" w:line="264" w:lineRule="auto"/>
+            </w:pPr>
+            <w:r>
+              <w:rPr>
+                <w:b/>
+                <w:sz w:val="20"/>
+                <w:szCs w:val="20"/>
+                <w:rFonts w:ascii="Arial" w:hAnsi="Arial" w:cs="Arial"/>
+                <w:color w:val="1D4ED8"/>
+              </w:rPr>
+              <w:t xml:space="preserve">View Admin Operational Dashboard</w:t>
+            </w:r>
+          </w:p>
+        </w:tc>
+        <w:tc>
+          <w:tcPr>
+            <w:tcBorders>
+              <w:top w:val="single" w:sz="4" w:space="0" w:color="CBD5E1"/>
+              <w:left w:val="single" w:sz="4" w:space="0" w:color="CBD5E1"/>
+              <w:bottom w:val="single" w:sz="4" w:space="0" w:color="CBD5E1"/>
+              <w:right w:val="single" w:sz="4" w:space="0" w:color="CBD5E1"/>
+            </w:tcBorders>
+            <w:vAlign w:val="top"/>
+            <w:tcMar>
+              <w:top w:w="80" w:type="dxa"/>
+              <w:left w:w="80" w:type="dxa"/>
+              <w:bottom w:w="80" w:type="dxa"/>
+              <w:right w:w="80" w:type="dxa"/>
+            </w:tcMar>
+          </w:tcPr>
+          <w:p>
+            <w:pPr>
+              <w:jc w:val="left"/>
+              <w:spacing w:after="40" w:line="264" w:lineRule="auto"/>
+            </w:pPr>
+            <w:r>
+              <w:rPr>
+                <w:sz w:val="20"/>
+                <w:szCs w:val="20"/>
+                <w:rFonts w:ascii="Arial" w:hAnsi="Arial" w:cs="Arial"/>
+                <w:color w:val="334155"/>
+              </w:rPr>
+              <w:t xml:space="preserve">Dashboard &amp; Reports</w:t>
+            </w:r>
+          </w:p>
+        </w:tc>
+        <w:tc>
+          <w:tcPr>
+            <w:tcBorders>
+              <w:top w:val="single" w:sz="4" w:space="0" w:color="CBD5E1"/>
+              <w:left w:val="single" w:sz="4" w:space="0" w:color="CBD5E1"/>
+              <w:bottom w:val="single" w:sz="4" w:space="0" w:color="CBD5E1"/>
+              <w:right w:val="single" w:sz="4" w:space="0" w:color="CBD5E1"/>
+            </w:tcBorders>
+            <w:vAlign w:val="top"/>
+            <w:tcMar>
+              <w:top w:w="80" w:type="dxa"/>
+              <w:left w:w="80" w:type="dxa"/>
+              <w:bottom w:w="80" w:type="dxa"/>
+              <w:right w:w="80" w:type="dxa"/>
+            </w:tcMar>
+          </w:tcPr>
+          <w:p>
+            <w:pPr>
+              <w:jc w:val="left"/>
+              <w:spacing w:after="40" w:line="264" w:lineRule="auto"/>
+            </w:pPr>
+            <w:r>
+              <w:rPr>
+                <w:sz w:val="20"/>
+                <w:szCs w:val="20"/>
+                <w:rFonts w:ascii="Arial" w:hAnsi="Arial" w:cs="Arial"/>
+                <w:color w:val="334155"/>
+              </w:rPr>
+              <w:t xml:space="preserve">Provides the Academic Admin with a centralized dashboard displaying: today's session schedule, pending attendance entries, overdue Feedback submissions (SLA violations), upcoming Learning Package expirations, and recent Notification delivery status. Designed to replace 100% of manual Excel tracking.</w:t>
+            </w:r>
+          </w:p>
+        </w:tc>
+      </w:tr>
+      <w:tr>
+        <w:tc>
+          <w:tcPr>
+            <w:tcBorders>
+              <w:top w:val="single" w:sz="4" w:space="0" w:color="CBD5E1"/>
+              <w:left w:val="single" w:sz="4" w:space="0" w:color="CBD5E1"/>
+              <w:bottom w:val="single" w:sz="4" w:space="0" w:color="CBD5E1"/>
+              <w:right w:val="single" w:sz="4" w:space="0" w:color="CBD5E1"/>
+            </w:tcBorders>
+            <w:vAlign w:val="top"/>
+            <w:tcMar>
+              <w:top w:w="80" w:type="dxa"/>
+              <w:left w:w="80" w:type="dxa"/>
+              <w:bottom w:w="80" w:type="dxa"/>
+              <w:right w:w="80" w:type="dxa"/>
+            </w:tcMar>
+          </w:tcPr>
+          <w:p>
+            <w:pPr>
+              <w:jc w:val="center"/>
+              <w:spacing w:after="40" w:line="264" w:lineRule="auto"/>
+            </w:pPr>
+            <w:r>
+              <w:rPr>
+                <w:b/>
+                <w:sz w:val="20"/>
+                <w:szCs w:val="20"/>
+                <w:rFonts w:ascii="Arial" w:hAnsi="Arial" w:cs="Arial"/>
+                <w:color w:val="0F172A"/>
+              </w:rPr>
+              <w:t xml:space="preserve">UC-24</w:t>
+            </w:r>
+          </w:p>
+        </w:tc>
+        <w:tc>
+          <w:tcPr>
+            <w:tcBorders>
+              <w:top w:val="single" w:sz="4" w:space="0" w:color="CBD5E1"/>
+              <w:left w:val="single" w:sz="4" w:space="0" w:color="CBD5E1"/>
+              <w:bottom w:val="single" w:sz="4" w:space="0" w:color="CBD5E1"/>
+              <w:right w:val="single" w:sz="4" w:space="0" w:color="CBD5E1"/>
+            </w:tcBorders>
+            <w:vAlign w:val="top"/>
+            <w:tcMar>
+              <w:top w:w="80" w:type="dxa"/>
+              <w:left w:w="80" w:type="dxa"/>
+              <w:bottom w:w="80" w:type="dxa"/>
+              <w:right w:w="80" w:type="dxa"/>
+            </w:tcMar>
+          </w:tcPr>
+          <w:p>
+            <w:pPr>
+              <w:jc w:val="left"/>
+              <w:spacing w:after="40" w:line="264" w:lineRule="auto"/>
+            </w:pPr>
+            <w:r>
+              <w:rPr>
+                <w:b/>
+                <w:sz w:val="20"/>
+                <w:szCs w:val="20"/>
+                <w:rFonts w:ascii="Arial" w:hAnsi="Arial" w:cs="Arial"/>
+                <w:color w:val="1D4ED8"/>
+              </w:rPr>
+              <w:t xml:space="preserve">View Center Director Dashboard</w:t>
+            </w:r>
+          </w:p>
+        </w:tc>
+        <w:tc>
+          <w:tcPr>
+            <w:tcBorders>
+              <w:top w:val="single" w:sz="4" w:space="0" w:color="CBD5E1"/>
+              <w:left w:val="single" w:sz="4" w:space="0" w:color="CBD5E1"/>
+              <w:bottom w:val="single" w:sz="4" w:space="0" w:color="CBD5E1"/>
+              <w:right w:val="single" w:sz="4" w:space="0" w:color="CBD5E1"/>
+            </w:tcBorders>
+            <w:vAlign w:val="top"/>
+            <w:tcMar>
+              <w:top w:w="80" w:type="dxa"/>
+              <w:left w:w="80" w:type="dxa"/>
+              <w:bottom w:w="80" w:type="dxa"/>
+              <w:right w:w="80" w:type="dxa"/>
+            </w:tcMar>
+          </w:tcPr>
+          <w:p>
+            <w:pPr>
+              <w:jc w:val="left"/>
+              <w:spacing w:after="40" w:line="264" w:lineRule="auto"/>
+            </w:pPr>
+            <w:r>
+              <w:rPr>
+                <w:sz w:val="20"/>
+                <w:szCs w:val="20"/>
+                <w:rFonts w:ascii="Arial" w:hAnsi="Arial" w:cs="Arial"/>
+                <w:color w:val="334155"/>
+              </w:rPr>
+              <w:t xml:space="preserve">Dashboard &amp; Reports</w:t>
+            </w:r>
+          </w:p>
+        </w:tc>
+        <w:tc>
+          <w:tcPr>
+            <w:tcBorders>
+              <w:top w:val="single" w:sz="4" w:space="0" w:color="CBD5E1"/>
+              <w:left w:val="single" w:sz="4" w:space="0" w:color="CBD5E1"/>
+              <w:bottom w:val="single" w:sz="4" w:space="0" w:color="CBD5E1"/>
+              <w:right w:val="single" w:sz="4" w:space="0" w:color="CBD5E1"/>
+            </w:tcBorders>
+            <w:vAlign w:val="top"/>
+            <w:tcMar>
+              <w:top w:w="80" w:type="dxa"/>
+              <w:left w:w="80" w:type="dxa"/>
+              <w:bottom w:w="80" w:type="dxa"/>
+              <w:right w:w="80" w:type="dxa"/>
+            </w:tcMar>
+          </w:tcPr>
+          <w:p>
+            <w:pPr>
+              <w:jc w:val="left"/>
+              <w:spacing w:after="40" w:line="264" w:lineRule="auto"/>
+            </w:pPr>
+            <w:r>
+              <w:rPr>
+                <w:sz w:val="20"/>
+                <w:szCs w:val="20"/>
+                <w:rFonts w:ascii="Arial" w:hAnsi="Arial" w:cs="Arial"/>
+                <w:color w:val="334155"/>
+              </w:rPr>
+              <w:t xml:space="preserve">Provides the Center Director with a high-level strategic dashboard displaying: total active learners, learner churn rate trends, revenue from Learning Packages, session utilization rates, Teacher workload distribution, and Feedback SLA compliance percentage.</w:t>
+            </w:r>
+          </w:p>
+        </w:tc>
+      </w:tr>
+      <w:tr>
+        <w:tc>
+          <w:tcPr>
+            <w:tcBorders>
+              <w:top w:val="single" w:sz="4" w:space="0" w:color="CBD5E1"/>
+              <w:left w:val="single" w:sz="4" w:space="0" w:color="CBD5E1"/>
+              <w:bottom w:val="single" w:sz="4" w:space="0" w:color="CBD5E1"/>
+              <w:right w:val="single" w:sz="4" w:space="0" w:color="CBD5E1"/>
+            </w:tcBorders>
+            <w:vAlign w:val="top"/>
+            <w:tcMar>
+              <w:top w:w="80" w:type="dxa"/>
+              <w:left w:w="80" w:type="dxa"/>
+              <w:bottom w:w="80" w:type="dxa"/>
+              <w:right w:w="80" w:type="dxa"/>
+            </w:tcMar>
+          </w:tcPr>
+          <w:p>
+            <w:pPr>
+              <w:jc w:val="center"/>
+              <w:spacing w:after="40" w:line="264" w:lineRule="auto"/>
+            </w:pPr>
+            <w:r>
+              <w:rPr>
+                <w:b/>
+                <w:sz w:val="20"/>
+                <w:szCs w:val="20"/>
+                <w:rFonts w:ascii="Arial" w:hAnsi="Arial" w:cs="Arial"/>
+                <w:color w:val="0F172A"/>
+              </w:rPr>
+              <w:t xml:space="preserve">UC-25</w:t>
+            </w:r>
+          </w:p>
+        </w:tc>
+        <w:tc>
+          <w:tcPr>
+            <w:tcBorders>
+              <w:top w:val="single" w:sz="4" w:space="0" w:color="CBD5E1"/>
+              <w:left w:val="single" w:sz="4" w:space="0" w:color="CBD5E1"/>
+              <w:bottom w:val="single" w:sz="4" w:space="0" w:color="CBD5E1"/>
+              <w:right w:val="single" w:sz="4" w:space="0" w:color="CBD5E1"/>
+            </w:tcBorders>
+            <w:vAlign w:val="top"/>
+            <w:tcMar>
+              <w:top w:w="80" w:type="dxa"/>
+              <w:left w:w="80" w:type="dxa"/>
+              <w:bottom w:w="80" w:type="dxa"/>
+              <w:right w:w="80" w:type="dxa"/>
+            </w:tcMar>
+          </w:tcPr>
+          <w:p>
+            <w:pPr>
+              <w:jc w:val="left"/>
+              <w:spacing w:after="40" w:line="264" w:lineRule="auto"/>
+            </w:pPr>
+            <w:r>
+              <w:rPr>
+                <w:b/>
+                <w:sz w:val="20"/>
+                <w:szCs w:val="20"/>
+                <w:rFonts w:ascii="Arial" w:hAnsi="Arial" w:cs="Arial"/>
+                <w:color w:val="1D4ED8"/>
+              </w:rPr>
+              <w:t xml:space="preserve">Export Operational Reports</w:t>
+            </w:r>
+          </w:p>
+        </w:tc>
+        <w:tc>
+          <w:tcPr>
+            <w:tcBorders>
+              <w:top w:val="single" w:sz="4" w:space="0" w:color="CBD5E1"/>
+              <w:left w:val="single" w:sz="4" w:space="0" w:color="CBD5E1"/>
+              <w:bottom w:val="single" w:sz="4" w:space="0" w:color="CBD5E1"/>
+              <w:right w:val="single" w:sz="4" w:space="0" w:color="CBD5E1"/>
+            </w:tcBorders>
+            <w:vAlign w:val="top"/>
+            <w:tcMar>
+              <w:top w:w="80" w:type="dxa"/>
+              <w:left w:w="80" w:type="dxa"/>
+              <w:bottom w:w="80" w:type="dxa"/>
+              <w:right w:w="80" w:type="dxa"/>
+            </w:tcMar>
+          </w:tcPr>
+          <w:p>
+            <w:pPr>
+              <w:jc w:val="left"/>
+              <w:spacing w:after="40" w:line="264" w:lineRule="auto"/>
+            </w:pPr>
+            <w:r>
+              <w:rPr>
+                <w:sz w:val="20"/>
+                <w:szCs w:val="20"/>
+                <w:rFonts w:ascii="Arial" w:hAnsi="Arial" w:cs="Arial"/>
+                <w:color w:val="334155"/>
+              </w:rPr>
+              <w:t xml:space="preserve">Dashboard &amp; Reports</w:t>
+            </w:r>
+          </w:p>
+        </w:tc>
+        <w:tc>
+          <w:tcPr>
+            <w:tcBorders>
+              <w:top w:val="single" w:sz="4" w:space="0" w:color="CBD5E1"/>
+              <w:left w:val="single" w:sz="4" w:space="0" w:color="CBD5E1"/>
+              <w:bottom w:val="single" w:sz="4" w:space="0" w:color="CBD5E1"/>
+              <w:right w:val="single" w:sz="4" w:space="0" w:color="CBD5E1"/>
+            </w:tcBorders>
+            <w:vAlign w:val="top"/>
+            <w:tcMar>
+              <w:top w:w="80" w:type="dxa"/>
+              <w:left w:w="80" w:type="dxa"/>
+              <w:bottom w:w="80" w:type="dxa"/>
+              <w:right w:w="80" w:type="dxa"/>
+            </w:tcMar>
+          </w:tcPr>
+          <w:p>
+            <w:pPr>
+              <w:jc w:val="left"/>
+              <w:spacing w:after="40" w:line="264" w:lineRule="auto"/>
+            </w:pPr>
+            <w:r>
+              <w:rPr>
+                <w:sz w:val="20"/>
+                <w:szCs w:val="20"/>
+                <w:rFonts w:ascii="Arial" w:hAnsi="Arial" w:cs="Arial"/>
+                <w:color w:val="334155"/>
+              </w:rPr>
+              <w:t xml:space="preserve">Allows the Academic Admin and Center Director to export attendance summaries, learner status lists, package expiry timelines, and Feedback compliance reports as downloadable files (PDF / Excel) for offline review or stakeholder presentation.</w:t>
+            </w:r>
+          </w:p>
+        </w:tc>
+      </w:tr>
+      <w:tr>
+        <w:tc>
+          <w:tcPr>
+            <w:tcBorders>
+              <w:top w:val="single" w:sz="4" w:space="0" w:color="CBD5E1"/>
+              <w:left w:val="single" w:sz="4" w:space="0" w:color="CBD5E1"/>
+              <w:bottom w:val="single" w:sz="4" w:space="0" w:color="CBD5E1"/>
+              <w:right w:val="single" w:sz="4" w:space="0" w:color="CBD5E1"/>
+            </w:tcBorders>
+            <w:vAlign w:val="top"/>
+            <w:tcMar>
+              <w:top w:w="80" w:type="dxa"/>
+              <w:left w:w="80" w:type="dxa"/>
+              <w:bottom w:w="80" w:type="dxa"/>
+              <w:right w:w="80" w:type="dxa"/>
+            </w:tcMar>
+          </w:tcPr>
+          <w:p>
+            <w:pPr>
+              <w:jc w:val="center"/>
+              <w:spacing w:after="40" w:line="264" w:lineRule="auto"/>
+            </w:pPr>
+            <w:r>
+              <w:rPr>
+                <w:b/>
+                <w:sz w:val="20"/>
+                <w:szCs w:val="20"/>
+                <w:rFonts w:ascii="Arial" w:hAnsi="Arial" w:cs="Arial"/>
+                <w:color w:val="0F172A"/>
+              </w:rPr>
+              <w:t xml:space="preserve">UC-26</w:t>
+            </w:r>
+          </w:p>
+        </w:tc>
+        <w:tc>
+          <w:tcPr>
+            <w:tcBorders>
+              <w:top w:val="single" w:sz="4" w:space="0" w:color="CBD5E1"/>
+              <w:left w:val="single" w:sz="4" w:space="0" w:color="CBD5E1"/>
+              <w:bottom w:val="single" w:sz="4" w:space="0" w:color="CBD5E1"/>
+              <w:right w:val="single" w:sz="4" w:space="0" w:color="CBD5E1"/>
+            </w:tcBorders>
+            <w:vAlign w:val="top"/>
+            <w:tcMar>
+              <w:top w:w="80" w:type="dxa"/>
+              <w:left w:w="80" w:type="dxa"/>
+              <w:bottom w:w="80" w:type="dxa"/>
+              <w:right w:w="80" w:type="dxa"/>
+            </w:tcMar>
+          </w:tcPr>
+          <w:p>
+            <w:pPr>
+              <w:jc w:val="left"/>
+              <w:spacing w:after="40" w:line="264" w:lineRule="auto"/>
+            </w:pPr>
+            <w:r>
+              <w:rPr>
+                <w:b/>
+                <w:sz w:val="20"/>
+                <w:szCs w:val="20"/>
+                <w:rFonts w:ascii="Arial" w:hAnsi="Arial" w:cs="Arial"/>
+                <w:color w:val="1D4ED8"/>
+              </w:rPr>
+              <w:t xml:space="preserve">Manage User Accounts</w:t>
+            </w:r>
+          </w:p>
+        </w:tc>
+        <w:tc>
+          <w:tcPr>
+            <w:tcBorders>
+              <w:top w:val="single" w:sz="4" w:space="0" w:color="CBD5E1"/>
+              <w:left w:val="single" w:sz="4" w:space="0" w:color="CBD5E1"/>
+              <w:bottom w:val="single" w:sz="4" w:space="0" w:color="CBD5E1"/>
+              <w:right w:val="single" w:sz="4" w:space="0" w:color="CBD5E1"/>
+            </w:tcBorders>
+            <w:vAlign w:val="top"/>
+            <w:tcMar>
+              <w:top w:w="80" w:type="dxa"/>
+              <w:left w:w="80" w:type="dxa"/>
+              <w:bottom w:w="80" w:type="dxa"/>
+              <w:right w:w="80" w:type="dxa"/>
+            </w:tcMar>
+          </w:tcPr>
+          <w:p>
+            <w:pPr>
+              <w:jc w:val="left"/>
+              <w:spacing w:after="40" w:line="264" w:lineRule="auto"/>
+            </w:pPr>
+            <w:r>
+              <w:rPr>
+                <w:sz w:val="20"/>
+                <w:szCs w:val="20"/>
+                <w:rFonts w:ascii="Arial" w:hAnsi="Arial" w:cs="Arial"/>
+                <w:color w:val="334155"/>
+              </w:rPr>
+              <w:t xml:space="preserve">System Administration</w:t>
+            </w:r>
+          </w:p>
+        </w:tc>
+        <w:tc>
+          <w:tcPr>
+            <w:tcBorders>
+              <w:top w:val="single" w:sz="4" w:space="0" w:color="CBD5E1"/>
+              <w:left w:val="single" w:sz="4" w:space="0" w:color="CBD5E1"/>
+              <w:bottom w:val="single" w:sz="4" w:space="0" w:color="CBD5E1"/>
+              <w:right w:val="single" w:sz="4" w:space="0" w:color="CBD5E1"/>
+            </w:tcBorders>
+            <w:vAlign w:val="top"/>
+            <w:tcMar>
+              <w:top w:w="80" w:type="dxa"/>
+              <w:left w:w="80" w:type="dxa"/>
+              <w:bottom w:w="80" w:type="dxa"/>
+              <w:right w:w="80" w:type="dxa"/>
+            </w:tcMar>
+          </w:tcPr>
+          <w:p>
+            <w:pPr>
+              <w:jc w:val="left"/>
+              <w:spacing w:after="40" w:line="264" w:lineRule="auto"/>
+            </w:pPr>
+            <w:r>
+              <w:rPr>
+                <w:sz w:val="20"/>
+                <w:szCs w:val="20"/>
+                <w:rFonts w:ascii="Arial" w:hAnsi="Arial" w:cs="Arial"/>
+                <w:color w:val="334155"/>
+              </w:rPr>
+              <w:t xml:space="preserve">Allows the Academic Admin to create, update, activate, or deactivate user accounts for Teachers and other Academic Admin staff. Each account is assigned a role (Academic Admin / Teacher / Center Director) which determines system access permissions and visible menu items.</w:t>
+            </w:r>
+          </w:p>
+        </w:tc>
+      </w:tr>
+      <w:tr>
+        <w:tc>
+          <w:tcPr>
+            <w:tcBorders>
+              <w:top w:val="single" w:sz="4" w:space="0" w:color="CBD5E1"/>
+              <w:left w:val="single" w:sz="4" w:space="0" w:color="CBD5E1"/>
+              <w:bottom w:val="single" w:sz="4" w:space="0" w:color="CBD5E1"/>
+              <w:right w:val="single" w:sz="4" w:space="0" w:color="CBD5E1"/>
+            </w:tcBorders>
+            <w:vAlign w:val="top"/>
+            <w:tcMar>
+              <w:top w:w="80" w:type="dxa"/>
+              <w:left w:w="80" w:type="dxa"/>
+              <w:bottom w:w="80" w:type="dxa"/>
+              <w:right w:w="80" w:type="dxa"/>
+            </w:tcMar>
+          </w:tcPr>
+          <w:p>
+            <w:pPr>
+              <w:jc w:val="center"/>
+              <w:spacing w:after="40" w:line="264" w:lineRule="auto"/>
+            </w:pPr>
+            <w:r>
+              <w:rPr>
+                <w:b/>
+                <w:sz w:val="20"/>
+                <w:szCs w:val="20"/>
+                <w:rFonts w:ascii="Arial" w:hAnsi="Arial" w:cs="Arial"/>
+                <w:color w:val="0F172A"/>
+              </w:rPr>
+              <w:t xml:space="preserve">UC-27</w:t>
+            </w:r>
+          </w:p>
+        </w:tc>
+        <w:tc>
+          <w:tcPr>
+            <w:tcBorders>
+              <w:top w:val="single" w:sz="4" w:space="0" w:color="CBD5E1"/>
+              <w:left w:val="single" w:sz="4" w:space="0" w:color="CBD5E1"/>
+              <w:bottom w:val="single" w:sz="4" w:space="0" w:color="CBD5E1"/>
+              <w:right w:val="single" w:sz="4" w:space="0" w:color="CBD5E1"/>
+            </w:tcBorders>
+            <w:vAlign w:val="top"/>
+            <w:tcMar>
+              <w:top w:w="80" w:type="dxa"/>
+              <w:left w:w="80" w:type="dxa"/>
+              <w:bottom w:w="80" w:type="dxa"/>
+              <w:right w:w="80" w:type="dxa"/>
+            </w:tcMar>
+          </w:tcPr>
+          <w:p>
+            <w:pPr>
+              <w:jc w:val="left"/>
+              <w:spacing w:after="40" w:line="264" w:lineRule="auto"/>
+            </w:pPr>
+            <w:r>
+              <w:rPr>
+                <w:b/>
+                <w:sz w:val="20"/>
+                <w:szCs w:val="20"/>
+                <w:rFonts w:ascii="Arial" w:hAnsi="Arial" w:cs="Arial"/>
+                <w:color w:val="1D4ED8"/>
+              </w:rPr>
+              <w:t xml:space="preserve">Manage Master Data</w:t>
+            </w:r>
+          </w:p>
+        </w:tc>
+        <w:tc>
+          <w:tcPr>
+            <w:tcBorders>
+              <w:top w:val="single" w:sz="4" w:space="0" w:color="CBD5E1"/>
+              <w:left w:val="single" w:sz="4" w:space="0" w:color="CBD5E1"/>
+              <w:bottom w:val="single" w:sz="4" w:space="0" w:color="CBD5E1"/>
+              <w:right w:val="single" w:sz="4" w:space="0" w:color="CBD5E1"/>
+            </w:tcBorders>
+            <w:vAlign w:val="top"/>
+            <w:tcMar>
+              <w:top w:w="80" w:type="dxa"/>
+              <w:left w:w="80" w:type="dxa"/>
+              <w:bottom w:w="80" w:type="dxa"/>
+              <w:right w:w="80" w:type="dxa"/>
+            </w:tcMar>
+          </w:tcPr>
+          <w:p>
+            <w:pPr>
+              <w:jc w:val="left"/>
+              <w:spacing w:after="40" w:line="264" w:lineRule="auto"/>
+            </w:pPr>
+            <w:r>
+              <w:rPr>
+                <w:sz w:val="20"/>
+                <w:szCs w:val="20"/>
+                <w:rFonts w:ascii="Arial" w:hAnsi="Arial" w:cs="Arial"/>
+                <w:color w:val="334155"/>
+              </w:rPr>
+              <w:t xml:space="preserve">System Administration</w:t>
+            </w:r>
+          </w:p>
+        </w:tc>
+        <w:tc>
+          <w:tcPr>
+            <w:tcBorders>
+              <w:top w:val="single" w:sz="4" w:space="0" w:color="CBD5E1"/>
+              <w:left w:val="single" w:sz="4" w:space="0" w:color="CBD5E1"/>
+              <w:bottom w:val="single" w:sz="4" w:space="0" w:color="CBD5E1"/>
+              <w:right w:val="single" w:sz="4" w:space="0" w:color="CBD5E1"/>
+            </w:tcBorders>
+            <w:vAlign w:val="top"/>
+            <w:tcMar>
+              <w:top w:w="80" w:type="dxa"/>
+              <w:left w:w="80" w:type="dxa"/>
+              <w:bottom w:w="80" w:type="dxa"/>
+              <w:right w:w="80" w:type="dxa"/>
+            </w:tcMar>
+          </w:tcPr>
+          <w:p>
+            <w:pPr>
+              <w:jc w:val="left"/>
+              <w:spacing w:after="40" w:line="264" w:lineRule="auto"/>
+            </w:pPr>
+            <w:r>
+              <w:rPr>
+                <w:sz w:val="20"/>
+                <w:szCs w:val="20"/>
+                <w:rFonts w:ascii="Arial" w:hAnsi="Arial" w:cs="Arial"/>
+                <w:color w:val="334155"/>
+              </w:rPr>
+              <w:t xml:space="preserve">Allows the Academic Admin to manage system-wide configuration data including: classroom definitions (name, capacity), time slot templates, subject categories (English / Kids Coding), and notification email templates. This is the foundational data required before scheduling sessions.</w:t>
+            </w:r>
           </w:p>
         </w:tc>
       </w:tr>
     </w:tbl>
-    <w:p>
-      <w:r>
-        <w:t>…</w:t>
-      </w:r>
-    </w:p>
     <w:p>
       <w:pPr>
         <w:pStyle w:val="Heading4"/>

</xml_diff>

<commit_message>
Add Erd to ERS
</commit_message>
<xml_diff>
--- a/Document/02_Requirements/Report3_Software Requirement Specification.docx
+++ b/Document/02_Requirements/Report3_Software Requirement Specification.docx
@@ -9669,87 +9669,111 @@
     </w:p>
     <w:tbl>
       <w:tblPr>
-        <w:tblStyle w:val="Kiu2"/>
-        <w:tblW w:w="4861" w:type="pct"/>
-        <w:tblInd w:w="137" w:type="dxa"/>
-        <w:tblLook w:val="04A0" w:firstRow="1" w:lastRow="0" w:firstColumn="1" w:lastColumn="0" w:noHBand="0" w:noVBand="1"/>
+        <w:tblStyle w:val="TableGrid"/>
+        <w:tblW w:w="5000" w:type="pct"/>
       </w:tblPr>
       <w:tblGrid>
-        <w:gridCol w:w="517"/>
-        <w:gridCol w:w="2123"/>
-        <w:gridCol w:w="6149"/>
+        <w:gridCol w:w="600"/>
+        <w:gridCol w:w="2200"/>
+        <w:gridCol w:w="6800"/>
       </w:tblGrid>
       <w:tr>
         <w:trPr>
-          <w:cnfStyle w:val="100000000000" w:firstRow="1" w:lastRow="0" w:firstColumn="0" w:lastColumn="0" w:oddVBand="0" w:evenVBand="0" w:oddHBand="0" w:evenHBand="0" w:firstRowFirstColumn="0" w:firstRowLastColumn="0" w:lastRowFirstColumn="0" w:lastRowLastColumn="0"/>
-          <w:trHeight w:val="67"/>
+          <w:tblHeader/>
         </w:trPr>
         <w:tc>
           <w:tcPr>
-            <w:tcW w:w="294" w:type="pct"/>
-            <w:shd w:val="clear" w:color="auto" w:fill="FFE8E1"/>
-          </w:tcPr>
-          <w:p>
-            <w:pPr>
-              <w:rPr>
-                <w:rFonts w:asciiTheme="minorHAnsi" w:hAnsiTheme="minorHAnsi" w:cstheme="minorHAnsi"/>
+            <w:shd w:val="clear" w:color="auto" w:fill="F8FAFC"/>
+            <w:tcBorders>
+              <w:top w:val="single" w:sz="4" w:space="0" w:color="CBD5E1"/>
+              <w:left w:val="single" w:sz="4" w:space="0" w:color="CBD5E1"/>
+              <w:bottom w:val="single" w:sz="4" w:space="0" w:color="CBD5E1"/>
+              <w:right w:val="single" w:sz="4" w:space="0" w:color="CBD5E1"/>
+            </w:tcBorders>
+            <w:tcMar>
+              <w:top w:w="60" w:type="dxa"/>
+              <w:left w:w="60" w:type="dxa"/>
+              <w:bottom w:w="60" w:type="dxa"/>
+              <w:right w:w="60" w:type="dxa"/>
+            </w:tcMar>
+          </w:tcPr>
+          <w:p>
+            <w:pPr>
+              <w:jc w:val="center"/>
+              <w:spacing w:after="40" w:line="264" w:lineRule="auto"/>
+            </w:pPr>
+            <w:r>
+              <w:rPr>
                 <w:b/>
-                <w:sz w:val="22"/>
-              </w:rPr>
-            </w:pPr>
-            <w:r>
-              <w:rPr>
-                <w:rFonts w:asciiTheme="minorHAnsi" w:hAnsiTheme="minorHAnsi" w:cstheme="minorHAnsi"/>
+                <w:sz w:val="21"/>
+                <w:rFonts w:ascii="Arial" w:hAnsi="Arial"/>
+                <w:color w:val="1E40AF"/>
+              </w:rPr>
+              <w:t xml:space="preserve">#</w:t>
+            </w:r>
+          </w:p>
+        </w:tc>
+        <w:tc>
+          <w:tcPr>
+            <w:shd w:val="clear" w:color="auto" w:fill="F8FAFC"/>
+            <w:tcBorders>
+              <w:top w:val="single" w:sz="4" w:space="0" w:color="CBD5E1"/>
+              <w:left w:val="single" w:sz="4" w:space="0" w:color="CBD5E1"/>
+              <w:bottom w:val="single" w:sz="4" w:space="0" w:color="CBD5E1"/>
+              <w:right w:val="single" w:sz="4" w:space="0" w:color="CBD5E1"/>
+            </w:tcBorders>
+            <w:tcMar>
+              <w:top w:w="60" w:type="dxa"/>
+              <w:left w:w="60" w:type="dxa"/>
+              <w:bottom w:w="60" w:type="dxa"/>
+              <w:right w:w="60" w:type="dxa"/>
+            </w:tcMar>
+          </w:tcPr>
+          <w:p>
+            <w:pPr>
+              <w:jc w:val="center"/>
+              <w:spacing w:after="40" w:line="264" w:lineRule="auto"/>
+            </w:pPr>
+            <w:r>
+              <w:rPr>
                 <w:b/>
-                <w:sz w:val="22"/>
-              </w:rPr>
-              <w:t>#</w:t>
-            </w:r>
-          </w:p>
-        </w:tc>
-        <w:tc>
-          <w:tcPr>
-            <w:tcW w:w="1208" w:type="pct"/>
-            <w:shd w:val="clear" w:color="auto" w:fill="FFE8E1"/>
-          </w:tcPr>
-          <w:p>
-            <w:pPr>
-              <w:rPr>
-                <w:rFonts w:asciiTheme="minorHAnsi" w:hAnsiTheme="minorHAnsi" w:cstheme="minorHAnsi"/>
+                <w:sz w:val="21"/>
+                <w:rFonts w:ascii="Arial" w:hAnsi="Arial"/>
+                <w:color w:val="1E40AF"/>
+              </w:rPr>
+              <w:t xml:space="preserve">Entity</w:t>
+            </w:r>
+          </w:p>
+        </w:tc>
+        <w:tc>
+          <w:tcPr>
+            <w:shd w:val="clear" w:color="auto" w:fill="F8FAFC"/>
+            <w:tcBorders>
+              <w:top w:val="single" w:sz="4" w:space="0" w:color="CBD5E1"/>
+              <w:left w:val="single" w:sz="4" w:space="0" w:color="CBD5E1"/>
+              <w:bottom w:val="single" w:sz="4" w:space="0" w:color="CBD5E1"/>
+              <w:right w:val="single" w:sz="4" w:space="0" w:color="CBD5E1"/>
+            </w:tcBorders>
+            <w:tcMar>
+              <w:top w:w="60" w:type="dxa"/>
+              <w:left w:w="60" w:type="dxa"/>
+              <w:bottom w:w="60" w:type="dxa"/>
+              <w:right w:w="60" w:type="dxa"/>
+            </w:tcMar>
+          </w:tcPr>
+          <w:p>
+            <w:pPr>
+              <w:jc w:val="center"/>
+              <w:spacing w:after="40" w:line="264" w:lineRule="auto"/>
+            </w:pPr>
+            <w:r>
+              <w:rPr>
                 <w:b/>
-                <w:sz w:val="22"/>
-              </w:rPr>
-            </w:pPr>
-            <w:r>
-              <w:rPr>
-                <w:rFonts w:asciiTheme="minorHAnsi" w:hAnsiTheme="minorHAnsi" w:cstheme="minorHAnsi"/>
-                <w:b/>
-                <w:sz w:val="22"/>
-              </w:rPr>
-              <w:t>Entity</w:t>
-            </w:r>
-          </w:p>
-        </w:tc>
-        <w:tc>
-          <w:tcPr>
-            <w:tcW w:w="3498" w:type="pct"/>
-            <w:shd w:val="clear" w:color="auto" w:fill="FFE8E1"/>
-          </w:tcPr>
-          <w:p>
-            <w:pPr>
-              <w:rPr>
-                <w:rFonts w:asciiTheme="minorHAnsi" w:hAnsiTheme="minorHAnsi" w:cstheme="minorHAnsi"/>
-                <w:b/>
-                <w:sz w:val="22"/>
-              </w:rPr>
-            </w:pPr>
-            <w:r>
-              <w:rPr>
-                <w:rFonts w:asciiTheme="minorHAnsi" w:hAnsiTheme="minorHAnsi" w:cstheme="minorHAnsi"/>
-                <w:b/>
-                <w:sz w:val="22"/>
-              </w:rPr>
-              <w:t>Description</w:t>
+                <w:sz w:val="21"/>
+                <w:rFonts w:ascii="Arial" w:hAnsi="Arial"/>
+                <w:color w:val="1E40AF"/>
+              </w:rPr>
+              <w:t xml:space="preserve">Description</w:t>
             </w:r>
           </w:p>
         </w:tc>
@@ -9757,61 +9781,93 @@
       <w:tr>
         <w:tc>
           <w:tcPr>
-            <w:tcW w:w="294" w:type="pct"/>
-          </w:tcPr>
-          <w:p>
-            <w:pPr>
-              <w:rPr>
-                <w:rFonts w:asciiTheme="minorHAnsi" w:hAnsiTheme="minorHAnsi" w:cstheme="minorHAnsi"/>
-                <w:sz w:val="22"/>
-              </w:rPr>
-            </w:pPr>
-            <w:r>
-              <w:rPr>
-                <w:rFonts w:asciiTheme="minorHAnsi" w:hAnsiTheme="minorHAnsi" w:cstheme="minorHAnsi"/>
-                <w:sz w:val="22"/>
-              </w:rPr>
-              <w:t>1</w:t>
-            </w:r>
-          </w:p>
-        </w:tc>
-        <w:tc>
-          <w:tcPr>
-            <w:tcW w:w="1208" w:type="pct"/>
-          </w:tcPr>
-          <w:p>
-            <w:pPr>
-              <w:rPr>
-                <w:rFonts w:asciiTheme="minorHAnsi" w:hAnsiTheme="minorHAnsi" w:cstheme="minorHAnsi"/>
-                <w:sz w:val="22"/>
-              </w:rPr>
-            </w:pPr>
-            <w:r>
-              <w:rPr>
-                <w:rFonts w:asciiTheme="minorHAnsi" w:hAnsiTheme="minorHAnsi" w:cstheme="minorHAnsi"/>
-                <w:sz w:val="22"/>
-              </w:rPr>
-              <w:t>Patrol</w:t>
-            </w:r>
-          </w:p>
-        </w:tc>
-        <w:tc>
-          <w:tcPr>
-            <w:tcW w:w="3498" w:type="pct"/>
-          </w:tcPr>
-          <w:p>
-            <w:pPr>
-              <w:rPr>
-                <w:rFonts w:asciiTheme="minorHAnsi" w:hAnsiTheme="minorHAnsi" w:cstheme="minorHAnsi"/>
-                <w:sz w:val="22"/>
-              </w:rPr>
-            </w:pPr>
-            <w:r>
-              <w:rPr>
-                <w:rFonts w:asciiTheme="minorHAnsi" w:hAnsiTheme="minorHAnsi" w:cstheme="minorHAnsi"/>
-                <w:sz w:val="22"/>
-              </w:rPr>
-              <w:t>Cafeteria’s customer information</w:t>
+            <w:tcBorders>
+              <w:top w:val="single" w:sz="4" w:space="0" w:color="CBD5E1"/>
+              <w:left w:val="single" w:sz="4" w:space="0" w:color="CBD5E1"/>
+              <w:bottom w:val="single" w:sz="4" w:space="0" w:color="CBD5E1"/>
+              <w:right w:val="single" w:sz="4" w:space="0" w:color="CBD5E1"/>
+            </w:tcBorders>
+            <w:tcMar>
+              <w:top w:w="60" w:type="dxa"/>
+              <w:left w:w="60" w:type="dxa"/>
+              <w:bottom w:w="60" w:type="dxa"/>
+              <w:right w:w="60" w:type="dxa"/>
+            </w:tcMar>
+          </w:tcPr>
+          <w:p>
+            <w:pPr>
+              <w:jc w:val="center"/>
+              <w:spacing w:after="40" w:line="264" w:lineRule="auto"/>
+            </w:pPr>
+            <w:r>
+              <w:rPr>
+                <w:b/>
+                <w:sz w:val="20"/>
+                <w:rFonts w:ascii="Arial" w:hAnsi="Arial"/>
+                <w:color w:val="0F172A"/>
+              </w:rPr>
+              <w:t xml:space="preserve">1</w:t>
+            </w:r>
+          </w:p>
+        </w:tc>
+        <w:tc>
+          <w:tcPr>
+            <w:tcBorders>
+              <w:top w:val="single" w:sz="4" w:space="0" w:color="CBD5E1"/>
+              <w:left w:val="single" w:sz="4" w:space="0" w:color="CBD5E1"/>
+              <w:bottom w:val="single" w:sz="4" w:space="0" w:color="CBD5E1"/>
+              <w:right w:val="single" w:sz="4" w:space="0" w:color="CBD5E1"/>
+            </w:tcBorders>
+            <w:tcMar>
+              <w:top w:w="60" w:type="dxa"/>
+              <w:left w:w="60" w:type="dxa"/>
+              <w:bottom w:w="60" w:type="dxa"/>
+              <w:right w:w="60" w:type="dxa"/>
+            </w:tcMar>
+          </w:tcPr>
+          <w:p>
+            <w:pPr>
+              <w:jc w:val="left"/>
+              <w:spacing w:after="40" w:line="264" w:lineRule="auto"/>
+            </w:pPr>
+            <w:r>
+              <w:rPr>
+                <w:b/>
+                <w:sz w:val="20"/>
+                <w:rFonts w:ascii="Arial" w:hAnsi="Arial"/>
+                <w:color w:val="1D4ED8"/>
+              </w:rPr>
+              <w:t xml:space="preserve">Role</w:t>
+            </w:r>
+          </w:p>
+        </w:tc>
+        <w:tc>
+          <w:tcPr>
+            <w:tcBorders>
+              <w:top w:val="single" w:sz="4" w:space="0" w:color="CBD5E1"/>
+              <w:left w:val="single" w:sz="4" w:space="0" w:color="CBD5E1"/>
+              <w:bottom w:val="single" w:sz="4" w:space="0" w:color="CBD5E1"/>
+              <w:right w:val="single" w:sz="4" w:space="0" w:color="CBD5E1"/>
+            </w:tcBorders>
+            <w:tcMar>
+              <w:top w:w="60" w:type="dxa"/>
+              <w:left w:w="60" w:type="dxa"/>
+              <w:bottom w:w="60" w:type="dxa"/>
+              <w:right w:w="60" w:type="dxa"/>
+            </w:tcMar>
+          </w:tcPr>
+          <w:p>
+            <w:pPr>
+              <w:jc w:val="left"/>
+              <w:spacing w:after="40" w:line="264" w:lineRule="auto"/>
+            </w:pPr>
+            <w:r>
+              <w:rPr>
+                <w:sz w:val="20"/>
+                <w:rFonts w:ascii="Arial" w:hAnsi="Arial"/>
+                <w:color w:val="334155"/>
+              </w:rPr>
+              <w:t xml:space="preserve">Stores role definitions controlling system access permissions for Academic Admin, Teacher, and Center Director.</w:t>
             </w:r>
           </w:p>
         </w:tc>
@@ -9819,61 +9875,93 @@
       <w:tr>
         <w:tc>
           <w:tcPr>
-            <w:tcW w:w="294" w:type="pct"/>
-          </w:tcPr>
-          <w:p>
-            <w:pPr>
-              <w:rPr>
-                <w:rFonts w:asciiTheme="minorHAnsi" w:hAnsiTheme="minorHAnsi" w:cstheme="minorHAnsi"/>
-                <w:sz w:val="22"/>
-              </w:rPr>
-            </w:pPr>
-            <w:r>
-              <w:rPr>
-                <w:rFonts w:asciiTheme="minorHAnsi" w:hAnsiTheme="minorHAnsi" w:cstheme="minorHAnsi"/>
-                <w:sz w:val="22"/>
-              </w:rPr>
-              <w:t>2</w:t>
-            </w:r>
-          </w:p>
-        </w:tc>
-        <w:tc>
-          <w:tcPr>
-            <w:tcW w:w="1208" w:type="pct"/>
-          </w:tcPr>
-          <w:p>
-            <w:pPr>
-              <w:rPr>
-                <w:rFonts w:asciiTheme="minorHAnsi" w:hAnsiTheme="minorHAnsi" w:cstheme="minorHAnsi"/>
-                <w:sz w:val="22"/>
-              </w:rPr>
-            </w:pPr>
-            <w:r>
-              <w:rPr>
-                <w:rFonts w:asciiTheme="minorHAnsi" w:hAnsiTheme="minorHAnsi" w:cstheme="minorHAnsi"/>
-                <w:sz w:val="22"/>
-              </w:rPr>
-              <w:t>Meal</w:t>
-            </w:r>
-          </w:p>
-        </w:tc>
-        <w:tc>
-          <w:tcPr>
-            <w:tcW w:w="3498" w:type="pct"/>
-          </w:tcPr>
-          <w:p>
-            <w:pPr>
-              <w:rPr>
-                <w:rFonts w:asciiTheme="minorHAnsi" w:hAnsiTheme="minorHAnsi" w:cstheme="minorHAnsi"/>
-                <w:sz w:val="22"/>
-              </w:rPr>
-            </w:pPr>
-            <w:r>
-              <w:rPr>
-                <w:rFonts w:asciiTheme="minorHAnsi" w:hAnsiTheme="minorHAnsi" w:cstheme="minorHAnsi"/>
-                <w:sz w:val="22"/>
-              </w:rPr>
-              <w:t>…</w:t>
+            <w:tcBorders>
+              <w:top w:val="single" w:sz="4" w:space="0" w:color="CBD5E1"/>
+              <w:left w:val="single" w:sz="4" w:space="0" w:color="CBD5E1"/>
+              <w:bottom w:val="single" w:sz="4" w:space="0" w:color="CBD5E1"/>
+              <w:right w:val="single" w:sz="4" w:space="0" w:color="CBD5E1"/>
+            </w:tcBorders>
+            <w:tcMar>
+              <w:top w:w="60" w:type="dxa"/>
+              <w:left w:w="60" w:type="dxa"/>
+              <w:bottom w:w="60" w:type="dxa"/>
+              <w:right w:w="60" w:type="dxa"/>
+            </w:tcMar>
+          </w:tcPr>
+          <w:p>
+            <w:pPr>
+              <w:jc w:val="center"/>
+              <w:spacing w:after="40" w:line="264" w:lineRule="auto"/>
+            </w:pPr>
+            <w:r>
+              <w:rPr>
+                <w:b/>
+                <w:sz w:val="20"/>
+                <w:rFonts w:ascii="Arial" w:hAnsi="Arial"/>
+                <w:color w:val="0F172A"/>
+              </w:rPr>
+              <w:t xml:space="preserve">2</w:t>
+            </w:r>
+          </w:p>
+        </w:tc>
+        <w:tc>
+          <w:tcPr>
+            <w:tcBorders>
+              <w:top w:val="single" w:sz="4" w:space="0" w:color="CBD5E1"/>
+              <w:left w:val="single" w:sz="4" w:space="0" w:color="CBD5E1"/>
+              <w:bottom w:val="single" w:sz="4" w:space="0" w:color="CBD5E1"/>
+              <w:right w:val="single" w:sz="4" w:space="0" w:color="CBD5E1"/>
+            </w:tcBorders>
+            <w:tcMar>
+              <w:top w:w="60" w:type="dxa"/>
+              <w:left w:w="60" w:type="dxa"/>
+              <w:bottom w:w="60" w:type="dxa"/>
+              <w:right w:w="60" w:type="dxa"/>
+            </w:tcMar>
+          </w:tcPr>
+          <w:p>
+            <w:pPr>
+              <w:jc w:val="left"/>
+              <w:spacing w:after="40" w:line="264" w:lineRule="auto"/>
+            </w:pPr>
+            <w:r>
+              <w:rPr>
+                <w:b/>
+                <w:sz w:val="20"/>
+                <w:rFonts w:ascii="Arial" w:hAnsi="Arial"/>
+                <w:color w:val="1D4ED8"/>
+              </w:rPr>
+              <w:t xml:space="preserve">User</w:t>
+            </w:r>
+          </w:p>
+        </w:tc>
+        <w:tc>
+          <w:tcPr>
+            <w:tcBorders>
+              <w:top w:val="single" w:sz="4" w:space="0" w:color="CBD5E1"/>
+              <w:left w:val="single" w:sz="4" w:space="0" w:color="CBD5E1"/>
+              <w:bottom w:val="single" w:sz="4" w:space="0" w:color="CBD5E1"/>
+              <w:right w:val="single" w:sz="4" w:space="0" w:color="CBD5E1"/>
+            </w:tcBorders>
+            <w:tcMar>
+              <w:top w:w="60" w:type="dxa"/>
+              <w:left w:w="60" w:type="dxa"/>
+              <w:bottom w:w="60" w:type="dxa"/>
+              <w:right w:w="60" w:type="dxa"/>
+            </w:tcMar>
+          </w:tcPr>
+          <w:p>
+            <w:pPr>
+              <w:jc w:val="left"/>
+              <w:spacing w:after="40" w:line="264" w:lineRule="auto"/>
+            </w:pPr>
+            <w:r>
+              <w:rPr>
+                <w:sz w:val="20"/>
+                <w:rFonts w:ascii="Arial" w:hAnsi="Arial"/>
+                <w:color w:val="334155"/>
+              </w:rPr>
+              <w:t xml:space="preserve">Stores authenticated user accounts including login credentials, profile data, and role assignments for all system operators (Academic Admin, Teacher, Center Director).</w:t>
             </w:r>
           </w:p>
         </w:tc>
@@ -9881,55 +9969,1222 @@
       <w:tr>
         <w:tc>
           <w:tcPr>
-            <w:tcW w:w="294" w:type="pct"/>
-          </w:tcPr>
-          <w:p>
-            <w:pPr>
-              <w:rPr>
-                <w:rFonts w:asciiTheme="minorHAnsi" w:hAnsiTheme="minorHAnsi" w:cstheme="minorHAnsi"/>
-                <w:sz w:val="22"/>
-              </w:rPr>
-            </w:pPr>
-            <w:r>
-              <w:rPr>
-                <w:rFonts w:asciiTheme="minorHAnsi" w:hAnsiTheme="minorHAnsi" w:cstheme="minorHAnsi"/>
-                <w:sz w:val="22"/>
-              </w:rPr>
-              <w:t>3</w:t>
-            </w:r>
-          </w:p>
-        </w:tc>
-        <w:tc>
-          <w:tcPr>
-            <w:tcW w:w="1208" w:type="pct"/>
-          </w:tcPr>
-          <w:p>
-            <w:pPr>
-              <w:rPr>
-                <w:rFonts w:asciiTheme="minorHAnsi" w:hAnsiTheme="minorHAnsi" w:cstheme="minorHAnsi"/>
-                <w:sz w:val="22"/>
-              </w:rPr>
-            </w:pPr>
-            <w:r>
-              <w:rPr>
-                <w:rFonts w:asciiTheme="minorHAnsi" w:hAnsiTheme="minorHAnsi" w:cstheme="minorHAnsi"/>
-                <w:sz w:val="22"/>
-              </w:rPr>
-              <w:t>…</w:t>
-            </w:r>
-          </w:p>
-        </w:tc>
-        <w:tc>
-          <w:tcPr>
-            <w:tcW w:w="3498" w:type="pct"/>
-          </w:tcPr>
-          <w:p>
-            <w:pPr>
-              <w:rPr>
-                <w:rFonts w:asciiTheme="minorHAnsi" w:hAnsiTheme="minorHAnsi" w:cstheme="minorHAnsi"/>
-                <w:sz w:val="22"/>
-              </w:rPr>
-            </w:pPr>
+            <w:tcBorders>
+              <w:top w:val="single" w:sz="4" w:space="0" w:color="CBD5E1"/>
+              <w:left w:val="single" w:sz="4" w:space="0" w:color="CBD5E1"/>
+              <w:bottom w:val="single" w:sz="4" w:space="0" w:color="CBD5E1"/>
+              <w:right w:val="single" w:sz="4" w:space="0" w:color="CBD5E1"/>
+            </w:tcBorders>
+            <w:tcMar>
+              <w:top w:w="60" w:type="dxa"/>
+              <w:left w:w="60" w:type="dxa"/>
+              <w:bottom w:w="60" w:type="dxa"/>
+              <w:right w:w="60" w:type="dxa"/>
+            </w:tcMar>
+          </w:tcPr>
+          <w:p>
+            <w:pPr>
+              <w:jc w:val="center"/>
+              <w:spacing w:after="40" w:line="264" w:lineRule="auto"/>
+            </w:pPr>
+            <w:r>
+              <w:rPr>
+                <w:b/>
+                <w:sz w:val="20"/>
+                <w:rFonts w:ascii="Arial" w:hAnsi="Arial"/>
+                <w:color w:val="0F172A"/>
+              </w:rPr>
+              <w:t xml:space="preserve">3</w:t>
+            </w:r>
+          </w:p>
+        </w:tc>
+        <w:tc>
+          <w:tcPr>
+            <w:tcBorders>
+              <w:top w:val="single" w:sz="4" w:space="0" w:color="CBD5E1"/>
+              <w:left w:val="single" w:sz="4" w:space="0" w:color="CBD5E1"/>
+              <w:bottom w:val="single" w:sz="4" w:space="0" w:color="CBD5E1"/>
+              <w:right w:val="single" w:sz="4" w:space="0" w:color="CBD5E1"/>
+            </w:tcBorders>
+            <w:tcMar>
+              <w:top w:w="60" w:type="dxa"/>
+              <w:left w:w="60" w:type="dxa"/>
+              <w:bottom w:w="60" w:type="dxa"/>
+              <w:right w:w="60" w:type="dxa"/>
+            </w:tcMar>
+          </w:tcPr>
+          <w:p>
+            <w:pPr>
+              <w:jc w:val="left"/>
+              <w:spacing w:after="40" w:line="264" w:lineRule="auto"/>
+            </w:pPr>
+            <w:r>
+              <w:rPr>
+                <w:b/>
+                <w:sz w:val="20"/>
+                <w:rFonts w:ascii="Arial" w:hAnsi="Arial"/>
+                <w:color w:val="1D4ED8"/>
+              </w:rPr>
+              <w:t xml:space="preserve">Learner</w:t>
+            </w:r>
+          </w:p>
+        </w:tc>
+        <w:tc>
+          <w:tcPr>
+            <w:tcBorders>
+              <w:top w:val="single" w:sz="4" w:space="0" w:color="CBD5E1"/>
+              <w:left w:val="single" w:sz="4" w:space="0" w:color="CBD5E1"/>
+              <w:bottom w:val="single" w:sz="4" w:space="0" w:color="CBD5E1"/>
+              <w:right w:val="single" w:sz="4" w:space="0" w:color="CBD5E1"/>
+            </w:tcBorders>
+            <w:tcMar>
+              <w:top w:w="60" w:type="dxa"/>
+              <w:left w:w="60" w:type="dxa"/>
+              <w:bottom w:w="60" w:type="dxa"/>
+              <w:right w:w="60" w:type="dxa"/>
+            </w:tcMar>
+          </w:tcPr>
+          <w:p>
+            <w:pPr>
+              <w:jc w:val="left"/>
+              <w:spacing w:after="40" w:line="264" w:lineRule="auto"/>
+            </w:pPr>
+            <w:r>
+              <w:rPr>
+                <w:sz w:val="20"/>
+                <w:rFonts w:ascii="Arial" w:hAnsi="Arial"/>
+                <w:color w:val="334155"/>
+              </w:rPr>
+              <w:t xml:space="preserve">Stores learner personal information, enrollment status, and parent association. Tracks the full lifecycle from enrollment through completion or withdrawal.</w:t>
+            </w:r>
+          </w:p>
+        </w:tc>
+      </w:tr>
+      <w:tr>
+        <w:tc>
+          <w:tcPr>
+            <w:tcBorders>
+              <w:top w:val="single" w:sz="4" w:space="0" w:color="CBD5E1"/>
+              <w:left w:val="single" w:sz="4" w:space="0" w:color="CBD5E1"/>
+              <w:bottom w:val="single" w:sz="4" w:space="0" w:color="CBD5E1"/>
+              <w:right w:val="single" w:sz="4" w:space="0" w:color="CBD5E1"/>
+            </w:tcBorders>
+            <w:tcMar>
+              <w:top w:w="60" w:type="dxa"/>
+              <w:left w:w="60" w:type="dxa"/>
+              <w:bottom w:w="60" w:type="dxa"/>
+              <w:right w:w="60" w:type="dxa"/>
+            </w:tcMar>
+          </w:tcPr>
+          <w:p>
+            <w:pPr>
+              <w:jc w:val="center"/>
+              <w:spacing w:after="40" w:line="264" w:lineRule="auto"/>
+            </w:pPr>
+            <w:r>
+              <w:rPr>
+                <w:b/>
+                <w:sz w:val="20"/>
+                <w:rFonts w:ascii="Arial" w:hAnsi="Arial"/>
+                <w:color w:val="0F172A"/>
+              </w:rPr>
+              <w:t xml:space="preserve">4</w:t>
+            </w:r>
+          </w:p>
+        </w:tc>
+        <w:tc>
+          <w:tcPr>
+            <w:tcBorders>
+              <w:top w:val="single" w:sz="4" w:space="0" w:color="CBD5E1"/>
+              <w:left w:val="single" w:sz="4" w:space="0" w:color="CBD5E1"/>
+              <w:bottom w:val="single" w:sz="4" w:space="0" w:color="CBD5E1"/>
+              <w:right w:val="single" w:sz="4" w:space="0" w:color="CBD5E1"/>
+            </w:tcBorders>
+            <w:tcMar>
+              <w:top w:w="60" w:type="dxa"/>
+              <w:left w:w="60" w:type="dxa"/>
+              <w:bottom w:w="60" w:type="dxa"/>
+              <w:right w:w="60" w:type="dxa"/>
+            </w:tcMar>
+          </w:tcPr>
+          <w:p>
+            <w:pPr>
+              <w:jc w:val="left"/>
+              <w:spacing w:after="40" w:line="264" w:lineRule="auto"/>
+            </w:pPr>
+            <w:r>
+              <w:rPr>
+                <w:b/>
+                <w:sz w:val="20"/>
+                <w:rFonts w:ascii="Arial" w:hAnsi="Arial"/>
+                <w:color w:val="1D4ED8"/>
+              </w:rPr>
+              <w:t xml:space="preserve">Parent</w:t>
+            </w:r>
+          </w:p>
+        </w:tc>
+        <w:tc>
+          <w:tcPr>
+            <w:tcBorders>
+              <w:top w:val="single" w:sz="4" w:space="0" w:color="CBD5E1"/>
+              <w:left w:val="single" w:sz="4" w:space="0" w:color="CBD5E1"/>
+              <w:bottom w:val="single" w:sz="4" w:space="0" w:color="CBD5E1"/>
+              <w:right w:val="single" w:sz="4" w:space="0" w:color="CBD5E1"/>
+            </w:tcBorders>
+            <w:tcMar>
+              <w:top w:w="60" w:type="dxa"/>
+              <w:left w:w="60" w:type="dxa"/>
+              <w:bottom w:w="60" w:type="dxa"/>
+              <w:right w:w="60" w:type="dxa"/>
+            </w:tcMar>
+          </w:tcPr>
+          <w:p>
+            <w:pPr>
+              <w:jc w:val="left"/>
+              <w:spacing w:after="40" w:line="264" w:lineRule="auto"/>
+            </w:pPr>
+            <w:r>
+              <w:rPr>
+                <w:sz w:val="20"/>
+                <w:rFonts w:ascii="Arial" w:hAnsi="Arial"/>
+                <w:color w:val="334155"/>
+              </w:rPr>
+              <w:t xml:space="preserve">Stores parent (financial sponsor) contact information. Primary recipient of all automated email Notifications regarding their child's academic activity.</w:t>
+            </w:r>
+          </w:p>
+        </w:tc>
+      </w:tr>
+      <w:tr>
+        <w:tc>
+          <w:tcPr>
+            <w:tcBorders>
+              <w:top w:val="single" w:sz="4" w:space="0" w:color="CBD5E1"/>
+              <w:left w:val="single" w:sz="4" w:space="0" w:color="CBD5E1"/>
+              <w:bottom w:val="single" w:sz="4" w:space="0" w:color="CBD5E1"/>
+              <w:right w:val="single" w:sz="4" w:space="0" w:color="CBD5E1"/>
+            </w:tcBorders>
+            <w:tcMar>
+              <w:top w:w="60" w:type="dxa"/>
+              <w:left w:w="60" w:type="dxa"/>
+              <w:bottom w:w="60" w:type="dxa"/>
+              <w:right w:w="60" w:type="dxa"/>
+            </w:tcMar>
+          </w:tcPr>
+          <w:p>
+            <w:pPr>
+              <w:jc w:val="center"/>
+              <w:spacing w:after="40" w:line="264" w:lineRule="auto"/>
+            </w:pPr>
+            <w:r>
+              <w:rPr>
+                <w:b/>
+                <w:sz w:val="20"/>
+                <w:rFonts w:ascii="Arial" w:hAnsi="Arial"/>
+                <w:color w:val="0F172A"/>
+              </w:rPr>
+              <w:t xml:space="preserve">5</w:t>
+            </w:r>
+          </w:p>
+        </w:tc>
+        <w:tc>
+          <w:tcPr>
+            <w:tcBorders>
+              <w:top w:val="single" w:sz="4" w:space="0" w:color="CBD5E1"/>
+              <w:left w:val="single" w:sz="4" w:space="0" w:color="CBD5E1"/>
+              <w:bottom w:val="single" w:sz="4" w:space="0" w:color="CBD5E1"/>
+              <w:right w:val="single" w:sz="4" w:space="0" w:color="CBD5E1"/>
+            </w:tcBorders>
+            <w:tcMar>
+              <w:top w:w="60" w:type="dxa"/>
+              <w:left w:w="60" w:type="dxa"/>
+              <w:bottom w:w="60" w:type="dxa"/>
+              <w:right w:w="60" w:type="dxa"/>
+            </w:tcMar>
+          </w:tcPr>
+          <w:p>
+            <w:pPr>
+              <w:jc w:val="left"/>
+              <w:spacing w:after="40" w:line="264" w:lineRule="auto"/>
+            </w:pPr>
+            <w:r>
+              <w:rPr>
+                <w:b/>
+                <w:sz w:val="20"/>
+                <w:rFonts w:ascii="Arial" w:hAnsi="Arial"/>
+                <w:color w:val="1D4ED8"/>
+              </w:rPr>
+              <w:t xml:space="preserve">Notification</w:t>
+            </w:r>
+          </w:p>
+        </w:tc>
+        <w:tc>
+          <w:tcPr>
+            <w:tcBorders>
+              <w:top w:val="single" w:sz="4" w:space="0" w:color="CBD5E1"/>
+              <w:left w:val="single" w:sz="4" w:space="0" w:color="CBD5E1"/>
+              <w:bottom w:val="single" w:sz="4" w:space="0" w:color="CBD5E1"/>
+              <w:right w:val="single" w:sz="4" w:space="0" w:color="CBD5E1"/>
+            </w:tcBorders>
+            <w:tcMar>
+              <w:top w:w="60" w:type="dxa"/>
+              <w:left w:w="60" w:type="dxa"/>
+              <w:bottom w:w="60" w:type="dxa"/>
+              <w:right w:w="60" w:type="dxa"/>
+            </w:tcMar>
+          </w:tcPr>
+          <w:p>
+            <w:pPr>
+              <w:jc w:val="left"/>
+              <w:spacing w:after="40" w:line="264" w:lineRule="auto"/>
+            </w:pPr>
+            <w:r>
+              <w:rPr>
+                <w:sz w:val="20"/>
+                <w:rFonts w:ascii="Arial" w:hAnsi="Arial"/>
+                <w:color w:val="334155"/>
+              </w:rPr>
+              <w:t xml:space="preserve">Logs all automated email notifications dispatched to Parents via the Email Service (attendance, schedule changes, feedback reports, package expiry alerts). Tracks delivery status.</w:t>
+            </w:r>
+          </w:p>
+        </w:tc>
+      </w:tr>
+      <w:tr>
+        <w:tc>
+          <w:tcPr>
+            <w:tcBorders>
+              <w:top w:val="single" w:sz="4" w:space="0" w:color="CBD5E1"/>
+              <w:left w:val="single" w:sz="4" w:space="0" w:color="CBD5E1"/>
+              <w:bottom w:val="single" w:sz="4" w:space="0" w:color="CBD5E1"/>
+              <w:right w:val="single" w:sz="4" w:space="0" w:color="CBD5E1"/>
+            </w:tcBorders>
+            <w:tcMar>
+              <w:top w:w="60" w:type="dxa"/>
+              <w:left w:w="60" w:type="dxa"/>
+              <w:bottom w:w="60" w:type="dxa"/>
+              <w:right w:w="60" w:type="dxa"/>
+            </w:tcMar>
+          </w:tcPr>
+          <w:p>
+            <w:pPr>
+              <w:jc w:val="center"/>
+              <w:spacing w:after="40" w:line="264" w:lineRule="auto"/>
+            </w:pPr>
+            <w:r>
+              <w:rPr>
+                <w:b/>
+                <w:sz w:val="20"/>
+                <w:rFonts w:ascii="Arial" w:hAnsi="Arial"/>
+                <w:color w:val="0F172A"/>
+              </w:rPr>
+              <w:t xml:space="preserve">6</w:t>
+            </w:r>
+          </w:p>
+        </w:tc>
+        <w:tc>
+          <w:tcPr>
+            <w:tcBorders>
+              <w:top w:val="single" w:sz="4" w:space="0" w:color="CBD5E1"/>
+              <w:left w:val="single" w:sz="4" w:space="0" w:color="CBD5E1"/>
+              <w:bottom w:val="single" w:sz="4" w:space="0" w:color="CBD5E1"/>
+              <w:right w:val="single" w:sz="4" w:space="0" w:color="CBD5E1"/>
+            </w:tcBorders>
+            <w:tcMar>
+              <w:top w:w="60" w:type="dxa"/>
+              <w:left w:w="60" w:type="dxa"/>
+              <w:bottom w:w="60" w:type="dxa"/>
+              <w:right w:w="60" w:type="dxa"/>
+            </w:tcMar>
+          </w:tcPr>
+          <w:p>
+            <w:pPr>
+              <w:jc w:val="left"/>
+              <w:spacing w:after="40" w:line="264" w:lineRule="auto"/>
+            </w:pPr>
+            <w:r>
+              <w:rPr>
+                <w:b/>
+                <w:sz w:val="20"/>
+                <w:rFonts w:ascii="Arial" w:hAnsi="Arial"/>
+                <w:color w:val="1D4ED8"/>
+              </w:rPr>
+              <w:t xml:space="preserve">Subject</w:t>
+            </w:r>
+          </w:p>
+        </w:tc>
+        <w:tc>
+          <w:tcPr>
+            <w:tcBorders>
+              <w:top w:val="single" w:sz="4" w:space="0" w:color="CBD5E1"/>
+              <w:left w:val="single" w:sz="4" w:space="0" w:color="CBD5E1"/>
+              <w:bottom w:val="single" w:sz="4" w:space="0" w:color="CBD5E1"/>
+              <w:right w:val="single" w:sz="4" w:space="0" w:color="CBD5E1"/>
+            </w:tcBorders>
+            <w:tcMar>
+              <w:top w:w="60" w:type="dxa"/>
+              <w:left w:w="60" w:type="dxa"/>
+              <w:bottom w:w="60" w:type="dxa"/>
+              <w:right w:w="60" w:type="dxa"/>
+            </w:tcMar>
+          </w:tcPr>
+          <w:p>
+            <w:pPr>
+              <w:jc w:val="left"/>
+              <w:spacing w:after="40" w:line="264" w:lineRule="auto"/>
+            </w:pPr>
+            <w:r>
+              <w:rPr>
+                <w:sz w:val="20"/>
+                <w:rFonts w:ascii="Arial" w:hAnsi="Arial"/>
+                <w:color w:val="334155"/>
+              </w:rPr>
+              <w:t xml:space="preserve">Master data for subject categories offered by the center (e.g., English, Kids Coding). Referenced by Learning Packages and Sessions.</w:t>
+            </w:r>
+          </w:p>
+        </w:tc>
+      </w:tr>
+      <w:tr>
+        <w:tc>
+          <w:tcPr>
+            <w:tcBorders>
+              <w:top w:val="single" w:sz="4" w:space="0" w:color="CBD5E1"/>
+              <w:left w:val="single" w:sz="4" w:space="0" w:color="CBD5E1"/>
+              <w:bottom w:val="single" w:sz="4" w:space="0" w:color="CBD5E1"/>
+              <w:right w:val="single" w:sz="4" w:space="0" w:color="CBD5E1"/>
+            </w:tcBorders>
+            <w:tcMar>
+              <w:top w:w="60" w:type="dxa"/>
+              <w:left w:w="60" w:type="dxa"/>
+              <w:bottom w:w="60" w:type="dxa"/>
+              <w:right w:w="60" w:type="dxa"/>
+            </w:tcMar>
+          </w:tcPr>
+          <w:p>
+            <w:pPr>
+              <w:jc w:val="center"/>
+              <w:spacing w:after="40" w:line="264" w:lineRule="auto"/>
+            </w:pPr>
+            <w:r>
+              <w:rPr>
+                <w:b/>
+                <w:sz w:val="20"/>
+                <w:rFonts w:ascii="Arial" w:hAnsi="Arial"/>
+                <w:color w:val="0F172A"/>
+              </w:rPr>
+              <w:t xml:space="preserve">7</w:t>
+            </w:r>
+          </w:p>
+        </w:tc>
+        <w:tc>
+          <w:tcPr>
+            <w:tcBorders>
+              <w:top w:val="single" w:sz="4" w:space="0" w:color="CBD5E1"/>
+              <w:left w:val="single" w:sz="4" w:space="0" w:color="CBD5E1"/>
+              <w:bottom w:val="single" w:sz="4" w:space="0" w:color="CBD5E1"/>
+              <w:right w:val="single" w:sz="4" w:space="0" w:color="CBD5E1"/>
+            </w:tcBorders>
+            <w:tcMar>
+              <w:top w:w="60" w:type="dxa"/>
+              <w:left w:w="60" w:type="dxa"/>
+              <w:bottom w:w="60" w:type="dxa"/>
+              <w:right w:w="60" w:type="dxa"/>
+            </w:tcMar>
+          </w:tcPr>
+          <w:p>
+            <w:pPr>
+              <w:jc w:val="left"/>
+              <w:spacing w:after="40" w:line="264" w:lineRule="auto"/>
+            </w:pPr>
+            <w:r>
+              <w:rPr>
+                <w:b/>
+                <w:sz w:val="20"/>
+                <w:rFonts w:ascii="Arial" w:hAnsi="Arial"/>
+                <w:color w:val="1D4ED8"/>
+              </w:rPr>
+              <w:t xml:space="preserve">LearningPackage</w:t>
+            </w:r>
+          </w:p>
+        </w:tc>
+        <w:tc>
+          <w:tcPr>
+            <w:tcBorders>
+              <w:top w:val="single" w:sz="4" w:space="0" w:color="CBD5E1"/>
+              <w:left w:val="single" w:sz="4" w:space="0" w:color="CBD5E1"/>
+              <w:bottom w:val="single" w:sz="4" w:space="0" w:color="CBD5E1"/>
+              <w:right w:val="single" w:sz="4" w:space="0" w:color="CBD5E1"/>
+            </w:tcBorders>
+            <w:tcMar>
+              <w:top w:w="60" w:type="dxa"/>
+              <w:left w:w="60" w:type="dxa"/>
+              <w:bottom w:w="60" w:type="dxa"/>
+              <w:right w:w="60" w:type="dxa"/>
+            </w:tcMar>
+          </w:tcPr>
+          <w:p>
+            <w:pPr>
+              <w:jc w:val="left"/>
+              <w:spacing w:after="40" w:line="264" w:lineRule="auto"/>
+            </w:pPr>
+            <w:r>
+              <w:rPr>
+                <w:sz w:val="20"/>
+                <w:rFonts w:ascii="Arial" w:hAnsi="Arial"/>
+                <w:color w:val="334155"/>
+              </w:rPr>
+              <w:t xml:space="preserve">Defines tuition fee packages available for purchase, specifying total sessions or duration, fee amount, and associated subject. Used for enrollment and renewal tracking.</w:t>
+            </w:r>
+          </w:p>
+        </w:tc>
+      </w:tr>
+      <w:tr>
+        <w:tc>
+          <w:tcPr>
+            <w:tcBorders>
+              <w:top w:val="single" w:sz="4" w:space="0" w:color="CBD5E1"/>
+              <w:left w:val="single" w:sz="4" w:space="0" w:color="CBD5E1"/>
+              <w:bottom w:val="single" w:sz="4" w:space="0" w:color="CBD5E1"/>
+              <w:right w:val="single" w:sz="4" w:space="0" w:color="CBD5E1"/>
+            </w:tcBorders>
+            <w:tcMar>
+              <w:top w:w="60" w:type="dxa"/>
+              <w:left w:w="60" w:type="dxa"/>
+              <w:bottom w:w="60" w:type="dxa"/>
+              <w:right w:w="60" w:type="dxa"/>
+            </w:tcMar>
+          </w:tcPr>
+          <w:p>
+            <w:pPr>
+              <w:jc w:val="center"/>
+              <w:spacing w:after="40" w:line="264" w:lineRule="auto"/>
+            </w:pPr>
+            <w:r>
+              <w:rPr>
+                <w:b/>
+                <w:sz w:val="20"/>
+                <w:rFonts w:ascii="Arial" w:hAnsi="Arial"/>
+                <w:color w:val="0F172A"/>
+              </w:rPr>
+              <w:t xml:space="preserve">8</w:t>
+            </w:r>
+          </w:p>
+        </w:tc>
+        <w:tc>
+          <w:tcPr>
+            <w:tcBorders>
+              <w:top w:val="single" w:sz="4" w:space="0" w:color="CBD5E1"/>
+              <w:left w:val="single" w:sz="4" w:space="0" w:color="CBD5E1"/>
+              <w:bottom w:val="single" w:sz="4" w:space="0" w:color="CBD5E1"/>
+              <w:right w:val="single" w:sz="4" w:space="0" w:color="CBD5E1"/>
+            </w:tcBorders>
+            <w:tcMar>
+              <w:top w:w="60" w:type="dxa"/>
+              <w:left w:w="60" w:type="dxa"/>
+              <w:bottom w:w="60" w:type="dxa"/>
+              <w:right w:w="60" w:type="dxa"/>
+            </w:tcMar>
+          </w:tcPr>
+          <w:p>
+            <w:pPr>
+              <w:jc w:val="left"/>
+              <w:spacing w:after="40" w:line="264" w:lineRule="auto"/>
+            </w:pPr>
+            <w:r>
+              <w:rPr>
+                <w:b/>
+                <w:sz w:val="20"/>
+                <w:rFonts w:ascii="Arial" w:hAnsi="Arial"/>
+                <w:color w:val="1D4ED8"/>
+              </w:rPr>
+              <w:t xml:space="preserve">Classroom</w:t>
+            </w:r>
+          </w:p>
+        </w:tc>
+        <w:tc>
+          <w:tcPr>
+            <w:tcBorders>
+              <w:top w:val="single" w:sz="4" w:space="0" w:color="CBD5E1"/>
+              <w:left w:val="single" w:sz="4" w:space="0" w:color="CBD5E1"/>
+              <w:bottom w:val="single" w:sz="4" w:space="0" w:color="CBD5E1"/>
+              <w:right w:val="single" w:sz="4" w:space="0" w:color="CBD5E1"/>
+            </w:tcBorders>
+            <w:tcMar>
+              <w:top w:w="60" w:type="dxa"/>
+              <w:left w:w="60" w:type="dxa"/>
+              <w:bottom w:w="60" w:type="dxa"/>
+              <w:right w:w="60" w:type="dxa"/>
+            </w:tcMar>
+          </w:tcPr>
+          <w:p>
+            <w:pPr>
+              <w:jc w:val="left"/>
+              <w:spacing w:after="40" w:line="264" w:lineRule="auto"/>
+            </w:pPr>
+            <w:r>
+              <w:rPr>
+                <w:sz w:val="20"/>
+                <w:rFonts w:ascii="Arial" w:hAnsi="Arial"/>
+                <w:color w:val="334155"/>
+              </w:rPr>
+              <w:t xml:space="preserve">Master data for physical classrooms/rooms at the center. Used for session scheduling and conflict detection (room double-booking prevention).</w:t>
+            </w:r>
+          </w:p>
+        </w:tc>
+      </w:tr>
+      <w:tr>
+        <w:tc>
+          <w:tcPr>
+            <w:tcBorders>
+              <w:top w:val="single" w:sz="4" w:space="0" w:color="CBD5E1"/>
+              <w:left w:val="single" w:sz="4" w:space="0" w:color="CBD5E1"/>
+              <w:bottom w:val="single" w:sz="4" w:space="0" w:color="CBD5E1"/>
+              <w:right w:val="single" w:sz="4" w:space="0" w:color="CBD5E1"/>
+            </w:tcBorders>
+            <w:tcMar>
+              <w:top w:w="60" w:type="dxa"/>
+              <w:left w:w="60" w:type="dxa"/>
+              <w:bottom w:w="60" w:type="dxa"/>
+              <w:right w:w="60" w:type="dxa"/>
+            </w:tcMar>
+          </w:tcPr>
+          <w:p>
+            <w:pPr>
+              <w:jc w:val="center"/>
+              <w:spacing w:after="40" w:line="264" w:lineRule="auto"/>
+            </w:pPr>
+            <w:r>
+              <w:rPr>
+                <w:b/>
+                <w:sz w:val="20"/>
+                <w:rFonts w:ascii="Arial" w:hAnsi="Arial"/>
+                <w:color w:val="0F172A"/>
+              </w:rPr>
+              <w:t xml:space="preserve">9</w:t>
+            </w:r>
+          </w:p>
+        </w:tc>
+        <w:tc>
+          <w:tcPr>
+            <w:tcBorders>
+              <w:top w:val="single" w:sz="4" w:space="0" w:color="CBD5E1"/>
+              <w:left w:val="single" w:sz="4" w:space="0" w:color="CBD5E1"/>
+              <w:bottom w:val="single" w:sz="4" w:space="0" w:color="CBD5E1"/>
+              <w:right w:val="single" w:sz="4" w:space="0" w:color="CBD5E1"/>
+            </w:tcBorders>
+            <w:tcMar>
+              <w:top w:w="60" w:type="dxa"/>
+              <w:left w:w="60" w:type="dxa"/>
+              <w:bottom w:w="60" w:type="dxa"/>
+              <w:right w:w="60" w:type="dxa"/>
+            </w:tcMar>
+          </w:tcPr>
+          <w:p>
+            <w:pPr>
+              <w:jc w:val="left"/>
+              <w:spacing w:after="40" w:line="264" w:lineRule="auto"/>
+            </w:pPr>
+            <w:r>
+              <w:rPr>
+                <w:b/>
+                <w:sz w:val="20"/>
+                <w:rFonts w:ascii="Arial" w:hAnsi="Arial"/>
+                <w:color w:val="1D4ED8"/>
+              </w:rPr>
+              <w:t xml:space="preserve">Session</w:t>
+            </w:r>
+          </w:p>
+        </w:tc>
+        <w:tc>
+          <w:tcPr>
+            <w:tcBorders>
+              <w:top w:val="single" w:sz="4" w:space="0" w:color="CBD5E1"/>
+              <w:left w:val="single" w:sz="4" w:space="0" w:color="CBD5E1"/>
+              <w:bottom w:val="single" w:sz="4" w:space="0" w:color="CBD5E1"/>
+              <w:right w:val="single" w:sz="4" w:space="0" w:color="CBD5E1"/>
+            </w:tcBorders>
+            <w:tcMar>
+              <w:top w:w="60" w:type="dxa"/>
+              <w:left w:w="60" w:type="dxa"/>
+              <w:bottom w:w="60" w:type="dxa"/>
+              <w:right w:w="60" w:type="dxa"/>
+            </w:tcMar>
+          </w:tcPr>
+          <w:p>
+            <w:pPr>
+              <w:jc w:val="left"/>
+              <w:spacing w:after="40" w:line="264" w:lineRule="auto"/>
+            </w:pPr>
+            <w:r>
+              <w:rPr>
+                <w:sz w:val="20"/>
+                <w:rFonts w:ascii="Arial" w:hAnsi="Arial"/>
+                <w:color w:val="334155"/>
+              </w:rPr>
+              <w:t xml:space="preserve">Represents a specific scheduled class session with assigned date, time slot, classroom, teacher, and subject. Core entity for scheduling, attendance, and feedback workflows.</w:t>
+            </w:r>
+          </w:p>
+        </w:tc>
+      </w:tr>
+      <w:tr>
+        <w:tc>
+          <w:tcPr>
+            <w:tcBorders>
+              <w:top w:val="single" w:sz="4" w:space="0" w:color="CBD5E1"/>
+              <w:left w:val="single" w:sz="4" w:space="0" w:color="CBD5E1"/>
+              <w:bottom w:val="single" w:sz="4" w:space="0" w:color="CBD5E1"/>
+              <w:right w:val="single" w:sz="4" w:space="0" w:color="CBD5E1"/>
+            </w:tcBorders>
+            <w:tcMar>
+              <w:top w:w="60" w:type="dxa"/>
+              <w:left w:w="60" w:type="dxa"/>
+              <w:bottom w:w="60" w:type="dxa"/>
+              <w:right w:w="60" w:type="dxa"/>
+            </w:tcMar>
+          </w:tcPr>
+          <w:p>
+            <w:pPr>
+              <w:jc w:val="center"/>
+              <w:spacing w:after="40" w:line="264" w:lineRule="auto"/>
+            </w:pPr>
+            <w:r>
+              <w:rPr>
+                <w:b/>
+                <w:sz w:val="20"/>
+                <w:rFonts w:ascii="Arial" w:hAnsi="Arial"/>
+                <w:color w:val="0F172A"/>
+              </w:rPr>
+              <w:t xml:space="preserve">10</w:t>
+            </w:r>
+          </w:p>
+        </w:tc>
+        <w:tc>
+          <w:tcPr>
+            <w:tcBorders>
+              <w:top w:val="single" w:sz="4" w:space="0" w:color="CBD5E1"/>
+              <w:left w:val="single" w:sz="4" w:space="0" w:color="CBD5E1"/>
+              <w:bottom w:val="single" w:sz="4" w:space="0" w:color="CBD5E1"/>
+              <w:right w:val="single" w:sz="4" w:space="0" w:color="CBD5E1"/>
+            </w:tcBorders>
+            <w:tcMar>
+              <w:top w:w="60" w:type="dxa"/>
+              <w:left w:w="60" w:type="dxa"/>
+              <w:bottom w:w="60" w:type="dxa"/>
+              <w:right w:w="60" w:type="dxa"/>
+            </w:tcMar>
+          </w:tcPr>
+          <w:p>
+            <w:pPr>
+              <w:jc w:val="left"/>
+              <w:spacing w:after="40" w:line="264" w:lineRule="auto"/>
+            </w:pPr>
+            <w:r>
+              <w:rPr>
+                <w:b/>
+                <w:sz w:val="20"/>
+                <w:rFonts w:ascii="Arial" w:hAnsi="Arial"/>
+                <w:color w:val="1D4ED8"/>
+              </w:rPr>
+              <w:t xml:space="preserve">Feedback</w:t>
+            </w:r>
+          </w:p>
+        </w:tc>
+        <w:tc>
+          <w:tcPr>
+            <w:tcBorders>
+              <w:top w:val="single" w:sz="4" w:space="0" w:color="CBD5E1"/>
+              <w:left w:val="single" w:sz="4" w:space="0" w:color="CBD5E1"/>
+              <w:bottom w:val="single" w:sz="4" w:space="0" w:color="CBD5E1"/>
+              <w:right w:val="single" w:sz="4" w:space="0" w:color="CBD5E1"/>
+            </w:tcBorders>
+            <w:tcMar>
+              <w:top w:w="60" w:type="dxa"/>
+              <w:left w:w="60" w:type="dxa"/>
+              <w:bottom w:w="60" w:type="dxa"/>
+              <w:right w:w="60" w:type="dxa"/>
+            </w:tcMar>
+          </w:tcPr>
+          <w:p>
+            <w:pPr>
+              <w:jc w:val="left"/>
+              <w:spacing w:after="40" w:line="264" w:lineRule="auto"/>
+            </w:pPr>
+            <w:r>
+              <w:rPr>
+                <w:sz w:val="20"/>
+                <w:rFonts w:ascii="Arial" w:hAnsi="Arial"/>
+                <w:color w:val="334155"/>
+              </w:rPr>
+              <w:t xml:space="preserve">Stores the Teacher's academic evaluation for each Learner after a Session. Tracks SLA compliance (12-hour submission deadline) with timestamps.</w:t>
+            </w:r>
+          </w:p>
+        </w:tc>
+      </w:tr>
+      <w:tr>
+        <w:tc>
+          <w:tcPr>
+            <w:tcBorders>
+              <w:top w:val="single" w:sz="4" w:space="0" w:color="CBD5E1"/>
+              <w:left w:val="single" w:sz="4" w:space="0" w:color="CBD5E1"/>
+              <w:bottom w:val="single" w:sz="4" w:space="0" w:color="CBD5E1"/>
+              <w:right w:val="single" w:sz="4" w:space="0" w:color="CBD5E1"/>
+            </w:tcBorders>
+            <w:tcMar>
+              <w:top w:w="60" w:type="dxa"/>
+              <w:left w:w="60" w:type="dxa"/>
+              <w:bottom w:w="60" w:type="dxa"/>
+              <w:right w:w="60" w:type="dxa"/>
+            </w:tcMar>
+          </w:tcPr>
+          <w:p>
+            <w:pPr>
+              <w:jc w:val="center"/>
+              <w:spacing w:after="40" w:line="264" w:lineRule="auto"/>
+            </w:pPr>
+            <w:r>
+              <w:rPr>
+                <w:b/>
+                <w:sz w:val="20"/>
+                <w:rFonts w:ascii="Arial" w:hAnsi="Arial"/>
+                <w:color w:val="0F172A"/>
+              </w:rPr>
+              <w:t xml:space="preserve">11</w:t>
+            </w:r>
+          </w:p>
+        </w:tc>
+        <w:tc>
+          <w:tcPr>
+            <w:tcBorders>
+              <w:top w:val="single" w:sz="4" w:space="0" w:color="CBD5E1"/>
+              <w:left w:val="single" w:sz="4" w:space="0" w:color="CBD5E1"/>
+              <w:bottom w:val="single" w:sz="4" w:space="0" w:color="CBD5E1"/>
+              <w:right w:val="single" w:sz="4" w:space="0" w:color="CBD5E1"/>
+            </w:tcBorders>
+            <w:tcMar>
+              <w:top w:w="60" w:type="dxa"/>
+              <w:left w:w="60" w:type="dxa"/>
+              <w:bottom w:w="60" w:type="dxa"/>
+              <w:right w:w="60" w:type="dxa"/>
+            </w:tcMar>
+          </w:tcPr>
+          <w:p>
+            <w:pPr>
+              <w:jc w:val="left"/>
+              <w:spacing w:after="40" w:line="264" w:lineRule="auto"/>
+            </w:pPr>
+            <w:r>
+              <w:rPr>
+                <w:b/>
+                <w:sz w:val="20"/>
+                <w:rFonts w:ascii="Arial" w:hAnsi="Arial"/>
+                <w:color w:val="1D4ED8"/>
+              </w:rPr>
+              <w:t xml:space="preserve">Setting</w:t>
+            </w:r>
+          </w:p>
+        </w:tc>
+        <w:tc>
+          <w:tcPr>
+            <w:tcBorders>
+              <w:top w:val="single" w:sz="4" w:space="0" w:color="CBD5E1"/>
+              <w:left w:val="single" w:sz="4" w:space="0" w:color="CBD5E1"/>
+              <w:bottom w:val="single" w:sz="4" w:space="0" w:color="CBD5E1"/>
+              <w:right w:val="single" w:sz="4" w:space="0" w:color="CBD5E1"/>
+            </w:tcBorders>
+            <w:tcMar>
+              <w:top w:w="60" w:type="dxa"/>
+              <w:left w:w="60" w:type="dxa"/>
+              <w:bottom w:w="60" w:type="dxa"/>
+              <w:right w:w="60" w:type="dxa"/>
+            </w:tcMar>
+          </w:tcPr>
+          <w:p>
+            <w:pPr>
+              <w:jc w:val="left"/>
+              <w:spacing w:after="40" w:line="264" w:lineRule="auto"/>
+            </w:pPr>
+            <w:r>
+              <w:rPr>
+                <w:sz w:val="20"/>
+                <w:rFonts w:ascii="Arial" w:hAnsi="Arial"/>
+                <w:color w:val="334155"/>
+              </w:rPr>
+              <w:t xml:space="preserve">System-wide configuration and master data entries (e.g., time slot templates, notification email templates, default values). Managed by Academic Admin.</w:t>
+            </w:r>
+          </w:p>
+        </w:tc>
+      </w:tr>
+      <w:tr>
+        <w:tc>
+          <w:tcPr>
+            <w:tcBorders>
+              <w:top w:val="single" w:sz="4" w:space="0" w:color="CBD5E1"/>
+              <w:left w:val="single" w:sz="4" w:space="0" w:color="CBD5E1"/>
+              <w:bottom w:val="single" w:sz="4" w:space="0" w:color="CBD5E1"/>
+              <w:right w:val="single" w:sz="4" w:space="0" w:color="CBD5E1"/>
+            </w:tcBorders>
+            <w:tcMar>
+              <w:top w:w="60" w:type="dxa"/>
+              <w:left w:w="60" w:type="dxa"/>
+              <w:bottom w:w="60" w:type="dxa"/>
+              <w:right w:w="60" w:type="dxa"/>
+            </w:tcMar>
+          </w:tcPr>
+          <w:p>
+            <w:pPr>
+              <w:jc w:val="center"/>
+              <w:spacing w:after="40" w:line="264" w:lineRule="auto"/>
+            </w:pPr>
+            <w:r>
+              <w:rPr>
+                <w:b/>
+                <w:sz w:val="20"/>
+                <w:rFonts w:ascii="Arial" w:hAnsi="Arial"/>
+                <w:color w:val="0F172A"/>
+              </w:rPr>
+              <w:t xml:space="preserve">12</w:t>
+            </w:r>
+          </w:p>
+        </w:tc>
+        <w:tc>
+          <w:tcPr>
+            <w:tcBorders>
+              <w:top w:val="single" w:sz="4" w:space="0" w:color="CBD5E1"/>
+              <w:left w:val="single" w:sz="4" w:space="0" w:color="CBD5E1"/>
+              <w:bottom w:val="single" w:sz="4" w:space="0" w:color="CBD5E1"/>
+              <w:right w:val="single" w:sz="4" w:space="0" w:color="CBD5E1"/>
+            </w:tcBorders>
+            <w:tcMar>
+              <w:top w:w="60" w:type="dxa"/>
+              <w:left w:w="60" w:type="dxa"/>
+              <w:bottom w:w="60" w:type="dxa"/>
+              <w:right w:w="60" w:type="dxa"/>
+            </w:tcMar>
+          </w:tcPr>
+          <w:p>
+            <w:pPr>
+              <w:jc w:val="left"/>
+              <w:spacing w:after="40" w:line="264" w:lineRule="auto"/>
+            </w:pPr>
+            <w:r>
+              <w:rPr>
+                <w:b/>
+                <w:sz w:val="20"/>
+                <w:rFonts w:ascii="Arial" w:hAnsi="Arial"/>
+                <w:color w:val="1D4ED8"/>
+              </w:rPr>
+              <w:t xml:space="preserve">LearnerPackage</w:t>
+            </w:r>
+          </w:p>
+        </w:tc>
+        <w:tc>
+          <w:tcPr>
+            <w:tcBorders>
+              <w:top w:val="single" w:sz="4" w:space="0" w:color="CBD5E1"/>
+              <w:left w:val="single" w:sz="4" w:space="0" w:color="CBD5E1"/>
+              <w:bottom w:val="single" w:sz="4" w:space="0" w:color="CBD5E1"/>
+              <w:right w:val="single" w:sz="4" w:space="0" w:color="CBD5E1"/>
+            </w:tcBorders>
+            <w:tcMar>
+              <w:top w:w="60" w:type="dxa"/>
+              <w:left w:w="60" w:type="dxa"/>
+              <w:bottom w:w="60" w:type="dxa"/>
+              <w:right w:w="60" w:type="dxa"/>
+            </w:tcMar>
+          </w:tcPr>
+          <w:p>
+            <w:pPr>
+              <w:jc w:val="left"/>
+              <w:spacing w:after="40" w:line="264" w:lineRule="auto"/>
+            </w:pPr>
+            <w:r>
+              <w:rPr>
+                <w:sz w:val="20"/>
+                <w:rFonts w:ascii="Arial" w:hAnsi="Arial"/>
+                <w:color w:val="334155"/>
+              </w:rPr>
+              <w:t xml:space="preserve">Junction entity recording the assignment of a Learning Package to a specific Learner. Tracks remaining sessions, expiry date, and renewal status for churn prevention alerts.</w:t>
+            </w:r>
+          </w:p>
+        </w:tc>
+      </w:tr>
+      <w:tr>
+        <w:tc>
+          <w:tcPr>
+            <w:tcBorders>
+              <w:top w:val="single" w:sz="4" w:space="0" w:color="CBD5E1"/>
+              <w:left w:val="single" w:sz="4" w:space="0" w:color="CBD5E1"/>
+              <w:bottom w:val="single" w:sz="4" w:space="0" w:color="CBD5E1"/>
+              <w:right w:val="single" w:sz="4" w:space="0" w:color="CBD5E1"/>
+            </w:tcBorders>
+            <w:tcMar>
+              <w:top w:w="60" w:type="dxa"/>
+              <w:left w:w="60" w:type="dxa"/>
+              <w:bottom w:w="60" w:type="dxa"/>
+              <w:right w:w="60" w:type="dxa"/>
+            </w:tcMar>
+          </w:tcPr>
+          <w:p>
+            <w:pPr>
+              <w:jc w:val="center"/>
+              <w:spacing w:after="40" w:line="264" w:lineRule="auto"/>
+            </w:pPr>
+            <w:r>
+              <w:rPr>
+                <w:b/>
+                <w:sz w:val="20"/>
+                <w:rFonts w:ascii="Arial" w:hAnsi="Arial"/>
+                <w:color w:val="0F172A"/>
+              </w:rPr>
+              <w:t xml:space="preserve">13</w:t>
+            </w:r>
+          </w:p>
+        </w:tc>
+        <w:tc>
+          <w:tcPr>
+            <w:tcBorders>
+              <w:top w:val="single" w:sz="4" w:space="0" w:color="CBD5E1"/>
+              <w:left w:val="single" w:sz="4" w:space="0" w:color="CBD5E1"/>
+              <w:bottom w:val="single" w:sz="4" w:space="0" w:color="CBD5E1"/>
+              <w:right w:val="single" w:sz="4" w:space="0" w:color="CBD5E1"/>
+            </w:tcBorders>
+            <w:tcMar>
+              <w:top w:w="60" w:type="dxa"/>
+              <w:left w:w="60" w:type="dxa"/>
+              <w:bottom w:w="60" w:type="dxa"/>
+              <w:right w:w="60" w:type="dxa"/>
+            </w:tcMar>
+          </w:tcPr>
+          <w:p>
+            <w:pPr>
+              <w:jc w:val="left"/>
+              <w:spacing w:after="40" w:line="264" w:lineRule="auto"/>
+            </w:pPr>
+            <w:r>
+              <w:rPr>
+                <w:b/>
+                <w:sz w:val="20"/>
+                <w:rFonts w:ascii="Arial" w:hAnsi="Arial"/>
+                <w:color w:val="1D4ED8"/>
+              </w:rPr>
+              <w:t xml:space="preserve">SessionLearner</w:t>
+            </w:r>
+          </w:p>
+        </w:tc>
+        <w:tc>
+          <w:tcPr>
+            <w:tcBorders>
+              <w:top w:val="single" w:sz="4" w:space="0" w:color="CBD5E1"/>
+              <w:left w:val="single" w:sz="4" w:space="0" w:color="CBD5E1"/>
+              <w:bottom w:val="single" w:sz="4" w:space="0" w:color="CBD5E1"/>
+              <w:right w:val="single" w:sz="4" w:space="0" w:color="CBD5E1"/>
+            </w:tcBorders>
+            <w:tcMar>
+              <w:top w:w="60" w:type="dxa"/>
+              <w:left w:w="60" w:type="dxa"/>
+              <w:bottom w:w="60" w:type="dxa"/>
+              <w:right w:w="60" w:type="dxa"/>
+            </w:tcMar>
+          </w:tcPr>
+          <w:p>
+            <w:pPr>
+              <w:jc w:val="left"/>
+              <w:spacing w:after="40" w:line="264" w:lineRule="auto"/>
+            </w:pPr>
+            <w:r>
+              <w:rPr>
+                <w:sz w:val="20"/>
+                <w:rFonts w:ascii="Arial" w:hAnsi="Arial"/>
+                <w:color w:val="334155"/>
+              </w:rPr>
+              <w:t xml:space="preserve">Junction entity for the many-to-many relationship between Session and Learner. Records which learners are enrolled in each session.</w:t>
+            </w:r>
+          </w:p>
+        </w:tc>
+      </w:tr>
+      <w:tr>
+        <w:tc>
+          <w:tcPr>
+            <w:tcBorders>
+              <w:top w:val="single" w:sz="4" w:space="0" w:color="CBD5E1"/>
+              <w:left w:val="single" w:sz="4" w:space="0" w:color="CBD5E1"/>
+              <w:bottom w:val="single" w:sz="4" w:space="0" w:color="CBD5E1"/>
+              <w:right w:val="single" w:sz="4" w:space="0" w:color="CBD5E1"/>
+            </w:tcBorders>
+            <w:tcMar>
+              <w:top w:w="60" w:type="dxa"/>
+              <w:left w:w="60" w:type="dxa"/>
+              <w:bottom w:w="60" w:type="dxa"/>
+              <w:right w:w="60" w:type="dxa"/>
+            </w:tcMar>
+          </w:tcPr>
+          <w:p>
+            <w:pPr>
+              <w:jc w:val="center"/>
+              <w:spacing w:after="40" w:line="264" w:lineRule="auto"/>
+            </w:pPr>
+            <w:r>
+              <w:rPr>
+                <w:b/>
+                <w:sz w:val="20"/>
+                <w:rFonts w:ascii="Arial" w:hAnsi="Arial"/>
+                <w:color w:val="0F172A"/>
+              </w:rPr>
+              <w:t xml:space="preserve">14</w:t>
+            </w:r>
+          </w:p>
+        </w:tc>
+        <w:tc>
+          <w:tcPr>
+            <w:tcBorders>
+              <w:top w:val="single" w:sz="4" w:space="0" w:color="CBD5E1"/>
+              <w:left w:val="single" w:sz="4" w:space="0" w:color="CBD5E1"/>
+              <w:bottom w:val="single" w:sz="4" w:space="0" w:color="CBD5E1"/>
+              <w:right w:val="single" w:sz="4" w:space="0" w:color="CBD5E1"/>
+            </w:tcBorders>
+            <w:tcMar>
+              <w:top w:w="60" w:type="dxa"/>
+              <w:left w:w="60" w:type="dxa"/>
+              <w:bottom w:w="60" w:type="dxa"/>
+              <w:right w:w="60" w:type="dxa"/>
+            </w:tcMar>
+          </w:tcPr>
+          <w:p>
+            <w:pPr>
+              <w:jc w:val="left"/>
+              <w:spacing w:after="40" w:line="264" w:lineRule="auto"/>
+            </w:pPr>
+            <w:r>
+              <w:rPr>
+                <w:b/>
+                <w:sz w:val="20"/>
+                <w:rFonts w:ascii="Arial" w:hAnsi="Arial"/>
+                <w:color w:val="1D4ED8"/>
+              </w:rPr>
+              <w:t xml:space="preserve">Attendance</w:t>
+            </w:r>
+          </w:p>
+        </w:tc>
+        <w:tc>
+          <w:tcPr>
+            <w:tcBorders>
+              <w:top w:val="single" w:sz="4" w:space="0" w:color="CBD5E1"/>
+              <w:left w:val="single" w:sz="4" w:space="0" w:color="CBD5E1"/>
+              <w:bottom w:val="single" w:sz="4" w:space="0" w:color="CBD5E1"/>
+              <w:right w:val="single" w:sz="4" w:space="0" w:color="CBD5E1"/>
+            </w:tcBorders>
+            <w:tcMar>
+              <w:top w:w="60" w:type="dxa"/>
+              <w:left w:w="60" w:type="dxa"/>
+              <w:bottom w:w="60" w:type="dxa"/>
+              <w:right w:w="60" w:type="dxa"/>
+            </w:tcMar>
+          </w:tcPr>
+          <w:p>
+            <w:pPr>
+              <w:jc w:val="left"/>
+              <w:spacing w:after="40" w:line="264" w:lineRule="auto"/>
+            </w:pPr>
+            <w:r>
+              <w:rPr>
+                <w:sz w:val="20"/>
+                <w:rFonts w:ascii="Arial" w:hAnsi="Arial"/>
+                <w:color w:val="334155"/>
+              </w:rPr>
+              <w:t xml:space="preserve">Records daily attendance status (Present, Absent, Late) for each Learner per Session. Triggers automated Notification to Parent and decrements Learning Package remaining sessions.</w:t>
+            </w:r>
+          </w:p>
+        </w:tc>
+      </w:tr>
+      <w:tr>
+        <w:tc>
+          <w:tcPr>
+            <w:tcBorders>
+              <w:top w:val="single" w:sz="4" w:space="0" w:color="CBD5E1"/>
+              <w:left w:val="single" w:sz="4" w:space="0" w:color="CBD5E1"/>
+              <w:bottom w:val="single" w:sz="4" w:space="0" w:color="CBD5E1"/>
+              <w:right w:val="single" w:sz="4" w:space="0" w:color="CBD5E1"/>
+            </w:tcBorders>
+            <w:tcMar>
+              <w:top w:w="60" w:type="dxa"/>
+              <w:left w:w="60" w:type="dxa"/>
+              <w:bottom w:w="60" w:type="dxa"/>
+              <w:right w:w="60" w:type="dxa"/>
+            </w:tcMar>
+          </w:tcPr>
+          <w:p>
+            <w:pPr>
+              <w:jc w:val="center"/>
+              <w:spacing w:after="40" w:line="264" w:lineRule="auto"/>
+            </w:pPr>
+            <w:r>
+              <w:rPr>
+                <w:b/>
+                <w:sz w:val="20"/>
+                <w:rFonts w:ascii="Arial" w:hAnsi="Arial"/>
+                <w:color w:val="0F172A"/>
+              </w:rPr>
+              <w:t xml:space="preserve">15</w:t>
+            </w:r>
+          </w:p>
+        </w:tc>
+        <w:tc>
+          <w:tcPr>
+            <w:tcBorders>
+              <w:top w:val="single" w:sz="4" w:space="0" w:color="CBD5E1"/>
+              <w:left w:val="single" w:sz="4" w:space="0" w:color="CBD5E1"/>
+              <w:bottom w:val="single" w:sz="4" w:space="0" w:color="CBD5E1"/>
+              <w:right w:val="single" w:sz="4" w:space="0" w:color="CBD5E1"/>
+            </w:tcBorders>
+            <w:tcMar>
+              <w:top w:w="60" w:type="dxa"/>
+              <w:left w:w="60" w:type="dxa"/>
+              <w:bottom w:w="60" w:type="dxa"/>
+              <w:right w:w="60" w:type="dxa"/>
+            </w:tcMar>
+          </w:tcPr>
+          <w:p>
+            <w:pPr>
+              <w:jc w:val="left"/>
+              <w:spacing w:after="40" w:line="264" w:lineRule="auto"/>
+            </w:pPr>
+            <w:r>
+              <w:rPr>
+                <w:b/>
+                <w:sz w:val="20"/>
+                <w:rFonts w:ascii="Arial" w:hAnsi="Arial"/>
+                <w:color w:val="1D4ED8"/>
+              </w:rPr>
+              <w:t xml:space="preserve">ActivityLog</w:t>
+            </w:r>
+          </w:p>
+        </w:tc>
+        <w:tc>
+          <w:tcPr>
+            <w:tcBorders>
+              <w:top w:val="single" w:sz="4" w:space="0" w:color="CBD5E1"/>
+              <w:left w:val="single" w:sz="4" w:space="0" w:color="CBD5E1"/>
+              <w:bottom w:val="single" w:sz="4" w:space="0" w:color="CBD5E1"/>
+              <w:right w:val="single" w:sz="4" w:space="0" w:color="CBD5E1"/>
+            </w:tcBorders>
+            <w:tcMar>
+              <w:top w:w="60" w:type="dxa"/>
+              <w:left w:w="60" w:type="dxa"/>
+              <w:bottom w:w="60" w:type="dxa"/>
+              <w:right w:w="60" w:type="dxa"/>
+            </w:tcMar>
+          </w:tcPr>
+          <w:p>
+            <w:pPr>
+              <w:jc w:val="left"/>
+              <w:spacing w:after="40" w:line="264" w:lineRule="auto"/>
+            </w:pPr>
+            <w:r>
+              <w:rPr>
+                <w:sz w:val="20"/>
+                <w:rFonts w:ascii="Arial" w:hAnsi="Arial"/>
+                <w:color w:val="334155"/>
+              </w:rPr>
+              <w:t xml:space="preserve">Audit trail recording all significant user actions within the system (login, data changes, exports) for security monitoring and operational accountability.</w:t>
+            </w:r>
           </w:p>
         </w:tc>
       </w:tr>

</xml_diff>

<commit_message>
Add 1.4 System Functionalities to SRS
</commit_message>
<xml_diff>
--- a/Document/02_Requirements/Report3_Software Requirement Specification.docx
+++ b/Document/02_Requirements/Report3_Software Requirement Specification.docx
@@ -8852,180 +8852,155 @@
     </w:p>
     <w:tbl>
       <w:tblPr>
-        <w:tblStyle w:val="a1"/>
-        <w:tblW w:w="9214" w:type="dxa"/>
-        <w:tblInd w:w="-5" w:type="dxa"/>
-        <w:tblBorders>
-          <w:top w:val="single" w:sz="8" w:space="0" w:color="000000"/>
-          <w:left w:val="single" w:sz="8" w:space="0" w:color="000000"/>
-          <w:bottom w:val="single" w:sz="8" w:space="0" w:color="000000"/>
-          <w:right w:val="single" w:sz="8" w:space="0" w:color="000000"/>
-          <w:insideH w:val="single" w:sz="8" w:space="0" w:color="000000"/>
-          <w:insideV w:val="single" w:sz="8" w:space="0" w:color="000000"/>
-        </w:tblBorders>
-        <w:tblLayout w:type="fixed"/>
-        <w:tblLook w:val="0400" w:firstRow="0" w:lastRow="0" w:firstColumn="0" w:lastColumn="0" w:noHBand="0" w:noVBand="1"/>
+        <w:tblStyle w:val="TableGrid"/>
+        <w:tblW w:w="5000" w:type="pct"/>
       </w:tblPr>
-      <w:tblGrid>
-        <w:gridCol w:w="3119"/>
-        <w:gridCol w:w="1417"/>
-        <w:gridCol w:w="1418"/>
-        <w:gridCol w:w="1559"/>
-        <w:gridCol w:w="1701"/>
-      </w:tblGrid>
       <w:tr>
-        <w:trPr>
-          <w:trHeight w:val="288"/>
-        </w:trPr>
-        <w:tc>
-          <w:tcPr>
-            <w:tcW w:w="3119" w:type="dxa"/>
-            <w:shd w:val="clear" w:color="auto" w:fill="FFE8E1"/>
-            <w:vAlign w:val="bottom"/>
-          </w:tcPr>
-          <w:p>
-            <w:pPr>
-              <w:spacing w:after="0"/>
-              <w:rPr>
-                <w:b/>
-              </w:rPr>
-            </w:pPr>
-            <w:r>
-              <w:rPr>
-                <w:b/>
-              </w:rPr>
-              <w:t>Screen</w:t>
-            </w:r>
-          </w:p>
-        </w:tc>
-        <w:tc>
-          <w:tcPr>
-            <w:tcW w:w="1417" w:type="dxa"/>
-            <w:shd w:val="clear" w:color="auto" w:fill="FFE8E1"/>
-            <w:vAlign w:val="bottom"/>
-          </w:tcPr>
-          <w:p>
-            <w:pPr>
-              <w:spacing w:after="0"/>
+        <w:tc>
+          <w:tcPr>
+            <w:shd w:val="clear" w:color="auto" w:fill="F8FAFC"/>
+            <w:tcBorders>
+              <w:top w:val="single" w:sz="4" w:space="0" w:color="CBD5E1"/>
+              <w:left w:val="single" w:sz="4" w:space="0" w:color="CBD5E1"/>
+              <w:bottom w:val="single" w:sz="4" w:space="0" w:color="CBD5E1"/>
+              <w:right w:val="single" w:sz="4" w:space="0" w:color="CBD5E1"/>
+            </w:tcBorders>
+          </w:tcPr>
+          <w:p>
+            <w:pPr>
+              <w:jc w:val="left"/>
+            </w:pPr>
+            <w:r>
+              <w:rPr>
+                <w:b/>
+                <w:sz w:val="20"/>
+                <w:rFonts w:ascii="Arial" w:hAnsi="Arial"/>
+                <w:color w:val="1E40AF"/>
+              </w:rPr>
+              <w:t>Screen Name</w:t>
+            </w:r>
+          </w:p>
+        </w:tc>
+        <w:tc>
+          <w:tcPr>
+            <w:shd w:val="clear" w:color="auto" w:fill="F8FAFC"/>
+            <w:tcBorders>
+              <w:top w:val="single" w:sz="4" w:space="0" w:color="CBD5E1"/>
+              <w:left w:val="single" w:sz="4" w:space="0" w:color="CBD5E1"/>
+              <w:bottom w:val="single" w:sz="4" w:space="0" w:color="CBD5E1"/>
+              <w:right w:val="single" w:sz="4" w:space="0" w:color="CBD5E1"/>
+            </w:tcBorders>
+          </w:tcPr>
+          <w:p>
+            <w:pPr>
               <w:jc w:val="center"/>
-              <w:rPr>
-                <w:b/>
-              </w:rPr>
-            </w:pPr>
-            <w:r>
-              <w:rPr>
-                <w:b/>
-              </w:rPr>
-              <w:t>Role-Name1</w:t>
-            </w:r>
-          </w:p>
-        </w:tc>
-        <w:tc>
-          <w:tcPr>
-            <w:tcW w:w="1418" w:type="dxa"/>
-            <w:shd w:val="clear" w:color="auto" w:fill="FFE8E1"/>
-          </w:tcPr>
-          <w:p>
-            <w:pPr>
-              <w:spacing w:after="0"/>
+            </w:pPr>
+            <w:r>
+              <w:rPr>
+                <w:b/>
+                <w:sz w:val="20"/>
+                <w:rFonts w:ascii="Arial" w:hAnsi="Arial"/>
+                <w:color w:val="1E40AF"/>
+              </w:rPr>
+              <w:t>Academic Admin</w:t>
+            </w:r>
+          </w:p>
+        </w:tc>
+        <w:tc>
+          <w:tcPr>
+            <w:shd w:val="clear" w:color="auto" w:fill="F8FAFC"/>
+            <w:tcBorders>
+              <w:top w:val="single" w:sz="4" w:space="0" w:color="CBD5E1"/>
+              <w:left w:val="single" w:sz="4" w:space="0" w:color="CBD5E1"/>
+              <w:bottom w:val="single" w:sz="4" w:space="0" w:color="CBD5E1"/>
+              <w:right w:val="single" w:sz="4" w:space="0" w:color="CBD5E1"/>
+            </w:tcBorders>
+          </w:tcPr>
+          <w:p>
+            <w:pPr>
               <w:jc w:val="center"/>
-              <w:rPr>
-                <w:b/>
-              </w:rPr>
-            </w:pPr>
-            <w:r>
-              <w:rPr>
-                <w:b/>
-              </w:rPr>
-              <w:t>Role-Name2</w:t>
-            </w:r>
-          </w:p>
-        </w:tc>
-        <w:tc>
-          <w:tcPr>
-            <w:tcW w:w="1559" w:type="dxa"/>
-            <w:shd w:val="clear" w:color="auto" w:fill="FFE8E1"/>
-          </w:tcPr>
-          <w:p>
-            <w:pPr>
-              <w:spacing w:after="0"/>
+            </w:pPr>
+            <w:r>
+              <w:rPr>
+                <w:b/>
+                <w:sz w:val="20"/>
+                <w:rFonts w:ascii="Arial" w:hAnsi="Arial"/>
+                <w:color w:val="1E40AF"/>
+              </w:rPr>
+              <w:t>Teacher</w:t>
+            </w:r>
+          </w:p>
+        </w:tc>
+        <w:tc>
+          <w:tcPr>
+            <w:shd w:val="clear" w:color="auto" w:fill="F8FAFC"/>
+            <w:tcBorders>
+              <w:top w:val="single" w:sz="4" w:space="0" w:color="CBD5E1"/>
+              <w:left w:val="single" w:sz="4" w:space="0" w:color="CBD5E1"/>
+              <w:bottom w:val="single" w:sz="4" w:space="0" w:color="CBD5E1"/>
+              <w:right w:val="single" w:sz="4" w:space="0" w:color="CBD5E1"/>
+            </w:tcBorders>
+          </w:tcPr>
+          <w:p>
+            <w:pPr>
               <w:jc w:val="center"/>
-              <w:rPr>
-                <w:b/>
-              </w:rPr>
-            </w:pPr>
-            <w:r>
-              <w:rPr>
-                <w:b/>
-              </w:rPr>
-              <w:t>Role-Name3</w:t>
-            </w:r>
-          </w:p>
-        </w:tc>
-        <w:tc>
-          <w:tcPr>
-            <w:tcW w:w="1701" w:type="dxa"/>
-            <w:shd w:val="clear" w:color="auto" w:fill="FFE8E1"/>
-          </w:tcPr>
-          <w:p>
-            <w:pPr>
-              <w:spacing w:after="0"/>
-              <w:jc w:val="center"/>
-              <w:rPr>
-                <w:b/>
-              </w:rPr>
-            </w:pPr>
-            <w:r>
-              <w:rPr>
-                <w:b/>
-              </w:rPr>
-              <w:t>…</w:t>
+            </w:pPr>
+            <w:r>
+              <w:rPr>
+                <w:b/>
+                <w:sz w:val="20"/>
+                <w:rFonts w:ascii="Arial" w:hAnsi="Arial"/>
+                <w:color w:val="1E40AF"/>
+              </w:rPr>
+              <w:t>Center Director</w:t>
             </w:r>
           </w:p>
         </w:tc>
       </w:tr>
       <w:tr>
-        <w:trPr>
-          <w:trHeight w:val="288"/>
-        </w:trPr>
-        <w:tc>
-          <w:tcPr>
-            <w:tcW w:w="3119" w:type="dxa"/>
-            <w:shd w:val="clear" w:color="auto" w:fill="auto"/>
-            <w:vAlign w:val="bottom"/>
-          </w:tcPr>
-          <w:p>
-            <w:pPr>
-              <w:spacing w:after="0"/>
-              <w:rPr>
-                <w:color w:val="000000"/>
-              </w:rPr>
-            </w:pPr>
-            <w:r>
-              <w:rPr>
-                <w:color w:val="000000"/>
-              </w:rPr>
-              <w:t>&lt;&lt;Screen Name1&gt;&gt;</w:t>
-            </w:r>
-          </w:p>
-        </w:tc>
-        <w:tc>
-          <w:tcPr>
-            <w:tcW w:w="1417" w:type="dxa"/>
-            <w:shd w:val="clear" w:color="auto" w:fill="auto"/>
-            <w:vAlign w:val="bottom"/>
-          </w:tcPr>
-          <w:p>
-            <w:pPr>
-              <w:spacing w:after="0"/>
+        <w:tc>
+          <w:tcPr>
+            <w:tcBorders>
+              <w:top w:val="single" w:sz="4" w:space="0" w:color="CBD5E1"/>
+              <w:left w:val="single" w:sz="4" w:space="0" w:color="CBD5E1"/>
+              <w:bottom w:val="single" w:sz="4" w:space="0" w:color="CBD5E1"/>
+              <w:right w:val="single" w:sz="4" w:space="0" w:color="CBD5E1"/>
+            </w:tcBorders>
+          </w:tcPr>
+          <w:p>
+            <w:pPr>
+              <w:jc w:val="left"/>
+            </w:pPr>
+            <w:r>
+              <w:rPr>
+                <w:b/>
+                <w:sz w:val="20"/>
+                <w:rFonts w:ascii="Arial" w:hAnsi="Arial"/>
+                <w:color w:val="1D4ED8"/>
+              </w:rPr>
+              <w:t>1. Login Page</w:t>
+            </w:r>
+          </w:p>
+        </w:tc>
+        <w:tc>
+          <w:tcPr>
+            <w:tcBorders>
+              <w:top w:val="single" w:sz="4" w:space="0" w:color="CBD5E1"/>
+              <w:left w:val="single" w:sz="4" w:space="0" w:color="CBD5E1"/>
+              <w:bottom w:val="single" w:sz="4" w:space="0" w:color="CBD5E1"/>
+              <w:right w:val="single" w:sz="4" w:space="0" w:color="CBD5E1"/>
+            </w:tcBorders>
+          </w:tcPr>
+          <w:p>
+            <w:pPr>
               <w:jc w:val="center"/>
-              <w:rPr>
-                <w:color w:val="000000"/>
-              </w:rPr>
-            </w:pPr>
-            <w:r>
-              <w:rPr>
-                <w:color w:val="000000"/>
+            </w:pPr>
+            <w:r>
+              <w:rPr>
+                <w:b/>
+                <w:sz w:val="20"/>
+                <w:rFonts w:ascii="Arial" w:hAnsi="Arial"/>
+                <w:color w:val="15803d"/>
               </w:rPr>
               <w:t>X</w:t>
             </w:r>
@@ -9033,53 +9008,47 @@
         </w:tc>
         <w:tc>
           <w:tcPr>
-            <w:tcW w:w="1418" w:type="dxa"/>
-          </w:tcPr>
-          <w:p>
-            <w:pPr>
-              <w:spacing w:after="0"/>
+            <w:tcBorders>
+              <w:top w:val="single" w:sz="4" w:space="0" w:color="CBD5E1"/>
+              <w:left w:val="single" w:sz="4" w:space="0" w:color="CBD5E1"/>
+              <w:bottom w:val="single" w:sz="4" w:space="0" w:color="CBD5E1"/>
+              <w:right w:val="single" w:sz="4" w:space="0" w:color="CBD5E1"/>
+            </w:tcBorders>
+          </w:tcPr>
+          <w:p>
+            <w:pPr>
               <w:jc w:val="center"/>
-              <w:rPr>
-                <w:color w:val="000000"/>
-              </w:rPr>
-            </w:pPr>
-          </w:p>
-        </w:tc>
-        <w:tc>
-          <w:tcPr>
-            <w:tcW w:w="1559" w:type="dxa"/>
-          </w:tcPr>
-          <w:p>
-            <w:pPr>
-              <w:spacing w:after="0"/>
+            </w:pPr>
+            <w:r>
+              <w:rPr>
+                <w:b/>
+                <w:sz w:val="20"/>
+                <w:rFonts w:ascii="Arial" w:hAnsi="Arial"/>
+                <w:color w:val="15803d"/>
+              </w:rPr>
+              <w:t>X</w:t>
+            </w:r>
+          </w:p>
+        </w:tc>
+        <w:tc>
+          <w:tcPr>
+            <w:tcBorders>
+              <w:top w:val="single" w:sz="4" w:space="0" w:color="CBD5E1"/>
+              <w:left w:val="single" w:sz="4" w:space="0" w:color="CBD5E1"/>
+              <w:bottom w:val="single" w:sz="4" w:space="0" w:color="CBD5E1"/>
+              <w:right w:val="single" w:sz="4" w:space="0" w:color="CBD5E1"/>
+            </w:tcBorders>
+          </w:tcPr>
+          <w:p>
+            <w:pPr>
               <w:jc w:val="center"/>
-              <w:rPr>
-                <w:color w:val="000000"/>
-              </w:rPr>
-            </w:pPr>
-            <w:r>
-              <w:rPr>
-                <w:color w:val="000000"/>
-              </w:rPr>
-              <w:t>X</w:t>
-            </w:r>
-          </w:p>
-        </w:tc>
-        <w:tc>
-          <w:tcPr>
-            <w:tcW w:w="1701" w:type="dxa"/>
-          </w:tcPr>
-          <w:p>
-            <w:pPr>
-              <w:spacing w:after="0"/>
-              <w:jc w:val="center"/>
-              <w:rPr>
-                <w:color w:val="000000"/>
-              </w:rPr>
-            </w:pPr>
-            <w:r>
-              <w:rPr>
-                <w:color w:val="000000"/>
+            </w:pPr>
+            <w:r>
+              <w:rPr>
+                <w:b/>
+                <w:sz w:val="20"/>
+                <w:rFonts w:ascii="Arial" w:hAnsi="Arial"/>
+                <w:color w:val="15803d"/>
               </w:rPr>
               <w:t>X</w:t>
             </w:r>
@@ -9087,61 +9056,73 @@
         </w:tc>
       </w:tr>
       <w:tr>
-        <w:trPr>
-          <w:trHeight w:val="288"/>
-        </w:trPr>
-        <w:tc>
-          <w:tcPr>
-            <w:tcW w:w="3119" w:type="dxa"/>
-            <w:shd w:val="clear" w:color="auto" w:fill="auto"/>
-            <w:vAlign w:val="bottom"/>
-          </w:tcPr>
-          <w:p>
-            <w:pPr>
-              <w:spacing w:after="0"/>
-              <w:rPr>
-                <w:color w:val="000000"/>
-              </w:rPr>
-            </w:pPr>
-            <w:r>
-              <w:rPr>
-                <w:color w:val="000000"/>
-              </w:rPr>
-              <w:t>&lt;&lt;Screen Name2&gt;&gt;</w:t>
-            </w:r>
-          </w:p>
-        </w:tc>
-        <w:tc>
-          <w:tcPr>
-            <w:tcW w:w="1417" w:type="dxa"/>
-            <w:shd w:val="clear" w:color="auto" w:fill="auto"/>
-            <w:vAlign w:val="bottom"/>
-          </w:tcPr>
-          <w:p>
-            <w:pPr>
-              <w:spacing w:after="0"/>
+        <w:tc>
+          <w:tcPr>
+            <w:tcBorders>
+              <w:top w:val="single" w:sz="4" w:space="0" w:color="CBD5E1"/>
+              <w:left w:val="single" w:sz="4" w:space="0" w:color="CBD5E1"/>
+              <w:bottom w:val="single" w:sz="4" w:space="0" w:color="CBD5E1"/>
+              <w:right w:val="single" w:sz="4" w:space="0" w:color="CBD5E1"/>
+            </w:tcBorders>
+          </w:tcPr>
+          <w:p>
+            <w:pPr>
+              <w:jc w:val="left"/>
+            </w:pPr>
+            <w:r>
+              <w:rPr>
+                <w:b/>
+                <w:sz w:val="20"/>
+                <w:rFonts w:ascii="Arial" w:hAnsi="Arial"/>
+                <w:color w:val="1D4ED8"/>
+              </w:rPr>
+              <w:t>2. Forgot/Reset Password Modal</w:t>
+            </w:r>
+          </w:p>
+        </w:tc>
+        <w:tc>
+          <w:tcPr>
+            <w:tcBorders>
+              <w:top w:val="single" w:sz="4" w:space="0" w:color="CBD5E1"/>
+              <w:left w:val="single" w:sz="4" w:space="0" w:color="CBD5E1"/>
+              <w:bottom w:val="single" w:sz="4" w:space="0" w:color="CBD5E1"/>
+              <w:right w:val="single" w:sz="4" w:space="0" w:color="CBD5E1"/>
+            </w:tcBorders>
+          </w:tcPr>
+          <w:p>
+            <w:pPr>
               <w:jc w:val="center"/>
-              <w:rPr>
-                <w:color w:val="000000"/>
-              </w:rPr>
-            </w:pPr>
-          </w:p>
-        </w:tc>
-        <w:tc>
-          <w:tcPr>
-            <w:tcW w:w="1418" w:type="dxa"/>
-          </w:tcPr>
-          <w:p>
-            <w:pPr>
-              <w:spacing w:after="0"/>
+            </w:pPr>
+            <w:r>
+              <w:rPr>
+                <w:b/>
+                <w:sz w:val="20"/>
+                <w:rFonts w:ascii="Arial" w:hAnsi="Arial"/>
+                <w:color w:val="15803d"/>
+              </w:rPr>
+              <w:t>X</w:t>
+            </w:r>
+          </w:p>
+        </w:tc>
+        <w:tc>
+          <w:tcPr>
+            <w:tcBorders>
+              <w:top w:val="single" w:sz="4" w:space="0" w:color="CBD5E1"/>
+              <w:left w:val="single" w:sz="4" w:space="0" w:color="CBD5E1"/>
+              <w:bottom w:val="single" w:sz="4" w:space="0" w:color="CBD5E1"/>
+              <w:right w:val="single" w:sz="4" w:space="0" w:color="CBD5E1"/>
+            </w:tcBorders>
+          </w:tcPr>
+          <w:p>
+            <w:pPr>
               <w:jc w:val="center"/>
-              <w:rPr>
-                <w:color w:val="000000"/>
-              </w:rPr>
-            </w:pPr>
-            <w:r>
-              <w:rPr>
-                <w:color w:val="000000"/>
+            </w:pPr>
+            <w:r>
+              <w:rPr>
+                <w:b/>
+                <w:sz w:val="20"/>
+                <w:rFonts w:ascii="Arial" w:hAnsi="Arial"/>
+                <w:color w:val="15803d"/>
               </w:rPr>
               <w:t>X</w:t>
             </w:r>
@@ -9149,118 +9130,1681 @@
         </w:tc>
         <w:tc>
           <w:tcPr>
-            <w:tcW w:w="1559" w:type="dxa"/>
-          </w:tcPr>
-          <w:p>
-            <w:pPr>
-              <w:spacing w:after="0"/>
+            <w:tcBorders>
+              <w:top w:val="single" w:sz="4" w:space="0" w:color="CBD5E1"/>
+              <w:left w:val="single" w:sz="4" w:space="0" w:color="CBD5E1"/>
+              <w:bottom w:val="single" w:sz="4" w:space="0" w:color="CBD5E1"/>
+              <w:right w:val="single" w:sz="4" w:space="0" w:color="CBD5E1"/>
+            </w:tcBorders>
+          </w:tcPr>
+          <w:p>
+            <w:pPr>
               <w:jc w:val="center"/>
-              <w:rPr>
-                <w:color w:val="000000"/>
-              </w:rPr>
-            </w:pPr>
-          </w:p>
-        </w:tc>
-        <w:tc>
-          <w:tcPr>
-            <w:tcW w:w="1701" w:type="dxa"/>
-          </w:tcPr>
-          <w:p>
-            <w:pPr>
-              <w:spacing w:after="0"/>
-              <w:jc w:val="center"/>
-              <w:rPr>
-                <w:color w:val="000000"/>
-              </w:rPr>
-            </w:pPr>
+            </w:pPr>
+            <w:r>
+              <w:rPr>
+                <w:b/>
+                <w:sz w:val="20"/>
+                <w:rFonts w:ascii="Arial" w:hAnsi="Arial"/>
+                <w:color w:val="15803d"/>
+              </w:rPr>
+              <w:t>X</w:t>
+            </w:r>
           </w:p>
         </w:tc>
       </w:tr>
       <w:tr>
-        <w:trPr>
-          <w:trHeight w:val="288"/>
-        </w:trPr>
-        <w:tc>
-          <w:tcPr>
-            <w:tcW w:w="3119" w:type="dxa"/>
-            <w:shd w:val="clear" w:color="auto" w:fill="auto"/>
-            <w:vAlign w:val="bottom"/>
-          </w:tcPr>
-          <w:p>
-            <w:pPr>
-              <w:spacing w:after="0"/>
-              <w:rPr>
-                <w:color w:val="000000"/>
-              </w:rPr>
-            </w:pPr>
-            <w:r>
-              <w:rPr>
-                <w:color w:val="000000"/>
-              </w:rPr>
-              <w:t xml:space="preserve">    …</w:t>
-            </w:r>
-          </w:p>
-        </w:tc>
-        <w:tc>
-          <w:tcPr>
-            <w:tcW w:w="1417" w:type="dxa"/>
-            <w:shd w:val="clear" w:color="auto" w:fill="auto"/>
-            <w:vAlign w:val="bottom"/>
-          </w:tcPr>
-          <w:p>
-            <w:pPr>
-              <w:spacing w:after="0"/>
+        <w:tc>
+          <w:tcPr>
+            <w:tcBorders>
+              <w:top w:val="single" w:sz="4" w:space="0" w:color="CBD5E1"/>
+              <w:left w:val="single" w:sz="4" w:space="0" w:color="CBD5E1"/>
+              <w:bottom w:val="single" w:sz="4" w:space="0" w:color="CBD5E1"/>
+              <w:right w:val="single" w:sz="4" w:space="0" w:color="CBD5E1"/>
+            </w:tcBorders>
+          </w:tcPr>
+          <w:p>
+            <w:pPr>
+              <w:jc w:val="left"/>
+            </w:pPr>
+            <w:r>
+              <w:rPr>
+                <w:b/>
+                <w:sz w:val="20"/>
+                <w:rFonts w:ascii="Arial" w:hAnsi="Arial"/>
+                <w:color w:val="1D4ED8"/>
+              </w:rPr>
+              <w:t>3. Admin Dashboard Page</w:t>
+            </w:r>
+          </w:p>
+        </w:tc>
+        <w:tc>
+          <w:tcPr>
+            <w:tcBorders>
+              <w:top w:val="single" w:sz="4" w:space="0" w:color="CBD5E1"/>
+              <w:left w:val="single" w:sz="4" w:space="0" w:color="CBD5E1"/>
+              <w:bottom w:val="single" w:sz="4" w:space="0" w:color="CBD5E1"/>
+              <w:right w:val="single" w:sz="4" w:space="0" w:color="CBD5E1"/>
+            </w:tcBorders>
+          </w:tcPr>
+          <w:p>
+            <w:pPr>
               <w:jc w:val="center"/>
-              <w:rPr>
-                <w:color w:val="000000"/>
-              </w:rPr>
-            </w:pPr>
-          </w:p>
-        </w:tc>
-        <w:tc>
-          <w:tcPr>
-            <w:tcW w:w="1418" w:type="dxa"/>
-          </w:tcPr>
-          <w:p>
-            <w:pPr>
-              <w:spacing w:after="0"/>
+            </w:pPr>
+            <w:r>
+              <w:rPr>
+                <w:b/>
+                <w:sz w:val="20"/>
+                <w:rFonts w:ascii="Arial" w:hAnsi="Arial"/>
+                <w:color w:val="15803d"/>
+              </w:rPr>
+              <w:t>X</w:t>
+            </w:r>
+          </w:p>
+        </w:tc>
+        <w:tc>
+          <w:tcPr>
+            <w:tcBorders>
+              <w:top w:val="single" w:sz="4" w:space="0" w:color="CBD5E1"/>
+              <w:left w:val="single" w:sz="4" w:space="0" w:color="CBD5E1"/>
+              <w:bottom w:val="single" w:sz="4" w:space="0" w:color="CBD5E1"/>
+              <w:right w:val="single" w:sz="4" w:space="0" w:color="CBD5E1"/>
+            </w:tcBorders>
+          </w:tcPr>
+          <w:p>
+            <w:pPr>
               <w:jc w:val="center"/>
-              <w:rPr>
-                <w:color w:val="000000"/>
-              </w:rPr>
-            </w:pPr>
-          </w:p>
-        </w:tc>
-        <w:tc>
-          <w:tcPr>
-            <w:tcW w:w="1559" w:type="dxa"/>
-          </w:tcPr>
-          <w:p>
-            <w:pPr>
-              <w:spacing w:after="0"/>
+            </w:pPr>
+            <w:r>
+              <w:rPr>
+                <w:sz w:val="20"/>
+                <w:rFonts w:ascii="Arial" w:hAnsi="Arial"/>
+                <w:color w:val="94a3b8"/>
+              </w:rPr>
+              <w:t>-</w:t>
+            </w:r>
+          </w:p>
+        </w:tc>
+        <w:tc>
+          <w:tcPr>
+            <w:tcBorders>
+              <w:top w:val="single" w:sz="4" w:space="0" w:color="CBD5E1"/>
+              <w:left w:val="single" w:sz="4" w:space="0" w:color="CBD5E1"/>
+              <w:bottom w:val="single" w:sz="4" w:space="0" w:color="CBD5E1"/>
+              <w:right w:val="single" w:sz="4" w:space="0" w:color="CBD5E1"/>
+            </w:tcBorders>
+          </w:tcPr>
+          <w:p>
+            <w:pPr>
               <w:jc w:val="center"/>
-              <w:rPr>
-                <w:color w:val="000000"/>
-              </w:rPr>
-            </w:pPr>
-          </w:p>
-        </w:tc>
-        <w:tc>
-          <w:tcPr>
-            <w:tcW w:w="1701" w:type="dxa"/>
-          </w:tcPr>
-          <w:p>
-            <w:pPr>
-              <w:spacing w:after="0"/>
+            </w:pPr>
+            <w:r>
+              <w:rPr>
+                <w:sz w:val="20"/>
+                <w:rFonts w:ascii="Arial" w:hAnsi="Arial"/>
+                <w:color w:val="94a3b8"/>
+              </w:rPr>
+              <w:t>-</w:t>
+            </w:r>
+          </w:p>
+        </w:tc>
+      </w:tr>
+      <w:tr>
+        <w:tc>
+          <w:tcPr>
+            <w:tcBorders>
+              <w:top w:val="single" w:sz="4" w:space="0" w:color="CBD5E1"/>
+              <w:left w:val="single" w:sz="4" w:space="0" w:color="CBD5E1"/>
+              <w:bottom w:val="single" w:sz="4" w:space="0" w:color="CBD5E1"/>
+              <w:right w:val="single" w:sz="4" w:space="0" w:color="CBD5E1"/>
+            </w:tcBorders>
+          </w:tcPr>
+          <w:p>
+            <w:pPr>
+              <w:jc w:val="left"/>
+            </w:pPr>
+            <w:r>
+              <w:rPr>
+                <w:b/>
+                <w:sz w:val="20"/>
+                <w:rFonts w:ascii="Arial" w:hAnsi="Arial"/>
+                <w:color w:val="1D4ED8"/>
+              </w:rPr>
+              <w:t>4. Director Dashboard Page</w:t>
+            </w:r>
+          </w:p>
+        </w:tc>
+        <w:tc>
+          <w:tcPr>
+            <w:tcBorders>
+              <w:top w:val="single" w:sz="4" w:space="0" w:color="CBD5E1"/>
+              <w:left w:val="single" w:sz="4" w:space="0" w:color="CBD5E1"/>
+              <w:bottom w:val="single" w:sz="4" w:space="0" w:color="CBD5E1"/>
+              <w:right w:val="single" w:sz="4" w:space="0" w:color="CBD5E1"/>
+            </w:tcBorders>
+          </w:tcPr>
+          <w:p>
+            <w:pPr>
               <w:jc w:val="center"/>
-              <w:rPr>
-                <w:color w:val="000000"/>
-              </w:rPr>
-            </w:pPr>
+            </w:pPr>
+            <w:r>
+              <w:rPr>
+                <w:sz w:val="20"/>
+                <w:rFonts w:ascii="Arial" w:hAnsi="Arial"/>
+                <w:color w:val="94a3b8"/>
+              </w:rPr>
+              <w:t>-</w:t>
+            </w:r>
+          </w:p>
+        </w:tc>
+        <w:tc>
+          <w:tcPr>
+            <w:tcBorders>
+              <w:top w:val="single" w:sz="4" w:space="0" w:color="CBD5E1"/>
+              <w:left w:val="single" w:sz="4" w:space="0" w:color="CBD5E1"/>
+              <w:bottom w:val="single" w:sz="4" w:space="0" w:color="CBD5E1"/>
+              <w:right w:val="single" w:sz="4" w:space="0" w:color="CBD5E1"/>
+            </w:tcBorders>
+          </w:tcPr>
+          <w:p>
+            <w:pPr>
+              <w:jc w:val="center"/>
+            </w:pPr>
+            <w:r>
+              <w:rPr>
+                <w:sz w:val="20"/>
+                <w:rFonts w:ascii="Arial" w:hAnsi="Arial"/>
+                <w:color w:val="94a3b8"/>
+              </w:rPr>
+              <w:t>-</w:t>
+            </w:r>
+          </w:p>
+        </w:tc>
+        <w:tc>
+          <w:tcPr>
+            <w:tcBorders>
+              <w:top w:val="single" w:sz="4" w:space="0" w:color="CBD5E1"/>
+              <w:left w:val="single" w:sz="4" w:space="0" w:color="CBD5E1"/>
+              <w:bottom w:val="single" w:sz="4" w:space="0" w:color="CBD5E1"/>
+              <w:right w:val="single" w:sz="4" w:space="0" w:color="CBD5E1"/>
+            </w:tcBorders>
+          </w:tcPr>
+          <w:p>
+            <w:pPr>
+              <w:jc w:val="center"/>
+            </w:pPr>
+            <w:r>
+              <w:rPr>
+                <w:b/>
+                <w:sz w:val="20"/>
+                <w:rFonts w:ascii="Arial" w:hAnsi="Arial"/>
+                <w:color w:val="15803d"/>
+              </w:rPr>
+              <w:t>X</w:t>
+            </w:r>
+          </w:p>
+        </w:tc>
+      </w:tr>
+      <w:tr>
+        <w:tc>
+          <w:tcPr>
+            <w:tcBorders>
+              <w:top w:val="single" w:sz="4" w:space="0" w:color="CBD5E1"/>
+              <w:left w:val="single" w:sz="4" w:space="0" w:color="CBD5E1"/>
+              <w:bottom w:val="single" w:sz="4" w:space="0" w:color="CBD5E1"/>
+              <w:right w:val="single" w:sz="4" w:space="0" w:color="CBD5E1"/>
+            </w:tcBorders>
+          </w:tcPr>
+          <w:p>
+            <w:pPr>
+              <w:jc w:val="left"/>
+            </w:pPr>
+            <w:r>
+              <w:rPr>
+                <w:b/>
+                <w:sz w:val="20"/>
+                <w:rFonts w:ascii="Arial" w:hAnsi="Arial"/>
+                <w:color w:val="1D4ED8"/>
+              </w:rPr>
+              <w:t>5. Teacher Dashboard &amp; Timetable</w:t>
+            </w:r>
+          </w:p>
+        </w:tc>
+        <w:tc>
+          <w:tcPr>
+            <w:tcBorders>
+              <w:top w:val="single" w:sz="4" w:space="0" w:color="CBD5E1"/>
+              <w:left w:val="single" w:sz="4" w:space="0" w:color="CBD5E1"/>
+              <w:bottom w:val="single" w:sz="4" w:space="0" w:color="CBD5E1"/>
+              <w:right w:val="single" w:sz="4" w:space="0" w:color="CBD5E1"/>
+            </w:tcBorders>
+          </w:tcPr>
+          <w:p>
+            <w:pPr>
+              <w:jc w:val="center"/>
+            </w:pPr>
+            <w:r>
+              <w:rPr>
+                <w:sz w:val="20"/>
+                <w:rFonts w:ascii="Arial" w:hAnsi="Arial"/>
+                <w:color w:val="94a3b8"/>
+              </w:rPr>
+              <w:t>-</w:t>
+            </w:r>
+          </w:p>
+        </w:tc>
+        <w:tc>
+          <w:tcPr>
+            <w:tcBorders>
+              <w:top w:val="single" w:sz="4" w:space="0" w:color="CBD5E1"/>
+              <w:left w:val="single" w:sz="4" w:space="0" w:color="CBD5E1"/>
+              <w:bottom w:val="single" w:sz="4" w:space="0" w:color="CBD5E1"/>
+              <w:right w:val="single" w:sz="4" w:space="0" w:color="CBD5E1"/>
+            </w:tcBorders>
+          </w:tcPr>
+          <w:p>
+            <w:pPr>
+              <w:jc w:val="center"/>
+            </w:pPr>
+            <w:r>
+              <w:rPr>
+                <w:b/>
+                <w:sz w:val="20"/>
+                <w:rFonts w:ascii="Arial" w:hAnsi="Arial"/>
+                <w:color w:val="15803d"/>
+              </w:rPr>
+              <w:t>X</w:t>
+            </w:r>
+          </w:p>
+        </w:tc>
+        <w:tc>
+          <w:tcPr>
+            <w:tcBorders>
+              <w:top w:val="single" w:sz="4" w:space="0" w:color="CBD5E1"/>
+              <w:left w:val="single" w:sz="4" w:space="0" w:color="CBD5E1"/>
+              <w:bottom w:val="single" w:sz="4" w:space="0" w:color="CBD5E1"/>
+              <w:right w:val="single" w:sz="4" w:space="0" w:color="CBD5E1"/>
+            </w:tcBorders>
+          </w:tcPr>
+          <w:p>
+            <w:pPr>
+              <w:jc w:val="center"/>
+            </w:pPr>
+            <w:r>
+              <w:rPr>
+                <w:sz w:val="20"/>
+                <w:rFonts w:ascii="Arial" w:hAnsi="Arial"/>
+                <w:color w:val="94a3b8"/>
+              </w:rPr>
+              <w:t>-</w:t>
+            </w:r>
+          </w:p>
+        </w:tc>
+      </w:tr>
+      <w:tr>
+        <w:tc>
+          <w:tcPr>
+            <w:tcBorders>
+              <w:top w:val="single" w:sz="4" w:space="0" w:color="CBD5E1"/>
+              <w:left w:val="single" w:sz="4" w:space="0" w:color="CBD5E1"/>
+              <w:bottom w:val="single" w:sz="4" w:space="0" w:color="CBD5E1"/>
+              <w:right w:val="single" w:sz="4" w:space="0" w:color="CBD5E1"/>
+            </w:tcBorders>
+          </w:tcPr>
+          <w:p>
+            <w:pPr>
+              <w:jc w:val="left"/>
+            </w:pPr>
+            <w:r>
+              <w:rPr>
+                <w:b/>
+                <w:sz w:val="20"/>
+                <w:rFonts w:ascii="Arial" w:hAnsi="Arial"/>
+                <w:color w:val="1D4ED8"/>
+              </w:rPr>
+              <w:t>6. Learner List Page</w:t>
+            </w:r>
+          </w:p>
+        </w:tc>
+        <w:tc>
+          <w:tcPr>
+            <w:tcBorders>
+              <w:top w:val="single" w:sz="4" w:space="0" w:color="CBD5E1"/>
+              <w:left w:val="single" w:sz="4" w:space="0" w:color="CBD5E1"/>
+              <w:bottom w:val="single" w:sz="4" w:space="0" w:color="CBD5E1"/>
+              <w:right w:val="single" w:sz="4" w:space="0" w:color="CBD5E1"/>
+            </w:tcBorders>
+          </w:tcPr>
+          <w:p>
+            <w:pPr>
+              <w:jc w:val="center"/>
+            </w:pPr>
+            <w:r>
+              <w:rPr>
+                <w:b/>
+                <w:sz w:val="20"/>
+                <w:rFonts w:ascii="Arial" w:hAnsi="Arial"/>
+                <w:color w:val="15803d"/>
+              </w:rPr>
+              <w:t>X</w:t>
+            </w:r>
+          </w:p>
+        </w:tc>
+        <w:tc>
+          <w:tcPr>
+            <w:tcBorders>
+              <w:top w:val="single" w:sz="4" w:space="0" w:color="CBD5E1"/>
+              <w:left w:val="single" w:sz="4" w:space="0" w:color="CBD5E1"/>
+              <w:bottom w:val="single" w:sz="4" w:space="0" w:color="CBD5E1"/>
+              <w:right w:val="single" w:sz="4" w:space="0" w:color="CBD5E1"/>
+            </w:tcBorders>
+          </w:tcPr>
+          <w:p>
+            <w:pPr>
+              <w:jc w:val="center"/>
+            </w:pPr>
+            <w:r>
+              <w:rPr>
+                <w:sz w:val="20"/>
+                <w:rFonts w:ascii="Arial" w:hAnsi="Arial"/>
+                <w:color w:val="94a3b8"/>
+              </w:rPr>
+              <w:t>-</w:t>
+            </w:r>
+          </w:p>
+        </w:tc>
+        <w:tc>
+          <w:tcPr>
+            <w:tcBorders>
+              <w:top w:val="single" w:sz="4" w:space="0" w:color="CBD5E1"/>
+              <w:left w:val="single" w:sz="4" w:space="0" w:color="CBD5E1"/>
+              <w:bottom w:val="single" w:sz="4" w:space="0" w:color="CBD5E1"/>
+              <w:right w:val="single" w:sz="4" w:space="0" w:color="CBD5E1"/>
+            </w:tcBorders>
+          </w:tcPr>
+          <w:p>
+            <w:pPr>
+              <w:jc w:val="center"/>
+            </w:pPr>
+            <w:r>
+              <w:rPr>
+                <w:b/>
+                <w:sz w:val="20"/>
+                <w:rFonts w:ascii="Arial" w:hAnsi="Arial"/>
+                <w:color w:val="ea580c"/>
+              </w:rPr>
+              <w:t>V</w:t>
+            </w:r>
+          </w:p>
+        </w:tc>
+      </w:tr>
+      <w:tr>
+        <w:tc>
+          <w:tcPr>
+            <w:tcBorders>
+              <w:top w:val="single" w:sz="4" w:space="0" w:color="CBD5E1"/>
+              <w:left w:val="single" w:sz="4" w:space="0" w:color="CBD5E1"/>
+              <w:bottom w:val="single" w:sz="4" w:space="0" w:color="CBD5E1"/>
+              <w:right w:val="single" w:sz="4" w:space="0" w:color="CBD5E1"/>
+            </w:tcBorders>
+          </w:tcPr>
+          <w:p>
+            <w:pPr>
+              <w:jc w:val="left"/>
+            </w:pPr>
+            <w:r>
+              <w:rPr>
+                <w:b/>
+                <w:sz w:val="20"/>
+                <w:rFonts w:ascii="Arial" w:hAnsi="Arial"/>
+                <w:color w:val="1D4ED8"/>
+              </w:rPr>
+              <w:t>7. Learner Profile Page</w:t>
+            </w:r>
+          </w:p>
+        </w:tc>
+        <w:tc>
+          <w:tcPr>
+            <w:tcBorders>
+              <w:top w:val="single" w:sz="4" w:space="0" w:color="CBD5E1"/>
+              <w:left w:val="single" w:sz="4" w:space="0" w:color="CBD5E1"/>
+              <w:bottom w:val="single" w:sz="4" w:space="0" w:color="CBD5E1"/>
+              <w:right w:val="single" w:sz="4" w:space="0" w:color="CBD5E1"/>
+            </w:tcBorders>
+          </w:tcPr>
+          <w:p>
+            <w:pPr>
+              <w:jc w:val="center"/>
+            </w:pPr>
+            <w:r>
+              <w:rPr>
+                <w:b/>
+                <w:sz w:val="20"/>
+                <w:rFonts w:ascii="Arial" w:hAnsi="Arial"/>
+                <w:color w:val="15803d"/>
+              </w:rPr>
+              <w:t>X</w:t>
+            </w:r>
+          </w:p>
+        </w:tc>
+        <w:tc>
+          <w:tcPr>
+            <w:tcBorders>
+              <w:top w:val="single" w:sz="4" w:space="0" w:color="CBD5E1"/>
+              <w:left w:val="single" w:sz="4" w:space="0" w:color="CBD5E1"/>
+              <w:bottom w:val="single" w:sz="4" w:space="0" w:color="CBD5E1"/>
+              <w:right w:val="single" w:sz="4" w:space="0" w:color="CBD5E1"/>
+            </w:tcBorders>
+          </w:tcPr>
+          <w:p>
+            <w:pPr>
+              <w:jc w:val="center"/>
+            </w:pPr>
+            <w:r>
+              <w:rPr>
+                <w:sz w:val="20"/>
+                <w:rFonts w:ascii="Arial" w:hAnsi="Arial"/>
+                <w:color w:val="94a3b8"/>
+              </w:rPr>
+              <w:t>-</w:t>
+            </w:r>
+          </w:p>
+        </w:tc>
+        <w:tc>
+          <w:tcPr>
+            <w:tcBorders>
+              <w:top w:val="single" w:sz="4" w:space="0" w:color="CBD5E1"/>
+              <w:left w:val="single" w:sz="4" w:space="0" w:color="CBD5E1"/>
+              <w:bottom w:val="single" w:sz="4" w:space="0" w:color="CBD5E1"/>
+              <w:right w:val="single" w:sz="4" w:space="0" w:color="CBD5E1"/>
+            </w:tcBorders>
+          </w:tcPr>
+          <w:p>
+            <w:pPr>
+              <w:jc w:val="center"/>
+            </w:pPr>
+            <w:r>
+              <w:rPr>
+                <w:sz w:val="20"/>
+                <w:rFonts w:ascii="Arial" w:hAnsi="Arial"/>
+                <w:color w:val="94a3b8"/>
+              </w:rPr>
+              <w:t>-</w:t>
+            </w:r>
+          </w:p>
+        </w:tc>
+      </w:tr>
+      <w:tr>
+        <w:tc>
+          <w:tcPr>
+            <w:tcBorders>
+              <w:top w:val="single" w:sz="4" w:space="0" w:color="CBD5E1"/>
+              <w:left w:val="single" w:sz="4" w:space="0" w:color="CBD5E1"/>
+              <w:bottom w:val="single" w:sz="4" w:space="0" w:color="CBD5E1"/>
+              <w:right w:val="single" w:sz="4" w:space="0" w:color="CBD5E1"/>
+            </w:tcBorders>
+          </w:tcPr>
+          <w:p>
+            <w:pPr>
+              <w:jc w:val="left"/>
+            </w:pPr>
+            <w:r>
+              <w:rPr>
+                <w:b/>
+                <w:sz w:val="20"/>
+                <w:rFonts w:ascii="Arial" w:hAnsi="Arial"/>
+                <w:color w:val="1D4ED8"/>
+              </w:rPr>
+              <w:t>8. Enroll Learner / Update Form</w:t>
+            </w:r>
+          </w:p>
+        </w:tc>
+        <w:tc>
+          <w:tcPr>
+            <w:tcBorders>
+              <w:top w:val="single" w:sz="4" w:space="0" w:color="CBD5E1"/>
+              <w:left w:val="single" w:sz="4" w:space="0" w:color="CBD5E1"/>
+              <w:bottom w:val="single" w:sz="4" w:space="0" w:color="CBD5E1"/>
+              <w:right w:val="single" w:sz="4" w:space="0" w:color="CBD5E1"/>
+            </w:tcBorders>
+          </w:tcPr>
+          <w:p>
+            <w:pPr>
+              <w:jc w:val="center"/>
+            </w:pPr>
+            <w:r>
+              <w:rPr>
+                <w:b/>
+                <w:sz w:val="20"/>
+                <w:rFonts w:ascii="Arial" w:hAnsi="Arial"/>
+                <w:color w:val="15803d"/>
+              </w:rPr>
+              <w:t>X</w:t>
+            </w:r>
+          </w:p>
+        </w:tc>
+        <w:tc>
+          <w:tcPr>
+            <w:tcBorders>
+              <w:top w:val="single" w:sz="4" w:space="0" w:color="CBD5E1"/>
+              <w:left w:val="single" w:sz="4" w:space="0" w:color="CBD5E1"/>
+              <w:bottom w:val="single" w:sz="4" w:space="0" w:color="CBD5E1"/>
+              <w:right w:val="single" w:sz="4" w:space="0" w:color="CBD5E1"/>
+            </w:tcBorders>
+          </w:tcPr>
+          <w:p>
+            <w:pPr>
+              <w:jc w:val="center"/>
+            </w:pPr>
+            <w:r>
+              <w:rPr>
+                <w:sz w:val="20"/>
+                <w:rFonts w:ascii="Arial" w:hAnsi="Arial"/>
+                <w:color w:val="94a3b8"/>
+              </w:rPr>
+              <w:t>-</w:t>
+            </w:r>
+          </w:p>
+        </w:tc>
+        <w:tc>
+          <w:tcPr>
+            <w:tcBorders>
+              <w:top w:val="single" w:sz="4" w:space="0" w:color="CBD5E1"/>
+              <w:left w:val="single" w:sz="4" w:space="0" w:color="CBD5E1"/>
+              <w:bottom w:val="single" w:sz="4" w:space="0" w:color="CBD5E1"/>
+              <w:right w:val="single" w:sz="4" w:space="0" w:color="CBD5E1"/>
+            </w:tcBorders>
+          </w:tcPr>
+          <w:p>
+            <w:pPr>
+              <w:jc w:val="center"/>
+            </w:pPr>
+            <w:r>
+              <w:rPr>
+                <w:sz w:val="20"/>
+                <w:rFonts w:ascii="Arial" w:hAnsi="Arial"/>
+                <w:color w:val="94a3b8"/>
+              </w:rPr>
+              <w:t>-</w:t>
+            </w:r>
+          </w:p>
+        </w:tc>
+      </w:tr>
+      <w:tr>
+        <w:tc>
+          <w:tcPr>
+            <w:tcBorders>
+              <w:top w:val="single" w:sz="4" w:space="0" w:color="CBD5E1"/>
+              <w:left w:val="single" w:sz="4" w:space="0" w:color="CBD5E1"/>
+              <w:bottom w:val="single" w:sz="4" w:space="0" w:color="CBD5E1"/>
+              <w:right w:val="single" w:sz="4" w:space="0" w:color="CBD5E1"/>
+            </w:tcBorders>
+          </w:tcPr>
+          <w:p>
+            <w:pPr>
+              <w:jc w:val="left"/>
+            </w:pPr>
+            <w:r>
+              <w:rPr>
+                <w:b/>
+                <w:sz w:val="20"/>
+                <w:rFonts w:ascii="Arial" w:hAnsi="Arial"/>
+                <w:color w:val="1D4ED8"/>
+              </w:rPr>
+              <w:t>9. Package Management Page</w:t>
+            </w:r>
+          </w:p>
+        </w:tc>
+        <w:tc>
+          <w:tcPr>
+            <w:tcBorders>
+              <w:top w:val="single" w:sz="4" w:space="0" w:color="CBD5E1"/>
+              <w:left w:val="single" w:sz="4" w:space="0" w:color="CBD5E1"/>
+              <w:bottom w:val="single" w:sz="4" w:space="0" w:color="CBD5E1"/>
+              <w:right w:val="single" w:sz="4" w:space="0" w:color="CBD5E1"/>
+            </w:tcBorders>
+          </w:tcPr>
+          <w:p>
+            <w:pPr>
+              <w:jc w:val="center"/>
+            </w:pPr>
+            <w:r>
+              <w:rPr>
+                <w:b/>
+                <w:sz w:val="20"/>
+                <w:rFonts w:ascii="Arial" w:hAnsi="Arial"/>
+                <w:color w:val="15803d"/>
+              </w:rPr>
+              <w:t>X</w:t>
+            </w:r>
+          </w:p>
+        </w:tc>
+        <w:tc>
+          <w:tcPr>
+            <w:tcBorders>
+              <w:top w:val="single" w:sz="4" w:space="0" w:color="CBD5E1"/>
+              <w:left w:val="single" w:sz="4" w:space="0" w:color="CBD5E1"/>
+              <w:bottom w:val="single" w:sz="4" w:space="0" w:color="CBD5E1"/>
+              <w:right w:val="single" w:sz="4" w:space="0" w:color="CBD5E1"/>
+            </w:tcBorders>
+          </w:tcPr>
+          <w:p>
+            <w:pPr>
+              <w:jc w:val="center"/>
+            </w:pPr>
+            <w:r>
+              <w:rPr>
+                <w:sz w:val="20"/>
+                <w:rFonts w:ascii="Arial" w:hAnsi="Arial"/>
+                <w:color w:val="94a3b8"/>
+              </w:rPr>
+              <w:t>-</w:t>
+            </w:r>
+          </w:p>
+        </w:tc>
+        <w:tc>
+          <w:tcPr>
+            <w:tcBorders>
+              <w:top w:val="single" w:sz="4" w:space="0" w:color="CBD5E1"/>
+              <w:left w:val="single" w:sz="4" w:space="0" w:color="CBD5E1"/>
+              <w:bottom w:val="single" w:sz="4" w:space="0" w:color="CBD5E1"/>
+              <w:right w:val="single" w:sz="4" w:space="0" w:color="CBD5E1"/>
+            </w:tcBorders>
+          </w:tcPr>
+          <w:p>
+            <w:pPr>
+              <w:jc w:val="center"/>
+            </w:pPr>
+            <w:r>
+              <w:rPr>
+                <w:b/>
+                <w:sz w:val="20"/>
+                <w:rFonts w:ascii="Arial" w:hAnsi="Arial"/>
+                <w:color w:val="ea580c"/>
+              </w:rPr>
+              <w:t>V</w:t>
+            </w:r>
+          </w:p>
+        </w:tc>
+      </w:tr>
+      <w:tr>
+        <w:tc>
+          <w:tcPr>
+            <w:tcBorders>
+              <w:top w:val="single" w:sz="4" w:space="0" w:color="CBD5E1"/>
+              <w:left w:val="single" w:sz="4" w:space="0" w:color="CBD5E1"/>
+              <w:bottom w:val="single" w:sz="4" w:space="0" w:color="CBD5E1"/>
+              <w:right w:val="single" w:sz="4" w:space="0" w:color="CBD5E1"/>
+            </w:tcBorders>
+          </w:tcPr>
+          <w:p>
+            <w:pPr>
+              <w:jc w:val="left"/>
+            </w:pPr>
+            <w:r>
+              <w:rPr>
+                <w:b/>
+                <w:sz w:val="20"/>
+                <w:rFonts w:ascii="Arial" w:hAnsi="Arial"/>
+                <w:color w:val="1D4ED8"/>
+              </w:rPr>
+              <w:t>10. Assign Package Form</w:t>
+            </w:r>
+          </w:p>
+        </w:tc>
+        <w:tc>
+          <w:tcPr>
+            <w:tcBorders>
+              <w:top w:val="single" w:sz="4" w:space="0" w:color="CBD5E1"/>
+              <w:left w:val="single" w:sz="4" w:space="0" w:color="CBD5E1"/>
+              <w:bottom w:val="single" w:sz="4" w:space="0" w:color="CBD5E1"/>
+              <w:right w:val="single" w:sz="4" w:space="0" w:color="CBD5E1"/>
+            </w:tcBorders>
+          </w:tcPr>
+          <w:p>
+            <w:pPr>
+              <w:jc w:val="center"/>
+            </w:pPr>
+            <w:r>
+              <w:rPr>
+                <w:b/>
+                <w:sz w:val="20"/>
+                <w:rFonts w:ascii="Arial" w:hAnsi="Arial"/>
+                <w:color w:val="15803d"/>
+              </w:rPr>
+              <w:t>X</w:t>
+            </w:r>
+          </w:p>
+        </w:tc>
+        <w:tc>
+          <w:tcPr>
+            <w:tcBorders>
+              <w:top w:val="single" w:sz="4" w:space="0" w:color="CBD5E1"/>
+              <w:left w:val="single" w:sz="4" w:space="0" w:color="CBD5E1"/>
+              <w:bottom w:val="single" w:sz="4" w:space="0" w:color="CBD5E1"/>
+              <w:right w:val="single" w:sz="4" w:space="0" w:color="CBD5E1"/>
+            </w:tcBorders>
+          </w:tcPr>
+          <w:p>
+            <w:pPr>
+              <w:jc w:val="center"/>
+            </w:pPr>
+            <w:r>
+              <w:rPr>
+                <w:sz w:val="20"/>
+                <w:rFonts w:ascii="Arial" w:hAnsi="Arial"/>
+                <w:color w:val="94a3b8"/>
+              </w:rPr>
+              <w:t>-</w:t>
+            </w:r>
+          </w:p>
+        </w:tc>
+        <w:tc>
+          <w:tcPr>
+            <w:tcBorders>
+              <w:top w:val="single" w:sz="4" w:space="0" w:color="CBD5E1"/>
+              <w:left w:val="single" w:sz="4" w:space="0" w:color="CBD5E1"/>
+              <w:bottom w:val="single" w:sz="4" w:space="0" w:color="CBD5E1"/>
+              <w:right w:val="single" w:sz="4" w:space="0" w:color="CBD5E1"/>
+            </w:tcBorders>
+          </w:tcPr>
+          <w:p>
+            <w:pPr>
+              <w:jc w:val="center"/>
+            </w:pPr>
+            <w:r>
+              <w:rPr>
+                <w:sz w:val="20"/>
+                <w:rFonts w:ascii="Arial" w:hAnsi="Arial"/>
+                <w:color w:val="94a3b8"/>
+              </w:rPr>
+              <w:t>-</w:t>
+            </w:r>
+          </w:p>
+        </w:tc>
+      </w:tr>
+      <w:tr>
+        <w:tc>
+          <w:tcPr>
+            <w:tcBorders>
+              <w:top w:val="single" w:sz="4" w:space="0" w:color="CBD5E1"/>
+              <w:left w:val="single" w:sz="4" w:space="0" w:color="CBD5E1"/>
+              <w:bottom w:val="single" w:sz="4" w:space="0" w:color="CBD5E1"/>
+              <w:right w:val="single" w:sz="4" w:space="0" w:color="CBD5E1"/>
+            </w:tcBorders>
+          </w:tcPr>
+          <w:p>
+            <w:pPr>
+              <w:jc w:val="left"/>
+            </w:pPr>
+            <w:r>
+              <w:rPr>
+                <w:b/>
+                <w:sz w:val="20"/>
+                <w:rFonts w:ascii="Arial" w:hAnsi="Arial"/>
+                <w:color w:val="1D4ED8"/>
+              </w:rPr>
+              <w:t>11. Session Timetable Page</w:t>
+            </w:r>
+          </w:p>
+        </w:tc>
+        <w:tc>
+          <w:tcPr>
+            <w:tcBorders>
+              <w:top w:val="single" w:sz="4" w:space="0" w:color="CBD5E1"/>
+              <w:left w:val="single" w:sz="4" w:space="0" w:color="CBD5E1"/>
+              <w:bottom w:val="single" w:sz="4" w:space="0" w:color="CBD5E1"/>
+              <w:right w:val="single" w:sz="4" w:space="0" w:color="CBD5E1"/>
+            </w:tcBorders>
+          </w:tcPr>
+          <w:p>
+            <w:pPr>
+              <w:jc w:val="center"/>
+            </w:pPr>
+            <w:r>
+              <w:rPr>
+                <w:b/>
+                <w:sz w:val="20"/>
+                <w:rFonts w:ascii="Arial" w:hAnsi="Arial"/>
+                <w:color w:val="15803d"/>
+              </w:rPr>
+              <w:t>X</w:t>
+            </w:r>
+          </w:p>
+        </w:tc>
+        <w:tc>
+          <w:tcPr>
+            <w:tcBorders>
+              <w:top w:val="single" w:sz="4" w:space="0" w:color="CBD5E1"/>
+              <w:left w:val="single" w:sz="4" w:space="0" w:color="CBD5E1"/>
+              <w:bottom w:val="single" w:sz="4" w:space="0" w:color="CBD5E1"/>
+              <w:right w:val="single" w:sz="4" w:space="0" w:color="CBD5E1"/>
+            </w:tcBorders>
+          </w:tcPr>
+          <w:p>
+            <w:pPr>
+              <w:jc w:val="center"/>
+            </w:pPr>
+            <w:r>
+              <w:rPr>
+                <w:b/>
+                <w:sz w:val="20"/>
+                <w:rFonts w:ascii="Arial" w:hAnsi="Arial"/>
+                <w:color w:val="ea580c"/>
+              </w:rPr>
+              <w:t>V</w:t>
+            </w:r>
+          </w:p>
+        </w:tc>
+        <w:tc>
+          <w:tcPr>
+            <w:tcBorders>
+              <w:top w:val="single" w:sz="4" w:space="0" w:color="CBD5E1"/>
+              <w:left w:val="single" w:sz="4" w:space="0" w:color="CBD5E1"/>
+              <w:bottom w:val="single" w:sz="4" w:space="0" w:color="CBD5E1"/>
+              <w:right w:val="single" w:sz="4" w:space="0" w:color="CBD5E1"/>
+            </w:tcBorders>
+          </w:tcPr>
+          <w:p>
+            <w:pPr>
+              <w:jc w:val="center"/>
+            </w:pPr>
+            <w:r>
+              <w:rPr>
+                <w:b/>
+                <w:sz w:val="20"/>
+                <w:rFonts w:ascii="Arial" w:hAnsi="Arial"/>
+                <w:color w:val="ea580c"/>
+              </w:rPr>
+              <w:t>V</w:t>
+            </w:r>
+          </w:p>
+        </w:tc>
+      </w:tr>
+      <w:tr>
+        <w:tc>
+          <w:tcPr>
+            <w:tcBorders>
+              <w:top w:val="single" w:sz="4" w:space="0" w:color="CBD5E1"/>
+              <w:left w:val="single" w:sz="4" w:space="0" w:color="CBD5E1"/>
+              <w:bottom w:val="single" w:sz="4" w:space="0" w:color="CBD5E1"/>
+              <w:right w:val="single" w:sz="4" w:space="0" w:color="CBD5E1"/>
+            </w:tcBorders>
+          </w:tcPr>
+          <w:p>
+            <w:pPr>
+              <w:jc w:val="left"/>
+            </w:pPr>
+            <w:r>
+              <w:rPr>
+                <w:b/>
+                <w:sz w:val="20"/>
+                <w:rFonts w:ascii="Arial" w:hAnsi="Arial"/>
+                <w:color w:val="1D4ED8"/>
+              </w:rPr>
+              <w:t>12. Create/Update Session Form</w:t>
+            </w:r>
+          </w:p>
+        </w:tc>
+        <w:tc>
+          <w:tcPr>
+            <w:tcBorders>
+              <w:top w:val="single" w:sz="4" w:space="0" w:color="CBD5E1"/>
+              <w:left w:val="single" w:sz="4" w:space="0" w:color="CBD5E1"/>
+              <w:bottom w:val="single" w:sz="4" w:space="0" w:color="CBD5E1"/>
+              <w:right w:val="single" w:sz="4" w:space="0" w:color="CBD5E1"/>
+            </w:tcBorders>
+          </w:tcPr>
+          <w:p>
+            <w:pPr>
+              <w:jc w:val="center"/>
+            </w:pPr>
+            <w:r>
+              <w:rPr>
+                <w:b/>
+                <w:sz w:val="20"/>
+                <w:rFonts w:ascii="Arial" w:hAnsi="Arial"/>
+                <w:color w:val="15803d"/>
+              </w:rPr>
+              <w:t>X</w:t>
+            </w:r>
+          </w:p>
+        </w:tc>
+        <w:tc>
+          <w:tcPr>
+            <w:tcBorders>
+              <w:top w:val="single" w:sz="4" w:space="0" w:color="CBD5E1"/>
+              <w:left w:val="single" w:sz="4" w:space="0" w:color="CBD5E1"/>
+              <w:bottom w:val="single" w:sz="4" w:space="0" w:color="CBD5E1"/>
+              <w:right w:val="single" w:sz="4" w:space="0" w:color="CBD5E1"/>
+            </w:tcBorders>
+          </w:tcPr>
+          <w:p>
+            <w:pPr>
+              <w:jc w:val="center"/>
+            </w:pPr>
+            <w:r>
+              <w:rPr>
+                <w:sz w:val="20"/>
+                <w:rFonts w:ascii="Arial" w:hAnsi="Arial"/>
+                <w:color w:val="94a3b8"/>
+              </w:rPr>
+              <w:t>-</w:t>
+            </w:r>
+          </w:p>
+        </w:tc>
+        <w:tc>
+          <w:tcPr>
+            <w:tcBorders>
+              <w:top w:val="single" w:sz="4" w:space="0" w:color="CBD5E1"/>
+              <w:left w:val="single" w:sz="4" w:space="0" w:color="CBD5E1"/>
+              <w:bottom w:val="single" w:sz="4" w:space="0" w:color="CBD5E1"/>
+              <w:right w:val="single" w:sz="4" w:space="0" w:color="CBD5E1"/>
+            </w:tcBorders>
+          </w:tcPr>
+          <w:p>
+            <w:pPr>
+              <w:jc w:val="center"/>
+            </w:pPr>
+            <w:r>
+              <w:rPr>
+                <w:sz w:val="20"/>
+                <w:rFonts w:ascii="Arial" w:hAnsi="Arial"/>
+                <w:color w:val="94a3b8"/>
+              </w:rPr>
+              <w:t>-</w:t>
+            </w:r>
+          </w:p>
+        </w:tc>
+      </w:tr>
+      <w:tr>
+        <w:tc>
+          <w:tcPr>
+            <w:tcBorders>
+              <w:top w:val="single" w:sz="4" w:space="0" w:color="CBD5E1"/>
+              <w:left w:val="single" w:sz="4" w:space="0" w:color="CBD5E1"/>
+              <w:bottom w:val="single" w:sz="4" w:space="0" w:color="CBD5E1"/>
+              <w:right w:val="single" w:sz="4" w:space="0" w:color="CBD5E1"/>
+            </w:tcBorders>
+          </w:tcPr>
+          <w:p>
+            <w:pPr>
+              <w:jc w:val="left"/>
+            </w:pPr>
+            <w:r>
+              <w:rPr>
+                <w:b/>
+                <w:sz w:val="20"/>
+                <w:rFonts w:ascii="Arial" w:hAnsi="Arial"/>
+                <w:color w:val="1D4ED8"/>
+              </w:rPr>
+              <w:t>13. Attendance Tracking Page</w:t>
+            </w:r>
+          </w:p>
+        </w:tc>
+        <w:tc>
+          <w:tcPr>
+            <w:tcBorders>
+              <w:top w:val="single" w:sz="4" w:space="0" w:color="CBD5E1"/>
+              <w:left w:val="single" w:sz="4" w:space="0" w:color="CBD5E1"/>
+              <w:bottom w:val="single" w:sz="4" w:space="0" w:color="CBD5E1"/>
+              <w:right w:val="single" w:sz="4" w:space="0" w:color="CBD5E1"/>
+            </w:tcBorders>
+          </w:tcPr>
+          <w:p>
+            <w:pPr>
+              <w:jc w:val="center"/>
+            </w:pPr>
+            <w:r>
+              <w:rPr>
+                <w:b/>
+                <w:sz w:val="20"/>
+                <w:rFonts w:ascii="Arial" w:hAnsi="Arial"/>
+                <w:color w:val="15803d"/>
+              </w:rPr>
+              <w:t>X</w:t>
+            </w:r>
+          </w:p>
+        </w:tc>
+        <w:tc>
+          <w:tcPr>
+            <w:tcBorders>
+              <w:top w:val="single" w:sz="4" w:space="0" w:color="CBD5E1"/>
+              <w:left w:val="single" w:sz="4" w:space="0" w:color="CBD5E1"/>
+              <w:bottom w:val="single" w:sz="4" w:space="0" w:color="CBD5E1"/>
+              <w:right w:val="single" w:sz="4" w:space="0" w:color="CBD5E1"/>
+            </w:tcBorders>
+          </w:tcPr>
+          <w:p>
+            <w:pPr>
+              <w:jc w:val="center"/>
+            </w:pPr>
+            <w:r>
+              <w:rPr>
+                <w:b/>
+                <w:sz w:val="20"/>
+                <w:rFonts w:ascii="Arial" w:hAnsi="Arial"/>
+                <w:color w:val="ea580c"/>
+              </w:rPr>
+              <w:t>V</w:t>
+            </w:r>
+          </w:p>
+        </w:tc>
+        <w:tc>
+          <w:tcPr>
+            <w:tcBorders>
+              <w:top w:val="single" w:sz="4" w:space="0" w:color="CBD5E1"/>
+              <w:left w:val="single" w:sz="4" w:space="0" w:color="CBD5E1"/>
+              <w:bottom w:val="single" w:sz="4" w:space="0" w:color="CBD5E1"/>
+              <w:right w:val="single" w:sz="4" w:space="0" w:color="CBD5E1"/>
+            </w:tcBorders>
+          </w:tcPr>
+          <w:p>
+            <w:pPr>
+              <w:jc w:val="center"/>
+            </w:pPr>
+            <w:r>
+              <w:rPr>
+                <w:b/>
+                <w:sz w:val="20"/>
+                <w:rFonts w:ascii="Arial" w:hAnsi="Arial"/>
+                <w:color w:val="ea580c"/>
+              </w:rPr>
+              <w:t>V</w:t>
+            </w:r>
+          </w:p>
+        </w:tc>
+      </w:tr>
+      <w:tr>
+        <w:tc>
+          <w:tcPr>
+            <w:tcBorders>
+              <w:top w:val="single" w:sz="4" w:space="0" w:color="CBD5E1"/>
+              <w:left w:val="single" w:sz="4" w:space="0" w:color="CBD5E1"/>
+              <w:bottom w:val="single" w:sz="4" w:space="0" w:color="CBD5E1"/>
+              <w:right w:val="single" w:sz="4" w:space="0" w:color="CBD5E1"/>
+            </w:tcBorders>
+          </w:tcPr>
+          <w:p>
+            <w:pPr>
+              <w:jc w:val="left"/>
+            </w:pPr>
+            <w:r>
+              <w:rPr>
+                <w:b/>
+                <w:sz w:val="20"/>
+                <w:rFonts w:ascii="Arial" w:hAnsi="Arial"/>
+                <w:color w:val="1D4ED8"/>
+              </w:rPr>
+              <w:t>14. Record Attendance Form</w:t>
+            </w:r>
+          </w:p>
+        </w:tc>
+        <w:tc>
+          <w:tcPr>
+            <w:tcBorders>
+              <w:top w:val="single" w:sz="4" w:space="0" w:color="CBD5E1"/>
+              <w:left w:val="single" w:sz="4" w:space="0" w:color="CBD5E1"/>
+              <w:bottom w:val="single" w:sz="4" w:space="0" w:color="CBD5E1"/>
+              <w:right w:val="single" w:sz="4" w:space="0" w:color="CBD5E1"/>
+            </w:tcBorders>
+          </w:tcPr>
+          <w:p>
+            <w:pPr>
+              <w:jc w:val="center"/>
+            </w:pPr>
+            <w:r>
+              <w:rPr>
+                <w:b/>
+                <w:sz w:val="20"/>
+                <w:rFonts w:ascii="Arial" w:hAnsi="Arial"/>
+                <w:color w:val="15803d"/>
+              </w:rPr>
+              <w:t>X</w:t>
+            </w:r>
+          </w:p>
+        </w:tc>
+        <w:tc>
+          <w:tcPr>
+            <w:tcBorders>
+              <w:top w:val="single" w:sz="4" w:space="0" w:color="CBD5E1"/>
+              <w:left w:val="single" w:sz="4" w:space="0" w:color="CBD5E1"/>
+              <w:bottom w:val="single" w:sz="4" w:space="0" w:color="CBD5E1"/>
+              <w:right w:val="single" w:sz="4" w:space="0" w:color="CBD5E1"/>
+            </w:tcBorders>
+          </w:tcPr>
+          <w:p>
+            <w:pPr>
+              <w:jc w:val="center"/>
+            </w:pPr>
+            <w:r>
+              <w:rPr>
+                <w:b/>
+                <w:sz w:val="20"/>
+                <w:rFonts w:ascii="Arial" w:hAnsi="Arial"/>
+                <w:color w:val="15803d"/>
+              </w:rPr>
+              <w:t>X</w:t>
+            </w:r>
+          </w:p>
+        </w:tc>
+        <w:tc>
+          <w:tcPr>
+            <w:tcBorders>
+              <w:top w:val="single" w:sz="4" w:space="0" w:color="CBD5E1"/>
+              <w:left w:val="single" w:sz="4" w:space="0" w:color="CBD5E1"/>
+              <w:bottom w:val="single" w:sz="4" w:space="0" w:color="CBD5E1"/>
+              <w:right w:val="single" w:sz="4" w:space="0" w:color="CBD5E1"/>
+            </w:tcBorders>
+          </w:tcPr>
+          <w:p>
+            <w:pPr>
+              <w:jc w:val="center"/>
+            </w:pPr>
+            <w:r>
+              <w:rPr>
+                <w:sz w:val="20"/>
+                <w:rFonts w:ascii="Arial" w:hAnsi="Arial"/>
+                <w:color w:val="94a3b8"/>
+              </w:rPr>
+              <w:t>-</w:t>
+            </w:r>
+          </w:p>
+        </w:tc>
+      </w:tr>
+      <w:tr>
+        <w:tc>
+          <w:tcPr>
+            <w:tcBorders>
+              <w:top w:val="single" w:sz="4" w:space="0" w:color="CBD5E1"/>
+              <w:left w:val="single" w:sz="4" w:space="0" w:color="CBD5E1"/>
+              <w:bottom w:val="single" w:sz="4" w:space="0" w:color="CBD5E1"/>
+              <w:right w:val="single" w:sz="4" w:space="0" w:color="CBD5E1"/>
+            </w:tcBorders>
+          </w:tcPr>
+          <w:p>
+            <w:pPr>
+              <w:jc w:val="left"/>
+            </w:pPr>
+            <w:r>
+              <w:rPr>
+                <w:b/>
+                <w:sz w:val="20"/>
+                <w:rFonts w:ascii="Arial" w:hAnsi="Arial"/>
+                <w:color w:val="1D4ED8"/>
+              </w:rPr>
+              <w:t>15. Feedback History Page</w:t>
+            </w:r>
+          </w:p>
+        </w:tc>
+        <w:tc>
+          <w:tcPr>
+            <w:tcBorders>
+              <w:top w:val="single" w:sz="4" w:space="0" w:color="CBD5E1"/>
+              <w:left w:val="single" w:sz="4" w:space="0" w:color="CBD5E1"/>
+              <w:bottom w:val="single" w:sz="4" w:space="0" w:color="CBD5E1"/>
+              <w:right w:val="single" w:sz="4" w:space="0" w:color="CBD5E1"/>
+            </w:tcBorders>
+          </w:tcPr>
+          <w:p>
+            <w:pPr>
+              <w:jc w:val="center"/>
+            </w:pPr>
+            <w:r>
+              <w:rPr>
+                <w:b/>
+                <w:sz w:val="20"/>
+                <w:rFonts w:ascii="Arial" w:hAnsi="Arial"/>
+                <w:color w:val="15803d"/>
+              </w:rPr>
+              <w:t>X</w:t>
+            </w:r>
+          </w:p>
+        </w:tc>
+        <w:tc>
+          <w:tcPr>
+            <w:tcBorders>
+              <w:top w:val="single" w:sz="4" w:space="0" w:color="CBD5E1"/>
+              <w:left w:val="single" w:sz="4" w:space="0" w:color="CBD5E1"/>
+              <w:bottom w:val="single" w:sz="4" w:space="0" w:color="CBD5E1"/>
+              <w:right w:val="single" w:sz="4" w:space="0" w:color="CBD5E1"/>
+            </w:tcBorders>
+          </w:tcPr>
+          <w:p>
+            <w:pPr>
+              <w:jc w:val="center"/>
+            </w:pPr>
+            <w:r>
+              <w:rPr>
+                <w:b/>
+                <w:sz w:val="20"/>
+                <w:rFonts w:ascii="Arial" w:hAnsi="Arial"/>
+                <w:color w:val="ea580c"/>
+              </w:rPr>
+              <w:t>V</w:t>
+            </w:r>
+          </w:p>
+        </w:tc>
+        <w:tc>
+          <w:tcPr>
+            <w:tcBorders>
+              <w:top w:val="single" w:sz="4" w:space="0" w:color="CBD5E1"/>
+              <w:left w:val="single" w:sz="4" w:space="0" w:color="CBD5E1"/>
+              <w:bottom w:val="single" w:sz="4" w:space="0" w:color="CBD5E1"/>
+              <w:right w:val="single" w:sz="4" w:space="0" w:color="CBD5E1"/>
+            </w:tcBorders>
+          </w:tcPr>
+          <w:p>
+            <w:pPr>
+              <w:jc w:val="center"/>
+            </w:pPr>
+            <w:r>
+              <w:rPr>
+                <w:b/>
+                <w:sz w:val="20"/>
+                <w:rFonts w:ascii="Arial" w:hAnsi="Arial"/>
+                <w:color w:val="ea580c"/>
+              </w:rPr>
+              <w:t>V</w:t>
+            </w:r>
+          </w:p>
+        </w:tc>
+      </w:tr>
+      <w:tr>
+        <w:tc>
+          <w:tcPr>
+            <w:tcBorders>
+              <w:top w:val="single" w:sz="4" w:space="0" w:color="CBD5E1"/>
+              <w:left w:val="single" w:sz="4" w:space="0" w:color="CBD5E1"/>
+              <w:bottom w:val="single" w:sz="4" w:space="0" w:color="CBD5E1"/>
+              <w:right w:val="single" w:sz="4" w:space="0" w:color="CBD5E1"/>
+            </w:tcBorders>
+          </w:tcPr>
+          <w:p>
+            <w:pPr>
+              <w:jc w:val="left"/>
+            </w:pPr>
+            <w:r>
+              <w:rPr>
+                <w:b/>
+                <w:sz w:val="20"/>
+                <w:rFonts w:ascii="Arial" w:hAnsi="Arial"/>
+                <w:color w:val="1D4ED8"/>
+              </w:rPr>
+              <w:t>16. Submit Feedback Form</w:t>
+            </w:r>
+          </w:p>
+        </w:tc>
+        <w:tc>
+          <w:tcPr>
+            <w:tcBorders>
+              <w:top w:val="single" w:sz="4" w:space="0" w:color="CBD5E1"/>
+              <w:left w:val="single" w:sz="4" w:space="0" w:color="CBD5E1"/>
+              <w:bottom w:val="single" w:sz="4" w:space="0" w:color="CBD5E1"/>
+              <w:right w:val="single" w:sz="4" w:space="0" w:color="CBD5E1"/>
+            </w:tcBorders>
+          </w:tcPr>
+          <w:p>
+            <w:pPr>
+              <w:jc w:val="center"/>
+            </w:pPr>
+            <w:r>
+              <w:rPr>
+                <w:sz w:val="20"/>
+                <w:rFonts w:ascii="Arial" w:hAnsi="Arial"/>
+                <w:color w:val="94a3b8"/>
+              </w:rPr>
+              <w:t>-</w:t>
+            </w:r>
+          </w:p>
+        </w:tc>
+        <w:tc>
+          <w:tcPr>
+            <w:tcBorders>
+              <w:top w:val="single" w:sz="4" w:space="0" w:color="CBD5E1"/>
+              <w:left w:val="single" w:sz="4" w:space="0" w:color="CBD5E1"/>
+              <w:bottom w:val="single" w:sz="4" w:space="0" w:color="CBD5E1"/>
+              <w:right w:val="single" w:sz="4" w:space="0" w:color="CBD5E1"/>
+            </w:tcBorders>
+          </w:tcPr>
+          <w:p>
+            <w:pPr>
+              <w:jc w:val="center"/>
+            </w:pPr>
+            <w:r>
+              <w:rPr>
+                <w:b/>
+                <w:sz w:val="20"/>
+                <w:rFonts w:ascii="Arial" w:hAnsi="Arial"/>
+                <w:color w:val="15803d"/>
+              </w:rPr>
+              <w:t>X</w:t>
+            </w:r>
+          </w:p>
+        </w:tc>
+        <w:tc>
+          <w:tcPr>
+            <w:tcBorders>
+              <w:top w:val="single" w:sz="4" w:space="0" w:color="CBD5E1"/>
+              <w:left w:val="single" w:sz="4" w:space="0" w:color="CBD5E1"/>
+              <w:bottom w:val="single" w:sz="4" w:space="0" w:color="CBD5E1"/>
+              <w:right w:val="single" w:sz="4" w:space="0" w:color="CBD5E1"/>
+            </w:tcBorders>
+          </w:tcPr>
+          <w:p>
+            <w:pPr>
+              <w:jc w:val="center"/>
+            </w:pPr>
+            <w:r>
+              <w:rPr>
+                <w:sz w:val="20"/>
+                <w:rFonts w:ascii="Arial" w:hAnsi="Arial"/>
+                <w:color w:val="94a3b8"/>
+              </w:rPr>
+              <w:t>-</w:t>
+            </w:r>
+          </w:p>
+        </w:tc>
+      </w:tr>
+      <w:tr>
+        <w:tc>
+          <w:tcPr>
+            <w:tcBorders>
+              <w:top w:val="single" w:sz="4" w:space="0" w:color="CBD5E1"/>
+              <w:left w:val="single" w:sz="4" w:space="0" w:color="CBD5E1"/>
+              <w:bottom w:val="single" w:sz="4" w:space="0" w:color="CBD5E1"/>
+              <w:right w:val="single" w:sz="4" w:space="0" w:color="CBD5E1"/>
+            </w:tcBorders>
+          </w:tcPr>
+          <w:p>
+            <w:pPr>
+              <w:jc w:val="left"/>
+            </w:pPr>
+            <w:r>
+              <w:rPr>
+                <w:b/>
+                <w:sz w:val="20"/>
+                <w:rFonts w:ascii="Arial" w:hAnsi="Arial"/>
+                <w:color w:val="1D4ED8"/>
+              </w:rPr>
+              <w:t>17. User Account Mgmt Page</w:t>
+            </w:r>
+          </w:p>
+        </w:tc>
+        <w:tc>
+          <w:tcPr>
+            <w:tcBorders>
+              <w:top w:val="single" w:sz="4" w:space="0" w:color="CBD5E1"/>
+              <w:left w:val="single" w:sz="4" w:space="0" w:color="CBD5E1"/>
+              <w:bottom w:val="single" w:sz="4" w:space="0" w:color="CBD5E1"/>
+              <w:right w:val="single" w:sz="4" w:space="0" w:color="CBD5E1"/>
+            </w:tcBorders>
+          </w:tcPr>
+          <w:p>
+            <w:pPr>
+              <w:jc w:val="center"/>
+            </w:pPr>
+            <w:r>
+              <w:rPr>
+                <w:b/>
+                <w:sz w:val="20"/>
+                <w:rFonts w:ascii="Arial" w:hAnsi="Arial"/>
+                <w:color w:val="15803d"/>
+              </w:rPr>
+              <w:t>X</w:t>
+            </w:r>
+          </w:p>
+        </w:tc>
+        <w:tc>
+          <w:tcPr>
+            <w:tcBorders>
+              <w:top w:val="single" w:sz="4" w:space="0" w:color="CBD5E1"/>
+              <w:left w:val="single" w:sz="4" w:space="0" w:color="CBD5E1"/>
+              <w:bottom w:val="single" w:sz="4" w:space="0" w:color="CBD5E1"/>
+              <w:right w:val="single" w:sz="4" w:space="0" w:color="CBD5E1"/>
+            </w:tcBorders>
+          </w:tcPr>
+          <w:p>
+            <w:pPr>
+              <w:jc w:val="center"/>
+            </w:pPr>
+            <w:r>
+              <w:rPr>
+                <w:sz w:val="20"/>
+                <w:rFonts w:ascii="Arial" w:hAnsi="Arial"/>
+                <w:color w:val="94a3b8"/>
+              </w:rPr>
+              <w:t>-</w:t>
+            </w:r>
+          </w:p>
+        </w:tc>
+        <w:tc>
+          <w:tcPr>
+            <w:tcBorders>
+              <w:top w:val="single" w:sz="4" w:space="0" w:color="CBD5E1"/>
+              <w:left w:val="single" w:sz="4" w:space="0" w:color="CBD5E1"/>
+              <w:bottom w:val="single" w:sz="4" w:space="0" w:color="CBD5E1"/>
+              <w:right w:val="single" w:sz="4" w:space="0" w:color="CBD5E1"/>
+            </w:tcBorders>
+          </w:tcPr>
+          <w:p>
+            <w:pPr>
+              <w:jc w:val="center"/>
+            </w:pPr>
+            <w:r>
+              <w:rPr>
+                <w:sz w:val="20"/>
+                <w:rFonts w:ascii="Arial" w:hAnsi="Arial"/>
+                <w:color w:val="94a3b8"/>
+              </w:rPr>
+              <w:t>-</w:t>
+            </w:r>
+          </w:p>
+        </w:tc>
+      </w:tr>
+      <w:tr>
+        <w:tc>
+          <w:tcPr>
+            <w:tcBorders>
+              <w:top w:val="single" w:sz="4" w:space="0" w:color="CBD5E1"/>
+              <w:left w:val="single" w:sz="4" w:space="0" w:color="CBD5E1"/>
+              <w:bottom w:val="single" w:sz="4" w:space="0" w:color="CBD5E1"/>
+              <w:right w:val="single" w:sz="4" w:space="0" w:color="CBD5E1"/>
+            </w:tcBorders>
+          </w:tcPr>
+          <w:p>
+            <w:pPr>
+              <w:jc w:val="left"/>
+            </w:pPr>
+            <w:r>
+              <w:rPr>
+                <w:b/>
+                <w:sz w:val="20"/>
+                <w:rFonts w:ascii="Arial" w:hAnsi="Arial"/>
+                <w:color w:val="1D4ED8"/>
+              </w:rPr>
+              <w:t>18. Master Data Mgmt Page</w:t>
+            </w:r>
+          </w:p>
+        </w:tc>
+        <w:tc>
+          <w:tcPr>
+            <w:tcBorders>
+              <w:top w:val="single" w:sz="4" w:space="0" w:color="CBD5E1"/>
+              <w:left w:val="single" w:sz="4" w:space="0" w:color="CBD5E1"/>
+              <w:bottom w:val="single" w:sz="4" w:space="0" w:color="CBD5E1"/>
+              <w:right w:val="single" w:sz="4" w:space="0" w:color="CBD5E1"/>
+            </w:tcBorders>
+          </w:tcPr>
+          <w:p>
+            <w:pPr>
+              <w:jc w:val="center"/>
+            </w:pPr>
+            <w:r>
+              <w:rPr>
+                <w:b/>
+                <w:sz w:val="20"/>
+                <w:rFonts w:ascii="Arial" w:hAnsi="Arial"/>
+                <w:color w:val="15803d"/>
+              </w:rPr>
+              <w:t>X</w:t>
+            </w:r>
+          </w:p>
+        </w:tc>
+        <w:tc>
+          <w:tcPr>
+            <w:tcBorders>
+              <w:top w:val="single" w:sz="4" w:space="0" w:color="CBD5E1"/>
+              <w:left w:val="single" w:sz="4" w:space="0" w:color="CBD5E1"/>
+              <w:bottom w:val="single" w:sz="4" w:space="0" w:color="CBD5E1"/>
+              <w:right w:val="single" w:sz="4" w:space="0" w:color="CBD5E1"/>
+            </w:tcBorders>
+          </w:tcPr>
+          <w:p>
+            <w:pPr>
+              <w:jc w:val="center"/>
+            </w:pPr>
+            <w:r>
+              <w:rPr>
+                <w:sz w:val="20"/>
+                <w:rFonts w:ascii="Arial" w:hAnsi="Arial"/>
+                <w:color w:val="94a3b8"/>
+              </w:rPr>
+              <w:t>-</w:t>
+            </w:r>
+          </w:p>
+        </w:tc>
+        <w:tc>
+          <w:tcPr>
+            <w:tcBorders>
+              <w:top w:val="single" w:sz="4" w:space="0" w:color="CBD5E1"/>
+              <w:left w:val="single" w:sz="4" w:space="0" w:color="CBD5E1"/>
+              <w:bottom w:val="single" w:sz="4" w:space="0" w:color="CBD5E1"/>
+              <w:right w:val="single" w:sz="4" w:space="0" w:color="CBD5E1"/>
+            </w:tcBorders>
+          </w:tcPr>
+          <w:p>
+            <w:pPr>
+              <w:jc w:val="center"/>
+            </w:pPr>
+            <w:r>
+              <w:rPr>
+                <w:sz w:val="20"/>
+                <w:rFonts w:ascii="Arial" w:hAnsi="Arial"/>
+                <w:color w:val="94a3b8"/>
+              </w:rPr>
+              <w:t>-</w:t>
+            </w:r>
+          </w:p>
+        </w:tc>
+      </w:tr>
+      <w:tr>
+        <w:tc>
+          <w:tcPr>
+            <w:tcBorders>
+              <w:top w:val="single" w:sz="4" w:space="0" w:color="CBD5E1"/>
+              <w:left w:val="single" w:sz="4" w:space="0" w:color="CBD5E1"/>
+              <w:bottom w:val="single" w:sz="4" w:space="0" w:color="CBD5E1"/>
+              <w:right w:val="single" w:sz="4" w:space="0" w:color="CBD5E1"/>
+            </w:tcBorders>
+          </w:tcPr>
+          <w:p>
+            <w:pPr>
+              <w:jc w:val="left"/>
+            </w:pPr>
+            <w:r>
+              <w:rPr>
+                <w:b/>
+                <w:sz w:val="20"/>
+                <w:rFonts w:ascii="Arial" w:hAnsi="Arial"/>
+                <w:color w:val="1D4ED8"/>
+              </w:rPr>
+              <w:t>19. Export Reports Modal</w:t>
+            </w:r>
+          </w:p>
+        </w:tc>
+        <w:tc>
+          <w:tcPr>
+            <w:tcBorders>
+              <w:top w:val="single" w:sz="4" w:space="0" w:color="CBD5E1"/>
+              <w:left w:val="single" w:sz="4" w:space="0" w:color="CBD5E1"/>
+              <w:bottom w:val="single" w:sz="4" w:space="0" w:color="CBD5E1"/>
+              <w:right w:val="single" w:sz="4" w:space="0" w:color="CBD5E1"/>
+            </w:tcBorders>
+          </w:tcPr>
+          <w:p>
+            <w:pPr>
+              <w:jc w:val="center"/>
+            </w:pPr>
+            <w:r>
+              <w:rPr>
+                <w:b/>
+                <w:sz w:val="20"/>
+                <w:rFonts w:ascii="Arial" w:hAnsi="Arial"/>
+                <w:color w:val="15803d"/>
+              </w:rPr>
+              <w:t>X</w:t>
+            </w:r>
+          </w:p>
+        </w:tc>
+        <w:tc>
+          <w:tcPr>
+            <w:tcBorders>
+              <w:top w:val="single" w:sz="4" w:space="0" w:color="CBD5E1"/>
+              <w:left w:val="single" w:sz="4" w:space="0" w:color="CBD5E1"/>
+              <w:bottom w:val="single" w:sz="4" w:space="0" w:color="CBD5E1"/>
+              <w:right w:val="single" w:sz="4" w:space="0" w:color="CBD5E1"/>
+            </w:tcBorders>
+          </w:tcPr>
+          <w:p>
+            <w:pPr>
+              <w:jc w:val="center"/>
+            </w:pPr>
+            <w:r>
+              <w:rPr>
+                <w:sz w:val="20"/>
+                <w:rFonts w:ascii="Arial" w:hAnsi="Arial"/>
+                <w:color w:val="94a3b8"/>
+              </w:rPr>
+              <w:t>-</w:t>
+            </w:r>
+          </w:p>
+        </w:tc>
+        <w:tc>
+          <w:tcPr>
+            <w:tcBorders>
+              <w:top w:val="single" w:sz="4" w:space="0" w:color="CBD5E1"/>
+              <w:left w:val="single" w:sz="4" w:space="0" w:color="CBD5E1"/>
+              <w:bottom w:val="single" w:sz="4" w:space="0" w:color="CBD5E1"/>
+              <w:right w:val="single" w:sz="4" w:space="0" w:color="CBD5E1"/>
+            </w:tcBorders>
+          </w:tcPr>
+          <w:p>
+            <w:pPr>
+              <w:jc w:val="center"/>
+            </w:pPr>
+            <w:r>
+              <w:rPr>
+                <w:b/>
+                <w:sz w:val="20"/>
+                <w:rFonts w:ascii="Arial" w:hAnsi="Arial"/>
+                <w:color w:val="15803d"/>
+              </w:rPr>
+              <w:t>X</w:t>
+            </w:r>
           </w:p>
         </w:tc>
       </w:tr>
     </w:tbl>
+    <w:p>
+      <w:r>
+        <w:rPr>
+          <w:sz w:val="18"/>
+        </w:rPr>
+        <w:i/>
+        <w:t>* Legend: X = Full Access (CRUD); V = View Only; - = No Access. Parent &amp; Email Service do not have login screens.</w:t>
+      </w:r>
+    </w:p>
     <w:p>
       <w:pPr>
         <w:rPr>

</xml_diff>

<commit_message>
create backend code base and refactor SRS
</commit_message>
<xml_diff>
--- a/Document/02_Requirements/Report3_Software Requirement Specification.docx
+++ b/Document/02_Requirements/Report3_Software Requirement Specification.docx
@@ -12,7 +12,7 @@
           <w:noProof/>
         </w:rPr>
         <w:drawing>
-          <wp:inline distT="0" distB="0" distL="0" distR="0" wp14:anchorId="4622AF1D" wp14:editId="3BA4BB8F">
+          <wp:inline distT="0" distB="0" distL="0" distR="0" wp14:anchorId="4C9CE0FB" wp14:editId="396FE410">
             <wp:extent cx="2713741" cy="742362"/>
             <wp:effectExtent l="0" t="0" r="0" b="0"/>
             <wp:docPr id="24" name="image1.png"/>
@@ -3317,12 +3317,20 @@
       </w:r>
     </w:p>
     <w:p>
+      <w:r>
+        <w:t>&lt;&lt;Sample: The Cafeteria Ordering System is a new software system that replaces the current manual and telephone processes for ordering and picking up meals in the Process Impact cafeteria. The context diagram below illustrates the external entities and system interfaces for release 1.0. The system is expected to evolve over several releases, ultimately connecting to the Internet ordering services for several local restaurants and to credit and debit card authorization services.</w:t>
+      </w:r>
+      <w:r>
+        <w:t xml:space="preserve"> </w:t>
+      </w:r>
+      <w:r>
+        <w:t>&gt;&gt;</w:t>
+      </w:r>
+    </w:p>
+    <w:p>
       <w:pPr>
         <w:jc w:val="both"/>
       </w:pPr>
-      <w:r>
-        <w:t>&lt;&lt;Sample: The Cafeteria Ordering System is a new software system that replaces the current manual and telephone processes for ordering and picking up meals in the Process Impact cafeteria. The context diagram below illustrates the external entities and system interfaces for release 1.0. The system is expected to evolve over several releases, ultimately connecting to the Internet ordering services for several local restaurants and to credit and debit card authorization services.</w:t>
-      </w:r>
     </w:p>
     <w:p>
       <w:pPr>
@@ -3333,21 +3341,22 @@
           <w:noProof/>
         </w:rPr>
         <w:drawing>
-          <wp:inline distT="0" distB="0" distL="0" distR="0" wp14:anchorId="39BC367D" wp14:editId="04833593">
-            <wp:extent cx="4330342" cy="3315587"/>
-            <wp:effectExtent l="0" t="0" r="0" b="0"/>
-            <wp:docPr id="26" name="image6.png"/>
-            <wp:cNvGraphicFramePr/>
+          <wp:inline distT="0" distB="0" distL="0" distR="0" wp14:anchorId="148CFC5A" wp14:editId="7FB9C78E">
+            <wp:extent cx="5746750" cy="3121025"/>
+            <wp:effectExtent l="0" t="0" r="6350" b="3175"/>
+            <wp:docPr id="1" name="Picture 1"/>
+            <wp:cNvGraphicFramePr>
+              <a:graphicFrameLocks xmlns:a="http://schemas.openxmlformats.org/drawingml/2006/main" noChangeAspect="1"/>
+            </wp:cNvGraphicFramePr>
             <a:graphic xmlns:a="http://schemas.openxmlformats.org/drawingml/2006/main">
               <a:graphicData uri="http://schemas.openxmlformats.org/drawingml/2006/picture">
                 <pic:pic xmlns:pic="http://schemas.openxmlformats.org/drawingml/2006/picture">
                   <pic:nvPicPr>
-                    <pic:cNvPr id="0" name="image6.png"/>
-                    <pic:cNvPicPr preferRelativeResize="0"/>
+                    <pic:cNvPr id="1" name=""/>
+                    <pic:cNvPicPr/>
                   </pic:nvPicPr>
                   <pic:blipFill>
                     <a:blip r:embed="rId9"/>
-                    <a:srcRect/>
                     <a:stretch>
                       <a:fillRect/>
                     </a:stretch>
@@ -3355,23 +3364,17 @@
                   <pic:spPr>
                     <a:xfrm>
                       <a:off x="0" y="0"/>
-                      <a:ext cx="4330342" cy="3315587"/>
+                      <a:ext cx="5746750" cy="3121025"/>
                     </a:xfrm>
                     <a:prstGeom prst="rect">
                       <a:avLst/>
                     </a:prstGeom>
-                    <a:ln/>
                   </pic:spPr>
                 </pic:pic>
               </a:graphicData>
             </a:graphic>
           </wp:inline>
         </w:drawing>
-      </w:r>
-    </w:p>
-    <w:p>
-      <w:r>
-        <w:t>&gt;&gt;</w:t>
       </w:r>
     </w:p>
     <w:p>
@@ -3431,7 +3434,16 @@
         <w:t>2</w:t>
       </w:r>
       <w:r>
-        <w:t>.1 Order Processing</w:t>
+        <w:t xml:space="preserve">.1 </w:t>
+      </w:r>
+      <w:r>
+        <w:t>Learner</w:t>
+      </w:r>
+      <w:r>
+        <w:t xml:space="preserve"> </w:t>
+      </w:r>
+      <w:r>
+        <w:t>Enrollment</w:t>
       </w:r>
     </w:p>
     <w:p>
@@ -3440,21 +3452,22 @@
           <w:noProof/>
         </w:rPr>
         <w:drawing>
-          <wp:inline distT="0" distB="0" distL="0" distR="0" wp14:anchorId="38AB0BEA" wp14:editId="14F4DCBD">
-            <wp:extent cx="5746750" cy="2310765"/>
-            <wp:effectExtent l="0" t="0" r="0" b="0"/>
-            <wp:docPr id="25" name="image3.png"/>
-            <wp:cNvGraphicFramePr/>
+          <wp:inline distT="0" distB="0" distL="0" distR="0" wp14:anchorId="1529A200" wp14:editId="7938A6F3">
+            <wp:extent cx="5746750" cy="1997075"/>
+            <wp:effectExtent l="0" t="0" r="6350" b="3175"/>
+            <wp:docPr id="5" name="Picture 5"/>
+            <wp:cNvGraphicFramePr>
+              <a:graphicFrameLocks xmlns:a="http://schemas.openxmlformats.org/drawingml/2006/main" noChangeAspect="1"/>
+            </wp:cNvGraphicFramePr>
             <a:graphic xmlns:a="http://schemas.openxmlformats.org/drawingml/2006/main">
               <a:graphicData uri="http://schemas.openxmlformats.org/drawingml/2006/picture">
                 <pic:pic xmlns:pic="http://schemas.openxmlformats.org/drawingml/2006/picture">
                   <pic:nvPicPr>
-                    <pic:cNvPr id="0" name="image3.png"/>
-                    <pic:cNvPicPr preferRelativeResize="0"/>
+                    <pic:cNvPr id="1" name=""/>
+                    <pic:cNvPicPr/>
                   </pic:nvPicPr>
                   <pic:blipFill>
                     <a:blip r:embed="rId10"/>
-                    <a:srcRect/>
                     <a:stretch>
                       <a:fillRect/>
                     </a:stretch>
@@ -3462,12 +3475,11 @@
                   <pic:spPr>
                     <a:xfrm>
                       <a:off x="0" y="0"/>
-                      <a:ext cx="5746750" cy="2310765"/>
+                      <a:ext cx="5746750" cy="1997075"/>
                     </a:xfrm>
                     <a:prstGeom prst="rect">
                       <a:avLst/>
                     </a:prstGeom>
-                    <a:ln/>
                   </pic:spPr>
                 </pic:pic>
               </a:graphicData>
@@ -3487,7 +3499,16 @@
         <w:t>2</w:t>
       </w:r>
       <w:r>
-        <w:t>.2 Customer Support</w:t>
+        <w:t xml:space="preserve">.2 </w:t>
+      </w:r>
+      <w:r>
+        <w:t>Schedule</w:t>
+      </w:r>
+      <w:r>
+        <w:t xml:space="preserve"> </w:t>
+      </w:r>
+      <w:r>
+        <w:t>and Conflict</w:t>
       </w:r>
     </w:p>
     <w:p>
@@ -3495,7 +3516,143 @@
         <w:rPr>
           <w:noProof/>
         </w:rPr>
-        <w:t>…</w:t>
+        <w:drawing>
+          <wp:inline distT="0" distB="0" distL="0" distR="0" wp14:anchorId="0D69A706" wp14:editId="293956A4">
+            <wp:extent cx="5746750" cy="1392555"/>
+            <wp:effectExtent l="0" t="0" r="6350" b="0"/>
+            <wp:docPr id="6" name="Picture 6"/>
+            <wp:cNvGraphicFramePr>
+              <a:graphicFrameLocks xmlns:a="http://schemas.openxmlformats.org/drawingml/2006/main" noChangeAspect="1"/>
+            </wp:cNvGraphicFramePr>
+            <a:graphic xmlns:a="http://schemas.openxmlformats.org/drawingml/2006/main">
+              <a:graphicData uri="http://schemas.openxmlformats.org/drawingml/2006/picture">
+                <pic:pic xmlns:pic="http://schemas.openxmlformats.org/drawingml/2006/picture">
+                  <pic:nvPicPr>
+                    <pic:cNvPr id="1" name=""/>
+                    <pic:cNvPicPr/>
+                  </pic:nvPicPr>
+                  <pic:blipFill>
+                    <a:blip r:embed="rId11"/>
+                    <a:stretch>
+                      <a:fillRect/>
+                    </a:stretch>
+                  </pic:blipFill>
+                  <pic:spPr>
+                    <a:xfrm>
+                      <a:off x="0" y="0"/>
+                      <a:ext cx="5746750" cy="1392555"/>
+                    </a:xfrm>
+                    <a:prstGeom prst="rect">
+                      <a:avLst/>
+                    </a:prstGeom>
+                  </pic:spPr>
+                </pic:pic>
+              </a:graphicData>
+            </a:graphic>
+          </wp:inline>
+        </w:drawing>
+      </w:r>
+    </w:p>
+    <w:p>
+      <w:pPr>
+        <w:pStyle w:val="Heading4"/>
+      </w:pPr>
+      <w:r>
+        <w:t>1.2.3 Attendance and Notification</w:t>
+      </w:r>
+    </w:p>
+    <w:p>
+      <w:r>
+        <w:rPr>
+          <w:noProof/>
+        </w:rPr>
+        <w:drawing>
+          <wp:inline distT="0" distB="0" distL="0" distR="0" wp14:anchorId="17BD93AB" wp14:editId="5ED6C28A">
+            <wp:extent cx="5746750" cy="1944370"/>
+            <wp:effectExtent l="0" t="0" r="6350" b="0"/>
+            <wp:docPr id="7" name="Picture 7"/>
+            <wp:cNvGraphicFramePr>
+              <a:graphicFrameLocks xmlns:a="http://schemas.openxmlformats.org/drawingml/2006/main" noChangeAspect="1"/>
+            </wp:cNvGraphicFramePr>
+            <a:graphic xmlns:a="http://schemas.openxmlformats.org/drawingml/2006/main">
+              <a:graphicData uri="http://schemas.openxmlformats.org/drawingml/2006/picture">
+                <pic:pic xmlns:pic="http://schemas.openxmlformats.org/drawingml/2006/picture">
+                  <pic:nvPicPr>
+                    <pic:cNvPr id="1" name=""/>
+                    <pic:cNvPicPr/>
+                  </pic:nvPicPr>
+                  <pic:blipFill>
+                    <a:blip r:embed="rId12"/>
+                    <a:stretch>
+                      <a:fillRect/>
+                    </a:stretch>
+                  </pic:blipFill>
+                  <pic:spPr>
+                    <a:xfrm>
+                      <a:off x="0" y="0"/>
+                      <a:ext cx="5746750" cy="1944370"/>
+                    </a:xfrm>
+                    <a:prstGeom prst="rect">
+                      <a:avLst/>
+                    </a:prstGeom>
+                  </pic:spPr>
+                </pic:pic>
+              </a:graphicData>
+            </a:graphic>
+          </wp:inline>
+        </w:drawing>
+      </w:r>
+    </w:p>
+    <w:p/>
+    <w:p>
+      <w:pPr>
+        <w:pStyle w:val="Heading4"/>
+      </w:pPr>
+      <w:r>
+        <w:lastRenderedPageBreak/>
+        <w:t>1.2.3 Feedback and SLA Tracking</w:t>
+      </w:r>
+    </w:p>
+    <w:p>
+      <w:r>
+        <w:rPr>
+          <w:noProof/>
+        </w:rPr>
+        <w:drawing>
+          <wp:inline distT="0" distB="0" distL="0" distR="0" wp14:anchorId="6FF2038B" wp14:editId="327EDC6A">
+            <wp:extent cx="5746750" cy="2042795"/>
+            <wp:effectExtent l="0" t="0" r="6350" b="0"/>
+            <wp:docPr id="8" name="Picture 8"/>
+            <wp:cNvGraphicFramePr>
+              <a:graphicFrameLocks xmlns:a="http://schemas.openxmlformats.org/drawingml/2006/main" noChangeAspect="1"/>
+            </wp:cNvGraphicFramePr>
+            <a:graphic xmlns:a="http://schemas.openxmlformats.org/drawingml/2006/main">
+              <a:graphicData uri="http://schemas.openxmlformats.org/drawingml/2006/picture">
+                <pic:pic xmlns:pic="http://schemas.openxmlformats.org/drawingml/2006/picture">
+                  <pic:nvPicPr>
+                    <pic:cNvPr id="1" name=""/>
+                    <pic:cNvPicPr/>
+                  </pic:nvPicPr>
+                  <pic:blipFill>
+                    <a:blip r:embed="rId13"/>
+                    <a:stretch>
+                      <a:fillRect/>
+                    </a:stretch>
+                  </pic:blipFill>
+                  <pic:spPr>
+                    <a:xfrm>
+                      <a:off x="0" y="0"/>
+                      <a:ext cx="5746750" cy="2042795"/>
+                    </a:xfrm>
+                    <a:prstGeom prst="rect">
+                      <a:avLst/>
+                    </a:prstGeom>
+                  </pic:spPr>
+                </pic:pic>
+              </a:graphicData>
+            </a:graphic>
+          </wp:inline>
+        </w:drawing>
       </w:r>
     </w:p>
     <w:p/>
@@ -3504,6 +3661,7 @@
         <w:pStyle w:val="Heading3"/>
       </w:pPr>
       <w:bookmarkStart w:id="5" w:name="_Toc187341935"/>
+      <w:bookmarkStart w:id="6" w:name="_Hlk227844496"/>
       <w:r>
         <w:t>1.</w:t>
       </w:r>
@@ -3565,6 +3723,7 @@
             </w:tcMar>
             <w:vAlign w:val="center"/>
           </w:tcPr>
+          <w:bookmarkEnd w:id="6"/>
           <w:p>
             <w:pPr>
               <w:spacing w:line="264" w:lineRule="auto"/>
@@ -3786,39 +3945,7 @@
                 <w:rFonts w:ascii="Arial" w:hAnsi="Arial"/>
                 <w:sz w:val="20"/>
               </w:rPr>
-              <w:t xml:space="preserve"> </w:t>
-            </w:r>
-            <w:proofErr w:type="spellStart"/>
-            <w:r>
-              <w:rPr>
-                <w:rFonts w:ascii="Arial" w:hAnsi="Arial"/>
-                <w:sz w:val="20"/>
-              </w:rPr>
-              <w:t>Enrolls</w:t>
-            </w:r>
-            <w:proofErr w:type="spellEnd"/>
-            <w:r>
-              <w:rPr>
-                <w:rFonts w:ascii="Arial" w:hAnsi="Arial"/>
-                <w:sz w:val="20"/>
-              </w:rPr>
-              <w:t xml:space="preserve"> new learners, manages their profiles, assigns Learning Packages, and tracks each learner's progression from </w:t>
-            </w:r>
-            <w:proofErr w:type="spellStart"/>
-            <w:r>
-              <w:rPr>
-                <w:rFonts w:ascii="Arial" w:hAnsi="Arial"/>
-                <w:sz w:val="20"/>
-              </w:rPr>
-              <w:t>enrollment</w:t>
-            </w:r>
-            <w:proofErr w:type="spellEnd"/>
-            <w:r>
-              <w:rPr>
-                <w:rFonts w:ascii="Arial" w:hAnsi="Arial"/>
-                <w:sz w:val="20"/>
-              </w:rPr>
-              <w:t xml:space="preserve"> through completion or withdrawal.</w:t>
+              <w:t xml:space="preserve"> Enrolls new learners, manages their profiles, assigns Learning Packages, and tracks each learner's progression from enrollment through completion or withdrawal.</w:t>
             </w:r>
           </w:p>
           <w:p>
@@ -3963,7 +4090,6 @@
                 <w:color w:val="0F172A"/>
                 <w:sz w:val="20"/>
               </w:rPr>
-              <w:lastRenderedPageBreak/>
               <w:t>2</w:t>
             </w:r>
           </w:p>
@@ -4053,6 +4179,7 @@
                 <w:rFonts w:ascii="Arial" w:hAnsi="Arial"/>
                 <w:sz w:val="20"/>
               </w:rPr>
+              <w:lastRenderedPageBreak/>
               <w:t xml:space="preserve">• </w:t>
             </w:r>
             <w:r>
@@ -4186,6 +4313,7 @@
                 <w:color w:val="0F172A"/>
                 <w:sz w:val="20"/>
               </w:rPr>
+              <w:lastRenderedPageBreak/>
               <w:t>3</w:t>
             </w:r>
           </w:p>
@@ -4432,7 +4560,6 @@
             <w:pPr>
               <w:spacing w:line="264" w:lineRule="auto"/>
             </w:pPr>
-            <w:proofErr w:type="spellStart"/>
             <w:r>
               <w:rPr>
                 <w:rFonts w:ascii="Arial" w:hAnsi="Arial"/>
@@ -4440,17 +4567,7 @@
                 <w:color w:val="1D4ED8"/>
                 <w:sz w:val="20"/>
               </w:rPr>
-              <w:t>Center</w:t>
-            </w:r>
-            <w:proofErr w:type="spellEnd"/>
-            <w:r>
-              <w:rPr>
-                <w:rFonts w:ascii="Arial" w:hAnsi="Arial"/>
-                <w:b/>
-                <w:color w:val="1D4ED8"/>
-                <w:sz w:val="20"/>
-              </w:rPr>
-              <w:t xml:space="preserve"> Director</w:t>
+              <w:t>Center Director</w:t>
             </w:r>
           </w:p>
         </w:tc>
@@ -4496,23 +4613,7 @@
                 <w:rFonts w:ascii="Arial" w:hAnsi="Arial"/>
                 <w:sz w:val="20"/>
               </w:rPr>
-              <w:t xml:space="preserve">The </w:t>
-            </w:r>
-            <w:proofErr w:type="spellStart"/>
-            <w:r>
-              <w:rPr>
-                <w:rFonts w:ascii="Arial" w:hAnsi="Arial"/>
-                <w:sz w:val="20"/>
-              </w:rPr>
-              <w:t>Center</w:t>
-            </w:r>
-            <w:proofErr w:type="spellEnd"/>
-            <w:r>
-              <w:rPr>
-                <w:rFonts w:ascii="Arial" w:hAnsi="Arial"/>
-                <w:sz w:val="20"/>
-              </w:rPr>
-              <w:t xml:space="preserve"> Director interacts with CLS at a strategic oversight level. This actor does not perform routine data entry but relies on the system for visibility into critical business metrics:</w:t>
+              <w:t>The Center Director interacts with CLS at a strategic oversight level. This actor does not perform routine data entry but relies on the system for visibility into critical business metrics:</w:t>
             </w:r>
           </w:p>
           <w:p>
@@ -4524,88 +4625,88 @@
                 <w:rFonts w:ascii="Arial" w:hAnsi="Arial"/>
                 <w:sz w:val="20"/>
               </w:rPr>
+              <w:t xml:space="preserve">• </w:t>
+            </w:r>
+            <w:r>
+              <w:rPr>
+                <w:rFonts w:ascii="Arial" w:hAnsi="Arial"/>
+                <w:b/>
+                <w:sz w:val="20"/>
+              </w:rPr>
+              <w:t>Operational Dashboard:</w:t>
+            </w:r>
+            <w:r>
+              <w:rPr>
+                <w:rFonts w:ascii="Arial" w:hAnsi="Arial"/>
+                <w:sz w:val="20"/>
+              </w:rPr>
+              <w:t xml:space="preserve"> Accesses a summary dashboard displaying key operational indicators — total active learners, session utilization rates, and Teacher workload distribution.</w:t>
+            </w:r>
+          </w:p>
+          <w:p>
+            <w:pPr>
+              <w:spacing w:after="40" w:line="264" w:lineRule="auto"/>
+            </w:pPr>
+            <w:r>
+              <w:rPr>
+                <w:rFonts w:ascii="Arial" w:hAnsi="Arial"/>
+                <w:sz w:val="20"/>
+              </w:rPr>
+              <w:t xml:space="preserve">• </w:t>
+            </w:r>
+            <w:r>
+              <w:rPr>
+                <w:rFonts w:ascii="Arial" w:hAnsi="Arial"/>
+                <w:b/>
+                <w:sz w:val="20"/>
+              </w:rPr>
+              <w:t>Churn Rate Monitoring:</w:t>
+            </w:r>
+            <w:r>
+              <w:rPr>
+                <w:rFonts w:ascii="Arial" w:hAnsi="Arial"/>
+                <w:sz w:val="20"/>
+              </w:rPr>
+              <w:t xml:space="preserve"> Reviews learner retention and dropout trends to evaluate the effectiveness of proactive renewal alerts (target: reduce churn by 20%).</w:t>
+            </w:r>
+          </w:p>
+          <w:p>
+            <w:pPr>
+              <w:spacing w:after="40" w:line="264" w:lineRule="auto"/>
+            </w:pPr>
+            <w:r>
+              <w:rPr>
+                <w:rFonts w:ascii="Arial" w:hAnsi="Arial"/>
+                <w:sz w:val="20"/>
+              </w:rPr>
+              <w:t xml:space="preserve">• </w:t>
+            </w:r>
+            <w:r>
+              <w:rPr>
+                <w:rFonts w:ascii="Arial" w:hAnsi="Arial"/>
+                <w:b/>
+                <w:sz w:val="20"/>
+              </w:rPr>
+              <w:t>Revenue &amp; Package Reports:</w:t>
+            </w:r>
+            <w:r>
+              <w:rPr>
+                <w:rFonts w:ascii="Arial" w:hAnsi="Arial"/>
+                <w:sz w:val="20"/>
+              </w:rPr>
+              <w:t xml:space="preserve"> Views aggregated data on Learning Package sales, remaining sessions across learners, and upcoming expirations for cash flow forecasting.</w:t>
+            </w:r>
+          </w:p>
+          <w:p>
+            <w:pPr>
+              <w:spacing w:line="264" w:lineRule="auto"/>
+            </w:pPr>
+            <w:r>
+              <w:rPr>
+                <w:rFonts w:ascii="Arial" w:hAnsi="Arial"/>
+                <w:sz w:val="20"/>
+              </w:rPr>
               <w:lastRenderedPageBreak/>
-              <w:t xml:space="preserve">• </w:t>
-            </w:r>
-            <w:r>
-              <w:rPr>
-                <w:rFonts w:ascii="Arial" w:hAnsi="Arial"/>
-                <w:b/>
-                <w:sz w:val="20"/>
-              </w:rPr>
-              <w:t>Operational Dashboard:</w:t>
-            </w:r>
-            <w:r>
-              <w:rPr>
-                <w:rFonts w:ascii="Arial" w:hAnsi="Arial"/>
-                <w:sz w:val="20"/>
-              </w:rPr>
-              <w:t xml:space="preserve"> Accesses a summary dashboard displaying key operational indicators — total active learners, session utilization rates, and Teacher workload distribution.</w:t>
-            </w:r>
-          </w:p>
-          <w:p>
-            <w:pPr>
-              <w:spacing w:after="40" w:line="264" w:lineRule="auto"/>
-            </w:pPr>
-            <w:r>
-              <w:rPr>
-                <w:rFonts w:ascii="Arial" w:hAnsi="Arial"/>
-                <w:sz w:val="20"/>
-              </w:rPr>
-              <w:t xml:space="preserve">• </w:t>
-            </w:r>
-            <w:r>
-              <w:rPr>
-                <w:rFonts w:ascii="Arial" w:hAnsi="Arial"/>
-                <w:b/>
-                <w:sz w:val="20"/>
-              </w:rPr>
-              <w:t>Churn Rate Monitoring:</w:t>
-            </w:r>
-            <w:r>
-              <w:rPr>
-                <w:rFonts w:ascii="Arial" w:hAnsi="Arial"/>
-                <w:sz w:val="20"/>
-              </w:rPr>
-              <w:t xml:space="preserve"> Reviews learner retention and dropout trends to evaluate the effectiveness of proactive renewal alerts (target: reduce churn by 20%).</w:t>
-            </w:r>
-          </w:p>
-          <w:p>
-            <w:pPr>
-              <w:spacing w:after="40" w:line="264" w:lineRule="auto"/>
-            </w:pPr>
-            <w:r>
-              <w:rPr>
-                <w:rFonts w:ascii="Arial" w:hAnsi="Arial"/>
-                <w:sz w:val="20"/>
-              </w:rPr>
-              <w:t xml:space="preserve">• </w:t>
-            </w:r>
-            <w:r>
-              <w:rPr>
-                <w:rFonts w:ascii="Arial" w:hAnsi="Arial"/>
-                <w:b/>
-                <w:sz w:val="20"/>
-              </w:rPr>
-              <w:t>Revenue &amp; Package Reports:</w:t>
-            </w:r>
-            <w:r>
-              <w:rPr>
-                <w:rFonts w:ascii="Arial" w:hAnsi="Arial"/>
-                <w:sz w:val="20"/>
-              </w:rPr>
-              <w:t xml:space="preserve"> Views aggregated data on Learning Package sales, remaining sessions across learners, and upcoming expirations for cash flow forecasting.</w:t>
-            </w:r>
-          </w:p>
-          <w:p>
-            <w:pPr>
-              <w:spacing w:line="264" w:lineRule="auto"/>
-            </w:pPr>
-            <w:r>
-              <w:rPr>
-                <w:rFonts w:ascii="Arial" w:hAnsi="Arial"/>
-                <w:sz w:val="20"/>
-              </w:rPr>
               <w:t xml:space="preserve">• </w:t>
             </w:r>
             <w:r>
@@ -5273,7 +5374,6 @@
                 <w:sz w:val="20"/>
                 <w:szCs w:val="20"/>
               </w:rPr>
-              <w:lastRenderedPageBreak/>
               <w:t>UC-03</w:t>
             </w:r>
           </w:p>
@@ -5406,6 +5506,7 @@
                 <w:sz w:val="20"/>
                 <w:szCs w:val="20"/>
               </w:rPr>
+              <w:lastRenderedPageBreak/>
               <w:t>UC-04</w:t>
             </w:r>
           </w:p>
@@ -6160,17 +6261,7 @@
                 <w:sz w:val="20"/>
                 <w:szCs w:val="20"/>
               </w:rPr>
-              <w:t xml:space="preserve">The system automatically generates an in-app alert to the Academic Admin exactly 2 weeks before a learner's Learning Package is fully depleted (based on remaining sessions or end </w:t>
-            </w:r>
-            <w:r>
-              <w:rPr>
-                <w:rFonts w:ascii="Arial" w:hAnsi="Arial" w:cs="Arial"/>
-                <w:color w:val="334155"/>
-                <w:sz w:val="20"/>
-                <w:szCs w:val="20"/>
-              </w:rPr>
-              <w:lastRenderedPageBreak/>
-              <w:t>date). This enables proactive outreach for renewal, directly addressing the 20% churn reduction target.</w:t>
+              <w:t>The system automatically generates an in-app alert to the Academic Admin exactly 2 weeks before a learner's Learning Package is fully depleted (based on remaining sessions or end date). This enables proactive outreach for renewal, directly addressing the 20% churn reduction target.</w:t>
             </w:r>
           </w:p>
         </w:tc>
@@ -6208,7 +6299,6 @@
                 <w:sz w:val="20"/>
                 <w:szCs w:val="20"/>
               </w:rPr>
-              <w:lastRenderedPageBreak/>
               <w:t>UC-10</w:t>
             </w:r>
           </w:p>
@@ -6303,7 +6393,17 @@
                 <w:sz w:val="20"/>
                 <w:szCs w:val="20"/>
               </w:rPr>
-              <w:t>Allows the Academic Admin to schedule a new session by specifying date, time slot, classroom, assigned Teacher, subject, and the list of enrolled learners. Before saving, the system runs the Scheduling Conflict detection algorithm to prevent Teacher or room double-booking.</w:t>
+              <w:t xml:space="preserve">Allows the Academic Admin to schedule a new session by specifying date, time slot, classroom, assigned Teacher, subject, and the list of enrolled learners. </w:t>
+            </w:r>
+            <w:r>
+              <w:rPr>
+                <w:rFonts w:ascii="Arial" w:hAnsi="Arial" w:cs="Arial"/>
+                <w:color w:val="334155"/>
+                <w:sz w:val="20"/>
+                <w:szCs w:val="20"/>
+              </w:rPr>
+              <w:lastRenderedPageBreak/>
+              <w:t>Before saving, the system runs the Scheduling Conflict detection algorithm to prevent Teacher or room double-booking.</w:t>
             </w:r>
           </w:p>
         </w:tc>
@@ -6341,6 +6441,7 @@
                 <w:sz w:val="20"/>
                 <w:szCs w:val="20"/>
               </w:rPr>
+              <w:lastRenderedPageBreak/>
               <w:t>UC-11</w:t>
             </w:r>
           </w:p>
@@ -6869,7 +6970,6 @@
                 <w:sz w:val="20"/>
                 <w:szCs w:val="20"/>
               </w:rPr>
-              <w:lastRenderedPageBreak/>
               <w:t>UC-15</w:t>
             </w:r>
           </w:p>
@@ -7002,6 +7102,7 @@
                 <w:sz w:val="20"/>
                 <w:szCs w:val="20"/>
               </w:rPr>
+              <w:lastRenderedPageBreak/>
               <w:t>UC-16</w:t>
             </w:r>
           </w:p>
@@ -7624,17 +7725,7 @@
                 <w:sz w:val="20"/>
                 <w:szCs w:val="20"/>
               </w:rPr>
-              <w:t xml:space="preserve">The system automatically dispatches an email to the Parent whenever a session involving their child is modified (change of date, time, room, or Teacher). The </w:t>
-            </w:r>
-            <w:r>
-              <w:rPr>
-                <w:rFonts w:ascii="Arial" w:hAnsi="Arial" w:cs="Arial"/>
-                <w:color w:val="334155"/>
-                <w:sz w:val="20"/>
-                <w:szCs w:val="20"/>
-              </w:rPr>
-              <w:lastRenderedPageBreak/>
-              <w:t>email clearly states the original and updated schedule details to avoid confusion.</w:t>
+              <w:t>The system automatically dispatches an email to the Parent whenever a session involving their child is modified (change of date, time, room, or Teacher). The email clearly states the original and updated schedule details to avoid confusion.</w:t>
             </w:r>
           </w:p>
         </w:tc>
@@ -7672,7 +7763,6 @@
                 <w:sz w:val="20"/>
                 <w:szCs w:val="20"/>
               </w:rPr>
-              <w:lastRenderedPageBreak/>
               <w:t>UC-21</w:t>
             </w:r>
           </w:p>
@@ -7767,7 +7857,17 @@
                 <w:sz w:val="20"/>
                 <w:szCs w:val="20"/>
               </w:rPr>
-              <w:t>The system automatically dispatches an email to the Parent after the Teacher submits a session Feedback for their child. The email contains the Teacher's academic evaluation, performance notes, and any improvement recommendations — providing transparent academic visibility.</w:t>
+              <w:t xml:space="preserve">The system automatically dispatches an email to the Parent after the Teacher submits a session Feedback for their child. The email contains the Teacher's </w:t>
+            </w:r>
+            <w:r>
+              <w:rPr>
+                <w:rFonts w:ascii="Arial" w:hAnsi="Arial" w:cs="Arial"/>
+                <w:color w:val="334155"/>
+                <w:sz w:val="20"/>
+                <w:szCs w:val="20"/>
+              </w:rPr>
+              <w:lastRenderedPageBreak/>
+              <w:t>academic evaluation, performance notes, and any improvement recommendations — providing transparent academic visibility.</w:t>
             </w:r>
           </w:p>
         </w:tc>
@@ -7805,6 +7905,7 @@
                 <w:sz w:val="20"/>
                 <w:szCs w:val="20"/>
               </w:rPr>
+              <w:lastRenderedPageBreak/>
               <w:t>UC-22</w:t>
             </w:r>
           </w:p>
@@ -8436,17 +8537,7 @@
                 <w:sz w:val="20"/>
                 <w:szCs w:val="20"/>
               </w:rPr>
-              <w:t xml:space="preserve">Allows the Academic Admin to create, update, activate, or deactivate user accounts for Teachers and other Academic Admin staff. Each account is assigned a role (Academic Admin / Teacher / Center Director) which </w:t>
-            </w:r>
-            <w:r>
-              <w:rPr>
-                <w:rFonts w:ascii="Arial" w:hAnsi="Arial" w:cs="Arial"/>
-                <w:color w:val="334155"/>
-                <w:sz w:val="20"/>
-                <w:szCs w:val="20"/>
-              </w:rPr>
-              <w:lastRenderedPageBreak/>
-              <w:t>determines system access permissions and visible menu items.</w:t>
+              <w:t>Allows the Academic Admin to create, update, activate, or deactivate user accounts for Teachers and other Academic Admin staff. Each account is assigned a role (Academic Admin / Teacher / Center Director) which determines system access permissions and visible menu items.</w:t>
             </w:r>
           </w:p>
         </w:tc>
@@ -8484,7 +8575,6 @@
                 <w:sz w:val="20"/>
                 <w:szCs w:val="20"/>
               </w:rPr>
-              <w:lastRenderedPageBreak/>
               <w:t>UC-27</w:t>
             </w:r>
           </w:p>
@@ -8579,7 +8669,17 @@
                 <w:sz w:val="20"/>
                 <w:szCs w:val="20"/>
               </w:rPr>
-              <w:t>Allows the Academic Admin to manage system-wide configuration data including: classroom definitions (name, capacity), time slot templates, subject categories (English / Kids Coding), and notification email templates. This is the foundational data required before scheduling sessions.</w:t>
+              <w:t xml:space="preserve">Allows the Academic Admin to manage system-wide configuration data including: classroom definitions (name, capacity), time slot templates, subject categories (English / Kids Coding), and notification </w:t>
+            </w:r>
+            <w:r>
+              <w:rPr>
+                <w:rFonts w:ascii="Arial" w:hAnsi="Arial" w:cs="Arial"/>
+                <w:color w:val="334155"/>
+                <w:sz w:val="20"/>
+                <w:szCs w:val="20"/>
+              </w:rPr>
+              <w:lastRenderedPageBreak/>
+              <w:t>email templates. This is the foundational data required before scheduling sessions.</w:t>
             </w:r>
           </w:p>
         </w:tc>
@@ -8590,6 +8690,7 @@
         <w:pStyle w:val="Heading4"/>
       </w:pPr>
       <w:r>
+        <w:lastRenderedPageBreak/>
         <w:t>1.</w:t>
       </w:r>
       <w:r>
@@ -8632,7 +8733,10 @@
         <w:t>3</w:t>
       </w:r>
       <w:r>
-        <w:t>.2.1 UCs for Guest</w:t>
+        <w:t xml:space="preserve">.2.1 UCs for </w:t>
+      </w:r>
+      <w:r>
+        <w:t>Academic Admin</w:t>
       </w:r>
     </w:p>
     <w:p>
@@ -8648,21 +8752,22 @@
           <w:noProof/>
         </w:rPr>
         <w:drawing>
-          <wp:inline distT="0" distB="0" distL="0" distR="0" wp14:anchorId="10C4F224" wp14:editId="6E89FA62">
-            <wp:extent cx="3384468" cy="1597231"/>
-            <wp:effectExtent l="0" t="0" r="6985" b="3175"/>
-            <wp:docPr id="27" name="image7.png"/>
-            <wp:cNvGraphicFramePr/>
+          <wp:inline distT="0" distB="0" distL="0" distR="0" wp14:anchorId="47DA9E28" wp14:editId="28F24198">
+            <wp:extent cx="5746750" cy="3434080"/>
+            <wp:effectExtent l="0" t="0" r="6350" b="0"/>
+            <wp:docPr id="9" name="Picture 9"/>
+            <wp:cNvGraphicFramePr>
+              <a:graphicFrameLocks xmlns:a="http://schemas.openxmlformats.org/drawingml/2006/main" noChangeAspect="1"/>
+            </wp:cNvGraphicFramePr>
             <a:graphic xmlns:a="http://schemas.openxmlformats.org/drawingml/2006/main">
               <a:graphicData uri="http://schemas.openxmlformats.org/drawingml/2006/picture">
                 <pic:pic xmlns:pic="http://schemas.openxmlformats.org/drawingml/2006/picture">
                   <pic:nvPicPr>
-                    <pic:cNvPr id="0" name="image7.png"/>
-                    <pic:cNvPicPr preferRelativeResize="0"/>
+                    <pic:cNvPr id="1" name=""/>
+                    <pic:cNvPicPr/>
                   </pic:nvPicPr>
                   <pic:blipFill>
-                    <a:blip r:embed="rId11"/>
-                    <a:srcRect/>
+                    <a:blip r:embed="rId14"/>
                     <a:stretch>
                       <a:fillRect/>
                     </a:stretch>
@@ -8670,12 +8775,11 @@
                   <pic:spPr>
                     <a:xfrm>
                       <a:off x="0" y="0"/>
-                      <a:ext cx="3430984" cy="1619183"/>
+                      <a:ext cx="5746750" cy="3434080"/>
                     </a:xfrm>
                     <a:prstGeom prst="rect">
                       <a:avLst/>
                     </a:prstGeom>
-                    <a:ln/>
                   </pic:spPr>
                 </pic:pic>
               </a:graphicData>
@@ -8690,13 +8794,17 @@
         <w:pStyle w:val="Heading5"/>
       </w:pPr>
       <w:r>
+        <w:lastRenderedPageBreak/>
         <w:t>1.</w:t>
       </w:r>
       <w:r>
         <w:t>3</w:t>
       </w:r>
       <w:r>
-        <w:t>.2.2 UCs for Student</w:t>
+        <w:t xml:space="preserve">.2.2 UCs for </w:t>
+      </w:r>
+      <w:r>
+        <w:t>Teacher</w:t>
       </w:r>
     </w:p>
     <w:p>
@@ -8712,21 +8820,22 @@
           <w:noProof/>
         </w:rPr>
         <w:drawing>
-          <wp:inline distT="0" distB="0" distL="0" distR="0" wp14:anchorId="3E57815B" wp14:editId="3E0A4E5C">
-            <wp:extent cx="3253839" cy="1692233"/>
-            <wp:effectExtent l="0" t="0" r="3810" b="3810"/>
-            <wp:docPr id="30" name="image9.png"/>
-            <wp:cNvGraphicFramePr/>
+          <wp:inline distT="0" distB="0" distL="0" distR="0" wp14:anchorId="70CB2E9F" wp14:editId="3DC871C3">
+            <wp:extent cx="5746750" cy="3337560"/>
+            <wp:effectExtent l="0" t="0" r="6350" b="0"/>
+            <wp:docPr id="10" name="Picture 10"/>
+            <wp:cNvGraphicFramePr>
+              <a:graphicFrameLocks xmlns:a="http://schemas.openxmlformats.org/drawingml/2006/main" noChangeAspect="1"/>
+            </wp:cNvGraphicFramePr>
             <a:graphic xmlns:a="http://schemas.openxmlformats.org/drawingml/2006/main">
               <a:graphicData uri="http://schemas.openxmlformats.org/drawingml/2006/picture">
                 <pic:pic xmlns:pic="http://schemas.openxmlformats.org/drawingml/2006/picture">
                   <pic:nvPicPr>
-                    <pic:cNvPr id="0" name="image9.png"/>
-                    <pic:cNvPicPr preferRelativeResize="0"/>
+                    <pic:cNvPr id="1" name=""/>
+                    <pic:cNvPicPr/>
                   </pic:nvPicPr>
                   <pic:blipFill>
-                    <a:blip r:embed="rId12"/>
-                    <a:srcRect/>
+                    <a:blip r:embed="rId15"/>
                     <a:stretch>
                       <a:fillRect/>
                     </a:stretch>
@@ -8734,12 +8843,11 @@
                   <pic:spPr>
                     <a:xfrm>
                       <a:off x="0" y="0"/>
-                      <a:ext cx="3273805" cy="1702617"/>
+                      <a:ext cx="5746750" cy="3337560"/>
                     </a:xfrm>
                     <a:prstGeom prst="rect">
                       <a:avLst/>
                     </a:prstGeom>
-                    <a:ln/>
                   </pic:spPr>
                 </pic:pic>
               </a:graphicData>
@@ -8759,7 +8867,109 @@
         <w:t>3</w:t>
       </w:r>
       <w:r>
-        <w:t>.2.3 …</w:t>
+        <w:t>.2.3</w:t>
+      </w:r>
+      <w:r>
+        <w:t xml:space="preserve"> UC for Center Director</w:t>
+      </w:r>
+    </w:p>
+    <w:p>
+      <w:r>
+        <w:rPr>
+          <w:noProof/>
+        </w:rPr>
+        <w:drawing>
+          <wp:inline distT="0" distB="0" distL="0" distR="0" wp14:anchorId="4DC1242D" wp14:editId="0595A021">
+            <wp:extent cx="5746750" cy="3188335"/>
+            <wp:effectExtent l="0" t="0" r="6350" b="0"/>
+            <wp:docPr id="11" name="Picture 11"/>
+            <wp:cNvGraphicFramePr>
+              <a:graphicFrameLocks xmlns:a="http://schemas.openxmlformats.org/drawingml/2006/main" noChangeAspect="1"/>
+            </wp:cNvGraphicFramePr>
+            <a:graphic xmlns:a="http://schemas.openxmlformats.org/drawingml/2006/main">
+              <a:graphicData uri="http://schemas.openxmlformats.org/drawingml/2006/picture">
+                <pic:pic xmlns:pic="http://schemas.openxmlformats.org/drawingml/2006/picture">
+                  <pic:nvPicPr>
+                    <pic:cNvPr id="1" name=""/>
+                    <pic:cNvPicPr/>
+                  </pic:nvPicPr>
+                  <pic:blipFill>
+                    <a:blip r:embed="rId16"/>
+                    <a:stretch>
+                      <a:fillRect/>
+                    </a:stretch>
+                  </pic:blipFill>
+                  <pic:spPr>
+                    <a:xfrm>
+                      <a:off x="0" y="0"/>
+                      <a:ext cx="5746750" cy="3188335"/>
+                    </a:xfrm>
+                    <a:prstGeom prst="rect">
+                      <a:avLst/>
+                    </a:prstGeom>
+                  </pic:spPr>
+                </pic:pic>
+              </a:graphicData>
+            </a:graphic>
+          </wp:inline>
+        </w:drawing>
+      </w:r>
+    </w:p>
+    <w:p/>
+    <w:p/>
+    <w:p/>
+    <w:p/>
+    <w:p/>
+    <w:p>
+      <w:pPr>
+        <w:pStyle w:val="Heading5"/>
+      </w:pPr>
+      <w:r>
+        <w:lastRenderedPageBreak/>
+        <w:t>1.3.2.4 UC for Parent Notification</w:t>
+      </w:r>
+    </w:p>
+    <w:p/>
+    <w:p>
+      <w:r>
+        <w:rPr>
+          <w:noProof/>
+        </w:rPr>
+        <w:drawing>
+          <wp:inline distT="0" distB="0" distL="0" distR="0" wp14:anchorId="582CB3EE" wp14:editId="45FF962A">
+            <wp:extent cx="5746750" cy="3247390"/>
+            <wp:effectExtent l="0" t="0" r="6350" b="0"/>
+            <wp:docPr id="12" name="Picture 12"/>
+            <wp:cNvGraphicFramePr>
+              <a:graphicFrameLocks xmlns:a="http://schemas.openxmlformats.org/drawingml/2006/main" noChangeAspect="1"/>
+            </wp:cNvGraphicFramePr>
+            <a:graphic xmlns:a="http://schemas.openxmlformats.org/drawingml/2006/main">
+              <a:graphicData uri="http://schemas.openxmlformats.org/drawingml/2006/picture">
+                <pic:pic xmlns:pic="http://schemas.openxmlformats.org/drawingml/2006/picture">
+                  <pic:nvPicPr>
+                    <pic:cNvPr id="1" name=""/>
+                    <pic:cNvPicPr/>
+                  </pic:nvPicPr>
+                  <pic:blipFill>
+                    <a:blip r:embed="rId17"/>
+                    <a:stretch>
+                      <a:fillRect/>
+                    </a:stretch>
+                  </pic:blipFill>
+                  <pic:spPr>
+                    <a:xfrm>
+                      <a:off x="0" y="0"/>
+                      <a:ext cx="5746750" cy="3247390"/>
+                    </a:xfrm>
+                    <a:prstGeom prst="rect">
+                      <a:avLst/>
+                    </a:prstGeom>
+                  </pic:spPr>
+                </pic:pic>
+              </a:graphicData>
+            </a:graphic>
+          </wp:inline>
+        </w:drawing>
       </w:r>
     </w:p>
     <w:p/>
@@ -8767,11 +8977,11 @@
       <w:pPr>
         <w:pStyle w:val="Heading3"/>
       </w:pPr>
-      <w:bookmarkStart w:id="6" w:name="_Toc187341936"/>
+      <w:bookmarkStart w:id="7" w:name="_Toc187341936"/>
       <w:r>
         <w:t>1.4 System Functionalities</w:t>
       </w:r>
-      <w:bookmarkEnd w:id="6"/>
+      <w:bookmarkEnd w:id="7"/>
     </w:p>
     <w:p>
       <w:pPr>
@@ -8794,7 +9004,6 @@
         <w:pStyle w:val="Heading4"/>
       </w:pPr>
       <w:r>
-        <w:lastRenderedPageBreak/>
         <w:t>1.4.1 Screens Flow</w:t>
       </w:r>
     </w:p>
@@ -8823,21 +9032,22 @@
           <w:noProof/>
         </w:rPr>
         <w:drawing>
-          <wp:inline distT="0" distB="0" distL="0" distR="0" wp14:anchorId="2C6CF225" wp14:editId="6A923D4C">
-            <wp:extent cx="5763629" cy="2462474"/>
+          <wp:inline distT="0" distB="0" distL="0" distR="0" wp14:anchorId="7930A7E4" wp14:editId="5AA5BF7A">
+            <wp:extent cx="4006850" cy="2828261"/>
             <wp:effectExtent l="0" t="0" r="0" b="0"/>
-            <wp:docPr id="29" name="image10.png"/>
-            <wp:cNvGraphicFramePr/>
+            <wp:docPr id="14" name="Picture 14"/>
+            <wp:cNvGraphicFramePr>
+              <a:graphicFrameLocks xmlns:a="http://schemas.openxmlformats.org/drawingml/2006/main" noChangeAspect="1"/>
+            </wp:cNvGraphicFramePr>
             <a:graphic xmlns:a="http://schemas.openxmlformats.org/drawingml/2006/main">
               <a:graphicData uri="http://schemas.openxmlformats.org/drawingml/2006/picture">
                 <pic:pic xmlns:pic="http://schemas.openxmlformats.org/drawingml/2006/picture">
                   <pic:nvPicPr>
-                    <pic:cNvPr id="0" name="image10.png"/>
-                    <pic:cNvPicPr preferRelativeResize="0"/>
+                    <pic:cNvPr id="1" name=""/>
+                    <pic:cNvPicPr/>
                   </pic:nvPicPr>
                   <pic:blipFill>
-                    <a:blip r:embed="rId13"/>
-                    <a:srcRect/>
+                    <a:blip r:embed="rId18"/>
                     <a:stretch>
                       <a:fillRect/>
                     </a:stretch>
@@ -8845,12 +9055,11 @@
                   <pic:spPr>
                     <a:xfrm>
                       <a:off x="0" y="0"/>
-                      <a:ext cx="5763629" cy="2462474"/>
+                      <a:ext cx="4016069" cy="2834768"/>
                     </a:xfrm>
                     <a:prstGeom prst="rect">
                       <a:avLst/>
                     </a:prstGeom>
-                    <a:ln/>
                   </pic:spPr>
                 </pic:pic>
               </a:graphicData>
@@ -8864,6 +9073,7 @@
         <w:pStyle w:val="Heading4"/>
       </w:pPr>
       <w:r>
+        <w:lastRenderedPageBreak/>
         <w:t>1.4.2 Screen Authorization</w:t>
       </w:r>
     </w:p>
@@ -8880,23 +9090,7 @@
           <w:i/>
           <w:color w:val="0000FF"/>
         </w:rPr>
-        <w:t>[Provide the system roles authorization to the system features (down to screens, and event to the screen activities if applicable) in the table form as below – replace Role-Name1, Role-Name</w:t>
-      </w:r>
-      <w:proofErr w:type="gramStart"/>
-      <w:r>
-        <w:rPr>
-          <w:i/>
-          <w:color w:val="0000FF"/>
-        </w:rPr>
-        <w:t>2,…</w:t>
-      </w:r>
-      <w:proofErr w:type="gramEnd"/>
-      <w:r>
-        <w:rPr>
-          <w:i/>
-          <w:color w:val="0000FF"/>
-        </w:rPr>
-        <w:t xml:space="preserve"> with your specific system user role names]</w:t>
+        <w:t>[Provide the system roles authorization to the system features (down to screens, and event to the screen activities if applicable) in the table form as below – replace Role-Name1, Role-Name2,… with your specific system user role names]</w:t>
       </w:r>
     </w:p>
     <w:tbl>
@@ -10909,39 +11103,7 @@
           <w:i/>
           <w:color w:val="0000FF"/>
         </w:rPr>
-        <w:t xml:space="preserve">[Provide the descriptions for the non-screen system functions, </w:t>
-      </w:r>
-      <w:proofErr w:type="spellStart"/>
-      <w:r>
-        <w:rPr>
-          <w:i/>
-          <w:color w:val="0000FF"/>
-        </w:rPr>
-        <w:t>i.e</w:t>
-      </w:r>
-      <w:proofErr w:type="spellEnd"/>
-      <w:r>
-        <w:rPr>
-          <w:i/>
-          <w:color w:val="0000FF"/>
-        </w:rPr>
-        <w:t xml:space="preserve"> batch/</w:t>
-      </w:r>
-      <w:proofErr w:type="spellStart"/>
-      <w:r>
-        <w:rPr>
-          <w:i/>
-          <w:color w:val="0000FF"/>
-        </w:rPr>
-        <w:t>cron</w:t>
-      </w:r>
-      <w:proofErr w:type="spellEnd"/>
-      <w:r>
-        <w:rPr>
-          <w:i/>
-          <w:color w:val="0000FF"/>
-        </w:rPr>
-        <w:t xml:space="preserve"> job, service, API, etc.]</w:t>
+        <w:t>[Provide the descriptions for the non-screen system functions, i.e batch/cron job, service, API, etc.]</w:t>
       </w:r>
     </w:p>
     <w:tbl>
@@ -10973,12 +11135,13 @@
         <w:tc>
           <w:tcPr>
             <w:tcW w:w="362" w:type="dxa"/>
-            <w:shd w:val="clear" w:color="auto" w:fill="FFE8E1"/>
+            <w:shd w:val="clear" w:color="auto" w:fill="F4CCCC"/>
             <w:vAlign w:val="center"/>
           </w:tcPr>
           <w:p>
             <w:pPr>
               <w:spacing w:after="0"/>
+              <w:jc w:val="center"/>
               <w:rPr>
                 <w:b/>
               </w:rPr>
@@ -10994,11 +11157,12 @@
         <w:tc>
           <w:tcPr>
             <w:tcW w:w="2043" w:type="dxa"/>
-            <w:shd w:val="clear" w:color="auto" w:fill="FFE8E1"/>
+            <w:shd w:val="clear" w:color="auto" w:fill="F4CCCC"/>
           </w:tcPr>
           <w:p>
             <w:pPr>
               <w:spacing w:after="0"/>
+              <w:jc w:val="center"/>
               <w:rPr>
                 <w:b/>
               </w:rPr>
@@ -11014,12 +11178,13 @@
         <w:tc>
           <w:tcPr>
             <w:tcW w:w="2268" w:type="dxa"/>
-            <w:shd w:val="clear" w:color="auto" w:fill="FFE8E1"/>
+            <w:shd w:val="clear" w:color="auto" w:fill="F4CCCC"/>
             <w:vAlign w:val="center"/>
           </w:tcPr>
           <w:p>
             <w:pPr>
               <w:spacing w:after="0"/>
+              <w:jc w:val="center"/>
               <w:rPr>
                 <w:b/>
               </w:rPr>
@@ -11035,12 +11200,13 @@
         <w:tc>
           <w:tcPr>
             <w:tcW w:w="4530" w:type="dxa"/>
-            <w:shd w:val="clear" w:color="auto" w:fill="FFE8E1"/>
+            <w:shd w:val="clear" w:color="auto" w:fill="F4CCCC"/>
             <w:vAlign w:val="center"/>
           </w:tcPr>
           <w:p>
             <w:pPr>
               <w:spacing w:after="0"/>
+              <w:jc w:val="center"/>
               <w:rPr>
                 <w:b/>
               </w:rPr>
@@ -11058,13 +11224,16 @@
         <w:tc>
           <w:tcPr>
             <w:tcW w:w="362" w:type="dxa"/>
-            <w:shd w:val="clear" w:color="auto" w:fill="auto"/>
-          </w:tcPr>
-          <w:p>
-            <w:pPr>
-              <w:spacing w:after="0"/>
-            </w:pPr>
-            <w:r>
+            <w:shd w:val="clear" w:color="auto" w:fill="FFFFFF"/>
+          </w:tcPr>
+          <w:p>
+            <w:pPr>
+              <w:jc w:val="center"/>
+            </w:pPr>
+            <w:r>
+              <w:rPr>
+                <w:sz w:val="21"/>
+              </w:rPr>
               <w:t>1</w:t>
             </w:r>
           </w:p>
@@ -11072,41 +11241,43 @@
         <w:tc>
           <w:tcPr>
             <w:tcW w:w="2043" w:type="dxa"/>
-          </w:tcPr>
-          <w:p>
-            <w:pPr>
-              <w:spacing w:after="0"/>
-            </w:pPr>
-            <w:r>
-              <w:t>&lt;&lt;Feature Name&gt;&gt;</w:t>
+            <w:shd w:val="clear" w:color="auto" w:fill="FFFFFF"/>
+          </w:tcPr>
+          <w:p>
+            <w:r>
+              <w:rPr>
+                <w:sz w:val="21"/>
+              </w:rPr>
+              <w:t>Parent Notification Engine</w:t>
             </w:r>
           </w:p>
         </w:tc>
         <w:tc>
           <w:tcPr>
             <w:tcW w:w="2268" w:type="dxa"/>
-            <w:shd w:val="clear" w:color="auto" w:fill="auto"/>
-          </w:tcPr>
-          <w:p>
-            <w:pPr>
-              <w:spacing w:after="0"/>
-            </w:pPr>
-            <w:r>
-              <w:t>&lt;&lt;Function Name1&gt;&gt;</w:t>
+            <w:shd w:val="clear" w:color="auto" w:fill="FFFFFF"/>
+          </w:tcPr>
+          <w:p>
+            <w:r>
+              <w:rPr>
+                <w:b/>
+                <w:sz w:val="21"/>
+              </w:rPr>
+              <w:t>Attendance Notification Service</w:t>
             </w:r>
           </w:p>
         </w:tc>
         <w:tc>
           <w:tcPr>
             <w:tcW w:w="4530" w:type="dxa"/>
-            <w:shd w:val="clear" w:color="auto" w:fill="auto"/>
-          </w:tcPr>
-          <w:p>
-            <w:pPr>
-              <w:spacing w:after="0"/>
-            </w:pPr>
-            <w:r>
-              <w:t>&lt;&lt;Function Name1 Description&gt;&gt;</w:t>
+            <w:shd w:val="clear" w:color="auto" w:fill="FFFFFF"/>
+          </w:tcPr>
+          <w:p>
+            <w:r>
+              <w:rPr>
+                <w:sz w:val="20"/>
+              </w:rPr>
+              <w:t>Event-driven background service triggered immediately after attendance is recorded for any Session. Composes and dispatches an HTML email to the Parent via the Email Service API, including: session date/time, Teacher name, and Learner attendance status (Present / Absent / Late). Fully automated — zero manual action required from Academic Admin. (UC-19, BR-ATT-02)</w:t>
             </w:r>
           </w:p>
         </w:tc>
@@ -11115,51 +11286,566 @@
         <w:tc>
           <w:tcPr>
             <w:tcW w:w="362" w:type="dxa"/>
-            <w:shd w:val="clear" w:color="auto" w:fill="auto"/>
-          </w:tcPr>
-          <w:p>
-            <w:pPr>
-              <w:spacing w:after="0"/>
-            </w:pPr>
-            <w:r>
+            <w:shd w:val="clear" w:color="auto" w:fill="F9F9F9"/>
+          </w:tcPr>
+          <w:p>
+            <w:pPr>
+              <w:jc w:val="center"/>
+            </w:pPr>
+            <w:r>
+              <w:rPr>
+                <w:sz w:val="21"/>
+              </w:rPr>
+              <w:t>2</w:t>
+            </w:r>
+          </w:p>
+        </w:tc>
+        <w:tc>
+          <w:tcPr>
+            <w:tcW w:w="2043" w:type="dxa"/>
+            <w:shd w:val="clear" w:color="auto" w:fill="F9F9F9"/>
+          </w:tcPr>
+          <w:p>
+            <w:r>
+              <w:rPr>
+                <w:sz w:val="21"/>
+              </w:rPr>
+              <w:t>Parent Notification Engine</w:t>
+            </w:r>
+          </w:p>
+        </w:tc>
+        <w:tc>
+          <w:tcPr>
+            <w:tcW w:w="2268" w:type="dxa"/>
+            <w:shd w:val="clear" w:color="auto" w:fill="F9F9F9"/>
+          </w:tcPr>
+          <w:p>
+            <w:r>
+              <w:rPr>
+                <w:b/>
+                <w:sz w:val="21"/>
+              </w:rPr>
+              <w:t>Schedule Change Notification Service</w:t>
+            </w:r>
+          </w:p>
+        </w:tc>
+        <w:tc>
+          <w:tcPr>
+            <w:tcW w:w="4530" w:type="dxa"/>
+            <w:shd w:val="clear" w:color="auto" w:fill="F9F9F9"/>
+          </w:tcPr>
+          <w:p>
+            <w:r>
+              <w:rPr>
+                <w:sz w:val="20"/>
+              </w:rPr>
+              <w:t>Event-driven service triggered on any modification or cancellation of a Session (change to date, time, classroom, or Teacher). Broadcasts a notification email to all Parents of enrolled Learners, stating both original and updated schedule details. (UC-20, BR-NOT-01)</w:t>
+            </w:r>
+          </w:p>
+        </w:tc>
+      </w:tr>
+      <w:tr>
+        <w:tc>
+          <w:tcPr>
+            <w:tcW w:w="362" w:type="dxa"/>
+            <w:shd w:val="clear" w:color="auto" w:fill="FFFFFF"/>
+          </w:tcPr>
+          <w:p>
+            <w:pPr>
+              <w:jc w:val="center"/>
+            </w:pPr>
+            <w:r>
+              <w:rPr>
+                <w:sz w:val="21"/>
+              </w:rPr>
+              <w:t>3</w:t>
+            </w:r>
+          </w:p>
+        </w:tc>
+        <w:tc>
+          <w:tcPr>
+            <w:tcW w:w="2043" w:type="dxa"/>
+            <w:shd w:val="clear" w:color="auto" w:fill="FFFFFF"/>
+          </w:tcPr>
+          <w:p>
+            <w:r>
+              <w:rPr>
+                <w:sz w:val="21"/>
+              </w:rPr>
+              <w:t>Parent Notification Engine</w:t>
+            </w:r>
+          </w:p>
+        </w:tc>
+        <w:tc>
+          <w:tcPr>
+            <w:tcW w:w="2268" w:type="dxa"/>
+            <w:shd w:val="clear" w:color="auto" w:fill="FFFFFF"/>
+          </w:tcPr>
+          <w:p>
+            <w:r>
+              <w:rPr>
+                <w:b/>
+                <w:sz w:val="21"/>
+              </w:rPr>
+              <w:t>Feedback Report Email Service</w:t>
+            </w:r>
+          </w:p>
+        </w:tc>
+        <w:tc>
+          <w:tcPr>
+            <w:tcW w:w="4530" w:type="dxa"/>
+            <w:shd w:val="clear" w:color="auto" w:fill="FFFFFF"/>
+          </w:tcPr>
+          <w:p>
+            <w:r>
+              <w:rPr>
+                <w:sz w:val="20"/>
+              </w:rPr>
+              <w:t xml:space="preserve">Triggered automatically when a Teacher submits a Feedback entry for a Learner. Composes and dispatches a per-Learner email report to the associated Parent, containing academic rating (1–5), </w:t>
+            </w:r>
+            <w:r>
+              <w:rPr>
+                <w:sz w:val="20"/>
+              </w:rPr>
               <w:lastRenderedPageBreak/>
-              <w:t>2</w:t>
+              <w:t>behavioral notes, and improvement recommendations. (UC-21)</w:t>
+            </w:r>
+          </w:p>
+        </w:tc>
+      </w:tr>
+      <w:tr>
+        <w:tc>
+          <w:tcPr>
+            <w:tcW w:w="362" w:type="dxa"/>
+            <w:shd w:val="clear" w:color="auto" w:fill="F9F9F9"/>
+          </w:tcPr>
+          <w:p>
+            <w:pPr>
+              <w:jc w:val="center"/>
+            </w:pPr>
+            <w:r>
+              <w:rPr>
+                <w:sz w:val="21"/>
+              </w:rPr>
+              <w:lastRenderedPageBreak/>
+              <w:t>4</w:t>
             </w:r>
           </w:p>
         </w:tc>
         <w:tc>
           <w:tcPr>
             <w:tcW w:w="2043" w:type="dxa"/>
-          </w:tcPr>
-          <w:p>
-            <w:pPr>
-              <w:spacing w:after="0"/>
-            </w:pPr>
-            <w:r>
-              <w:t>…</w:t>
+            <w:shd w:val="clear" w:color="auto" w:fill="F9F9F9"/>
+          </w:tcPr>
+          <w:p>
+            <w:r>
+              <w:rPr>
+                <w:sz w:val="21"/>
+              </w:rPr>
+              <w:t>Parent Notification Engine</w:t>
             </w:r>
           </w:p>
         </w:tc>
         <w:tc>
           <w:tcPr>
             <w:tcW w:w="2268" w:type="dxa"/>
-            <w:shd w:val="clear" w:color="auto" w:fill="auto"/>
-          </w:tcPr>
-          <w:p>
-            <w:pPr>
-              <w:spacing w:after="0"/>
-            </w:pPr>
+            <w:shd w:val="clear" w:color="auto" w:fill="F9F9F9"/>
+          </w:tcPr>
+          <w:p>
+            <w:r>
+              <w:rPr>
+                <w:b/>
+                <w:sz w:val="21"/>
+              </w:rPr>
+              <w:t>Package Expiry Cron Job</w:t>
+            </w:r>
           </w:p>
         </w:tc>
         <w:tc>
           <w:tcPr>
             <w:tcW w:w="4530" w:type="dxa"/>
-            <w:shd w:val="clear" w:color="auto" w:fill="auto"/>
-          </w:tcPr>
-          <w:p>
-            <w:pPr>
-              <w:spacing w:after="0"/>
-            </w:pPr>
+            <w:shd w:val="clear" w:color="auto" w:fill="F9F9F9"/>
+          </w:tcPr>
+          <w:p>
+            <w:r>
+              <w:rPr>
+                <w:sz w:val="20"/>
+              </w:rPr>
+              <w:t>Scheduled batch job running daily at 00:00 AM. Scans all active LearnerPackage records and identifies Learners whose remaining sessions reach the 2-week depletion threshold (BR-NOT-02). Dispatches expiry warning emails to associated Parents and creates in-app alerts for Academic Admin. Directly supports the 20% churn-reduction business goal. (UC-22, UC-23)</w:t>
+            </w:r>
+          </w:p>
+        </w:tc>
+      </w:tr>
+      <w:tr>
+        <w:tc>
+          <w:tcPr>
+            <w:tcW w:w="362" w:type="dxa"/>
+            <w:shd w:val="clear" w:color="auto" w:fill="FFFFFF"/>
+          </w:tcPr>
+          <w:p>
+            <w:pPr>
+              <w:jc w:val="center"/>
+            </w:pPr>
+            <w:r>
+              <w:rPr>
+                <w:sz w:val="21"/>
+              </w:rPr>
+              <w:t>5</w:t>
+            </w:r>
+          </w:p>
+        </w:tc>
+        <w:tc>
+          <w:tcPr>
+            <w:tcW w:w="2043" w:type="dxa"/>
+            <w:shd w:val="clear" w:color="auto" w:fill="FFFFFF"/>
+          </w:tcPr>
+          <w:p>
+            <w:r>
+              <w:rPr>
+                <w:sz w:val="21"/>
+              </w:rPr>
+              <w:t>Session Scheduling</w:t>
+            </w:r>
+          </w:p>
+        </w:tc>
+        <w:tc>
+          <w:tcPr>
+            <w:tcW w:w="2268" w:type="dxa"/>
+            <w:shd w:val="clear" w:color="auto" w:fill="FFFFFF"/>
+          </w:tcPr>
+          <w:p>
+            <w:r>
+              <w:rPr>
+                <w:b/>
+                <w:sz w:val="21"/>
+              </w:rPr>
+              <w:t>Conflict Detection Algorithm</w:t>
+            </w:r>
+          </w:p>
+        </w:tc>
+        <w:tc>
+          <w:tcPr>
+            <w:tcW w:w="4530" w:type="dxa"/>
+            <w:shd w:val="clear" w:color="auto" w:fill="FFFFFF"/>
+          </w:tcPr>
+          <w:p>
+            <w:r>
+              <w:rPr>
+                <w:sz w:val="20"/>
+              </w:rPr>
+              <w:t>Synchronous validation service invoked on every Session create or update (UC-13). Executes overlap query: WHERE (TimeStart &lt;= RequestedEnd) AND (TimeEnd &gt;= RequestedStart) for both RoomID and TeacherID. On conflict: blocks save and returns MSG-SCH-409 (Teacher double-booked) or MSG-SCH-410 (Room double-booked). Guarantees zero Scheduling Conflicts system-wide. (BR-SCH-01, BR-SCH-02)</w:t>
+            </w:r>
+          </w:p>
+        </w:tc>
+      </w:tr>
+      <w:tr>
+        <w:tc>
+          <w:tcPr>
+            <w:tcW w:w="362" w:type="dxa"/>
+            <w:shd w:val="clear" w:color="auto" w:fill="F9F9F9"/>
+          </w:tcPr>
+          <w:p>
+            <w:pPr>
+              <w:jc w:val="center"/>
+            </w:pPr>
+            <w:r>
+              <w:rPr>
+                <w:sz w:val="21"/>
+              </w:rPr>
+              <w:t>6</w:t>
+            </w:r>
+          </w:p>
+        </w:tc>
+        <w:tc>
+          <w:tcPr>
+            <w:tcW w:w="2043" w:type="dxa"/>
+            <w:shd w:val="clear" w:color="auto" w:fill="F9F9F9"/>
+          </w:tcPr>
+          <w:p>
+            <w:r>
+              <w:rPr>
+                <w:sz w:val="21"/>
+              </w:rPr>
+              <w:t>Teacher Feedback</w:t>
+            </w:r>
+          </w:p>
+        </w:tc>
+        <w:tc>
+          <w:tcPr>
+            <w:tcW w:w="2268" w:type="dxa"/>
+            <w:shd w:val="clear" w:color="auto" w:fill="F9F9F9"/>
+          </w:tcPr>
+          <w:p>
+            <w:r>
+              <w:rPr>
+                <w:b/>
+                <w:sz w:val="21"/>
+              </w:rPr>
+              <w:t>SLA Compliance Tracker</w:t>
+            </w:r>
+          </w:p>
+        </w:tc>
+        <w:tc>
+          <w:tcPr>
+            <w:tcW w:w="4530" w:type="dxa"/>
+            <w:shd w:val="clear" w:color="auto" w:fill="F9F9F9"/>
+          </w:tcPr>
+          <w:p>
+            <w:r>
+              <w:rPr>
+                <w:sz w:val="20"/>
+              </w:rPr>
+              <w:t>Background service triggered on each Feedback record insert. Calculates Delta = FeedbackSubmittedAt - SessionEndTime. Sets IsSLACompliant = True if Delta &lt;= 12 hours; False otherwise. SLA data feeds into the Admin Operational Dashboard for breach monitoring and reporting. (UC-19, BR-FDB-02)</w:t>
+            </w:r>
+          </w:p>
+        </w:tc>
+      </w:tr>
+      <w:tr>
+        <w:tc>
+          <w:tcPr>
+            <w:tcW w:w="362" w:type="dxa"/>
+            <w:shd w:val="clear" w:color="auto" w:fill="FFFFFF"/>
+          </w:tcPr>
+          <w:p>
+            <w:pPr>
+              <w:jc w:val="center"/>
+            </w:pPr>
+            <w:r>
+              <w:rPr>
+                <w:sz w:val="21"/>
+              </w:rPr>
+              <w:t>7</w:t>
+            </w:r>
+          </w:p>
+        </w:tc>
+        <w:tc>
+          <w:tcPr>
+            <w:tcW w:w="2043" w:type="dxa"/>
+            <w:shd w:val="clear" w:color="auto" w:fill="FFFFFF"/>
+          </w:tcPr>
+          <w:p>
+            <w:r>
+              <w:rPr>
+                <w:sz w:val="21"/>
+              </w:rPr>
+              <w:t>Teacher Feedback</w:t>
+            </w:r>
+          </w:p>
+        </w:tc>
+        <w:tc>
+          <w:tcPr>
+            <w:tcW w:w="2268" w:type="dxa"/>
+            <w:shd w:val="clear" w:color="auto" w:fill="FFFFFF"/>
+          </w:tcPr>
+          <w:p>
+            <w:r>
+              <w:rPr>
+                <w:b/>
+                <w:sz w:val="21"/>
+              </w:rPr>
+              <w:t>SLA Reminder Notification Service</w:t>
+            </w:r>
+          </w:p>
+        </w:tc>
+        <w:tc>
+          <w:tcPr>
+            <w:tcW w:w="4530" w:type="dxa"/>
+            <w:shd w:val="clear" w:color="auto" w:fill="FFFFFF"/>
+          </w:tcPr>
+          <w:p>
+            <w:r>
+              <w:rPr>
+                <w:sz w:val="20"/>
+              </w:rPr>
+              <w:t>Scheduled monitoring service tracking pending Feedback entries for completed Sessions. Sends an in-app + email reminder to the Teacher at the 8-hour warning mark post-session, and a final reminder at the 12-hour SLA deadline. Late submissions are flagged automatically for Academic Admin oversight. (UC-18)</w:t>
+            </w:r>
+          </w:p>
+        </w:tc>
+      </w:tr>
+      <w:tr>
+        <w:tc>
+          <w:tcPr>
+            <w:tcW w:w="362" w:type="dxa"/>
+            <w:shd w:val="clear" w:color="auto" w:fill="F9F9F9"/>
+          </w:tcPr>
+          <w:p>
+            <w:pPr>
+              <w:jc w:val="center"/>
+            </w:pPr>
+            <w:r>
+              <w:rPr>
+                <w:sz w:val="21"/>
+              </w:rPr>
+              <w:t>8</w:t>
+            </w:r>
+          </w:p>
+        </w:tc>
+        <w:tc>
+          <w:tcPr>
+            <w:tcW w:w="2043" w:type="dxa"/>
+            <w:shd w:val="clear" w:color="auto" w:fill="F9F9F9"/>
+          </w:tcPr>
+          <w:p>
+            <w:r>
+              <w:rPr>
+                <w:sz w:val="21"/>
+              </w:rPr>
+              <w:t>Learning Package Management</w:t>
+            </w:r>
+          </w:p>
+        </w:tc>
+        <w:tc>
+          <w:tcPr>
+            <w:tcW w:w="2268" w:type="dxa"/>
+            <w:shd w:val="clear" w:color="auto" w:fill="F9F9F9"/>
+          </w:tcPr>
+          <w:p>
+            <w:r>
+              <w:rPr>
+                <w:b/>
+                <w:sz w:val="21"/>
+              </w:rPr>
+              <w:t>Session Deduction Service</w:t>
+            </w:r>
+          </w:p>
+        </w:tc>
+        <w:tc>
+          <w:tcPr>
+            <w:tcW w:w="4530" w:type="dxa"/>
+            <w:shd w:val="clear" w:color="auto" w:fill="F9F9F9"/>
+          </w:tcPr>
+          <w:p>
+            <w:r>
+              <w:rPr>
+                <w:sz w:val="20"/>
+              </w:rPr>
+              <w:t>Event-driven service triggered on each attendance record save (BR-ATT-01). Decrements the RemainingSession counter in the associated LearnerPackage by 1 for each Present or Late status. If RemainingSession reaches 0, logs an arrears warning: MSG-ATT-401. (UC-14)</w:t>
+            </w:r>
+          </w:p>
+        </w:tc>
+      </w:tr>
+      <w:tr>
+        <w:tc>
+          <w:tcPr>
+            <w:tcW w:w="362" w:type="dxa"/>
+            <w:shd w:val="clear" w:color="auto" w:fill="FFFFFF"/>
+          </w:tcPr>
+          <w:p>
+            <w:pPr>
+              <w:jc w:val="center"/>
+            </w:pPr>
+            <w:r>
+              <w:rPr>
+                <w:sz w:val="21"/>
+              </w:rPr>
+              <w:t>9</w:t>
+            </w:r>
+          </w:p>
+        </w:tc>
+        <w:tc>
+          <w:tcPr>
+            <w:tcW w:w="2043" w:type="dxa"/>
+            <w:shd w:val="clear" w:color="auto" w:fill="FFFFFF"/>
+          </w:tcPr>
+          <w:p>
+            <w:r>
+              <w:rPr>
+                <w:sz w:val="21"/>
+              </w:rPr>
+              <w:t>System</w:t>
+            </w:r>
+          </w:p>
+        </w:tc>
+        <w:tc>
+          <w:tcPr>
+            <w:tcW w:w="2268" w:type="dxa"/>
+            <w:shd w:val="clear" w:color="auto" w:fill="FFFFFF"/>
+          </w:tcPr>
+          <w:p>
+            <w:r>
+              <w:rPr>
+                <w:b/>
+                <w:sz w:val="21"/>
+              </w:rPr>
+              <w:t>Activity Log Service</w:t>
+            </w:r>
+          </w:p>
+        </w:tc>
+        <w:tc>
+          <w:tcPr>
+            <w:tcW w:w="4530" w:type="dxa"/>
+            <w:shd w:val="clear" w:color="auto" w:fill="FFFFFF"/>
+          </w:tcPr>
+          <w:p>
+            <w:r>
+              <w:rPr>
+                <w:sz w:val="20"/>
+              </w:rPr>
+              <w:t>Background service recording all significant user actions to the ActivityLog table: login/logout events, data creation/modification/deletion, report exports, and admin operations. Supports security monitoring, operational accountability, and full audit trail requirements.</w:t>
+            </w:r>
+          </w:p>
+        </w:tc>
+      </w:tr>
+      <w:tr>
+        <w:tc>
+          <w:tcPr>
+            <w:tcW w:w="362" w:type="dxa"/>
+            <w:shd w:val="clear" w:color="auto" w:fill="F9F9F9"/>
+          </w:tcPr>
+          <w:p>
+            <w:pPr>
+              <w:jc w:val="center"/>
+            </w:pPr>
+            <w:r>
+              <w:rPr>
+                <w:sz w:val="21"/>
+              </w:rPr>
+              <w:lastRenderedPageBreak/>
+              <w:t>10</w:t>
+            </w:r>
+          </w:p>
+        </w:tc>
+        <w:tc>
+          <w:tcPr>
+            <w:tcW w:w="2043" w:type="dxa"/>
+            <w:shd w:val="clear" w:color="auto" w:fill="F9F9F9"/>
+          </w:tcPr>
+          <w:p>
+            <w:r>
+              <w:rPr>
+                <w:sz w:val="21"/>
+              </w:rPr>
+              <w:t>System</w:t>
+            </w:r>
+          </w:p>
+        </w:tc>
+        <w:tc>
+          <w:tcPr>
+            <w:tcW w:w="2268" w:type="dxa"/>
+            <w:shd w:val="clear" w:color="auto" w:fill="F9F9F9"/>
+          </w:tcPr>
+          <w:p>
+            <w:r>
+              <w:rPr>
+                <w:b/>
+                <w:sz w:val="21"/>
+              </w:rPr>
+              <w:t>Notification Delivery Status Tracker</w:t>
+            </w:r>
+          </w:p>
+        </w:tc>
+        <w:tc>
+          <w:tcPr>
+            <w:tcW w:w="4530" w:type="dxa"/>
+            <w:shd w:val="clear" w:color="auto" w:fill="F9F9F9"/>
+          </w:tcPr>
+          <w:p>
+            <w:r>
+              <w:rPr>
+                <w:sz w:val="20"/>
+              </w:rPr>
+              <w:t>Webhook receiver processing delivery status callbacks (delivered / bounced / failed) from the Email Service API (e.g., SendGrid, Amazon SES). Updates Notification log entries with delivery status and flags failed deliveries for Academic Admin review on the operational dashboard.</w:t>
+            </w:r>
           </w:p>
         </w:tc>
       </w:tr>
@@ -11169,11 +11855,11 @@
       <w:pPr>
         <w:pStyle w:val="Heading3"/>
       </w:pPr>
-      <w:bookmarkStart w:id="7" w:name="_Toc187341937"/>
+      <w:bookmarkStart w:id="8" w:name="_Toc187341937"/>
       <w:r>
         <w:t>1.5 Entity Relationship Diagram</w:t>
       </w:r>
-      <w:bookmarkEnd w:id="7"/>
+      <w:bookmarkEnd w:id="8"/>
     </w:p>
     <w:p>
       <w:pPr>
@@ -11224,25 +11910,23 @@
         <w:jc w:val="center"/>
       </w:pPr>
       <w:r>
-        <w:rPr>
-          <w:noProof/>
-        </w:rPr>
         <w:drawing>
-          <wp:inline distT="0" distB="0" distL="0" distR="0" wp14:anchorId="07466DDF" wp14:editId="33F1AEA6">
-            <wp:extent cx="5343525" cy="2371725"/>
-            <wp:effectExtent l="0" t="0" r="9525" b="9525"/>
-            <wp:docPr id="32" name="image12.png"/>
-            <wp:cNvGraphicFramePr/>
+          <wp:inline distT="0" distB="0" distL="0" distR="0" wp14:anchorId="34AF4A28" wp14:editId="6CE5942C">
+            <wp:extent cx="5746750" cy="3087370"/>
+            <wp:effectExtent l="0" t="0" r="6350" b="0"/>
+            <wp:docPr id="2" name="Picture 2"/>
+            <wp:cNvGraphicFramePr>
+              <a:graphicFrameLocks xmlns:a="http://schemas.openxmlformats.org/drawingml/2006/main" noChangeAspect="1"/>
+            </wp:cNvGraphicFramePr>
             <a:graphic xmlns:a="http://schemas.openxmlformats.org/drawingml/2006/main">
               <a:graphicData uri="http://schemas.openxmlformats.org/drawingml/2006/picture">
                 <pic:pic xmlns:pic="http://schemas.openxmlformats.org/drawingml/2006/picture">
                   <pic:nvPicPr>
-                    <pic:cNvPr id="0" name="image12.png"/>
-                    <pic:cNvPicPr preferRelativeResize="0"/>
+                    <pic:cNvPr id="1" name=""/>
+                    <pic:cNvPicPr/>
                   </pic:nvPicPr>
                   <pic:blipFill>
-                    <a:blip r:embed="rId14"/>
-                    <a:srcRect/>
+                    <a:blip r:embed="rId19"/>
                     <a:stretch>
                       <a:fillRect/>
                     </a:stretch>
@@ -11250,12 +11934,11 @@
                   <pic:spPr>
                     <a:xfrm>
                       <a:off x="0" y="0"/>
-                      <a:ext cx="5366353" cy="2381857"/>
+                      <a:ext cx="5746750" cy="3087370"/>
                     </a:xfrm>
                     <a:prstGeom prst="rect">
                       <a:avLst/>
                     </a:prstGeom>
-                    <a:ln/>
                   </pic:spPr>
                 </pic:pic>
               </a:graphicData>
@@ -11905,6 +12588,7 @@
                 <w:color w:val="0F172A"/>
                 <w:sz w:val="20"/>
               </w:rPr>
+              <w:lastRenderedPageBreak/>
               <w:t>6</w:t>
             </w:r>
           </w:p>
@@ -12190,7 +12874,6 @@
                 <w:color w:val="0F172A"/>
                 <w:sz w:val="20"/>
               </w:rPr>
-              <w:lastRenderedPageBreak/>
               <w:t>9</w:t>
             </w:r>
           </w:p>
@@ -12833,11 +13516,11 @@
       <w:pPr>
         <w:pStyle w:val="Heading2"/>
       </w:pPr>
-      <w:bookmarkStart w:id="8" w:name="_Toc187341938"/>
+      <w:bookmarkStart w:id="9" w:name="_Toc187341938"/>
       <w:r>
         <w:t>2. Use Case Specifications</w:t>
       </w:r>
-      <w:bookmarkEnd w:id="8"/>
+      <w:bookmarkEnd w:id="9"/>
     </w:p>
     <w:p>
       <w:pPr>
@@ -13121,6 +13804,7 @@
                 <w:rFonts w:ascii="Arial" w:hAnsi="Arial"/>
                 <w:b/>
               </w:rPr>
+              <w:lastRenderedPageBreak/>
               <w:t>Exceptions:</w:t>
             </w:r>
           </w:p>
@@ -13199,7 +13883,6 @@
               <w:rPr>
                 <w:rFonts w:ascii="Arial" w:hAnsi="Arial"/>
               </w:rPr>
-              <w:lastRenderedPageBreak/>
               <w:t xml:space="preserve">  2. System shows MSG-AUTH-403: 'Tài khoản bị hạn chế truy cập.'</w:t>
             </w:r>
           </w:p>
@@ -13778,6 +14461,7 @@
               <w:rPr>
                 <w:rFonts w:ascii="Arial" w:hAnsi="Arial"/>
               </w:rPr>
+              <w:lastRenderedPageBreak/>
               <w:t>6. Displays MSG-LRN-100: 'Thêm học viên thành công'.</w:t>
             </w:r>
           </w:p>
@@ -13794,6 +14478,7 @@
                 <w:rFonts w:ascii="Arial" w:hAnsi="Arial"/>
                 <w:b/>
               </w:rPr>
+              <w:lastRenderedPageBreak/>
               <w:t>Alternative Sequences/Flows:</w:t>
             </w:r>
           </w:p>
@@ -13882,7 +14567,6 @@
         <w:pStyle w:val="Heading3"/>
       </w:pPr>
       <w:r>
-        <w:lastRenderedPageBreak/>
         <w:t>[UC-04] View Learner Profile</w:t>
       </w:r>
     </w:p>
@@ -14672,6 +15356,7 @@
               <w:rPr>
                 <w:rFonts w:ascii="Arial" w:hAnsi="Arial"/>
               </w:rPr>
+              <w:lastRenderedPageBreak/>
               <w:t>5. Shows MSG-LRN-101: 'Thao tác thành công'.</w:t>
             </w:r>
           </w:p>
@@ -14688,6 +15373,7 @@
                 <w:rFonts w:ascii="Arial" w:hAnsi="Arial"/>
                 <w:b/>
               </w:rPr>
+              <w:lastRenderedPageBreak/>
               <w:t>Alternative Sequences/Flows:</w:t>
             </w:r>
           </w:p>
@@ -14760,7 +15446,6 @@
         <w:pStyle w:val="Heading3"/>
       </w:pPr>
       <w:r>
-        <w:lastRenderedPageBreak/>
         <w:t>[UC-07] Define New Package</w:t>
       </w:r>
     </w:p>
@@ -15586,6 +16271,7 @@
               <w:rPr>
                 <w:rFonts w:ascii="Arial" w:hAnsi="Arial"/>
               </w:rPr>
+              <w:lastRenderedPageBreak/>
               <w:t xml:space="preserve">  1. Learner already has active same subject package.</w:t>
             </w:r>
           </w:p>
@@ -15716,7 +16402,6 @@
               <w:rPr>
                 <w:rFonts w:ascii="Arial" w:hAnsi="Arial"/>
               </w:rPr>
-              <w:lastRenderedPageBreak/>
               <w:t>Preconditions:</w:t>
             </w:r>
           </w:p>
@@ -16420,6 +17105,7 @@
               <w:rPr>
                 <w:rFonts w:ascii="Arial" w:hAnsi="Arial"/>
               </w:rPr>
+              <w:lastRenderedPageBreak/>
               <w:t>2. Query SQL `WHERE (Start &lt;= EndRequested) AND (End &gt;= StartRequested)`.</w:t>
             </w:r>
           </w:p>
@@ -16444,6 +17130,7 @@
                 <w:rFonts w:ascii="Arial" w:hAnsi="Arial"/>
                 <w:b/>
               </w:rPr>
+              <w:lastRenderedPageBreak/>
               <w:t>Alternative Sequences/Flows:</w:t>
             </w:r>
           </w:p>
@@ -16500,7 +17187,6 @@
         <w:pStyle w:val="Heading3"/>
       </w:pPr>
       <w:r>
-        <w:lastRenderedPageBreak/>
         <w:t>[UC-13] Update Session Details</w:t>
       </w:r>
     </w:p>
@@ -17298,6 +17984,7 @@
                 <w:rFonts w:ascii="Arial" w:hAnsi="Arial"/>
                 <w:b/>
               </w:rPr>
+              <w:lastRenderedPageBreak/>
               <w:t>Alternative Sequences/Flows:</w:t>
             </w:r>
           </w:p>
@@ -17435,7 +18122,6 @@
               <w:rPr>
                 <w:rFonts w:ascii="Arial" w:hAnsi="Arial"/>
               </w:rPr>
-              <w:lastRenderedPageBreak/>
               <w:t>Description:</w:t>
             </w:r>
           </w:p>
@@ -18190,6 +18876,7 @@
                 <w:rFonts w:ascii="Arial" w:hAnsi="Arial"/>
                 <w:b/>
               </w:rPr>
+              <w:lastRenderedPageBreak/>
               <w:t>Exceptions:</w:t>
             </w:r>
           </w:p>
@@ -18305,7 +18992,6 @@
               <w:rPr>
                 <w:rFonts w:ascii="Arial" w:hAnsi="Arial"/>
               </w:rPr>
-              <w:lastRenderedPageBreak/>
               <w:t>Description:</w:t>
             </w:r>
           </w:p>
@@ -19119,6 +19805,7 @@
               <w:rPr>
                 <w:rFonts w:ascii="Arial" w:hAnsi="Arial"/>
               </w:rPr>
+              <w:lastRenderedPageBreak/>
               <w:t>Description:</w:t>
             </w:r>
           </w:p>
@@ -20106,6 +20793,7 @@
         <w:pStyle w:val="Heading3"/>
       </w:pPr>
       <w:r>
+        <w:lastRenderedPageBreak/>
         <w:t>[UC-26] Export Financial Reports</w:t>
       </w:r>
     </w:p>
@@ -20313,7 +21001,6 @@
               <w:rPr>
                 <w:rFonts w:ascii="Arial" w:hAnsi="Arial"/>
               </w:rPr>
-              <w:lastRenderedPageBreak/>
               <w:t>4. Downloads file.</w:t>
             </w:r>
           </w:p>
@@ -20330,7 +21017,6 @@
                 <w:rFonts w:ascii="Arial" w:hAnsi="Arial"/>
                 <w:b/>
               </w:rPr>
-              <w:lastRenderedPageBreak/>
               <w:t>Alternative Sequences/Flows:</w:t>
             </w:r>
           </w:p>
@@ -20697,34 +21383,18 @@
           <w:i/>
           <w:color w:val="0000FF"/>
         </w:rPr>
-        <w:t>. Other UCs (</w:t>
-      </w:r>
-      <w:proofErr w:type="spellStart"/>
-      <w:r>
-        <w:rPr>
-          <w:i/>
-          <w:color w:val="0000FF"/>
-        </w:rPr>
-        <w:t>i.e</w:t>
-      </w:r>
-      <w:proofErr w:type="spellEnd"/>
-      <w:r>
-        <w:rPr>
-          <w:i/>
-          <w:color w:val="0000FF"/>
-        </w:rPr>
-        <w:t xml:space="preserve"> CRUD or data-viewing UCs) are simple, and you just need to refer the descriptions in the Functional Requirement (part 3) below)]</w:t>
+        <w:t>. Other UCs (i.e CRUD or data-viewing UCs) are simple, and you just need to refer the descriptions in the Functional Requirement (part 3) below)]</w:t>
       </w:r>
     </w:p>
     <w:p>
       <w:pPr>
         <w:pStyle w:val="Heading3"/>
       </w:pPr>
-      <w:bookmarkStart w:id="9" w:name="_Toc187341939"/>
+      <w:bookmarkStart w:id="10" w:name="_Toc187341939"/>
       <w:r>
         <w:t>2.1 &lt;&lt;Feature Name1&gt;&gt;</w:t>
       </w:r>
-      <w:bookmarkEnd w:id="9"/>
+      <w:bookmarkEnd w:id="10"/>
     </w:p>
     <w:p>
       <w:pPr>
@@ -21012,6 +21682,7 @@
         <w:spacing w:after="60" w:line="240" w:lineRule="auto"/>
       </w:pPr>
       <w:r>
+        <w:lastRenderedPageBreak/>
         <w:t xml:space="preserve">Provide a brief description of the reason for and outcome of this use case, or a high-level description of the sequence of actions and the outcome of executing the use case. The description can be in the form of a user story (As a </w:t>
       </w:r>
       <w:r>
@@ -21087,7 +21758,6 @@
         <w:spacing w:after="120" w:line="220" w:lineRule="auto"/>
       </w:pPr>
       <w:r>
-        <w:lastRenderedPageBreak/>
         <w:t xml:space="preserve">Describe the state of the system at the successful conclusion of the use case execution. </w:t>
       </w:r>
     </w:p>
@@ -21504,21 +22174,7 @@
               <w:rPr>
                 <w:color w:val="000000"/>
               </w:rPr>
-              <w:t xml:space="preserve">System </w:t>
-            </w:r>
-            <w:proofErr w:type="gramStart"/>
-            <w:r>
-              <w:rPr>
-                <w:color w:val="000000"/>
-              </w:rPr>
-              <w:t>show</w:t>
-            </w:r>
-            <w:proofErr w:type="gramEnd"/>
-            <w:r>
-              <w:rPr>
-                <w:color w:val="000000"/>
-              </w:rPr>
-              <w:t xml:space="preserve"> the User Login screen</w:t>
+              <w:t>System show the User Login screen</w:t>
             </w:r>
           </w:p>
           <w:p>
@@ -21880,6 +22536,7 @@
                 <w:b/>
                 <w:i/>
               </w:rPr>
+              <w:lastRenderedPageBreak/>
               <w:t>Step 4_System can’t authenticate the user</w:t>
             </w:r>
           </w:p>
@@ -22038,7 +22695,7 @@
       <w:pPr>
         <w:pStyle w:val="Heading3"/>
       </w:pPr>
-      <w:bookmarkStart w:id="10" w:name="_Toc187341940"/>
+      <w:bookmarkStart w:id="11" w:name="_Toc187341940"/>
       <w:r>
         <w:t>2.</w:t>
       </w:r>
@@ -22046,17 +22703,9 @@
         <w:t>2</w:t>
       </w:r>
       <w:r>
-        <w:t xml:space="preserve"> </w:t>
+        <w:t xml:space="preserve"> Xyz Feature</w:t>
       </w:r>
-      <w:proofErr w:type="spellStart"/>
-      <w:r>
-        <w:t>Xyz</w:t>
-      </w:r>
-      <w:proofErr w:type="spellEnd"/>
-      <w:r>
-        <w:t xml:space="preserve"> Feature</w:t>
-      </w:r>
-      <w:bookmarkEnd w:id="10"/>
+      <w:bookmarkEnd w:id="11"/>
     </w:p>
     <w:p>
       <w:r>
@@ -22079,12 +22728,12 @@
       <w:pPr>
         <w:pStyle w:val="Heading2"/>
       </w:pPr>
-      <w:bookmarkStart w:id="11" w:name="_Toc187341941"/>
+      <w:bookmarkStart w:id="12" w:name="_Toc187341941"/>
       <w:r>
         <w:lastRenderedPageBreak/>
         <w:t>3. Functional Requirements</w:t>
       </w:r>
-      <w:bookmarkEnd w:id="11"/>
+      <w:bookmarkEnd w:id="12"/>
     </w:p>
     <w:p>
       <w:pPr>
@@ -22093,10 +22742,10 @@
           <w:color w:val="0000FF"/>
         </w:rPr>
       </w:pPr>
-      <w:bookmarkStart w:id="12" w:name="_Toc143617359"/>
-      <w:bookmarkStart w:id="13" w:name="_Toc146703157"/>
-      <w:bookmarkStart w:id="14" w:name="_Toc179689383"/>
-      <w:bookmarkStart w:id="15" w:name="_Hlk180308893"/>
+      <w:bookmarkStart w:id="13" w:name="_Toc143617359"/>
+      <w:bookmarkStart w:id="14" w:name="_Toc146703157"/>
+      <w:bookmarkStart w:id="15" w:name="_Toc179689383"/>
+      <w:bookmarkStart w:id="16" w:name="_Hlk180308893"/>
       <w:r>
         <w:rPr>
           <w:i/>
@@ -22109,12 +22758,12 @@
       <w:pPr>
         <w:pStyle w:val="Heading3"/>
       </w:pPr>
-      <w:bookmarkStart w:id="16" w:name="_Toc187228345"/>
-      <w:bookmarkStart w:id="17" w:name="_Toc187341942"/>
-      <w:bookmarkEnd w:id="12"/>
+      <w:bookmarkStart w:id="17" w:name="_Toc187228345"/>
+      <w:bookmarkStart w:id="18" w:name="_Toc187341942"/>
       <w:bookmarkEnd w:id="13"/>
       <w:bookmarkEnd w:id="14"/>
       <w:bookmarkEnd w:id="15"/>
+      <w:bookmarkEnd w:id="16"/>
       <w:r>
         <w:t xml:space="preserve">3.1 </w:t>
       </w:r>
@@ -22127,17 +22776,17 @@
       <w:r>
         <w:t>1</w:t>
       </w:r>
-      <w:bookmarkEnd w:id="16"/>
       <w:bookmarkEnd w:id="17"/>
+      <w:bookmarkEnd w:id="18"/>
     </w:p>
     <w:p>
       <w:pPr>
         <w:pStyle w:val="Heading4"/>
       </w:pPr>
-      <w:bookmarkStart w:id="18" w:name="_Toc143617360"/>
-      <w:bookmarkStart w:id="19" w:name="_Toc179689384"/>
-      <w:bookmarkStart w:id="20" w:name="_Toc187228346"/>
-      <w:bookmarkStart w:id="21" w:name="_Hlk144402728"/>
+      <w:bookmarkStart w:id="19" w:name="_Toc143617360"/>
+      <w:bookmarkStart w:id="20" w:name="_Toc179689384"/>
+      <w:bookmarkStart w:id="21" w:name="_Toc187228346"/>
+      <w:bookmarkStart w:id="22" w:name="_Hlk144402728"/>
       <w:r>
         <w:t>3.1</w:t>
       </w:r>
@@ -22147,12 +22796,12 @@
         </w:rPr>
         <w:t>.1 SubFeature Name</w:t>
       </w:r>
-      <w:bookmarkEnd w:id="18"/>
+      <w:bookmarkEnd w:id="19"/>
       <w:r>
         <w:t>1.1</w:t>
       </w:r>
-      <w:bookmarkEnd w:id="19"/>
       <w:bookmarkEnd w:id="20"/>
+      <w:bookmarkEnd w:id="21"/>
     </w:p>
     <w:p>
       <w:pPr>
@@ -22208,23 +22857,7 @@
           <w:i/>
           <w:color w:val="0000FF"/>
         </w:rPr>
-        <w:t>UI layout (</w:t>
-      </w:r>
-      <w:proofErr w:type="spellStart"/>
-      <w:r>
-        <w:rPr>
-          <w:i/>
-          <w:color w:val="0000FF"/>
-        </w:rPr>
-        <w:t>Mockup</w:t>
-      </w:r>
-      <w:proofErr w:type="spellEnd"/>
-      <w:r>
-        <w:rPr>
-          <w:i/>
-          <w:color w:val="0000FF"/>
-        </w:rPr>
-        <w:t xml:space="preserve"> </w:t>
+        <w:t xml:space="preserve">UI layout (Mockup </w:t>
       </w:r>
       <w:r>
         <w:rPr>
@@ -22577,9 +23210,9 @@
           <w:lang w:val="vi-VN"/>
         </w:rPr>
       </w:pPr>
-      <w:bookmarkStart w:id="22" w:name="_Toc179689385"/>
-      <w:bookmarkStart w:id="23" w:name="_Toc187228347"/>
-      <w:bookmarkEnd w:id="21"/>
+      <w:bookmarkStart w:id="23" w:name="_Toc179689385"/>
+      <w:bookmarkStart w:id="24" w:name="_Toc187228347"/>
+      <w:bookmarkEnd w:id="22"/>
       <w:r>
         <w:t>3.1</w:t>
       </w:r>
@@ -22601,8 +23234,8 @@
       <w:r>
         <w:t>1.2</w:t>
       </w:r>
-      <w:bookmarkEnd w:id="22"/>
       <w:bookmarkEnd w:id="23"/>
+      <w:bookmarkEnd w:id="24"/>
     </w:p>
     <w:p>
       <w:r>
@@ -22613,28 +23246,28 @@
       <w:pPr>
         <w:pStyle w:val="Heading3"/>
       </w:pPr>
-      <w:bookmarkStart w:id="24" w:name="_Toc179689386"/>
-      <w:bookmarkStart w:id="25" w:name="_Toc187228348"/>
-      <w:bookmarkStart w:id="26" w:name="_Toc187341943"/>
+      <w:bookmarkStart w:id="25" w:name="_Toc179689386"/>
+      <w:bookmarkStart w:id="26" w:name="_Toc187228348"/>
+      <w:bookmarkStart w:id="27" w:name="_Toc187341943"/>
       <w:r>
         <w:t>3.2 User Authentication</w:t>
       </w:r>
-      <w:bookmarkEnd w:id="24"/>
       <w:bookmarkEnd w:id="25"/>
       <w:bookmarkEnd w:id="26"/>
+      <w:bookmarkEnd w:id="27"/>
     </w:p>
     <w:p>
       <w:pPr>
         <w:pStyle w:val="Heading4"/>
       </w:pPr>
-      <w:bookmarkStart w:id="27" w:name="_Toc179689388"/>
-      <w:bookmarkStart w:id="28" w:name="_Toc187228349"/>
-      <w:bookmarkStart w:id="29" w:name="_Toc179689387"/>
+      <w:bookmarkStart w:id="28" w:name="_Toc179689388"/>
+      <w:bookmarkStart w:id="29" w:name="_Toc187228349"/>
+      <w:bookmarkStart w:id="30" w:name="_Toc179689387"/>
       <w:r>
         <w:t>3.2.1 User Register</w:t>
       </w:r>
-      <w:bookmarkEnd w:id="27"/>
       <w:bookmarkEnd w:id="28"/>
+      <w:bookmarkEnd w:id="29"/>
     </w:p>
     <w:p>
       <w:pPr>
@@ -22651,7 +23284,7 @@
           <w:lang w:val="vi-VN"/>
         </w:rPr>
       </w:pPr>
-      <w:bookmarkStart w:id="30" w:name="_Toc187228350"/>
+      <w:bookmarkStart w:id="31" w:name="_Toc187228350"/>
       <w:r>
         <w:t>3.2.2</w:t>
       </w:r>
@@ -22661,8 +23294,8 @@
         </w:rPr>
         <w:t xml:space="preserve"> User Login</w:t>
       </w:r>
-      <w:bookmarkEnd w:id="29"/>
       <w:bookmarkEnd w:id="30"/>
+      <w:bookmarkEnd w:id="31"/>
     </w:p>
     <w:p>
       <w:r>
@@ -22673,11 +23306,11 @@
       <w:pPr>
         <w:pStyle w:val="Heading4"/>
       </w:pPr>
-      <w:bookmarkStart w:id="31" w:name="_Toc187228351"/>
+      <w:bookmarkStart w:id="32" w:name="_Toc187228351"/>
       <w:r>
         <w:t>3.2.3 Password Reset</w:t>
       </w:r>
-      <w:bookmarkEnd w:id="31"/>
+      <w:bookmarkEnd w:id="32"/>
     </w:p>
     <w:p>
       <w:r>
@@ -22688,9 +23321,9 @@
       <w:pPr>
         <w:pStyle w:val="Heading3"/>
       </w:pPr>
-      <w:bookmarkStart w:id="32" w:name="_Toc179689390"/>
-      <w:bookmarkStart w:id="33" w:name="_Toc187228353"/>
-      <w:bookmarkStart w:id="34" w:name="_Toc187341944"/>
+      <w:bookmarkStart w:id="33" w:name="_Toc179689390"/>
+      <w:bookmarkStart w:id="34" w:name="_Toc187228353"/>
+      <w:bookmarkStart w:id="35" w:name="_Toc187341944"/>
       <w:r>
         <w:lastRenderedPageBreak/>
         <w:t>3.</w:t>
@@ -22698,27 +23331,27 @@
       <w:r>
         <w:t>3 System Administration</w:t>
       </w:r>
-      <w:bookmarkEnd w:id="32"/>
       <w:bookmarkEnd w:id="33"/>
       <w:bookmarkEnd w:id="34"/>
+      <w:bookmarkEnd w:id="35"/>
     </w:p>
     <w:p>
       <w:pPr>
         <w:pStyle w:val="Heading4"/>
       </w:pPr>
-      <w:bookmarkStart w:id="35" w:name="_Toc179689391"/>
-      <w:bookmarkStart w:id="36" w:name="_Toc187228354"/>
+      <w:bookmarkStart w:id="36" w:name="_Toc179689391"/>
+      <w:bookmarkStart w:id="37" w:name="_Toc187228354"/>
       <w:r>
         <w:t>3.</w:t>
       </w:r>
       <w:r>
         <w:t xml:space="preserve">3.1 </w:t>
       </w:r>
-      <w:bookmarkEnd w:id="35"/>
+      <w:bookmarkEnd w:id="36"/>
       <w:r>
         <w:t>Master Data</w:t>
       </w:r>
-      <w:bookmarkEnd w:id="36"/>
+      <w:bookmarkEnd w:id="37"/>
     </w:p>
     <w:p>
       <w:pPr>
@@ -22739,7 +23372,7 @@
         <mc:AlternateContent>
           <mc:Choice Requires="wps">
             <w:drawing>
-              <wp:anchor distT="0" distB="0" distL="114300" distR="114300" simplePos="0" relativeHeight="251661312" behindDoc="0" locked="0" layoutInCell="1" hidden="0" allowOverlap="1" wp14:anchorId="59C5D757" wp14:editId="15E317EC">
+              <wp:anchor distT="0" distB="0" distL="114300" distR="114300" simplePos="0" relativeHeight="251661312" behindDoc="0" locked="0" layoutInCell="1" hidden="0" allowOverlap="1" wp14:anchorId="6F0B3081" wp14:editId="1B50A992">
                 <wp:simplePos x="0" y="0"/>
                 <wp:positionH relativeFrom="column">
                   <wp:posOffset>5141595</wp:posOffset>
@@ -22797,7 +23430,7 @@
           </mc:Choice>
           <mc:Fallback>
             <w:pict>
-              <v:rect w14:anchorId="47E8A4D6" id="Rectangle 22" o:spid="_x0000_s1026" style="position:absolute;margin-left:404.85pt;margin-top:101pt;width:26.6pt;height:17.25pt;z-index:251661312;visibility:visible;mso-wrap-style:square;mso-wrap-distance-left:9pt;mso-wrap-distance-top:0;mso-wrap-distance-right:9pt;mso-wrap-distance-bottom:0;mso-position-horizontal:absolute;mso-position-horizontal-relative:text;mso-position-vertical:absolute;mso-position-vertical-relative:text;v-text-anchor:top" o:gfxdata="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" filled="f" stroked="f">
+              <v:rect w14:anchorId="59C5D757" id="Rectangle 22" o:spid="_x0000_s1026" style="position:absolute;margin-left:404.85pt;margin-top:101pt;width:26.6pt;height:17.25pt;z-index:251661312;visibility:visible;mso-wrap-style:square;mso-wrap-distance-left:9pt;mso-wrap-distance-top:0;mso-wrap-distance-right:9pt;mso-wrap-distance-bottom:0;mso-position-horizontal:absolute;mso-position-horizontal-relative:text;mso-position-vertical:absolute;mso-position-vertical-relative:text;v-text-anchor:top" o:gfxdata="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" filled="f" stroked="f">
                 <v:textbox inset="2.53958mm,1.2694mm,2.53958mm,1.2694mm">
                   <w:txbxContent>
                     <w:p>
@@ -22827,7 +23460,7 @@
         <mc:AlternateContent>
           <mc:Choice Requires="wps">
             <w:drawing>
-              <wp:anchor distT="0" distB="0" distL="114300" distR="114300" simplePos="0" relativeHeight="251660288" behindDoc="0" locked="0" layoutInCell="1" hidden="0" allowOverlap="1" wp14:anchorId="4419811D" wp14:editId="217B2136">
+              <wp:anchor distT="0" distB="0" distL="114300" distR="114300" simplePos="0" relativeHeight="251660288" behindDoc="0" locked="0" layoutInCell="1" hidden="0" allowOverlap="1" wp14:anchorId="0085FE50" wp14:editId="2F7A0659">
                 <wp:simplePos x="0" y="0"/>
                 <wp:positionH relativeFrom="column">
                   <wp:posOffset>734695</wp:posOffset>
@@ -22885,7 +23518,7 @@
           </mc:Choice>
           <mc:Fallback>
             <w:pict>
-              <v:rect w14:anchorId="35A664BC" id="Rectangle 23" o:spid="_x0000_s1027" style="position:absolute;margin-left:57.85pt;margin-top:14pt;width:26.6pt;height:17.25pt;z-index:251660288;visibility:visible;mso-wrap-style:square;mso-wrap-distance-left:9pt;mso-wrap-distance-top:0;mso-wrap-distance-right:9pt;mso-wrap-distance-bottom:0;mso-position-horizontal:absolute;mso-position-horizontal-relative:text;mso-position-vertical:absolute;mso-position-vertical-relative:text;v-text-anchor:top" o:gfxdata="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" filled="f" stroked="f">
+              <v:rect w14:anchorId="4419811D" id="Rectangle 23" o:spid="_x0000_s1027" style="position:absolute;margin-left:57.85pt;margin-top:14pt;width:26.6pt;height:17.25pt;z-index:251660288;visibility:visible;mso-wrap-style:square;mso-wrap-distance-left:9pt;mso-wrap-distance-top:0;mso-wrap-distance-right:9pt;mso-wrap-distance-bottom:0;mso-position-horizontal:absolute;mso-position-horizontal-relative:text;mso-position-vertical:absolute;mso-position-vertical-relative:text;v-text-anchor:top" o:gfxdata="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" filled="f" stroked="f">
                 <v:textbox inset="2.53958mm,1.2694mm,2.53958mm,1.2694mm">
                   <w:txbxContent>
                     <w:p>
@@ -22915,7 +23548,7 @@
         <mc:AlternateContent>
           <mc:Choice Requires="wps">
             <w:drawing>
-              <wp:anchor distT="0" distB="0" distL="114300" distR="114300" simplePos="0" relativeHeight="251659264" behindDoc="0" locked="0" layoutInCell="1" hidden="0" allowOverlap="1" wp14:anchorId="0BB5C8C5" wp14:editId="57E3F13A">
+              <wp:anchor distT="0" distB="0" distL="114300" distR="114300" simplePos="0" relativeHeight="251659264" behindDoc="0" locked="0" layoutInCell="1" hidden="0" allowOverlap="1" wp14:anchorId="77526284" wp14:editId="2E9A53A8">
                 <wp:simplePos x="0" y="0"/>
                 <wp:positionH relativeFrom="column">
                   <wp:posOffset>48895</wp:posOffset>
@@ -22973,7 +23606,7 @@
           </mc:Choice>
           <mc:Fallback>
             <w:pict>
-              <v:rect w14:anchorId="246F75B7" id="Rectangle 21" o:spid="_x0000_s1028" style="position:absolute;margin-left:3.85pt;margin-top:15pt;width:26.6pt;height:17.25pt;z-index:251659264;visibility:visible;mso-wrap-style:square;mso-wrap-distance-left:9pt;mso-wrap-distance-top:0;mso-wrap-distance-right:9pt;mso-wrap-distance-bottom:0;mso-position-horizontal:absolute;mso-position-horizontal-relative:text;mso-position-vertical:absolute;mso-position-vertical-relative:text;v-text-anchor:top" o:gfxdata="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" filled="f" stroked="f">
+              <v:rect w14:anchorId="0BB5C8C5" id="Rectangle 21" o:spid="_x0000_s1028" style="position:absolute;margin-left:3.85pt;margin-top:15pt;width:26.6pt;height:17.25pt;z-index:251659264;visibility:visible;mso-wrap-style:square;mso-wrap-distance-left:9pt;mso-wrap-distance-top:0;mso-wrap-distance-right:9pt;mso-wrap-distance-bottom:0;mso-position-horizontal:absolute;mso-position-horizontal-relative:text;mso-position-vertical:absolute;mso-position-vertical-relative:text;v-text-anchor:top" o:gfxdata="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" filled="f" stroked="f">
                 <v:textbox inset="2.53958mm,1.2694mm,2.53958mm,1.2694mm">
                   <w:txbxContent>
                     <w:p>
@@ -23001,7 +23634,7 @@
           <w:noProof/>
         </w:rPr>
         <w:drawing>
-          <wp:inline distT="0" distB="0" distL="0" distR="0" wp14:anchorId="5EAA18BB" wp14:editId="3E83B5E5">
+          <wp:inline distT="0" distB="0" distL="0" distR="0" wp14:anchorId="71883343" wp14:editId="11238C60">
             <wp:extent cx="5746750" cy="1701165"/>
             <wp:effectExtent l="19050" t="19050" r="25400" b="13335"/>
             <wp:docPr id="33" name="image8.png"/>
@@ -23014,7 +23647,7 @@
                     <pic:cNvPicPr preferRelativeResize="0"/>
                   </pic:nvPicPr>
                   <pic:blipFill>
-                    <a:blip r:embed="rId15"/>
+                    <a:blip r:embed="rId20"/>
                     <a:srcRect/>
                     <a:stretch>
                       <a:fillRect/>
@@ -23324,7 +23957,7 @@
           <w:noProof/>
         </w:rPr>
         <w:drawing>
-          <wp:inline distT="0" distB="0" distL="0" distR="0" wp14:anchorId="5DE5E49C" wp14:editId="57802D61">
+          <wp:inline distT="0" distB="0" distL="0" distR="0" wp14:anchorId="1BCCFC3E" wp14:editId="21F5A74C">
             <wp:extent cx="3297335" cy="2101186"/>
             <wp:effectExtent l="19050" t="19050" r="17780" b="13970"/>
             <wp:docPr id="34" name="image5.png"/>
@@ -23337,7 +23970,7 @@
                     <pic:cNvPicPr preferRelativeResize="0"/>
                   </pic:nvPicPr>
                   <pic:blipFill>
-                    <a:blip r:embed="rId16"/>
+                    <a:blip r:embed="rId21"/>
                     <a:srcRect/>
                     <a:stretch>
                       <a:fillRect/>
@@ -23599,14 +24232,14 @@
       <w:pPr>
         <w:pStyle w:val="Heading4"/>
       </w:pPr>
-      <w:bookmarkStart w:id="37" w:name="_Toc187228355"/>
+      <w:bookmarkStart w:id="38" w:name="_Toc187228355"/>
       <w:r>
         <w:t>3.</w:t>
       </w:r>
       <w:r>
         <w:t>3.2 User Management</w:t>
       </w:r>
-      <w:bookmarkEnd w:id="37"/>
+      <w:bookmarkEnd w:id="38"/>
     </w:p>
     <w:p>
       <w:pPr>
@@ -23644,21 +24277,21 @@
       <w:pPr>
         <w:pStyle w:val="Heading2"/>
       </w:pPr>
-      <w:bookmarkStart w:id="38" w:name="_Toc187341945"/>
+      <w:bookmarkStart w:id="39" w:name="_Toc187341945"/>
       <w:r>
         <w:t>4. Non-Functional Requirements</w:t>
       </w:r>
-      <w:bookmarkEnd w:id="38"/>
+      <w:bookmarkEnd w:id="39"/>
     </w:p>
     <w:p>
       <w:pPr>
         <w:pStyle w:val="Heading3"/>
       </w:pPr>
-      <w:bookmarkStart w:id="39" w:name="_Toc187341946"/>
+      <w:bookmarkStart w:id="40" w:name="_Toc187341946"/>
       <w:r>
         <w:t>3.1 External Interfaces</w:t>
       </w:r>
-      <w:bookmarkEnd w:id="39"/>
+      <w:bookmarkEnd w:id="40"/>
     </w:p>
     <w:p>
       <w:pPr>
@@ -23679,11 +24312,11 @@
       <w:pPr>
         <w:pStyle w:val="Heading3"/>
       </w:pPr>
-      <w:bookmarkStart w:id="40" w:name="_Toc187341947"/>
+      <w:bookmarkStart w:id="41" w:name="_Toc187341947"/>
       <w:r>
         <w:t>3.2 Quality Attributes</w:t>
       </w:r>
-      <w:bookmarkEnd w:id="40"/>
+      <w:bookmarkEnd w:id="41"/>
     </w:p>
     <w:p>
       <w:pPr>
@@ -23704,8 +24337,8 @@
       <w:pPr>
         <w:pStyle w:val="Heading4"/>
       </w:pPr>
-      <w:bookmarkStart w:id="41" w:name="_heading=h.1y810tw" w:colFirst="0" w:colLast="0"/>
-      <w:bookmarkEnd w:id="41"/>
+      <w:bookmarkStart w:id="42" w:name="_heading=h.1y810tw" w:colFirst="0" w:colLast="0"/>
+      <w:bookmarkEnd w:id="42"/>
       <w:r>
         <w:t xml:space="preserve">3.2.1 Usability </w:t>
       </w:r>
@@ -23730,8 +24363,8 @@
       <w:pPr>
         <w:pStyle w:val="Heading4"/>
       </w:pPr>
-      <w:bookmarkStart w:id="42" w:name="_heading=h.4i7ojhp" w:colFirst="0" w:colLast="0"/>
-      <w:bookmarkEnd w:id="42"/>
+      <w:bookmarkStart w:id="43" w:name="_heading=h.4i7ojhp" w:colFirst="0" w:colLast="0"/>
+      <w:bookmarkEnd w:id="43"/>
       <w:r>
         <w:t>3.2.2 Performance</w:t>
       </w:r>
@@ -23838,12 +24471,12 @@
       <w:pPr>
         <w:pStyle w:val="Heading2"/>
       </w:pPr>
-      <w:bookmarkStart w:id="43" w:name="_Toc187341948"/>
+      <w:bookmarkStart w:id="44" w:name="_Toc187341948"/>
       <w:r>
         <w:lastRenderedPageBreak/>
         <w:t>5. Requirement Appendix</w:t>
       </w:r>
-      <w:bookmarkEnd w:id="43"/>
+      <w:bookmarkEnd w:id="44"/>
     </w:p>
     <w:p>
       <w:pPr>
@@ -23865,11 +24498,11 @@
       <w:pPr>
         <w:pStyle w:val="Heading3"/>
       </w:pPr>
-      <w:bookmarkStart w:id="44" w:name="_Toc187341949"/>
+      <w:bookmarkStart w:id="45" w:name="_Toc187341949"/>
       <w:r>
         <w:t>5.1 Business Rules</w:t>
       </w:r>
-      <w:bookmarkEnd w:id="44"/>
+      <w:bookmarkEnd w:id="45"/>
     </w:p>
     <w:p>
       <w:pPr>
@@ -24543,11 +25176,11 @@
       <w:pPr>
         <w:pStyle w:val="Heading3"/>
       </w:pPr>
-      <w:bookmarkStart w:id="45" w:name="_Toc187341950"/>
+      <w:bookmarkStart w:id="46" w:name="_Toc187341950"/>
       <w:r>
         <w:t>5.2 System Messages</w:t>
       </w:r>
-      <w:bookmarkEnd w:id="45"/>
+      <w:bookmarkEnd w:id="46"/>
     </w:p>
     <w:tbl>
       <w:tblPr>
@@ -25292,19 +25925,118 @@
                 <w:sz w:val="22"/>
                 <w:szCs w:val="22"/>
               </w:rPr>
-              <w:t>A confirmation email has been sent to {</w:t>
-            </w:r>
-            <w:proofErr w:type="spellStart"/>
-            <w:r>
+              <w:t xml:space="preserve">A confirmation email has been sent to {email_address}. </w:t>
+            </w:r>
+          </w:p>
+        </w:tc>
+      </w:tr>
+      <w:tr>
+        <w:tc>
+          <w:tcPr>
+            <w:tcW w:w="557" w:type="dxa"/>
+          </w:tcPr>
+          <w:p>
+            <w:pPr>
+              <w:spacing w:before="60" w:after="60"/>
+              <w:rPr>
+                <w:rFonts w:asciiTheme="minorHAnsi" w:hAnsiTheme="minorHAnsi" w:cstheme="minorHAnsi"/>
+                <w:sz w:val="22"/>
+                <w:szCs w:val="22"/>
+              </w:rPr>
+            </w:pPr>
+            <w:r>
+              <w:rPr>
+                <w:rFonts w:asciiTheme="minorHAnsi" w:hAnsiTheme="minorHAnsi" w:cstheme="minorHAnsi"/>
+                <w:sz w:val="22"/>
+                <w:szCs w:val="22"/>
+              </w:rPr>
+              <w:t>6</w:t>
+            </w:r>
+          </w:p>
+        </w:tc>
+        <w:tc>
+          <w:tcPr>
+            <w:tcW w:w="1122" w:type="dxa"/>
+          </w:tcPr>
+          <w:p>
+            <w:pPr>
+              <w:spacing w:before="60" w:after="60"/>
+              <w:rPr>
+                <w:rFonts w:asciiTheme="minorHAnsi" w:hAnsiTheme="minorHAnsi" w:cstheme="minorHAnsi"/>
+                <w:sz w:val="22"/>
+                <w:szCs w:val="22"/>
+              </w:rPr>
+            </w:pPr>
+            <w:r>
+              <w:rPr>
+                <w:rFonts w:asciiTheme="minorHAnsi" w:hAnsiTheme="minorHAnsi" w:cstheme="minorHAnsi"/>
+                <w:sz w:val="22"/>
+                <w:szCs w:val="22"/>
+              </w:rPr>
+              <w:t>MSG06</w:t>
+            </w:r>
+          </w:p>
+        </w:tc>
+        <w:tc>
+          <w:tcPr>
+            <w:tcW w:w="1466" w:type="dxa"/>
+          </w:tcPr>
+          <w:p>
+            <w:pPr>
+              <w:spacing w:before="60" w:after="60"/>
+              <w:rPr>
+                <w:rFonts w:asciiTheme="minorHAnsi" w:hAnsiTheme="minorHAnsi" w:cstheme="minorHAnsi"/>
+                <w:sz w:val="22"/>
+                <w:szCs w:val="22"/>
+              </w:rPr>
+            </w:pPr>
+            <w:r>
+              <w:rPr>
+                <w:rFonts w:asciiTheme="minorHAnsi" w:hAnsiTheme="minorHAnsi" w:cstheme="minorHAnsi"/>
+                <w:sz w:val="22"/>
+                <w:szCs w:val="22"/>
+              </w:rPr>
+              <w:t>Toast message</w:t>
+            </w:r>
+          </w:p>
+        </w:tc>
+        <w:tc>
+          <w:tcPr>
+            <w:tcW w:w="3038" w:type="dxa"/>
+          </w:tcPr>
+          <w:p>
+            <w:pPr>
+              <w:spacing w:before="60" w:after="60"/>
+              <w:rPr>
+                <w:rFonts w:asciiTheme="minorHAnsi" w:hAnsiTheme="minorHAnsi" w:cstheme="minorHAnsi"/>
+                <w:sz w:val="22"/>
+                <w:szCs w:val="22"/>
+              </w:rPr>
+            </w:pPr>
+            <w:r>
+              <w:rPr>
+                <w:rFonts w:asciiTheme="minorHAnsi" w:hAnsiTheme="minorHAnsi" w:cstheme="minorHAnsi"/>
+                <w:sz w:val="22"/>
+                <w:szCs w:val="22"/>
+              </w:rPr>
+              <w:t>Resetting asset information successfully</w:t>
+            </w:r>
+          </w:p>
+        </w:tc>
+        <w:tc>
+          <w:tcPr>
+            <w:tcW w:w="2964" w:type="dxa"/>
+          </w:tcPr>
+          <w:p>
+            <w:pPr>
+              <w:spacing w:before="60" w:after="60"/>
               <w:rPr>
                 <w:rFonts w:asciiTheme="minorHAnsi" w:hAnsiTheme="minorHAnsi" w:cstheme="minorHAnsi"/>
                 <w:i/>
                 <w:sz w:val="22"/>
                 <w:szCs w:val="22"/>
               </w:rPr>
-              <w:t>email_address</w:t>
-            </w:r>
-            <w:proofErr w:type="spellEnd"/>
+            </w:pPr>
             <w:r>
               <w:rPr>
                 <w:rFonts w:asciiTheme="minorHAnsi" w:hAnsiTheme="minorHAnsi" w:cstheme="minorHAnsi"/>
@@ -25312,7 +26044,7 @@
                 <w:sz w:val="22"/>
                 <w:szCs w:val="22"/>
               </w:rPr>
-              <w:t xml:space="preserve">}. </w:t>
+              <w:t xml:space="preserve">Return asset(s) successfully. </w:t>
             </w:r>
           </w:p>
         </w:tc>
@@ -25337,7 +26069,7 @@
                 <w:sz w:val="22"/>
                 <w:szCs w:val="22"/>
               </w:rPr>
-              <w:t>6</w:t>
+              <w:t>7</w:t>
             </w:r>
           </w:p>
         </w:tc>
@@ -25360,7 +26092,7 @@
                 <w:sz w:val="22"/>
                 <w:szCs w:val="22"/>
               </w:rPr>
-              <w:t>MSG06</w:t>
+              <w:t>MSG07</w:t>
             </w:r>
           </w:p>
         </w:tc>
@@ -25406,7 +26138,7 @@
                 <w:sz w:val="22"/>
                 <w:szCs w:val="22"/>
               </w:rPr>
-              <w:t>Resetting asset information successfully</w:t>
+              <w:t>Deleting asset information successfully</w:t>
             </w:r>
           </w:p>
         </w:tc>
@@ -25431,7 +26163,7 @@
                 <w:sz w:val="22"/>
                 <w:szCs w:val="22"/>
               </w:rPr>
-              <w:t xml:space="preserve">Return asset(s) successfully. </w:t>
+              <w:t xml:space="preserve">Delete asset(s) successfully. </w:t>
             </w:r>
           </w:p>
         </w:tc>
@@ -25456,7 +26188,8 @@
                 <w:sz w:val="22"/>
                 <w:szCs w:val="22"/>
               </w:rPr>
-              <w:t>7</w:t>
+              <w:lastRenderedPageBreak/>
+              <w:t>8</w:t>
             </w:r>
           </w:p>
         </w:tc>
@@ -25479,7 +26212,7 @@
                 <w:sz w:val="22"/>
                 <w:szCs w:val="22"/>
               </w:rPr>
-              <w:t>MSG07</w:t>
+              <w:t>MSG08</w:t>
             </w:r>
           </w:p>
         </w:tc>
@@ -25502,7 +26235,7 @@
                 <w:sz w:val="22"/>
                 <w:szCs w:val="22"/>
               </w:rPr>
-              <w:t>Toast message</w:t>
+              <w:t>In red, under the text box</w:t>
             </w:r>
           </w:p>
         </w:tc>
@@ -25525,7 +26258,7 @@
                 <w:sz w:val="22"/>
                 <w:szCs w:val="22"/>
               </w:rPr>
-              <w:t>Deleting asset information successfully</w:t>
+              <w:t>Input value length &gt; max length</w:t>
             </w:r>
           </w:p>
         </w:tc>
@@ -25550,7 +26283,7 @@
                 <w:sz w:val="22"/>
                 <w:szCs w:val="22"/>
               </w:rPr>
-              <w:t xml:space="preserve">Delete asset(s) successfully. </w:t>
+              <w:t xml:space="preserve">Exceed max length of {max_length}. </w:t>
             </w:r>
           </w:p>
         </w:tc>
@@ -25575,8 +26308,7 @@
                 <w:sz w:val="22"/>
                 <w:szCs w:val="22"/>
               </w:rPr>
-              <w:lastRenderedPageBreak/>
-              <w:t>8</w:t>
+              <w:t>9</w:t>
             </w:r>
           </w:p>
         </w:tc>
@@ -25599,7 +26331,7 @@
                 <w:sz w:val="22"/>
                 <w:szCs w:val="22"/>
               </w:rPr>
-              <w:t>MSG08</w:t>
+              <w:t>MSG09</w:t>
             </w:r>
           </w:p>
         </w:tc>
@@ -25622,7 +26354,7 @@
                 <w:sz w:val="22"/>
                 <w:szCs w:val="22"/>
               </w:rPr>
-              <w:t>In red, under the text box</w:t>
+              <w:t>In line</w:t>
             </w:r>
           </w:p>
         </w:tc>
@@ -25645,7 +26377,7 @@
                 <w:sz w:val="22"/>
                 <w:szCs w:val="22"/>
               </w:rPr>
-              <w:t>Input value length &gt; max length</w:t>
+              <w:t>Username or password is not correct when clicking sign-in</w:t>
             </w:r>
           </w:p>
         </w:tc>
@@ -25670,157 +26402,7 @@
                 <w:sz w:val="22"/>
                 <w:szCs w:val="22"/>
               </w:rPr>
-              <w:t>Exceed max length of {</w:t>
-            </w:r>
-            <w:proofErr w:type="spellStart"/>
-            <w:r>
-              <w:rPr>
-                <w:rFonts w:asciiTheme="minorHAnsi" w:hAnsiTheme="minorHAnsi" w:cstheme="minorHAnsi"/>
-                <w:i/>
-                <w:sz w:val="22"/>
-                <w:szCs w:val="22"/>
-              </w:rPr>
-              <w:t>max_length</w:t>
-            </w:r>
-            <w:proofErr w:type="spellEnd"/>
-            <w:r>
-              <w:rPr>
-                <w:rFonts w:asciiTheme="minorHAnsi" w:hAnsiTheme="minorHAnsi" w:cstheme="minorHAnsi"/>
-                <w:i/>
-                <w:sz w:val="22"/>
-                <w:szCs w:val="22"/>
-              </w:rPr>
-              <w:t xml:space="preserve">}. </w:t>
-            </w:r>
-          </w:p>
-        </w:tc>
-      </w:tr>
-      <w:tr>
-        <w:tc>
-          <w:tcPr>
-            <w:tcW w:w="557" w:type="dxa"/>
-          </w:tcPr>
-          <w:p>
-            <w:pPr>
-              <w:spacing w:before="60" w:after="60"/>
-              <w:rPr>
-                <w:rFonts w:asciiTheme="minorHAnsi" w:hAnsiTheme="minorHAnsi" w:cstheme="minorHAnsi"/>
-                <w:sz w:val="22"/>
-                <w:szCs w:val="22"/>
-              </w:rPr>
-            </w:pPr>
-            <w:r>
-              <w:rPr>
-                <w:rFonts w:asciiTheme="minorHAnsi" w:hAnsiTheme="minorHAnsi" w:cstheme="minorHAnsi"/>
-                <w:sz w:val="22"/>
-                <w:szCs w:val="22"/>
-              </w:rPr>
-              <w:t>9</w:t>
-            </w:r>
-          </w:p>
-        </w:tc>
-        <w:tc>
-          <w:tcPr>
-            <w:tcW w:w="1122" w:type="dxa"/>
-          </w:tcPr>
-          <w:p>
-            <w:pPr>
-              <w:spacing w:before="60" w:after="60"/>
-              <w:rPr>
-                <w:rFonts w:asciiTheme="minorHAnsi" w:hAnsiTheme="minorHAnsi" w:cstheme="minorHAnsi"/>
-                <w:sz w:val="22"/>
-                <w:szCs w:val="22"/>
-              </w:rPr>
-            </w:pPr>
-            <w:r>
-              <w:rPr>
-                <w:rFonts w:asciiTheme="minorHAnsi" w:hAnsiTheme="minorHAnsi" w:cstheme="minorHAnsi"/>
-                <w:sz w:val="22"/>
-                <w:szCs w:val="22"/>
-              </w:rPr>
-              <w:t>MSG09</w:t>
-            </w:r>
-          </w:p>
-        </w:tc>
-        <w:tc>
-          <w:tcPr>
-            <w:tcW w:w="1466" w:type="dxa"/>
-          </w:tcPr>
-          <w:p>
-            <w:pPr>
-              <w:spacing w:before="60" w:after="60"/>
-              <w:rPr>
-                <w:rFonts w:asciiTheme="minorHAnsi" w:hAnsiTheme="minorHAnsi" w:cstheme="minorHAnsi"/>
-                <w:sz w:val="22"/>
-                <w:szCs w:val="22"/>
-              </w:rPr>
-            </w:pPr>
-            <w:r>
-              <w:rPr>
-                <w:rFonts w:asciiTheme="minorHAnsi" w:hAnsiTheme="minorHAnsi" w:cstheme="minorHAnsi"/>
-                <w:sz w:val="22"/>
-                <w:szCs w:val="22"/>
-              </w:rPr>
-              <w:t>In line</w:t>
-            </w:r>
-          </w:p>
-        </w:tc>
-        <w:tc>
-          <w:tcPr>
-            <w:tcW w:w="3038" w:type="dxa"/>
-          </w:tcPr>
-          <w:p>
-            <w:pPr>
-              <w:spacing w:before="60" w:after="60"/>
-              <w:rPr>
-                <w:rFonts w:asciiTheme="minorHAnsi" w:hAnsiTheme="minorHAnsi" w:cstheme="minorHAnsi"/>
-                <w:sz w:val="22"/>
-                <w:szCs w:val="22"/>
-              </w:rPr>
-            </w:pPr>
-            <w:r>
-              <w:rPr>
-                <w:rFonts w:asciiTheme="minorHAnsi" w:hAnsiTheme="minorHAnsi" w:cstheme="minorHAnsi"/>
-                <w:sz w:val="22"/>
-                <w:szCs w:val="22"/>
-              </w:rPr>
-              <w:t>Username or password is not correct when clicking sign-in</w:t>
-            </w:r>
-          </w:p>
-        </w:tc>
-        <w:tc>
-          <w:tcPr>
-            <w:tcW w:w="2964" w:type="dxa"/>
-          </w:tcPr>
-          <w:p>
-            <w:pPr>
-              <w:spacing w:before="60" w:after="60"/>
-              <w:rPr>
-                <w:rFonts w:asciiTheme="minorHAnsi" w:hAnsiTheme="minorHAnsi" w:cstheme="minorHAnsi"/>
-                <w:i/>
-                <w:sz w:val="22"/>
-                <w:szCs w:val="22"/>
-              </w:rPr>
-            </w:pPr>
-            <w:proofErr w:type="spellStart"/>
-            <w:r>
-              <w:rPr>
-                <w:rFonts w:asciiTheme="minorHAnsi" w:hAnsiTheme="minorHAnsi" w:cstheme="minorHAnsi"/>
-                <w:i/>
-                <w:sz w:val="22"/>
-                <w:szCs w:val="22"/>
-              </w:rPr>
-              <w:t>Incorrrect</w:t>
-            </w:r>
-            <w:proofErr w:type="spellEnd"/>
-            <w:r>
-              <w:rPr>
-                <w:rFonts w:asciiTheme="minorHAnsi" w:hAnsiTheme="minorHAnsi" w:cstheme="minorHAnsi"/>
-                <w:i/>
-                <w:sz w:val="22"/>
-                <w:szCs w:val="22"/>
-              </w:rPr>
-              <w:t xml:space="preserve"> user name or password. Please check again.</w:t>
+              <w:t>Incorrrect user name or password. Please check again.</w:t>
             </w:r>
           </w:p>
         </w:tc>
@@ -25933,14 +26515,14 @@
       <w:pPr>
         <w:pStyle w:val="Heading3"/>
       </w:pPr>
-      <w:bookmarkStart w:id="46" w:name="_Toc187341951"/>
+      <w:bookmarkStart w:id="47" w:name="_Toc187341951"/>
       <w:r>
         <w:t>5.3 Other Requirements…</w:t>
       </w:r>
-      <w:bookmarkEnd w:id="46"/>
+      <w:bookmarkEnd w:id="47"/>
     </w:p>
     <w:sectPr>
-      <w:footerReference w:type="default" r:id="rId17"/>
+      <w:footerReference w:type="default" r:id="rId22"/>
       <w:pgSz w:w="11906" w:h="16838"/>
       <w:pgMar w:top="1440" w:right="1416" w:bottom="1440" w:left="1440" w:header="708" w:footer="708" w:gutter="0"/>
       <w:pgNumType w:start="1"/>
@@ -26035,7 +26617,6 @@
               <w:szCs w:val="22"/>
             </w:rPr>
           </w:pPr>
-          <w:proofErr w:type="spellStart"/>
           <w:r>
             <w:rPr>
               <w:rFonts w:ascii="Calibri" w:eastAsia="Calibri" w:hAnsi="Calibri" w:cs="Calibri"/>
@@ -26043,17 +26624,7 @@
               <w:sz w:val="22"/>
               <w:szCs w:val="22"/>
             </w:rPr>
-            <w:t>ProjectCode</w:t>
-          </w:r>
-          <w:proofErr w:type="spellEnd"/>
-          <w:r>
-            <w:rPr>
-              <w:rFonts w:ascii="Calibri" w:eastAsia="Calibri" w:hAnsi="Calibri" w:cs="Calibri"/>
-              <w:color w:val="000000"/>
-              <w:sz w:val="22"/>
-              <w:szCs w:val="22"/>
-            </w:rPr>
-            <w:t xml:space="preserve"> – Report 3 (SRS Document)</w:t>
+            <w:t>ProjectCode – Report 3 (SRS Document)</w:t>
           </w:r>
         </w:p>
       </w:tc>

</xml_diff>